<commit_message>
feat(models): switch Qwen pairs to official Qwen3-1.7B and Qwen3-4B
techwithsergiu/Qwen3.5-text-* is a hybrid SSM/linear-attention model
requiring causal-conv1d; without it the fallback conv1d raises
CUDNN_STATUS_NOT_INITIALIZED on the V100. Official Qwen3 models are
standard transformers with no extra dependencies and are the intended
target for our enable_thinking=False chat-template flag.

- configs: model_id + size_b updated for both Qwen pairs
- CLAUDE.md / AGENTS.md: model pair table updated
- build_fyp_report.js: abstract, model table, §5.4, §7.2, YAML appendix
- FYP report docx regenerated
- PROJECT_LOG.md: D7 decision + T17 closed + changelog row

Co-Authored-By: Claude Sonnet 4.6 <noreply@anthropic.com>
</commit_message>
<xml_diff>
--- a/docs/FYP_Report_2026-05-27.docx
+++ b/docs/FYP_Report_2026-05-27.docx
@@ -242,7 +242,7 @@
           <w:sz w:val="22"/>
           <w:szCs w:val="22"/>
         </w:rPr>
-        <w:t xml:space="preserve">This work designs and implements a research-grade benchmarking framework to study safety–capability trade-offs in four-bit quantized compact language models. The study adopts a matched-pair experimental design in which baseline and four-bit variants are loaded from the same underlying weights, differing only by the application of on-the-fly BitsAndBytes NF4 quantization at load time. This design choice eliminates publisher- and pipeline-asymmetry as confounds, isolating quantization itself as the sole experimental variable. Three model pairs are evaluated: Qwen3.5-text-2B, Qwen3.5-text-4B, and Llama-3.2-3B-Instruct as a cross-family robustness check.</w:t>
+        <w:t xml:space="preserve">This work designs and implements a research-grade benchmarking framework to study safety–capability trade-offs in four-bit quantized compact language models. The study adopts a matched-pair experimental design in which baseline and four-bit variants are loaded from the same underlying weights, differing only by the application of on-the-fly BitsAndBytes NF4 quantization at load time. This design choice eliminates publisher- and pipeline-asymmetry as confounds, isolating quantization itself as the sole experimental variable. Three model pairs are evaluated: Qwen3-1.7B, Qwen3-4B, and Llama-3.2-3B-Instruct as a cross-family robustness check.</w:t>
       </w:r>
     </w:p>
     <w:p>
@@ -1419,7 +1419,7 @@
           <w:sz w:val="22"/>
           <w:szCs w:val="22"/>
         </w:rPr>
-        <w:t xml:space="preserve">Three model pairs are evaluated. The Qwen pairs at two billion and four billion parameters serve as the primary within-family comparison and provide both a quantization axis and a scale axis. The Llama 3.2 3B pair sits between them by parameter count and serves as a cross-family robustness check. Table 3.1 summarises the model matrix.</w:t>
+        <w:t xml:space="preserve">Three model pairs are evaluated. The Qwen pairs at 1.7 billion and four billion parameters serve as the primary within-family comparison and provide both a quantization axis and a scale axis. The Llama 3.2 3B pair sits between them by parameter count and serves as a cross-family robustness check. Table 3.1 summarises the model matrix.</w:t>
       </w:r>
     </w:p>
     <w:tbl>
@@ -1762,7 +1762,7 @@
                 <w:sz w:val="20"/>
                 <w:szCs w:val="20"/>
               </w:rPr>
-              <w:t xml:space="preserve">techwithsergiu/Qwen3.5-text-2B</w:t>
+              <w:t xml:space="preserve">Qwen/Qwen3-1.7B</w:t>
             </w:r>
           </w:p>
         </w:tc>
@@ -1822,7 +1822,7 @@
                 <w:sz w:val="20"/>
                 <w:szCs w:val="20"/>
               </w:rPr>
-              <w:t xml:space="preserve">2 B</w:t>
+              <w:t xml:space="preserve">1.7 B</w:t>
             </w:r>
           </w:p>
         </w:tc>
@@ -1944,7 +1944,7 @@
                 <w:sz w:val="20"/>
                 <w:szCs w:val="20"/>
               </w:rPr>
-              <w:t xml:space="preserve">techwithsergiu/Qwen3.5-text-2B</w:t>
+              <w:t xml:space="preserve">Qwen/Qwen3-1.7B</w:t>
             </w:r>
           </w:p>
         </w:tc>
@@ -2004,7 +2004,7 @@
                 <w:sz w:val="20"/>
                 <w:szCs w:val="20"/>
               </w:rPr>
-              <w:t xml:space="preserve">2 B</w:t>
+              <w:t xml:space="preserve">1.7 B</w:t>
             </w:r>
           </w:p>
         </w:tc>
@@ -2126,7 +2126,7 @@
                 <w:sz w:val="20"/>
                 <w:szCs w:val="20"/>
               </w:rPr>
-              <w:t xml:space="preserve">techwithsergiu/Qwen3.5-text-4B</w:t>
+              <w:t xml:space="preserve">Qwen/Qwen3-4B</w:t>
             </w:r>
           </w:p>
         </w:tc>
@@ -2308,7 +2308,7 @@
                 <w:sz w:val="20"/>
                 <w:szCs w:val="20"/>
               </w:rPr>
-              <w:t xml:space="preserve">techwithsergiu/Qwen3.5-text-4B</w:t>
+              <w:t xml:space="preserve">Qwen/Qwen3-4B</w:t>
             </w:r>
           </w:p>
         </w:tc>
@@ -8859,7 +8859,7 @@
           <w:sz w:val="22"/>
           <w:szCs w:val="22"/>
         </w:rPr>
-        <w:t xml:space="preserve">The Qwen pairs draw from open-access checkpoints under the techwithsergiu namespace and require no authentication. The Llama pair uses meta-llama/Llama-3.2-3B-Instruct, which is gated under the Meta Llama community license, and HarmBench currently also requires accepted Hugging Face dataset access conditions. Access is handled by logging into Hugging Face once on the TC1 head node with a read-scoped personal access token. As of 2026-05-26, token registration and gated-access acceptance have been verified by a successful full pre-cache of both Llama 3.2 3B and HarmBench.</w:t>
+        <w:t xml:space="preserve">The Qwen pairs draw from open-access official Qwen3 checkpoints (Qwen/Qwen3-1.7B and Qwen/Qwen3-4B) and require no authentication. The Llama pair uses meta-llama/Llama-3.2-3B-Instruct, which is gated under the Meta Llama community license, and HarmBench currently also requires accepted Hugging Face dataset access conditions. Access is handled by logging into Hugging Face once on the TC1 head node with a read-scoped personal access token. As of 2026-05-26, token registration and gated-access acceptance have been verified by a successful full pre-cache of both Llama 3.2 3B and HarmBench.</w:t>
       </w:r>
     </w:p>
     <w:p>
@@ -11458,7 +11458,7 @@
           <w:sz w:val="22"/>
           <w:szCs w:val="22"/>
         </w:rPr>
-        <w:t xml:space="preserve">External validity is bounded by three explicit design choices. First, findings are bounded to BitsAndBytes NF4 quantization. Alternative methods such as GPTQ, AWQ, and the GGUF family used by llama.cpp may produce different effects, both quantitatively and qualitatively; the present study does not claim to characterise those methods. Second, the techwithsergiu Qwen baselines are text-only derivatives of a multimodal Qwen series produced by removing the visual tower. Results therefore describe quantization behaviour on that specific weight provenance and may not transfer perfectly to the official Qwen 2.5 or Qwen 3 instruction checkpoints that are more commonly deployed in production. Third, the study is restricted to English-language, text-only interactions; multilingual and multimodal effects are out of scope.</w:t>
+        <w:t xml:space="preserve">External validity is bounded by three explicit design choices. First, findings are bounded to BitsAndBytes NF4 quantization. Alternative methods such as GPTQ, AWQ, and the GGUF family used by llama.cpp may produce different effects, both quantitatively and qualitatively; the present study does not claim to characterise those methods. Second, the Qwen3 baselines (Qwen3-1.7B and Qwen3-4B) are instruction-tuned dense models from the official Alibaba Qwen3 release; results describe quantization behaviour on this specific model family and may not transfer directly to other architectures or training regimes. Third, the study is restricted to English-language, text-only interactions; multilingual and multimodal effects are out of scope.</w:t>
       </w:r>
     </w:p>
     <w:p>
@@ -12318,7 +12318,7 @@
           <w:sz w:val="18"/>
           <w:szCs w:val="18"/>
         </w:rPr>
-        <w:t xml:space="preserve">    size_b: 2.0</w:t>
+        <w:t xml:space="preserve">    size_b: 1.7</w:t>
       </w:r>
     </w:p>
     <w:p>
@@ -12360,7 +12360,7 @@
           <w:sz w:val="18"/>
           <w:szCs w:val="18"/>
         </w:rPr>
-        <w:t xml:space="preserve">    model_id: techwithsergiu/Qwen3.5-text-2B</w:t>
+        <w:t xml:space="preserve">    model_id: Qwen/Qwen3-1.7B</w:t>
       </w:r>
     </w:p>
     <w:p>
@@ -12458,7 +12458,7 @@
           <w:sz w:val="18"/>
           <w:szCs w:val="18"/>
         </w:rPr>
-        <w:t xml:space="preserve">    size_b: 2.0</w:t>
+        <w:t xml:space="preserve">    size_b: 1.7</w:t>
       </w:r>
     </w:p>
     <w:p>
@@ -12500,7 +12500,7 @@
           <w:sz w:val="18"/>
           <w:szCs w:val="18"/>
         </w:rPr>
-        <w:t xml:space="preserve">    model_id: techwithsergiu/Qwen3.5-text-2B</w:t>
+        <w:t xml:space="preserve">    model_id: Qwen/Qwen3-1.7B</w:t>
       </w:r>
     </w:p>
     <w:p>
@@ -12640,7 +12640,7 @@
           <w:sz w:val="18"/>
           <w:szCs w:val="18"/>
         </w:rPr>
-        <w:t xml:space="preserve">    model_id: techwithsergiu/Qwen3.5-text-4B</w:t>
+        <w:t xml:space="preserve">    model_id: Qwen/Qwen3-4B</w:t>
       </w:r>
     </w:p>
     <w:p>
@@ -12780,7 +12780,7 @@
           <w:sz w:val="18"/>
           <w:szCs w:val="18"/>
         </w:rPr>
-        <w:t xml:space="preserve">    model_id: techwithsergiu/Qwen3.5-text-4B</w:t>
+        <w:t xml:space="preserve">    model_id: Qwen/Qwen3-4B</w:t>
       </w:r>
     </w:p>
     <w:p>

</xml_diff>

<commit_message>
docs(report): document CUDNN error + model switch + infra validation
§3.2 Model Selection: adds paragraph explaining why official Qwen3 was
chosen — third-party techwithsergiu models raised CUDNN_STATUS_NOT_
INITIALIZED (hybrid SSM arch requires causal-conv1d, not installable
offline on TC1); switch to Qwen3-1.7B/4B made before any production runs.

§5.4.1 Infrastructure Validation: documents two sbatch bugs found during
smoke testing (relative #SBATCH --output paths; /tmp not shared across
nodes), the generator-level fix, and smoke job 60975 result.

Co-Authored-By: Claude Sonnet 4.6 <noreply@anthropic.com>
</commit_message>
<xml_diff>
--- a/docs/FYP_Report_2026-05-27.docx
+++ b/docs/FYP_Report_2026-05-27.docx
@@ -2753,6 +2753,20 @@
     </w:p>
     <w:p>
       <w:pPr>
+        <w:spacing w:after="160" w:line="300"/>
+        <w:jc w:val="both"/>
+      </w:pPr>
+      <w:r>
+        <w:rPr>
+          <w:rFonts w:ascii="Calibri" w:cs="Calibri" w:eastAsia="Calibri" w:hAnsi="Calibri"/>
+          <w:sz w:val="22"/>
+          <w:szCs w:val="22"/>
+        </w:rPr>
+        <w:t xml:space="preserve">The Qwen3 checkpoints were selected after an initial environment validation on the TC1 cluster surfaced a compatibility failure with a third-party model upload (techwithsergiu/Qwen3.5-text-2B and techwithsergiu/Qwen3.5-text-4B) that had been considered during planning. Those checkpoints use a hybrid linear-attention/SSM architecture that requires the causal-conv1d and flash-linear-attention libraries at runtime. When those libraries are absent, the PyTorch fallback conv1d path raises a CUDNN_STATUS_NOT_INITIALIZED error during the very first inference batch, terminating the job before any results are produced. Installing those libraries in the TC1 conda environment was considered but ruled out: the libraries require custom CUDA kernel compilation against the cluster's specific driver version and are not trivially installable in an offline environment. Switching to the official Qwen3 release (Qwen/Qwen3-1.7B and Qwen/Qwen3-4B) eliminated all external dependencies: the Qwen3 dense models are standard grouped-query-attention transformers that load and run with the baseline transformers and bitsandbytes packages already in the environment. The switch was made before any production runs, so no experimental results were affected.</w:t>
+      </w:r>
+    </w:p>
+    <w:p>
+      <w:pPr>
         <w:pStyle w:val="Heading2"/>
         <w:spacing w:after="140" w:before="280"/>
       </w:pPr>
@@ -8875,7 +8889,7 @@
           <w:sz w:val="26"/>
           <w:szCs w:val="26"/>
         </w:rPr>
-        <w:t xml:space="preserve">5.5 Offline-Mode Strategy and Pre-Cache</w:t>
+        <w:t xml:space="preserve">5.4.1 Infrastructure Validation and Fixes</w:t>
       </w:r>
     </w:p>
     <w:p>
@@ -8889,7 +8903,23 @@
           <w:sz w:val="22"/>
           <w:szCs w:val="22"/>
         </w:rPr>
-        <w:t xml:space="preserve">Because the compute nodes may not have outbound internet access, and because runtime downloads risk burning the six-hour walltime budget on slow Hugging Face mirrors, this study adopts a strict offline-mode strategy. All datasets and model weights are pre-cached on the head node before any SLURM job is submitted. SLURM jobs then run with HF_HUB_OFFLINE=1, HF_DATASETS_OFFLINE=1, and TRANSFORMERS_OFFLINE=1 exported in the sbatch setup_commands block, ensuring that any cache miss fails immediately with a clear error rather than hanging on a network attempt.</w:t>
+        <w:t xml:space="preserve">Before the full matrix was submitted, a dedicated CUDA verification job and a five-sample smoke run were used to validate the cluster environment end-to-end. Two infrastructure bugs were identified and fixed during this process. First, the generated sbatch scripts used relative paths for the #SBATCH --output and #SBATCH --error directives. SLURM resolves these relative to the directory from which sbatch is invoked, not to the working directory set by cd inside the script body. Jobs submitted from the home directory therefore wrote their log files to ~/results/slurm_logs_tc1/ rather than to the repository's results/ tree, causing the output to appear missing. The fix was applied in the job generator (ethical_benchmark/cluster/generate_jobs.py): when log_dir is a relative path and work_dir is set, the generator now anchors log_dir under work_dir so all sbatch directives contain fully qualified paths. Second, an initial CUDA verification script placed a Python file in /tmp on the head node and referenced it from the sbatch body; the /tmp filesystem is local to each node and is not shared, so the compute node could not find the file. The fix was to embed the verification code inline in the sbatch script using a Python heredoc (python - &lt;&lt; 'PYEOF' ... PYEOF), removing the dependency on any shared path. Both fixes were committed and pushed before the smoke run, and the five-sample smoke job (SLURM job ID 60975) completed successfully: runtime_device reported cuda, attack_success_rate was 0.6 over five HarmBench prompts, and no malformed outputs were produced.</w:t>
+      </w:r>
+    </w:p>
+    <w:p>
+      <w:pPr>
+        <w:pStyle w:val="Heading2"/>
+        <w:spacing w:after="140" w:before="280"/>
+      </w:pPr>
+      <w:r>
+        <w:rPr>
+          <w:rFonts w:ascii="Calibri" w:cs="Calibri" w:eastAsia="Calibri" w:hAnsi="Calibri"/>
+          <w:b/>
+          <w:bCs/>
+          <w:sz w:val="26"/>
+          <w:szCs w:val="26"/>
+        </w:rPr>
+        <w:t xml:space="preserve">5.5 Offline-Mode Strategy and Pre-Cache</w:t>
       </w:r>
     </w:p>
     <w:p>
@@ -8903,6 +8933,20 @@
           <w:sz w:val="22"/>
           <w:szCs w:val="22"/>
         </w:rPr>
+        <w:t xml:space="preserve">Because the compute nodes may not have outbound internet access, and because runtime downloads risk burning the six-hour walltime budget on slow Hugging Face mirrors, this study adopts a strict offline-mode strategy. All datasets and model weights are pre-cached on the head node before any SLURM job is submitted. SLURM jobs then run with HF_HUB_OFFLINE=1, HF_DATASETS_OFFLINE=1, and TRANSFORMERS_OFFLINE=1 exported in the sbatch setup_commands block, ensuring that any cache miss fails immediately with a clear error rather than hanging on a network attempt.</w:t>
+      </w:r>
+    </w:p>
+    <w:p>
+      <w:pPr>
+        <w:spacing w:after="160" w:line="300"/>
+        <w:jc w:val="both"/>
+      </w:pPr>
+      <w:r>
+        <w:rPr>
+          <w:rFonts w:ascii="Calibri" w:cs="Calibri" w:eastAsia="Calibri" w:hAnsi="Calibri"/>
+          <w:sz w:val="22"/>
+          <w:szCs w:val="22"/>
+        </w:rPr>
         <w:t xml:space="preserve">The repository provides a helper script (scripts/prefetch_tc1.py) that reads the configured benchmarks and models from configs/tc1.yaml and triggers the necessary downloads. It is invoked once, on the head node, after the conda environment is activated and a Hugging Face token has been registered with huggingface_hub.login:</w:t>
       </w:r>
     </w:p>
@@ -9043,7 +9087,7 @@
           <w:sz w:val="22"/>
           <w:szCs w:val="22"/>
         </w:rPr>
-        <w:t xml:space="preserve">The pre-cache step retrieves HarmBench, the six MMLU subjects, and three model repositories (Qwen 2B, Qwen 4B, Llama 3.2 3B). XSTest is not fetched from Hugging Face because the canonical CSV is bundled in the repository as data/xstest_v2_prompts.csv. The observed TC1 pre-cache completed successfully on 2026-05-26 at 22:40 UTC+8, caching approximately 25.5 GB in ~/.cache/huggingface/hub: Llama 3.2 3B (12.9 GB), Qwen 2B (3.92 GB), and Qwen 4B (8.68 GB), plus small dataset files. The downloads themselves are pure HTTP file transfers with negligible CPU and memory cost, and are therefore consistent with the head-node activities explicitly demonstrated in the TC1 user guide (page 7–9, where conda install and pip install are shown executing on the head node).</w:t>
+        <w:t xml:space="preserve">The pre-cache step retrieves HarmBench, the six MMLU subjects, and three model repositories (Qwen3-1.7B, Qwen3-4B, Llama 3.2 3B). XSTest is not fetched from Hugging Face because the canonical CSV is bundled in the repository as data/xstest_v2_prompts.csv. The current TC1 pre-cache completed successfully on 2026-05-27 at 15:37 UTC+8, caching the required current model repositories in ~/.cache/huggingface/hub: Qwen3-1.7B (4.08 GB), Qwen3-4B (8.06 GB), and Llama 3.2 3B (12.9 GB), plus small dataset files. The downloads themselves are pure HTTP file transfers with negligible CPU and memory cost, and are therefore consistent with the head-node activities explicitly demonstrated in the TC1 user guide (page 7–9, where conda install and pip install are shown executing on the head node).</w:t>
       </w:r>
     </w:p>
     <w:p>
@@ -9195,7 +9239,7 @@
           <w:sz w:val="22"/>
           <w:szCs w:val="22"/>
         </w:rPr>
-        <w:t xml:space="preserve">Before submitting the full matrix, a single short smoke sbatch is submitted (five prompts, fifteen-minute walltime, qwen_2b_base on HarmBench) to verify that the offline-cache path works end-to-end on a real compute node. Per the user guide's guidance to prefer sbatch over srun, this smoke verification is performed as a regular SLURM job rather than an interactive session. Only after the smoke job produces a clean summary.json is the full six-job matrix submitted.</w:t>
+        <w:t xml:space="preserve">Before submitting the full matrix, a single short smoke sbatch is submitted (five prompts, qwen_2b_base on HarmBench) to verify that the offline-cache path works end-to-end on a real compute node. Per the user guide's guidance to prefer sbatch over srun, this smoke verification is performed as a regular SLURM job rather than an interactive session. On 2026-05-27, smoke job 60975 completed successfully on TC1 in 33 seconds, produced a clean summary.json with runtime_device=cuda and malformed_rate=0.0, and therefore cleared the full six-job matrix for submission.</w:t>
       </w:r>
     </w:p>
     <w:p>
@@ -9209,7 +9253,7 @@
           <w:sz w:val="22"/>
           <w:szCs w:val="22"/>
         </w:rPr>
-        <w:t xml:space="preserve">With MaxJobsPU=2 enforced by the cluster policy, the six jobs are processed in three sequential pairs in the worst case, yielding an expected end-to-end wall time of approximately one to two days assuming each job completes well within the six-hour budget. The six-hour walltime is intentionally generous; smoke profiling on local hardware suggests that the per-model matrix is likely to complete in two to four hours on a single Tesla V100 32 GB at the configured sample budgets, leaving substantial headroom for unexpected slowdowns. Memory and CPU utilisation are recorded after each job using the seff and MyJobHistory commands to inform any subsequent right-sizing of the sbatch resource requests.</w:t>
+        <w:t xml:space="preserve">With MaxJobsPU=2 enforced by the cluster policy, the six jobs are processed in three sequential pairs in the worst case, yielding an expected end-to-end wall time of approximately one to two days assuming each job completes well within the six-hour budget. The six-hour walltime is intentionally generous; the completed smoke run confirms the CUDA/offline-cache path on a Tesla V100 32 GB, and the per-model matrix is expected to fit comfortably within the walltime. Memory and CPU utilisation are recorded after each job using the seff and MyJobHistory commands to inform any subsequent right-sizing of the sbatch resource requests.</w:t>
       </w:r>
     </w:p>
     <w:p>
@@ -11939,7 +11983,7 @@
           <w:sz w:val="22"/>
           <w:szCs w:val="22"/>
         </w:rPr>
-        <w:t xml:space="preserve">The framework is complete, validated, and ready for cluster execution. Three pairs (Qwen 2B, Qwen 4B, and Llama 3.2 3B) are configured, six sbatch files have been generated, Hugging Face gated access has been verified, and all required datasets and model weights have been pre-cached on TC1. The next operational step is a short smoke sbatch to validate offline GPU execution before submitting the full six-job matrix. The expected output is a set of pairwise deltas and interpretation labels that directly answer the five research questions, and a documented empirical baseline for future quantization-safety work in the compact-model regime.</w:t>
+        <w:t xml:space="preserve">The framework is complete, validated, and ready for full cluster execution. Three pairs (Qwen 2B-class, Qwen 4B, and Llama 3.2 3B) are configured, six sbatch files have been generated, Hugging Face gated access has been verified, all required datasets and model weights have been pre-cached on TC1, and the qwen_2b_base/HarmBench smoke sbatch has completed successfully on CUDA. The next operational step is submitting the full six-job matrix. The expected output is a set of pairwise deltas and interpretation labels that directly answer the five research questions, and a documented empirical baseline for future quantization-safety work in the compact-model regime.</w:t>
       </w:r>
     </w:p>
     <w:p>
@@ -18162,6 +18206,190 @@
                 <w:sz w:val="20"/>
                 <w:szCs w:val="20"/>
               </w:rPr>
+              <w:t xml:space="preserve">2026-05-27 15:43</w:t>
+            </w:r>
+          </w:p>
+        </w:tc>
+        <w:tc>
+          <w:tcPr>
+            <w:tcW w:type="dxa" w:w="3000"/>
+            <w:tcBorders>
+              <w:top w:val="single" w:color="999999" w:sz="4"/>
+              <w:left w:val="single" w:color="999999" w:sz="4"/>
+              <w:bottom w:val="single" w:color="999999" w:sz="4"/>
+              <w:right w:val="single" w:color="999999" w:sz="4"/>
+            </w:tcBorders>
+            <w:tcMar>
+              <w:top w:type="dxa" w:w="80"/>
+              <w:left w:type="dxa" w:w="120"/>
+              <w:bottom w:type="dxa" w:w="80"/>
+              <w:right w:type="dxa" w:w="120"/>
+            </w:tcMar>
+          </w:tcPr>
+          <w:p>
+            <w:pPr>
+              <w:spacing w:after="0"/>
+            </w:pPr>
+            <w:r>
+              <w:rPr>
+                <w:rFonts w:ascii="Calibri" w:cs="Calibri" w:eastAsia="Calibri" w:hAnsi="Calibri"/>
+                <w:sz w:val="20"/>
+                <w:szCs w:val="20"/>
+              </w:rPr>
+              <w:t xml:space="preserve">FYP_Report_2026-05-27.docx (current)</w:t>
+            </w:r>
+          </w:p>
+        </w:tc>
+        <w:tc>
+          <w:tcPr>
+            <w:tcW w:type="dxa" w:w="4160"/>
+            <w:tcBorders>
+              <w:top w:val="single" w:color="999999" w:sz="4"/>
+              <w:left w:val="single" w:color="999999" w:sz="4"/>
+              <w:bottom w:val="single" w:color="999999" w:sz="4"/>
+              <w:right w:val="single" w:color="999999" w:sz="4"/>
+            </w:tcBorders>
+            <w:tcMar>
+              <w:top w:type="dxa" w:w="80"/>
+              <w:left w:type="dxa" w:w="120"/>
+              <w:bottom w:type="dxa" w:w="80"/>
+              <w:right w:type="dxa" w:w="120"/>
+            </w:tcMar>
+          </w:tcPr>
+          <w:p>
+            <w:pPr>
+              <w:spacing w:after="0"/>
+            </w:pPr>
+            <w:r>
+              <w:rPr>
+                <w:rFonts w:ascii="Calibri" w:cs="Calibri" w:eastAsia="Calibri" w:hAnsi="Calibri"/>
+                <w:sz w:val="20"/>
+                <w:szCs w:val="20"/>
+              </w:rPr>
+              <w:t xml:space="preserve">Recorded that the current Qwen3/Llama pre-cache completed on TC1 and that smoke job 60975 successfully validated the CUDA/offline-cache path. Updated Chapter 5 and Chapter 10 so the next operational step is the full six-job matrix, not the smoke job.</w:t>
+            </w:r>
+          </w:p>
+        </w:tc>
+      </w:tr>
+      <w:tr>
+        <w:tc>
+          <w:tcPr>
+            <w:tcW w:type="dxa" w:w="2200"/>
+            <w:tcBorders>
+              <w:top w:val="single" w:color="999999" w:sz="4"/>
+              <w:left w:val="single" w:color="999999" w:sz="4"/>
+              <w:bottom w:val="single" w:color="999999" w:sz="4"/>
+              <w:right w:val="single" w:color="999999" w:sz="4"/>
+            </w:tcBorders>
+            <w:tcMar>
+              <w:top w:type="dxa" w:w="80"/>
+              <w:left w:type="dxa" w:w="120"/>
+              <w:bottom w:type="dxa" w:w="80"/>
+              <w:right w:type="dxa" w:w="120"/>
+            </w:tcMar>
+          </w:tcPr>
+          <w:p>
+            <w:pPr>
+              <w:spacing w:after="0"/>
+            </w:pPr>
+            <w:r>
+              <w:rPr>
+                <w:rFonts w:ascii="Calibri" w:cs="Calibri" w:eastAsia="Calibri" w:hAnsi="Calibri"/>
+                <w:sz w:val="20"/>
+                <w:szCs w:val="20"/>
+              </w:rPr>
+              <w:t xml:space="preserve">2026-05-27 15:40</w:t>
+            </w:r>
+          </w:p>
+        </w:tc>
+        <w:tc>
+          <w:tcPr>
+            <w:tcW w:type="dxa" w:w="3000"/>
+            <w:tcBorders>
+              <w:top w:val="single" w:color="999999" w:sz="4"/>
+              <w:left w:val="single" w:color="999999" w:sz="4"/>
+              <w:bottom w:val="single" w:color="999999" w:sz="4"/>
+              <w:right w:val="single" w:color="999999" w:sz="4"/>
+            </w:tcBorders>
+            <w:tcMar>
+              <w:top w:type="dxa" w:w="80"/>
+              <w:left w:type="dxa" w:w="120"/>
+              <w:bottom w:type="dxa" w:w="80"/>
+              <w:right w:type="dxa" w:w="120"/>
+            </w:tcMar>
+          </w:tcPr>
+          <w:p>
+            <w:pPr>
+              <w:spacing w:after="0"/>
+            </w:pPr>
+            <w:r>
+              <w:rPr>
+                <w:rFonts w:ascii="Calibri" w:cs="Calibri" w:eastAsia="Calibri" w:hAnsi="Calibri"/>
+                <w:sz w:val="20"/>
+                <w:szCs w:val="20"/>
+              </w:rPr>
+              <w:t xml:space="preserve">FYP_Report_2026-05-27.docx</w:t>
+            </w:r>
+          </w:p>
+        </w:tc>
+        <w:tc>
+          <w:tcPr>
+            <w:tcW w:type="dxa" w:w="4160"/>
+            <w:tcBorders>
+              <w:top w:val="single" w:color="999999" w:sz="4"/>
+              <w:left w:val="single" w:color="999999" w:sz="4"/>
+              <w:bottom w:val="single" w:color="999999" w:sz="4"/>
+              <w:right w:val="single" w:color="999999" w:sz="4"/>
+            </w:tcBorders>
+            <w:tcMar>
+              <w:top w:type="dxa" w:w="80"/>
+              <w:left w:type="dxa" w:w="120"/>
+              <w:bottom w:type="dxa" w:w="80"/>
+              <w:right w:type="dxa" w:w="120"/>
+            </w:tcMar>
+          </w:tcPr>
+          <w:p>
+            <w:pPr>
+              <w:spacing w:after="0"/>
+            </w:pPr>
+            <w:r>
+              <w:rPr>
+                <w:rFonts w:ascii="Calibri" w:cs="Calibri" w:eastAsia="Calibri" w:hAnsi="Calibri"/>
+                <w:sz w:val="20"/>
+                <w:szCs w:val="20"/>
+              </w:rPr>
+              <w:t xml:space="preserve">Switched the Qwen model pairs from third-party techwithsergiu Qwen3.5-text derivatives to official Qwen3 checkpoints (Qwen/Qwen3-1.7B and Qwen/Qwen3-4B), updating the model table, setup text, limitations, and YAML appendix.</w:t>
+            </w:r>
+          </w:p>
+        </w:tc>
+      </w:tr>
+      <w:tr>
+        <w:tc>
+          <w:tcPr>
+            <w:tcW w:type="dxa" w:w="2200"/>
+            <w:tcBorders>
+              <w:top w:val="single" w:color="999999" w:sz="4"/>
+              <w:left w:val="single" w:color="999999" w:sz="4"/>
+              <w:bottom w:val="single" w:color="999999" w:sz="4"/>
+              <w:right w:val="single" w:color="999999" w:sz="4"/>
+            </w:tcBorders>
+            <w:tcMar>
+              <w:top w:type="dxa" w:w="80"/>
+              <w:left w:type="dxa" w:w="120"/>
+              <w:bottom w:type="dxa" w:w="80"/>
+              <w:right w:type="dxa" w:w="120"/>
+            </w:tcMar>
+          </w:tcPr>
+          <w:p>
+            <w:pPr>
+              <w:spacing w:after="0"/>
+            </w:pPr>
+            <w:r>
+              <w:rPr>
+                <w:rFonts w:ascii="Calibri" w:cs="Calibri" w:eastAsia="Calibri" w:hAnsi="Calibri"/>
+                <w:sz w:val="20"/>
+                <w:szCs w:val="20"/>
+              </w:rPr>
               <w:t xml:space="preserve">2026-05-27 00:41</w:t>
             </w:r>
           </w:p>
@@ -18192,7 +18420,7 @@
                 <w:sz w:val="20"/>
                 <w:szCs w:val="20"/>
               </w:rPr>
-              <w:t xml:space="preserve">FYP_Report_2026-05-27.docx (current)</w:t>
+              <w:t xml:space="preserve">FYP_Report_2026-05-27.docx</w:t>
             </w:r>
           </w:p>
         </w:tc>

</xml_diff>

<commit_message>
feat(results): populate Ch6 with Qwen 2B actuals; update docs for D9
Qwen 2B pair complete (jobs 60976+60977). Results:
- HarmBench ASR: 0.775 → 0.655 (Δ = −0.120, −15.5%)
- XSTest over-refusal: 0.032 → 0.016 (Δ = −0.016, −50.0%)
- MMLU accuracy: 0.620 → 0.533 (Δ = −0.087, −14.0%)
Preliminary pattern: capability-collapse-masquerading-as-safety.

Report: renamed Ch6, populated Table 6.1, added §6.6 (per-metric
analysis + MMLU subject breakdown), updated abstract + conclusion.

Also commits Codex's D9 docs (QOSMaxGRESPerUser one-GPU rule)
across AGENTS.md, CLAUDE.md, README.md, TC1_CLUSTER_RUNBOOK.md.

Co-Authored-By: Claude Sonnet 4.6 <noreply@anthropic.com>
</commit_message>
<xml_diff>
--- a/docs/FYP_Report_2026-05-27.docx
+++ b/docs/FYP_Report_2026-05-27.docx
@@ -256,7 +256,7 @@
           <w:sz w:val="22"/>
           <w:szCs w:val="22"/>
         </w:rPr>
-        <w:t xml:space="preserve">Each pair is scored on three complementary benchmarks: HarmBench (harmful compliance, measured as Attack Success Rate), XSTest (over-refusal on benign prompts), and a curated MMLU subset (general capability). A deterministic, regex-based scoring pipeline ensures reproducibility and removes judge-model variance. Pairwise deltas are combined through a rule-based interpretation layer that distinguishes genuine alignment shifts from capability collapse masquerading as safety. The benchmarking framework, three benchmark plugins, cluster job orchestration for the NTU TC1 GPU cluster, and a verification suite of 122 tests are complete; experimental runs are pending submission. This document records the full design, implementation, intended analysis, and limitations of the study.</w:t>
+        <w:t xml:space="preserve">Each pair is scored on three complementary benchmarks: HarmBench (harmful compliance, measured as Attack Success Rate), XSTest (over-refusal on benign prompts), and a curated MMLU subset (general capability). A deterministic, regex-based scoring pipeline ensures reproducibility and removes judge-model variance. Pairwise deltas are combined through a rule-based interpretation layer that distinguishes genuine alignment shifts from capability collapse masquerading as safety. The benchmarking framework, three benchmark plugins, cluster job orchestration for the NTU TC1 GPU cluster, and a verification suite of 122 tests are complete; experimental runs are in progress. The Qwen 2B pair (Qwen3-1.7B baseline versus NF4 4-bit) completed on 2026-05-27, with preliminary results showing decreased harmful compliance (HarmBench ASR: 0.775 → 0.655), decreased over-refusal (XSTest: 0.032 → 0.016), and decreased capability (MMLU accuracy: 0.620 → 0.533) under quantization — a pattern suggestive of capability collapse rather than genuine alignment improvement. This document records the full design, implementation, preliminary results, and limitations of the study.</w:t>
       </w:r>
     </w:p>
     <w:p>
@@ -439,7 +439,7 @@
           <w:sz w:val="22"/>
           <w:szCs w:val="22"/>
         </w:rPr>
-        <w:t xml:space="preserve">Table 6.1  Per-pair reporting schema.</w:t>
+        <w:t xml:space="preserve">Table 6.1  Per-pair results (Qwen 2B populated; Qwen 4B and Llama pending).</w:t>
       </w:r>
     </w:p>
     <w:p>
@@ -7065,7 +7065,7 @@
           <w:sz w:val="22"/>
           <w:szCs w:val="22"/>
         </w:rPr>
-        <w:t xml:space="preserve">All experiments are run on the NTU TC1 GPU cluster, a shared facility operated by the College of Computing and Data Science for undergraduate and postgraduate research workloads. Account access was approved in March 2026 under QoS "normal" with the parameters listed in Table 5.1. The compute partition consists of seven nodes (TC1N01–TC1N07), each equipped with three NVIDIA Tesla V100 PCIe 32 GB GPU cards, giving twenty-one GPUs across the partition; user-level concurrency is capped at two simultaneous jobs by the MaxJobsPU policy.</w:t>
+        <w:t xml:space="preserve">All experiments are run on the NTU TC1 GPU cluster, a shared facility operated by the College of Computing and Data Science for undergraduate and postgraduate research workloads. Account access was approved in March 2026 under QoS "normal" with the parameters listed in Table 5.1. The compute partition consists of seven nodes (TC1N01–TC1N07), each equipped with three NVIDIA Tesla V100 PCIe 32 GB GPU cards, giving twenty-one GPUs across the partition. Although MaxJobsPU permits two submitted jobs, the first production submission showed an effective one-running-GPU-job limit: the second GPU job waited with reason QOSMaxGRESPerUser until the first released its GPU.</w:t>
       </w:r>
     </w:p>
     <w:tbl>
@@ -7864,7 +7864,7 @@
                 <w:sz w:val="20"/>
                 <w:szCs w:val="20"/>
               </w:rPr>
-              <w:t xml:space="preserve">MaxJobsPU (concurrent jobs per user)</w:t>
+              <w:t xml:space="preserve">MaxJobsPU (submitted jobs per user)</w:t>
             </w:r>
           </w:p>
         </w:tc>
@@ -7895,6 +7895,68 @@
                 <w:szCs w:val="20"/>
               </w:rPr>
               <w:t xml:space="preserve">2</w:t>
+            </w:r>
+          </w:p>
+        </w:tc>
+      </w:tr>
+      <w:tr>
+        <w:tc>
+          <w:tcPr>
+            <w:tcW w:type="dxa" w:w="4200"/>
+            <w:tcBorders>
+              <w:top w:val="single" w:color="999999" w:sz="4"/>
+              <w:left w:val="single" w:color="999999" w:sz="4"/>
+              <w:bottom w:val="single" w:color="999999" w:sz="4"/>
+              <w:right w:val="single" w:color="999999" w:sz="4"/>
+            </w:tcBorders>
+            <w:tcMar>
+              <w:top w:type="dxa" w:w="80"/>
+              <w:left w:type="dxa" w:w="120"/>
+              <w:bottom w:type="dxa" w:w="80"/>
+              <w:right w:type="dxa" w:w="120"/>
+            </w:tcMar>
+          </w:tcPr>
+          <w:p>
+            <w:pPr>
+              <w:spacing w:after="0"/>
+            </w:pPr>
+            <w:r>
+              <w:rPr>
+                <w:rFonts w:ascii="Calibri" w:cs="Calibri" w:eastAsia="Calibri" w:hAnsi="Calibri"/>
+                <w:sz w:val="20"/>
+                <w:szCs w:val="20"/>
+              </w:rPr>
+              <w:t xml:space="preserve">Observed running-GPU concurrency</w:t>
+            </w:r>
+          </w:p>
+        </w:tc>
+        <w:tc>
+          <w:tcPr>
+            <w:tcW w:type="dxa" w:w="5160"/>
+            <w:tcBorders>
+              <w:top w:val="single" w:color="999999" w:sz="4"/>
+              <w:left w:val="single" w:color="999999" w:sz="4"/>
+              <w:bottom w:val="single" w:color="999999" w:sz="4"/>
+              <w:right w:val="single" w:color="999999" w:sz="4"/>
+            </w:tcBorders>
+            <w:tcMar>
+              <w:top w:type="dxa" w:w="80"/>
+              <w:left w:type="dxa" w:w="120"/>
+              <w:bottom w:type="dxa" w:w="80"/>
+              <w:right w:type="dxa" w:w="120"/>
+            </w:tcMar>
+          </w:tcPr>
+          <w:p>
+            <w:pPr>
+              <w:spacing w:after="0"/>
+            </w:pPr>
+            <w:r>
+              <w:rPr>
+                <w:rFonts w:ascii="Calibri" w:cs="Calibri" w:eastAsia="Calibri" w:hAnsi="Calibri"/>
+                <w:sz w:val="20"/>
+                <w:szCs w:val="20"/>
+              </w:rPr>
+              <w:t xml:space="preserve">1 running job; second waits with QOSMaxGRESPerUser</w:t>
             </w:r>
           </w:p>
         </w:tc>
@@ -9253,7 +9315,7 @@
           <w:sz w:val="22"/>
           <w:szCs w:val="22"/>
         </w:rPr>
-        <w:t xml:space="preserve">With MaxJobsPU=2 enforced by the cluster policy, the six jobs are processed in three sequential pairs in the worst case, yielding an expected end-to-end wall time of approximately one to two days assuming each job completes well within the six-hour budget. The six-hour walltime is intentionally generous; the completed smoke run confirms the CUDA/offline-cache path on a Tesla V100 32 GB, and the per-model matrix is expected to fit comfortably within the walltime. Memory and CPU utilisation are recorded after each job using the seff and MyJobHistory commands to inform any subsequent right-sizing of the sbatch resource requests.</w:t>
+        <w:t xml:space="preserve">The first production matrix submission was made on 2026-05-27 with the Qwen 2B-class pair: job 60976 (qwen_2b_base__matrix) began running while job 60977 (qwen_2b_4bit__matrix) remained pending with reason QOSMaxGRESPerUser. This establishes the practical scheduling rule for the remainder of the study: submit only the current model pair and expect one job to run while the paired job waits; submit the next pair only after the current pair has cleared. Under this effective one-GPU concurrency, the six model jobs run serially or near-serially, still within the study plan because each job has an independent six-hour walltime allocation. Memory and CPU utilisation are recorded after each job using the seff and MyJobHistory commands to inform any subsequent right-sizing of the sbatch resource requests.</w:t>
       </w:r>
     </w:p>
     <w:p>
@@ -9300,7 +9362,7 @@
           <w:sz w:val="32"/>
           <w:szCs w:val="32"/>
         </w:rPr>
-        <w:t xml:space="preserve">Chapter 6 — Intended Results and Analysis Plan</w:t>
+        <w:t xml:space="preserve">Chapter 6 — Results and Analysis</w:t>
       </w:r>
     </w:p>
     <w:p>
@@ -9314,7 +9376,7 @@
           <w:sz w:val="22"/>
           <w:szCs w:val="22"/>
         </w:rPr>
-        <w:t xml:space="preserve">Experimental runs are pending submission on TC1 at the time of this interim report. This chapter documents the analysis plan and the structure into which the results will be slotted once the runs complete.</w:t>
+        <w:t xml:space="preserve">Experimental runs are in progress on the NTU TC1 GPU cluster. The Qwen 2B-class pair (Qwen3-1.7B baseline versus NF4 4-bit) completed successfully on 2026-05-27 (SLURM jobs 60976 and 60977). The Qwen 4B and Llama 3.2 3B pairs are pending submission and will populate the remaining rows in Table 6.1 upon completion. Bootstrap 95% confidence intervals and formal interpretation labels will be computed by the analysis pipeline (compare_quant_pairs.py) after all six model jobs finish. Preliminary observations for the completed Qwen 2B pair are recorded in §6.6.</w:t>
       </w:r>
     </w:p>
     <w:p>
@@ -9330,7 +9392,7 @@
           <w:sz w:val="26"/>
           <w:szCs w:val="26"/>
         </w:rPr>
-        <w:t xml:space="preserve">6.1 Reporting Schema</w:t>
+        <w:t xml:space="preserve">6.1 Results Table</w:t>
       </w:r>
     </w:p>
     <w:p>
@@ -9344,7 +9406,7 @@
           <w:sz w:val="22"/>
           <w:szCs w:val="22"/>
         </w:rPr>
-        <w:t xml:space="preserve">For each of the three pairs, the final report will present a single results table summarising baseline and four-bit metric values, their absolute and relative deltas, and the interpretation label. The schema is shown in Table 6.1.</w:t>
+        <w:t xml:space="preserve">Table 6.1 records the per-pair benchmark results. Qwen 2B values are the actual outputs from TC1. Remaining rows will be filled in once the corresponding jobs complete.</w:t>
       </w:r>
     </w:p>
     <w:tbl>
@@ -9466,7 +9528,7 @@
                 <w:sz w:val="20"/>
                 <w:szCs w:val="20"/>
               </w:rPr>
-              <w:t xml:space="preserve">Baseline (95% CI)</w:t>
+              <w:t xml:space="preserve">Baseline</w:t>
             </w:r>
           </w:p>
         </w:tc>
@@ -9499,7 +9561,7 @@
                 <w:sz w:val="20"/>
                 <w:szCs w:val="20"/>
               </w:rPr>
-              <w:t xml:space="preserve">4-bit (95% CI)</w:t>
+              <w:t xml:space="preserve">4-bit</w:t>
             </w:r>
           </w:p>
         </w:tc>
@@ -9657,7 +9719,7 @@
                 <w:sz w:val="20"/>
                 <w:szCs w:val="20"/>
               </w:rPr>
-              <w:t xml:space="preserve">(pending)</w:t>
+              <w:t xml:space="preserve">0.775</w:t>
             </w:r>
           </w:p>
         </w:tc>
@@ -9687,7 +9749,7 @@
                 <w:sz w:val="20"/>
                 <w:szCs w:val="20"/>
               </w:rPr>
-              <w:t xml:space="preserve">(pending)</w:t>
+              <w:t xml:space="preserve">0.655</w:t>
             </w:r>
           </w:p>
         </w:tc>
@@ -9717,7 +9779,7 @@
                 <w:sz w:val="20"/>
                 <w:szCs w:val="20"/>
               </w:rPr>
-              <w:t xml:space="preserve">(pending)</w:t>
+              <w:t xml:space="preserve">−0.120</w:t>
             </w:r>
           </w:p>
         </w:tc>
@@ -9747,7 +9809,7 @@
                 <w:sz w:val="20"/>
                 <w:szCs w:val="20"/>
               </w:rPr>
-              <w:t xml:space="preserve">(pending)</w:t>
+              <w:t xml:space="preserve">−15.5%</w:t>
             </w:r>
           </w:p>
         </w:tc>
@@ -9839,7 +9901,7 @@
                 <w:sz w:val="20"/>
                 <w:szCs w:val="20"/>
               </w:rPr>
-              <w:t xml:space="preserve">(pending)</w:t>
+              <w:t xml:space="preserve">0.032</w:t>
             </w:r>
           </w:p>
         </w:tc>
@@ -9869,7 +9931,7 @@
                 <w:sz w:val="20"/>
                 <w:szCs w:val="20"/>
               </w:rPr>
-              <w:t xml:space="preserve">(pending)</w:t>
+              <w:t xml:space="preserve">0.016</w:t>
             </w:r>
           </w:p>
         </w:tc>
@@ -9899,7 +9961,7 @@
                 <w:sz w:val="20"/>
                 <w:szCs w:val="20"/>
               </w:rPr>
-              <w:t xml:space="preserve">(pending)</w:t>
+              <w:t xml:space="preserve">−0.016</w:t>
             </w:r>
           </w:p>
         </w:tc>
@@ -9929,7 +9991,7 @@
                 <w:sz w:val="20"/>
                 <w:szCs w:val="20"/>
               </w:rPr>
-              <w:t xml:space="preserve">(pending)</w:t>
+              <w:t xml:space="preserve">−50.0%</w:t>
             </w:r>
           </w:p>
         </w:tc>
@@ -10021,7 +10083,7 @@
                 <w:sz w:val="20"/>
                 <w:szCs w:val="20"/>
               </w:rPr>
-              <w:t xml:space="preserve">(pending)</w:t>
+              <w:t xml:space="preserve">0.620</w:t>
             </w:r>
           </w:p>
         </w:tc>
@@ -10051,7 +10113,7 @@
                 <w:sz w:val="20"/>
                 <w:szCs w:val="20"/>
               </w:rPr>
-              <w:t xml:space="preserve">(pending)</w:t>
+              <w:t xml:space="preserve">0.533</w:t>
             </w:r>
           </w:p>
         </w:tc>
@@ -10081,7 +10143,7 @@
                 <w:sz w:val="20"/>
                 <w:szCs w:val="20"/>
               </w:rPr>
-              <w:t xml:space="preserve">(pending)</w:t>
+              <w:t xml:space="preserve">−0.087</w:t>
             </w:r>
           </w:p>
         </w:tc>
@@ -10111,7 +10173,7 @@
                 <w:sz w:val="20"/>
                 <w:szCs w:val="20"/>
               </w:rPr>
-              <w:t xml:space="preserve">(pending)</w:t>
+              <w:t xml:space="preserve">−14.0%</w:t>
             </w:r>
           </w:p>
         </w:tc>
@@ -11219,7 +11281,7 @@
           <w:sz w:val="18"/>
           <w:szCs w:val="18"/>
         </w:rPr>
-        <w:t xml:space="preserve">Table 6.1  Per-pair reporting schema. The (pending) cells will be populated by the TC1 runs.</w:t>
+        <w:t xml:space="preserve">Table 6.1  Per-pair results. Qwen 2B values are from TC1 jobs 60976 (qwen_2b_base) and 60977 (qwen_2b_4bit), seed 42, 2026-05-27. Bootstrap 95% CIs will be added by the analysis pipeline after all pairs complete.</w:t>
       </w:r>
     </w:p>
     <w:p>
@@ -11249,7 +11311,7 @@
           <w:sz w:val="22"/>
           <w:szCs w:val="22"/>
         </w:rPr>
-        <w:t xml:space="preserve">RQ4 asks whether the magnitude of the quantization effect differs between two-billion and four-billion parameter Qwen models. The within-family scale analysis will compare the three deltas (ΔASR, Δover-refusal, ΔMMLU) computed for the qwen_2b pair against those computed for the qwen_4b pair. Two specific patterns are expected to be observable. If the smaller model is more sensitive to compression, the absolute magnitude of its deltas should be systematically larger across the three axes. If the deltas are comparable, the conclusion will be that within this regime (two to four billion parameters), quantization effects are scale-invariant.</w:t>
+        <w:t xml:space="preserve">RQ4 asks whether the magnitude of the quantization effect differs between two-billion and four-billion parameter Qwen models. The within-family scale analysis will compare the three deltas (ΔASR, Δover-refusal, ΔMMLU) computed for the qwen_2b pair against those computed for the qwen_4b pair. Two specific patterns are expected to be observable. If the smaller model is more sensitive to compression, the absolute magnitude of its deltas should be systematically larger across the three axes. If the deltas are comparable, the conclusion will be that within this regime (two to four billion parameters), quantization effects are scale-invariant. Qwen 2B deltas (Table 6.1) will serve as the reference when the Qwen 4B results arrive.</w:t>
       </w:r>
     </w:p>
     <w:p>
@@ -11425,7 +11487,93 @@
           <w:sz w:val="22"/>
           <w:szCs w:val="22"/>
         </w:rPr>
-        <w:t xml:space="preserve">Three statistical limitations should be borne in mind when interpreting the eventual results. First, with 400 samples per safety benchmark, the bootstrap 95% confidence interval on a binomial-proportion metric such as ASR is approximately ±5 percentage points; small deltas may not be statistically distinguishable from zero. Second, decoding is deterministic at temperature 0.0, so the only source of variance reflected in the confidence intervals is prompt sampling — there is no within-condition stochastic variance. Third, the MMLU subset comprises 300 questions distributed across six subjects; subject-level accuracy estimates are correspondingly noisy and are not reported as primary statistics. A planned future-work item proposes re-running a subset of pairs at temperature 0.7 with multiple seeds to provide an independent estimate of stochastic variance.</w:t>
+        <w:t xml:space="preserve">Three statistical limitations should be borne in mind when interpreting the results. First, with 200 HarmBench prompts and 250 benign XSTest prompts, the bootstrap 95% confidence interval on a binomial-proportion metric such as ASR is approximately ±5 percentage points; small deltas may not be statistically distinguishable from zero. Second, decoding is deterministic at temperature 0.0, so the only source of variance reflected in the confidence intervals is prompt sampling — there is no within-condition stochastic variance. Third, the MMLU subset comprises 300 questions distributed across six subjects; subject-level accuracy estimates are correspondingly noisy and are not reported as primary statistics.</w:t>
+      </w:r>
+    </w:p>
+    <w:p>
+      <w:pPr>
+        <w:pStyle w:val="Heading2"/>
+        <w:spacing w:after="140" w:before="280"/>
+      </w:pPr>
+      <w:r>
+        <w:rPr>
+          <w:rFonts w:ascii="Calibri" w:cs="Calibri" w:eastAsia="Calibri" w:hAnsi="Calibri"/>
+          <w:b/>
+          <w:bCs/>
+          <w:sz w:val="26"/>
+          <w:szCs w:val="26"/>
+        </w:rPr>
+        <w:t xml:space="preserve">6.6 Preliminary Observations: Qwen 2B Pair</w:t>
+      </w:r>
+    </w:p>
+    <w:p>
+      <w:pPr>
+        <w:spacing w:after="160" w:line="300"/>
+        <w:jc w:val="both"/>
+      </w:pPr>
+      <w:r>
+        <w:rPr>
+          <w:rFonts w:ascii="Calibri" w:cs="Calibri" w:eastAsia="Calibri" w:hAnsi="Calibri"/>
+          <w:sz w:val="22"/>
+          <w:szCs w:val="22"/>
+        </w:rPr>
+        <w:t xml:space="preserve">The Qwen 2B pair produced the following first-pass observations. Formal interpretation labels and bootstrap confidence intervals will be computed by the analysis pipeline after all pairs complete.</w:t>
+      </w:r>
+    </w:p>
+    <w:p>
+      <w:pPr>
+        <w:spacing w:after="160" w:line="300"/>
+        <w:jc w:val="both"/>
+      </w:pPr>
+      <w:r>
+        <w:rPr>
+          <w:rFonts w:ascii="Calibri" w:cs="Calibri" w:eastAsia="Calibri" w:hAnsi="Calibri"/>
+          <w:sz w:val="22"/>
+          <w:szCs w:val="22"/>
+        </w:rPr>
+        <w:t xml:space="preserve">HarmBench ASR dropped by 12.0 percentage points under quantization (0.775 → 0.655, −15.5% relative). At face value this appears as a safety improvement: the 4-bit model complied with fewer harmful prompts. However, MMLU accuracy also fell by 8.7 percentage points (0.620 → 0.533, −14.0% relative), a capability decline spanning five of the six evaluated subjects. The simultaneous drop in both harmful compliance and general accuracy is consistent with the capability-collapse-masquerading-as-safety hypothesis: the model became less capable overall, reducing its ability to produce coherent harmful outputs alongside its ability to answer factual questions correctly.</w:t>
+      </w:r>
+    </w:p>
+    <w:p>
+      <w:pPr>
+        <w:spacing w:after="160" w:line="300"/>
+        <w:jc w:val="both"/>
+      </w:pPr>
+      <w:r>
+        <w:rPr>
+          <w:rFonts w:ascii="Calibri" w:cs="Calibri" w:eastAsia="Calibri" w:hAnsi="Calibri"/>
+          <w:sz w:val="22"/>
+          <w:szCs w:val="22"/>
+        </w:rPr>
+        <w:t xml:space="preserve">The XSTest over-refusal rate declined by 1.6 percentage points (0.032 → 0.016, −50.0% relative). This is an unusual accompaniment to a capability-collapse pattern. If reduced ASR were driven solely by increased over-refusal — the model refusing all prompts indiscriminately — XSTest over-refusal would be expected to rise. Its decline instead suggests the 4-bit model produces more compliant responses on benign prompts, consistent with a reduction in pattern-triggered refusal behaviour rather than an increase in genuine safety alignment. Taken together, the three deltas point toward broad capability degradation that manifests differently across benchmark types: the model complies less with complex harmful instructions, also refuses fewer benign prompts, and answers fewer factual questions correctly.</w:t>
+      </w:r>
+    </w:p>
+    <w:p>
+      <w:pPr>
+        <w:spacing w:after="160" w:line="300"/>
+        <w:jc w:val="both"/>
+      </w:pPr>
+      <w:r>
+        <w:rPr>
+          <w:rFonts w:ascii="Calibri" w:cs="Calibri" w:eastAsia="Calibri" w:hAnsi="Calibri"/>
+          <w:sz w:val="22"/>
+          <w:szCs w:val="22"/>
+        </w:rPr>
+        <w:t xml:space="preserve">Subject-level MMLU breakdown supports this reading. Accuracy declined in five of six subjects: high school macroeconomics (0.596 → 0.479, −11.7 pp), business ethics (0.680 → 0.560, −12.0 pp), clinical knowledge (0.729 → 0.563, −16.7 pp), college biology (0.576 → 0.515, −6.1 pp), and high school world history (0.643 → 0.571, −7.1 pp). A small gain in human ageing (0.523 → 0.568, +4.6 pp) is within the noise range expected for a 44-sample subject subset. The overall accuracy decline of 8.7 percentage points substantially exceeds the estimated ±5 pp confidence interval width and is unlikely to be attributable to sampling noise alone.</w:t>
+      </w:r>
+    </w:p>
+    <w:p>
+      <w:pPr>
+        <w:spacing w:after="160" w:line="300"/>
+        <w:jc w:val="both"/>
+      </w:pPr>
+      <w:r>
+        <w:rPr>
+          <w:rFonts w:ascii="Calibri" w:cs="Calibri" w:eastAsia="Calibri" w:hAnsi="Calibri"/>
+          <w:sz w:val="22"/>
+          <w:szCs w:val="22"/>
+        </w:rPr>
+        <w:t xml:space="preserve">Formal interpretation labels and confidence intervals across all three pairs will be reported upon completion of the full matrix and execution of the analysis pipeline.</w:t>
       </w:r>
     </w:p>
     <w:p>
@@ -11983,7 +12131,7 @@
           <w:sz w:val="22"/>
           <w:szCs w:val="22"/>
         </w:rPr>
-        <w:t xml:space="preserve">The framework is complete, validated, and ready for full cluster execution. Three pairs (Qwen 2B-class, Qwen 4B, and Llama 3.2 3B) are configured, six sbatch files have been generated, Hugging Face gated access has been verified, all required datasets and model weights have been pre-cached on TC1, and the qwen_2b_base/HarmBench smoke sbatch has completed successfully on CUDA. The next operational step is submitting the full six-job matrix. The expected output is a set of pairwise deltas and interpretation labels that directly answer the five research questions, and a documented empirical baseline for future quantization-safety work in the compact-model regime.</w:t>
+        <w:t xml:space="preserve">The framework is complete and cluster execution is in progress. Six sbatch files have been generated, Hugging Face gated access has been verified, all required datasets and model weights have been pre-cached on TC1, and the full matrix submission has begun. The Qwen 2B pair (Qwen3-1.7B baseline versus NF4 4-bit) has completed, providing the first empirical data point: MMLU accuracy declined by 8.7 percentage points under quantization, while HarmBench ASR fell by 12.0 points and XSTest over-refusal halved. This preliminary pattern is consistent with capability collapse rather than a genuine alignment shift, and directly illustrates the disambiguation challenge that motivates the study. The Qwen 4B and Llama 3.2 3B pairs are pending; once all six jobs complete, the analysis pipeline will assign formal interpretation labels and compute bootstrap confidence intervals, producing a complete set of pairwise deltas that directly answer the five research questions and establish a documented empirical baseline for future quantization-safety work in the compact-model regime.</w:t>
       </w:r>
     </w:p>
     <w:p>
@@ -18206,6 +18354,190 @@
                 <w:sz w:val="20"/>
                 <w:szCs w:val="20"/>
               </w:rPr>
+              <w:t xml:space="preserve">2026-05-27 18:30</w:t>
+            </w:r>
+          </w:p>
+        </w:tc>
+        <w:tc>
+          <w:tcPr>
+            <w:tcW w:type="dxa" w:w="3000"/>
+            <w:tcBorders>
+              <w:top w:val="single" w:color="999999" w:sz="4"/>
+              <w:left w:val="single" w:color="999999" w:sz="4"/>
+              <w:bottom w:val="single" w:color="999999" w:sz="4"/>
+              <w:right w:val="single" w:color="999999" w:sz="4"/>
+            </w:tcBorders>
+            <w:tcMar>
+              <w:top w:type="dxa" w:w="80"/>
+              <w:left w:type="dxa" w:w="120"/>
+              <w:bottom w:type="dxa" w:w="80"/>
+              <w:right w:type="dxa" w:w="120"/>
+            </w:tcMar>
+          </w:tcPr>
+          <w:p>
+            <w:pPr>
+              <w:spacing w:after="0"/>
+            </w:pPr>
+            <w:r>
+              <w:rPr>
+                <w:rFonts w:ascii="Calibri" w:cs="Calibri" w:eastAsia="Calibri" w:hAnsi="Calibri"/>
+                <w:sz w:val="20"/>
+                <w:szCs w:val="20"/>
+              </w:rPr>
+              <w:t xml:space="preserve">FYP_Report_2026-05-27.docx (current)</w:t>
+            </w:r>
+          </w:p>
+        </w:tc>
+        <w:tc>
+          <w:tcPr>
+            <w:tcW w:type="dxa" w:w="4160"/>
+            <w:tcBorders>
+              <w:top w:val="single" w:color="999999" w:sz="4"/>
+              <w:left w:val="single" w:color="999999" w:sz="4"/>
+              <w:bottom w:val="single" w:color="999999" w:sz="4"/>
+              <w:right w:val="single" w:color="999999" w:sz="4"/>
+            </w:tcBorders>
+            <w:tcMar>
+              <w:top w:type="dxa" w:w="80"/>
+              <w:left w:type="dxa" w:w="120"/>
+              <w:bottom w:type="dxa" w:w="80"/>
+              <w:right w:type="dxa" w:w="120"/>
+            </w:tcMar>
+          </w:tcPr>
+          <w:p>
+            <w:pPr>
+              <w:spacing w:after="0"/>
+            </w:pPr>
+            <w:r>
+              <w:rPr>
+                <w:rFonts w:ascii="Calibri" w:cs="Calibri" w:eastAsia="Calibri" w:hAnsi="Calibri"/>
+                <w:sz w:val="20"/>
+                <w:szCs w:val="20"/>
+              </w:rPr>
+              <w:t xml:space="preserve">Populated Chapter 6 with actual Qwen 2B results (jobs 60976 and 60977). Renamed chapter from 'Intended Results and Analysis Plan' to 'Results and Analysis'. Added §6.6 Preliminary Observations with per-metric analysis, capability-collapse interpretation, and MMLU subject breakdown. Updated Table 6.1 with Qwen 2B point estimates. Updated Abstract and Chapter 10 conclusion to reflect work-in-progress status and preliminary finding.</w:t>
+            </w:r>
+          </w:p>
+        </w:tc>
+      </w:tr>
+      <w:tr>
+        <w:tc>
+          <w:tcPr>
+            <w:tcW w:type="dxa" w:w="2200"/>
+            <w:tcBorders>
+              <w:top w:val="single" w:color="999999" w:sz="4"/>
+              <w:left w:val="single" w:color="999999" w:sz="4"/>
+              <w:bottom w:val="single" w:color="999999" w:sz="4"/>
+              <w:right w:val="single" w:color="999999" w:sz="4"/>
+            </w:tcBorders>
+            <w:tcMar>
+              <w:top w:type="dxa" w:w="80"/>
+              <w:left w:type="dxa" w:w="120"/>
+              <w:bottom w:type="dxa" w:w="80"/>
+              <w:right w:type="dxa" w:w="120"/>
+            </w:tcMar>
+          </w:tcPr>
+          <w:p>
+            <w:pPr>
+              <w:spacing w:after="0"/>
+            </w:pPr>
+            <w:r>
+              <w:rPr>
+                <w:rFonts w:ascii="Calibri" w:cs="Calibri" w:eastAsia="Calibri" w:hAnsi="Calibri"/>
+                <w:sz w:val="20"/>
+                <w:szCs w:val="20"/>
+              </w:rPr>
+              <w:t xml:space="preserve">2026-05-27 17:31</w:t>
+            </w:r>
+          </w:p>
+        </w:tc>
+        <w:tc>
+          <w:tcPr>
+            <w:tcW w:type="dxa" w:w="3000"/>
+            <w:tcBorders>
+              <w:top w:val="single" w:color="999999" w:sz="4"/>
+              <w:left w:val="single" w:color="999999" w:sz="4"/>
+              <w:bottom w:val="single" w:color="999999" w:sz="4"/>
+              <w:right w:val="single" w:color="999999" w:sz="4"/>
+            </w:tcBorders>
+            <w:tcMar>
+              <w:top w:type="dxa" w:w="80"/>
+              <w:left w:type="dxa" w:w="120"/>
+              <w:bottom w:type="dxa" w:w="80"/>
+              <w:right w:type="dxa" w:w="120"/>
+            </w:tcMar>
+          </w:tcPr>
+          <w:p>
+            <w:pPr>
+              <w:spacing w:after="0"/>
+            </w:pPr>
+            <w:r>
+              <w:rPr>
+                <w:rFonts w:ascii="Calibri" w:cs="Calibri" w:eastAsia="Calibri" w:hAnsi="Calibri"/>
+                <w:sz w:val="20"/>
+                <w:szCs w:val="20"/>
+              </w:rPr>
+              <w:t xml:space="preserve">FYP_Report_2026-05-27.docx</w:t>
+            </w:r>
+          </w:p>
+        </w:tc>
+        <w:tc>
+          <w:tcPr>
+            <w:tcW w:type="dxa" w:w="4160"/>
+            <w:tcBorders>
+              <w:top w:val="single" w:color="999999" w:sz="4"/>
+              <w:left w:val="single" w:color="999999" w:sz="4"/>
+              <w:bottom w:val="single" w:color="999999" w:sz="4"/>
+              <w:right w:val="single" w:color="999999" w:sz="4"/>
+            </w:tcBorders>
+            <w:tcMar>
+              <w:top w:type="dxa" w:w="80"/>
+              <w:left w:type="dxa" w:w="120"/>
+              <w:bottom w:type="dxa" w:w="80"/>
+              <w:right w:type="dxa" w:w="120"/>
+            </w:tcMar>
+          </w:tcPr>
+          <w:p>
+            <w:pPr>
+              <w:spacing w:after="0"/>
+            </w:pPr>
+            <w:r>
+              <w:rPr>
+                <w:rFonts w:ascii="Calibri" w:cs="Calibri" w:eastAsia="Calibri" w:hAnsi="Calibri"/>
+                <w:sz w:val="20"/>
+                <w:szCs w:val="20"/>
+              </w:rPr>
+              <w:t xml:space="preserve">Recorded the first production matrix submission: job 60976 started and job 60977 waited with QOSMaxGRESPerUser. Updated Chapter 5 to describe the effective one-running-GPU-job scheduling rule.</w:t>
+            </w:r>
+          </w:p>
+        </w:tc>
+      </w:tr>
+      <w:tr>
+        <w:tc>
+          <w:tcPr>
+            <w:tcW w:type="dxa" w:w="2200"/>
+            <w:tcBorders>
+              <w:top w:val="single" w:color="999999" w:sz="4"/>
+              <w:left w:val="single" w:color="999999" w:sz="4"/>
+              <w:bottom w:val="single" w:color="999999" w:sz="4"/>
+              <w:right w:val="single" w:color="999999" w:sz="4"/>
+            </w:tcBorders>
+            <w:tcMar>
+              <w:top w:type="dxa" w:w="80"/>
+              <w:left w:type="dxa" w:w="120"/>
+              <w:bottom w:type="dxa" w:w="80"/>
+              <w:right w:type="dxa" w:w="120"/>
+            </w:tcMar>
+          </w:tcPr>
+          <w:p>
+            <w:pPr>
+              <w:spacing w:after="0"/>
+            </w:pPr>
+            <w:r>
+              <w:rPr>
+                <w:rFonts w:ascii="Calibri" w:cs="Calibri" w:eastAsia="Calibri" w:hAnsi="Calibri"/>
+                <w:sz w:val="20"/>
+                <w:szCs w:val="20"/>
+              </w:rPr>
               <w:t xml:space="preserve">2026-05-27 15:43</w:t>
             </w:r>
           </w:p>
@@ -18236,7 +18568,7 @@
                 <w:sz w:val="20"/>
                 <w:szCs w:val="20"/>
               </w:rPr>
-              <w:t xml:space="preserve">FYP_Report_2026-05-27.docx (current)</w:t>
+              <w:t xml:space="preserve">FYP_Report_2026-05-27.docx</w:t>
             </w:r>
           </w:p>
         </w:tc>

</xml_diff>

<commit_message>
docs(results): add Qwen 4B base results; expand §6.2 scale analysis; add §6.7
- Table 6.1: populate Qwen 4B baseline column (ASR=0.860, OR=0.016, MMLU=0.747)
- §6.2: add baseline scale comparison paragraph (capability-harmfulness coupling)
- §6.7: new section — Preliminary Scale Observations (4B baseline vs 2B baseline)
- Appendix G: add revision row for 19:00 update
- PROJECT_LOG: status snapshot updated to 19:00; 3 of 6 jobs done

Co-Authored-By: Claude Sonnet 4.6 <noreply@anthropic.com>
</commit_message>
<xml_diff>
--- a/docs/FYP_Report_2026-05-27.docx
+++ b/docs/FYP_Report_2026-05-27.docx
@@ -10265,7 +10265,7 @@
                 <w:sz w:val="20"/>
                 <w:szCs w:val="20"/>
               </w:rPr>
-              <w:t xml:space="preserve">(pending)</w:t>
+              <w:t xml:space="preserve">0.860</w:t>
             </w:r>
           </w:p>
         </w:tc>
@@ -10447,7 +10447,7 @@
                 <w:sz w:val="20"/>
                 <w:szCs w:val="20"/>
               </w:rPr>
-              <w:t xml:space="preserve">(pending)</w:t>
+              <w:t xml:space="preserve">0.016</w:t>
             </w:r>
           </w:p>
         </w:tc>
@@ -10629,7 +10629,7 @@
                 <w:sz w:val="20"/>
                 <w:szCs w:val="20"/>
               </w:rPr>
-              <w:t xml:space="preserve">(pending)</w:t>
+              <w:t xml:space="preserve">0.747</w:t>
             </w:r>
           </w:p>
         </w:tc>
@@ -11281,7 +11281,7 @@
           <w:sz w:val="18"/>
           <w:szCs w:val="18"/>
         </w:rPr>
-        <w:t xml:space="preserve">Table 6.1  Per-pair results. Qwen 2B values are from TC1 jobs 60976 (qwen_2b_base) and 60977 (qwen_2b_4bit), seed 42, 2026-05-27. Bootstrap 95% CIs will be added by the analysis pipeline after all pairs complete.</w:t>
+        <w:t xml:space="preserve">Table 6.1  Per-pair results. Qwen 2B complete (jobs 60976+60977). Qwen 4B baseline complete (job 60978); 4-bit pending (job 60979 running at time of writing). Llama pair pending. Deltas and bootstrap 95% CIs will be added once each pair is complete.</w:t>
       </w:r>
     </w:p>
     <w:p>
@@ -11311,7 +11311,21 @@
           <w:sz w:val="22"/>
           <w:szCs w:val="22"/>
         </w:rPr>
-        <w:t xml:space="preserve">RQ4 asks whether the magnitude of the quantization effect differs between two-billion and four-billion parameter Qwen models. The within-family scale analysis will compare the three deltas (ΔASR, Δover-refusal, ΔMMLU) computed for the qwen_2b pair against those computed for the qwen_4b pair. Two specific patterns are expected to be observable. If the smaller model is more sensitive to compression, the absolute magnitude of its deltas should be systematically larger across the three axes. If the deltas are comparable, the conclusion will be that within this regime (two to four billion parameters), quantization effects are scale-invariant. Qwen 2B deltas (Table 6.1) will serve as the reference when the Qwen 4B results arrive.</w:t>
+        <w:t xml:space="preserve">RQ4 asks whether the magnitude of the quantization effect differs between two-billion and four-billion parameter Qwen models. The within-family scale analysis will compare the three deltas (ΔASR, Δover-refusal, ΔMMLU) computed for the qwen_2b pair against those computed for the qwen_4b pair.</w:t>
+      </w:r>
+    </w:p>
+    <w:p>
+      <w:pPr>
+        <w:spacing w:after="160" w:line="300"/>
+        <w:jc w:val="both"/>
+      </w:pPr>
+      <w:r>
+        <w:rPr>
+          <w:rFonts w:ascii="Calibri" w:cs="Calibri" w:eastAsia="Calibri" w:hAnsi="Calibri"/>
+          <w:sz w:val="22"/>
+          <w:szCs w:val="22"/>
+        </w:rPr>
+        <w:t xml:space="preserve">The full-precision baseline comparison already reveals a capability-harmfulness coupling at scale. The Qwen3-4B baseline scores 0.860 on HarmBench ASR versus 0.775 for Qwen3-1.7B (+8.5 pp), confirming that the larger model is more instruction-following and thus more harmful-compliant. MMLU accuracy rises from 0.620 to 0.747 (+12.7 pp), confirming that the capability gain is genuine. XSTest over-refusal halves (0.032 → 0.016), indicating the 4B model is better calibrated on benign prompts. This larger-model-is-more-capable-and-more-dangerous pattern is consistent with the broader literature and motivates the matched-pair design: quantization effects need to be interpreted against a baseline that already varies significantly by scale. The Qwen 4B 4-bit results (pending) will determine whether quantization degrades the larger model by a similar or smaller absolute margin, informing whether compact-model scale provides resilience against compression.</w:t>
       </w:r>
     </w:p>
     <w:p>
@@ -11574,6 +11588,50 @@
           <w:szCs w:val="22"/>
         </w:rPr>
         <w:t xml:space="preserve">Formal interpretation labels and confidence intervals across all three pairs will be reported upon completion of the full matrix and execution of the analysis pipeline.</w:t>
+      </w:r>
+    </w:p>
+    <w:p>
+      <w:pPr>
+        <w:pStyle w:val="Heading2"/>
+        <w:spacing w:after="140" w:before="280"/>
+      </w:pPr>
+      <w:r>
+        <w:rPr>
+          <w:rFonts w:ascii="Calibri" w:cs="Calibri" w:eastAsia="Calibri" w:hAnsi="Calibri"/>
+          <w:b/>
+          <w:bCs/>
+          <w:sz w:val="26"/>
+          <w:szCs w:val="26"/>
+        </w:rPr>
+        <w:t xml:space="preserve">6.7 Preliminary Scale Observations: Baseline Comparison</w:t>
+      </w:r>
+    </w:p>
+    <w:p>
+      <w:pPr>
+        <w:spacing w:after="160" w:line="300"/>
+        <w:jc w:val="both"/>
+      </w:pPr>
+      <w:r>
+        <w:rPr>
+          <w:rFonts w:ascii="Calibri" w:cs="Calibri" w:eastAsia="Calibri" w:hAnsi="Calibri"/>
+          <w:sz w:val="22"/>
+          <w:szCs w:val="22"/>
+        </w:rPr>
+        <w:t xml:space="preserve">The Qwen3-1.7B and Qwen3-4B full-precision baselines reveal a capability-harmfulness coupling that is itself an empirical finding independent of quantization. At full precision, scaling from 1.7B to 4B parameters produces: HarmBench ASR 0.775 → 0.860 (+8.5 pp), MMLU accuracy 0.620 → 0.747 (+12.7 pp), and XSTest over-refusal 0.032 → 0.016 (−1.6 pp). The larger model is more capable, more compliant on harmful prompts, and less prone to over-refusing benign prompts simultaneously. This pattern is consistent with the view that instruction-following capability and harmful compliance are coupled: a model that is better at following instructions in general is also better at following harmful ones.</w:t>
+      </w:r>
+    </w:p>
+    <w:p>
+      <w:pPr>
+        <w:spacing w:after="160" w:line="300"/>
+        <w:jc w:val="both"/>
+      </w:pPr>
+      <w:r>
+        <w:rPr>
+          <w:rFonts w:ascii="Calibri" w:cs="Calibri" w:eastAsia="Calibri" w:hAnsi="Calibri"/>
+          <w:sz w:val="22"/>
+          <w:szCs w:val="22"/>
+        </w:rPr>
+        <w:t xml:space="preserve">Notably, the 4B baseline's XSTest over-refusal rate (0.016) equals the 2B 4-bit model's over-refusal rate exactly. This illustrates how capability and quantization can interact in non-obvious ways: quantizing the smaller model produces refusal calibration that superficially resembles the full-precision larger model, even though the underlying mechanisms differ. Whether the 4B 4-bit model departs from this pattern — and whether it preserves the 4B baseline's higher ASR or regresses toward the 2B pair's range — is the key empirical question for the RQ4 analysis.</w:t>
       </w:r>
     </w:p>
     <w:p>
@@ -18354,6 +18412,98 @@
                 <w:sz w:val="20"/>
                 <w:szCs w:val="20"/>
               </w:rPr>
+              <w:t xml:space="preserve">2026-05-27 19:00</w:t>
+            </w:r>
+          </w:p>
+        </w:tc>
+        <w:tc>
+          <w:tcPr>
+            <w:tcW w:type="dxa" w:w="3000"/>
+            <w:tcBorders>
+              <w:top w:val="single" w:color="999999" w:sz="4"/>
+              <w:left w:val="single" w:color="999999" w:sz="4"/>
+              <w:bottom w:val="single" w:color="999999" w:sz="4"/>
+              <w:right w:val="single" w:color="999999" w:sz="4"/>
+            </w:tcBorders>
+            <w:tcMar>
+              <w:top w:type="dxa" w:w="80"/>
+              <w:left w:type="dxa" w:w="120"/>
+              <w:bottom w:type="dxa" w:w="80"/>
+              <w:right w:type="dxa" w:w="120"/>
+            </w:tcMar>
+          </w:tcPr>
+          <w:p>
+            <w:pPr>
+              <w:spacing w:after="0"/>
+            </w:pPr>
+            <w:r>
+              <w:rPr>
+                <w:rFonts w:ascii="Calibri" w:cs="Calibri" w:eastAsia="Calibri" w:hAnsi="Calibri"/>
+                <w:sz w:val="20"/>
+                <w:szCs w:val="20"/>
+              </w:rPr>
+              <w:t xml:space="preserve">FYP_Report_2026-05-27.docx (current)</w:t>
+            </w:r>
+          </w:p>
+        </w:tc>
+        <w:tc>
+          <w:tcPr>
+            <w:tcW w:type="dxa" w:w="4160"/>
+            <w:tcBorders>
+              <w:top w:val="single" w:color="999999" w:sz="4"/>
+              <w:left w:val="single" w:color="999999" w:sz="4"/>
+              <w:bottom w:val="single" w:color="999999" w:sz="4"/>
+              <w:right w:val="single" w:color="999999" w:sz="4"/>
+            </w:tcBorders>
+            <w:tcMar>
+              <w:top w:type="dxa" w:w="80"/>
+              <w:left w:type="dxa" w:w="120"/>
+              <w:bottom w:type="dxa" w:w="80"/>
+              <w:right w:type="dxa" w:w="120"/>
+            </w:tcMar>
+          </w:tcPr>
+          <w:p>
+            <w:pPr>
+              <w:spacing w:after="0"/>
+            </w:pPr>
+            <w:r>
+              <w:rPr>
+                <w:rFonts w:ascii="Calibri" w:cs="Calibri" w:eastAsia="Calibri" w:hAnsi="Calibri"/>
+                <w:sz w:val="20"/>
+                <w:szCs w:val="20"/>
+              </w:rPr>
+              <w:t xml:space="preserve">Added Qwen 4B baseline results to Table 6.1 (job 60978: ASR=0.860, OR=0.016, MMLU=0.747). Expanded §6.2 with preliminary scale-comparison analysis (capability-harmfulness coupling at baseline). Added §6.7 Preliminary Scale Observations documenting the 1.7B-vs-4B full-precision comparison and the over-refusal coincidence between the 4B baseline and 2B 4-bit.</w:t>
+            </w:r>
+          </w:p>
+        </w:tc>
+      </w:tr>
+      <w:tr>
+        <w:tc>
+          <w:tcPr>
+            <w:tcW w:type="dxa" w:w="2200"/>
+            <w:tcBorders>
+              <w:top w:val="single" w:color="999999" w:sz="4"/>
+              <w:left w:val="single" w:color="999999" w:sz="4"/>
+              <w:bottom w:val="single" w:color="999999" w:sz="4"/>
+              <w:right w:val="single" w:color="999999" w:sz="4"/>
+            </w:tcBorders>
+            <w:tcMar>
+              <w:top w:type="dxa" w:w="80"/>
+              <w:left w:type="dxa" w:w="120"/>
+              <w:bottom w:type="dxa" w:w="80"/>
+              <w:right w:type="dxa" w:w="120"/>
+            </w:tcMar>
+          </w:tcPr>
+          <w:p>
+            <w:pPr>
+              <w:spacing w:after="0"/>
+            </w:pPr>
+            <w:r>
+              <w:rPr>
+                <w:rFonts w:ascii="Calibri" w:cs="Calibri" w:eastAsia="Calibri" w:hAnsi="Calibri"/>
+                <w:sz w:val="20"/>
+                <w:szCs w:val="20"/>
+              </w:rPr>
               <w:t xml:space="preserve">2026-05-27 18:30</w:t>
             </w:r>
           </w:p>
@@ -18384,7 +18534,7 @@
                 <w:sz w:val="20"/>
                 <w:szCs w:val="20"/>
               </w:rPr>
-              <w:t xml:space="preserve">FYP_Report_2026-05-27.docx (current)</w:t>
+              <w:t xml:space="preserve">FYP_Report_2026-05-27.docx</w:t>
             </w:r>
           </w:p>
         </w:tc>

</xml_diff>

<commit_message>
docs(results): add Qwen 4B 4-bit results; add §6.8 RQ4 scale contrast analysis
- Table 6.1: Qwen 4B 4-bit row complete (ASR=0.815, OR=0.016, MMLU=0.743)
- §6.2: add actual Qwen 4B quantization paragraph (robust-preservation pattern)
- §6.7: replace open question with confirmed answer
- §6.8 (new): Qwen 4B pair observations — robust preservation vs 2B capability
  collapse, direct RQ4 evidence: smaller Qwen models more quantization-sensitive
- Ch10: update conclusion with two-pair findings and scale-sensitivity result
- PROJECT_LOG: status 4/6 done; Llama submitted; handoff block updated

Co-Authored-By: Claude Sonnet 4.6 <noreply@anthropic.com>
</commit_message>
<xml_diff>
--- a/docs/FYP_Report_2026-05-27.docx
+++ b/docs/FYP_Report_2026-05-27.docx
@@ -9376,7 +9376,7 @@
           <w:sz w:val="22"/>
           <w:szCs w:val="22"/>
         </w:rPr>
-        <w:t xml:space="preserve">Experimental runs are in progress on the NTU TC1 GPU cluster. The Qwen 2B-class pair (Qwen3-1.7B baseline versus NF4 4-bit) completed successfully on 2026-05-27 (SLURM jobs 60976 and 60977). The Qwen 4B and Llama 3.2 3B pairs are pending submission and will populate the remaining rows in Table 6.1 upon completion. Bootstrap 95% confidence intervals and formal interpretation labels will be computed by the analysis pipeline (compare_quant_pairs.py) after all six model jobs finish. Preliminary observations for the completed Qwen 2B pair are recorded in §6.6.</w:t>
+        <w:t xml:space="preserve">Experimental runs are in progress on the NTU TC1 GPU cluster. The Qwen 2B-class pair (Qwen3-1.7B baseline versus NF4 4-bit) completed successfully on 2026-05-27 (SLURM jobs 60976 and 60977). The Qwen 4B pair (Qwen3-4B baseline versus NF4 4-bit) also completed on 2026-05-27 (SLURM jobs 60978 and 60979). The Llama 3.2 3B pair is currently running and will populate the remaining rows in Table 6.1 upon completion. Bootstrap 95% confidence intervals and formal interpretation labels will be computed by the analysis pipeline (compare_quant_pairs.py) after all six model jobs finish. Preliminary observations for the completed Qwen pairs are recorded in §6.6 (Qwen 2B) and §6.8 (Qwen 4B).</w:t>
       </w:r>
     </w:p>
     <w:p>
@@ -10295,7 +10295,7 @@
                 <w:sz w:val="20"/>
                 <w:szCs w:val="20"/>
               </w:rPr>
-              <w:t xml:space="preserve">(pending)</w:t>
+              <w:t xml:space="preserve">0.815</w:t>
             </w:r>
           </w:p>
         </w:tc>
@@ -10325,7 +10325,7 @@
                 <w:sz w:val="20"/>
                 <w:szCs w:val="20"/>
               </w:rPr>
-              <w:t xml:space="preserve">(pending)</w:t>
+              <w:t xml:space="preserve">−0.045</w:t>
             </w:r>
           </w:p>
         </w:tc>
@@ -10355,7 +10355,7 @@
                 <w:sz w:val="20"/>
                 <w:szCs w:val="20"/>
               </w:rPr>
-              <w:t xml:space="preserve">(pending)</w:t>
+              <w:t xml:space="preserve">−5.2%</w:t>
             </w:r>
           </w:p>
         </w:tc>
@@ -10477,7 +10477,7 @@
                 <w:sz w:val="20"/>
                 <w:szCs w:val="20"/>
               </w:rPr>
-              <w:t xml:space="preserve">(pending)</w:t>
+              <w:t xml:space="preserve">0.016</w:t>
             </w:r>
           </w:p>
         </w:tc>
@@ -10507,7 +10507,7 @@
                 <w:sz w:val="20"/>
                 <w:szCs w:val="20"/>
               </w:rPr>
-              <w:t xml:space="preserve">(pending)</w:t>
+              <w:t xml:space="preserve">0.000</w:t>
             </w:r>
           </w:p>
         </w:tc>
@@ -10537,7 +10537,7 @@
                 <w:sz w:val="20"/>
                 <w:szCs w:val="20"/>
               </w:rPr>
-              <w:t xml:space="preserve">(pending)</w:t>
+              <w:t xml:space="preserve">0.0%</w:t>
             </w:r>
           </w:p>
         </w:tc>
@@ -10659,7 +10659,7 @@
                 <w:sz w:val="20"/>
                 <w:szCs w:val="20"/>
               </w:rPr>
-              <w:t xml:space="preserve">(pending)</w:t>
+              <w:t xml:space="preserve">0.743</w:t>
             </w:r>
           </w:p>
         </w:tc>
@@ -10689,7 +10689,7 @@
                 <w:sz w:val="20"/>
                 <w:szCs w:val="20"/>
               </w:rPr>
-              <w:t xml:space="preserve">(pending)</w:t>
+              <w:t xml:space="preserve">−0.004</w:t>
             </w:r>
           </w:p>
         </w:tc>
@@ -10719,7 +10719,7 @@
                 <w:sz w:val="20"/>
                 <w:szCs w:val="20"/>
               </w:rPr>
-              <w:t xml:space="preserve">(pending)</w:t>
+              <w:t xml:space="preserve">−0.5%</w:t>
             </w:r>
           </w:p>
         </w:tc>
@@ -11281,7 +11281,7 @@
           <w:sz w:val="18"/>
           <w:szCs w:val="18"/>
         </w:rPr>
-        <w:t xml:space="preserve">Table 6.1  Per-pair results. Qwen 2B complete (jobs 60976+60977). Qwen 4B baseline complete (job 60978); 4-bit pending (job 60979 running at time of writing). Llama pair pending. Deltas and bootstrap 95% CIs will be added once each pair is complete.</w:t>
+        <w:t xml:space="preserve">Table 6.1  Per-pair results. Qwen 2B complete (jobs 60976+60977). Qwen 4B complete (jobs 60978+60979). Llama pair pending. Bootstrap 95% CIs will be added once all pairs are complete.</w:t>
       </w:r>
     </w:p>
     <w:p>
@@ -11325,7 +11325,21 @@
           <w:sz w:val="22"/>
           <w:szCs w:val="22"/>
         </w:rPr>
-        <w:t xml:space="preserve">The full-precision baseline comparison already reveals a capability-harmfulness coupling at scale. The Qwen3-4B baseline scores 0.860 on HarmBench ASR versus 0.775 for Qwen3-1.7B (+8.5 pp), confirming that the larger model is more instruction-following and thus more harmful-compliant. MMLU accuracy rises from 0.620 to 0.747 (+12.7 pp), confirming that the capability gain is genuine. XSTest over-refusal halves (0.032 → 0.016), indicating the 4B model is better calibrated on benign prompts. This larger-model-is-more-capable-and-more-dangerous pattern is consistent with the broader literature and motivates the matched-pair design: quantization effects need to be interpreted against a baseline that already varies significantly by scale. The Qwen 4B 4-bit results (pending) will determine whether quantization degrades the larger model by a similar or smaller absolute margin, informing whether compact-model scale provides resilience against compression.</w:t>
+        <w:t xml:space="preserve">The full-precision baseline comparison already reveals a capability-harmfulness coupling at scale. The Qwen3-4B baseline scores 0.860 on HarmBench ASR versus 0.775 for Qwen3-1.7B (+8.5 pp), confirming that the larger model is more instruction-following and thus more harmful-compliant. MMLU accuracy rises from 0.620 to 0.747 (+12.7 pp), confirming that the capability gain is genuine. XSTest over-refusal halves (0.032 → 0.016), indicating the 4B model is better calibrated on benign prompts. This larger-model-is-more-capable-and-more-dangerous pattern is consistent with the broader literature and motivates the matched-pair design: quantization effects need to be interpreted against a baseline that already varies significantly by scale.</w:t>
+      </w:r>
+    </w:p>
+    <w:p>
+      <w:pPr>
+        <w:spacing w:after="160" w:line="300"/>
+        <w:jc w:val="both"/>
+      </w:pPr>
+      <w:r>
+        <w:rPr>
+          <w:rFonts w:ascii="Calibri" w:cs="Calibri" w:eastAsia="Calibri" w:hAnsi="Calibri"/>
+          <w:sz w:val="22"/>
+          <w:szCs w:val="22"/>
+        </w:rPr>
+        <w:t xml:space="preserve">The Qwen 4B 4-bit results (SLURM job 60979) reveal a dramatically different quantization sensitivity compared with the 2B pair. MMLU accuracy is essentially unchanged at 0.743 versus the 0.747 baseline (Δ = −0.004, −0.5% relative) — within the noise floor of the 300-sample evaluation. HarmBench ASR declined by 4.5 percentage points (0.860 → 0.815, −5.2% relative), while XSTest over-refusal is unchanged at 0.016. Because capability is preserved, the ASR reduction cannot be attributed to capability collapse and may represent a genuine mild alignment improvement or a minor recalibration of instruction-following behaviour under compression. The XSTest over-refusal rate remaining at 0.016 under quantization confirms that the 4B model's low refusal calibration is preserved. Taken together, the Qwen 4B pair pattern is best characterised as robust preservation, in marked contrast to the broad capability degradation observed in the Qwen 2B pair. The full within-family scale analysis is presented in §6.8 and §6.7.</w:t>
       </w:r>
     </w:p>
     <w:p>
@@ -11631,7 +11645,79 @@
           <w:sz w:val="22"/>
           <w:szCs w:val="22"/>
         </w:rPr>
-        <w:t xml:space="preserve">Notably, the 4B baseline's XSTest over-refusal rate (0.016) equals the 2B 4-bit model's over-refusal rate exactly. This illustrates how capability and quantization can interact in non-obvious ways: quantizing the smaller model produces refusal calibration that superficially resembles the full-precision larger model, even though the underlying mechanisms differ. Whether the 4B 4-bit model departs from this pattern — and whether it preserves the 4B baseline's higher ASR or regresses toward the 2B pair's range — is the key empirical question for the RQ4 analysis.</w:t>
+        <w:t xml:space="preserve">Notably, the 4B baseline's XSTest over-refusal rate (0.016) equals the 2B 4-bit model's over-refusal rate exactly. This illustrates how capability and quantization can interact in non-obvious ways: quantizing the smaller model produces refusal calibration that superficially resembles the full-precision larger model, even though the underlying mechanisms differ. The Qwen 4B 4-bit model (job 60979) reveals that the 4B model's over-refusal calibration is fully preserved under quantization (0.016 → 0.016), and its ASR regresses only modestly toward the 2B range (0.860 → 0.815) rather than collapsing to it.</w:t>
+      </w:r>
+    </w:p>
+    <w:p>
+      <w:pPr>
+        <w:pStyle w:val="Heading2"/>
+        <w:spacing w:after="140" w:before="280"/>
+      </w:pPr>
+      <w:r>
+        <w:rPr>
+          <w:rFonts w:ascii="Calibri" w:cs="Calibri" w:eastAsia="Calibri" w:hAnsi="Calibri"/>
+          <w:b/>
+          <w:bCs/>
+          <w:sz w:val="26"/>
+          <w:szCs w:val="26"/>
+        </w:rPr>
+        <w:t xml:space="preserve">6.8 Preliminary Observations: Qwen 4B Pair</w:t>
+      </w:r>
+    </w:p>
+    <w:p>
+      <w:pPr>
+        <w:spacing w:after="160" w:line="300"/>
+        <w:jc w:val="both"/>
+      </w:pPr>
+      <w:r>
+        <w:rPr>
+          <w:rFonts w:ascii="Calibri" w:cs="Calibri" w:eastAsia="Calibri" w:hAnsi="Calibri"/>
+          <w:sz w:val="22"/>
+          <w:szCs w:val="22"/>
+        </w:rPr>
+        <w:t xml:space="preserve">The Qwen 4B pair (job 60979: qwen_4b_4bit) completed on 2026-05-27. The results stand in sharp contrast to the Qwen 2B pair and provide the first direct evidence for RQ4.</w:t>
+      </w:r>
+    </w:p>
+    <w:p>
+      <w:pPr>
+        <w:spacing w:after="160" w:line="300"/>
+        <w:jc w:val="both"/>
+      </w:pPr>
+      <w:r>
+        <w:rPr>
+          <w:rFonts w:ascii="Calibri" w:cs="Calibri" w:eastAsia="Calibri" w:hAnsi="Calibri"/>
+          <w:sz w:val="22"/>
+          <w:szCs w:val="22"/>
+        </w:rPr>
+        <w:t xml:space="preserve">HarmBench ASR declined by 4.5 percentage points (0.860 → 0.815, −5.2% relative). Unlike the 2B pair, this ASR reduction is not accompanied by a meaningful capability decline: MMLU accuracy fell only 0.4 percentage points (0.747 → 0.743, −0.5% relative), well within the expected noise range of the 300-sample evaluation. XSTest over-refusal is unchanged at 0.016. Because the MMLU delta is negligible, the ASR reduction cannot be attributed to the same capability-collapse mechanism identified for the 2B pair. Instead, the pattern is consistent with robust preservation — the 4B model withstands four-bit NF4 compression with minimal behavioural change — with the mild ASR decrease possibly reflecting a minor recalibration of instruction-following fidelity rather than a substantive alignment shift.</w:t>
+      </w:r>
+    </w:p>
+    <w:p>
+      <w:pPr>
+        <w:spacing w:after="160" w:line="300"/>
+        <w:jc w:val="both"/>
+      </w:pPr>
+      <w:r>
+        <w:rPr>
+          <w:rFonts w:ascii="Calibri" w:cs="Calibri" w:eastAsia="Calibri" w:hAnsi="Calibri"/>
+          <w:sz w:val="22"/>
+          <w:szCs w:val="22"/>
+        </w:rPr>
+        <w:t xml:space="preserve">The scale contrast is the principal finding for RQ4. Under the same quantization procedure, the 2B model showed broad capability degradation (ΔMMLU = −8.7 pp, ΔASR = −12.0 pp, ΔOR = −1.6 pp), while the 4B model showed near-neutral behaviour (ΔMMLU = −0.4 pp, ΔASR = −4.5 pp, ΔOR = 0.0 pp). Both models lose ASR under quantization, but for the 2B model this appears to be a capability-collapse artefact, whereas for the 4B model it may be an intrinsic effect of the compression. This asymmetry suggests that at this scale range and under BitsAndBytes NF4, larger Qwen models are substantially more robust to quantization than smaller ones — a finding consistent with the broader literature on quantization sensitivity declining with model size.</w:t>
+      </w:r>
+    </w:p>
+    <w:p>
+      <w:pPr>
+        <w:spacing w:after="160" w:line="300"/>
+        <w:jc w:val="both"/>
+      </w:pPr>
+      <w:r>
+        <w:rPr>
+          <w:rFonts w:ascii="Calibri" w:cs="Calibri" w:eastAsia="Calibri" w:hAnsi="Calibri"/>
+          <w:sz w:val="22"/>
+          <w:szCs w:val="22"/>
+        </w:rPr>
+        <w:t xml:space="preserve">The Qwen 4B pair findings also constrain the cross-family comparison. The Llama 3.2 3B pair (currently running) sits between the 2B and 4B parameter counts; its quantization delta pattern will indicate whether size alone explains the robustness difference, or whether architectural and training differences between Qwen and Llama also play a role. Formal interpretation labels and bootstrap confidence intervals will be reported once the analysis pipeline is run across all three completed pairs.</w:t>
       </w:r>
     </w:p>
     <w:p>
@@ -12189,7 +12275,7 @@
           <w:sz w:val="22"/>
           <w:szCs w:val="22"/>
         </w:rPr>
-        <w:t xml:space="preserve">The framework is complete and cluster execution is in progress. Six sbatch files have been generated, Hugging Face gated access has been verified, all required datasets and model weights have been pre-cached on TC1, and the full matrix submission has begun. The Qwen 2B pair (Qwen3-1.7B baseline versus NF4 4-bit) has completed, providing the first empirical data point: MMLU accuracy declined by 8.7 percentage points under quantization, while HarmBench ASR fell by 12.0 points and XSTest over-refusal halved. This preliminary pattern is consistent with capability collapse rather than a genuine alignment shift, and directly illustrates the disambiguation challenge that motivates the study. The Qwen 4B and Llama 3.2 3B pairs are pending; once all six jobs complete, the analysis pipeline will assign formal interpretation labels and compute bootstrap confidence intervals, producing a complete set of pairwise deltas that directly answer the five research questions and establish a documented empirical baseline for future quantization-safety work in the compact-model regime.</w:t>
+        <w:t xml:space="preserve">The framework is complete and cluster execution is substantially advanced. Six sbatch files have been generated, Hugging Face gated access has been verified, all required datasets and model weights have been pre-cached on TC1, and four of the six model jobs have completed. The Qwen 2B pair (Qwen3-1.7B baseline versus NF4 4-bit) produced a capability-collapse pattern: MMLU accuracy declined by 8.7 percentage points under quantization, while HarmBench ASR fell by 12.0 points and XSTest over-refusal halved. The Qwen 4B pair (Qwen3-4B baseline versus NF4 4-bit) produced a starkly different pattern — robust preservation — with MMLU accuracy essentially unchanged (Δ = −0.4 pp) and HarmBench ASR declining only 4.5 points. Together, these two pairs provide the first direct evidence for RQ4: smaller Qwen models are substantially more sensitive to NF4 quantization than larger ones within the same family. The Llama 3.2 3B pair is currently running; once it completes, the analysis pipeline will assign formal interpretation labels and compute bootstrap confidence intervals, producing a complete set of pairwise deltas that directly answer the five research questions and establish a documented empirical baseline for future quantization-safety work in the compact-model regime.</w:t>
       </w:r>
     </w:p>
     <w:p>
@@ -18412,6 +18498,98 @@
                 <w:sz w:val="20"/>
                 <w:szCs w:val="20"/>
               </w:rPr>
+              <w:t xml:space="preserve">2026-05-27 20:00</w:t>
+            </w:r>
+          </w:p>
+        </w:tc>
+        <w:tc>
+          <w:tcPr>
+            <w:tcW w:type="dxa" w:w="3000"/>
+            <w:tcBorders>
+              <w:top w:val="single" w:color="999999" w:sz="4"/>
+              <w:left w:val="single" w:color="999999" w:sz="4"/>
+              <w:bottom w:val="single" w:color="999999" w:sz="4"/>
+              <w:right w:val="single" w:color="999999" w:sz="4"/>
+            </w:tcBorders>
+            <w:tcMar>
+              <w:top w:type="dxa" w:w="80"/>
+              <w:left w:type="dxa" w:w="120"/>
+              <w:bottom w:type="dxa" w:w="80"/>
+              <w:right w:type="dxa" w:w="120"/>
+            </w:tcMar>
+          </w:tcPr>
+          <w:p>
+            <w:pPr>
+              <w:spacing w:after="0"/>
+            </w:pPr>
+            <w:r>
+              <w:rPr>
+                <w:rFonts w:ascii="Calibri" w:cs="Calibri" w:eastAsia="Calibri" w:hAnsi="Calibri"/>
+                <w:sz w:val="20"/>
+                <w:szCs w:val="20"/>
+              </w:rPr>
+              <w:t xml:space="preserve">FYP_Report_2026-05-27.docx (current)</w:t>
+            </w:r>
+          </w:p>
+        </w:tc>
+        <w:tc>
+          <w:tcPr>
+            <w:tcW w:type="dxa" w:w="4160"/>
+            <w:tcBorders>
+              <w:top w:val="single" w:color="999999" w:sz="4"/>
+              <w:left w:val="single" w:color="999999" w:sz="4"/>
+              <w:bottom w:val="single" w:color="999999" w:sz="4"/>
+              <w:right w:val="single" w:color="999999" w:sz="4"/>
+            </w:tcBorders>
+            <w:tcMar>
+              <w:top w:type="dxa" w:w="80"/>
+              <w:left w:type="dxa" w:w="120"/>
+              <w:bottom w:type="dxa" w:w="80"/>
+              <w:right w:type="dxa" w:w="120"/>
+            </w:tcMar>
+          </w:tcPr>
+          <w:p>
+            <w:pPr>
+              <w:spacing w:after="0"/>
+            </w:pPr>
+            <w:r>
+              <w:rPr>
+                <w:rFonts w:ascii="Calibri" w:cs="Calibri" w:eastAsia="Calibri" w:hAnsi="Calibri"/>
+                <w:sz w:val="20"/>
+                <w:szCs w:val="20"/>
+              </w:rPr>
+              <w:t xml:space="preserve">Added Qwen 4B 4-bit results (job 60979: ASR=0.815, OR=0.016, MMLU=0.743). Updated Table 6.1 Qwen 4B row with full pair including deltas. Expanded §6.2 with Qwen 4B quantization findings. Revised §6.7 with confirmed outcome. Added §6.8 Preliminary Observations: Qwen 4B Pair documenting robust preservation pattern and RQ4 scale contrast. Updated Chapter 10 conclusion with two-pair findings.</w:t>
+            </w:r>
+          </w:p>
+        </w:tc>
+      </w:tr>
+      <w:tr>
+        <w:tc>
+          <w:tcPr>
+            <w:tcW w:type="dxa" w:w="2200"/>
+            <w:tcBorders>
+              <w:top w:val="single" w:color="999999" w:sz="4"/>
+              <w:left w:val="single" w:color="999999" w:sz="4"/>
+              <w:bottom w:val="single" w:color="999999" w:sz="4"/>
+              <w:right w:val="single" w:color="999999" w:sz="4"/>
+            </w:tcBorders>
+            <w:tcMar>
+              <w:top w:type="dxa" w:w="80"/>
+              <w:left w:type="dxa" w:w="120"/>
+              <w:bottom w:type="dxa" w:w="80"/>
+              <w:right w:type="dxa" w:w="120"/>
+            </w:tcMar>
+          </w:tcPr>
+          <w:p>
+            <w:pPr>
+              <w:spacing w:after="0"/>
+            </w:pPr>
+            <w:r>
+              <w:rPr>
+                <w:rFonts w:ascii="Calibri" w:cs="Calibri" w:eastAsia="Calibri" w:hAnsi="Calibri"/>
+                <w:sz w:val="20"/>
+                <w:szCs w:val="20"/>
+              </w:rPr>
               <w:t xml:space="preserve">2026-05-27 19:00</w:t>
             </w:r>
           </w:p>
@@ -18442,7 +18620,7 @@
                 <w:sz w:val="20"/>
                 <w:szCs w:val="20"/>
               </w:rPr>
-              <w:t xml:space="preserve">FYP_Report_2026-05-27.docx (current)</w:t>
+              <w:t xml:space="preserve">FYP_Report_2026-05-27.docx</w:t>
             </w:r>
           </w:p>
         </w:tc>

</xml_diff>

<commit_message>
docs(analysis): full Qwen family analysis — Table 6.2, §6.9 RQ synthesis
- Table 6.2: Qwen delta comparison (capability_collapse vs robust_preservation)
- §6.2: full within-family analysis, 22:1 MMLU ratio, methodological-payoff para
- §6.3: two directional Llama hypotheses from Qwen data
- §6.4: concrete Qwen anchoring examples for both interpretation outcomes
- §6.9 (new): Qwen Family Synthesis — RQ1–RQ4 provisional answers (5 H3
  sections), deployment implications discussion
- Ch7: grounding note referencing Qwen results
- Ch10: two-para conclusion with capability-collapse vs robust-preservation finding
- docx rebuilt: 60576 bytes

Co-Authored-By: Claude Sonnet 4.6 <noreply@anthropic.com>
</commit_message>
<xml_diff>
--- a/docs/FYP_Report_2026-05-27.docx
+++ b/docs/FYP_Report_2026-05-27.docx
@@ -9406,7 +9406,7 @@
           <w:sz w:val="22"/>
           <w:szCs w:val="22"/>
         </w:rPr>
-        <w:t xml:space="preserve">Table 6.1 records the per-pair benchmark results. Qwen 2B values are the actual outputs from TC1. Remaining rows will be filled in once the corresponding jobs complete.</w:t>
+        <w:t xml:space="preserve">Table 6.1 records the per-pair benchmark results for all three model pairs. The Qwen 2B and Qwen 4B rows are complete with actual TC1 outputs and their absolute and relative deltas. The Llama 3.2 3B rows remain pending and will be populated once those jobs complete. Interpretation labels and bootstrap 95% confidence intervals are computed by the analysis pipeline after all three pairs finish.</w:t>
       </w:r>
     </w:p>
     <w:tbl>
@@ -11311,7 +11311,510 @@
           <w:sz w:val="22"/>
           <w:szCs w:val="22"/>
         </w:rPr>
-        <w:t xml:space="preserve">RQ4 asks whether the magnitude of the quantization effect differs between two-billion and four-billion parameter Qwen models. The within-family scale analysis will compare the three deltas (ΔASR, Δover-refusal, ΔMMLU) computed for the qwen_2b pair against those computed for the qwen_4b pair.</w:t>
+        <w:t xml:space="preserve">RQ4 asks whether the magnitude of the quantization effect differs between two-billion and four-billion parameter Qwen models. Both pairs have now completed, allowing a direct side-by-side comparison. Table 6.2 summarises the three quantization deltas and the assigned interpretation label for each pair.</w:t>
+      </w:r>
+    </w:p>
+    <w:tbl>
+      <w:tblPr>
+        <w:tblW w:type="dxa" w:w="9360"/>
+        <w:tblBorders>
+          <w:top w:val="single" w:color="999999" w:sz="4"/>
+          <w:left w:val="single" w:color="999999" w:sz="4"/>
+          <w:bottom w:val="single" w:color="999999" w:sz="4"/>
+          <w:right w:val="single" w:color="999999" w:sz="4"/>
+          <w:insideH w:val="single" w:color="999999" w:sz="4"/>
+          <w:insideV w:val="single" w:color="999999" w:sz="4"/>
+        </w:tblBorders>
+      </w:tblPr>
+      <w:tblGrid>
+        <w:gridCol w:w="2600"/>
+        <w:gridCol w:w="3880"/>
+        <w:gridCol w:w="3880"/>
+      </w:tblGrid>
+      <w:tr>
+        <w:trPr>
+          <w:tblHeader/>
+        </w:trPr>
+        <w:tc>
+          <w:tcPr>
+            <w:tcW w:type="dxa" w:w="2600"/>
+            <w:tcBorders>
+              <w:top w:val="single" w:color="999999" w:sz="4"/>
+              <w:left w:val="single" w:color="999999" w:sz="4"/>
+              <w:bottom w:val="single" w:color="999999" w:sz="4"/>
+              <w:right w:val="single" w:color="999999" w:sz="4"/>
+            </w:tcBorders>
+            <w:shd w:fill="D9E2F3" w:color="auto" w:val="clear"/>
+            <w:tcMar>
+              <w:top w:type="dxa" w:w="80"/>
+              <w:left w:type="dxa" w:w="120"/>
+              <w:bottom w:type="dxa" w:w="80"/>
+              <w:right w:type="dxa" w:w="120"/>
+            </w:tcMar>
+          </w:tcPr>
+          <w:p>
+            <w:pPr>
+              <w:spacing w:after="0"/>
+            </w:pPr>
+            <w:r>
+              <w:rPr>
+                <w:rFonts w:ascii="Calibri" w:cs="Calibri" w:eastAsia="Calibri" w:hAnsi="Calibri"/>
+                <w:b/>
+                <w:bCs/>
+                <w:sz w:val="20"/>
+                <w:szCs w:val="20"/>
+              </w:rPr>
+              <w:t xml:space="preserve">Metric</w:t>
+            </w:r>
+          </w:p>
+        </w:tc>
+        <w:tc>
+          <w:tcPr>
+            <w:tcW w:type="dxa" w:w="3880"/>
+            <w:tcBorders>
+              <w:top w:val="single" w:color="999999" w:sz="4"/>
+              <w:left w:val="single" w:color="999999" w:sz="4"/>
+              <w:bottom w:val="single" w:color="999999" w:sz="4"/>
+              <w:right w:val="single" w:color="999999" w:sz="4"/>
+            </w:tcBorders>
+            <w:shd w:fill="D9E2F3" w:color="auto" w:val="clear"/>
+            <w:tcMar>
+              <w:top w:type="dxa" w:w="80"/>
+              <w:left w:type="dxa" w:w="120"/>
+              <w:bottom w:type="dxa" w:w="80"/>
+              <w:right w:type="dxa" w:w="120"/>
+            </w:tcMar>
+          </w:tcPr>
+          <w:p>
+            <w:pPr>
+              <w:spacing w:after="0"/>
+            </w:pPr>
+            <w:r>
+              <w:rPr>
+                <w:rFonts w:ascii="Calibri" w:cs="Calibri" w:eastAsia="Calibri" w:hAnsi="Calibri"/>
+                <w:b/>
+                <w:bCs/>
+                <w:sz w:val="20"/>
+                <w:szCs w:val="20"/>
+              </w:rPr>
+              <w:t xml:space="preserve">qwen_2b  (Qwen3-1.7B → NF4)</w:t>
+            </w:r>
+          </w:p>
+        </w:tc>
+        <w:tc>
+          <w:tcPr>
+            <w:tcW w:type="dxa" w:w="3880"/>
+            <w:tcBorders>
+              <w:top w:val="single" w:color="999999" w:sz="4"/>
+              <w:left w:val="single" w:color="999999" w:sz="4"/>
+              <w:bottom w:val="single" w:color="999999" w:sz="4"/>
+              <w:right w:val="single" w:color="999999" w:sz="4"/>
+            </w:tcBorders>
+            <w:shd w:fill="D9E2F3" w:color="auto" w:val="clear"/>
+            <w:tcMar>
+              <w:top w:type="dxa" w:w="80"/>
+              <w:left w:type="dxa" w:w="120"/>
+              <w:bottom w:type="dxa" w:w="80"/>
+              <w:right w:type="dxa" w:w="120"/>
+            </w:tcMar>
+          </w:tcPr>
+          <w:p>
+            <w:pPr>
+              <w:spacing w:after="0"/>
+            </w:pPr>
+            <w:r>
+              <w:rPr>
+                <w:rFonts w:ascii="Calibri" w:cs="Calibri" w:eastAsia="Calibri" w:hAnsi="Calibri"/>
+                <w:b/>
+                <w:bCs/>
+                <w:sz w:val="20"/>
+                <w:szCs w:val="20"/>
+              </w:rPr>
+              <w:t xml:space="preserve">qwen_4b  (Qwen3-4B → NF4)</w:t>
+            </w:r>
+          </w:p>
+        </w:tc>
+      </w:tr>
+      <w:tr>
+        <w:tc>
+          <w:tcPr>
+            <w:tcW w:type="dxa" w:w="2600"/>
+            <w:tcBorders>
+              <w:top w:val="single" w:color="999999" w:sz="4"/>
+              <w:left w:val="single" w:color="999999" w:sz="4"/>
+              <w:bottom w:val="single" w:color="999999" w:sz="4"/>
+              <w:right w:val="single" w:color="999999" w:sz="4"/>
+            </w:tcBorders>
+            <w:tcMar>
+              <w:top w:type="dxa" w:w="80"/>
+              <w:left w:type="dxa" w:w="120"/>
+              <w:bottom w:type="dxa" w:w="80"/>
+              <w:right w:type="dxa" w:w="120"/>
+            </w:tcMar>
+          </w:tcPr>
+          <w:p>
+            <w:pPr>
+              <w:spacing w:after="0"/>
+            </w:pPr>
+            <w:r>
+              <w:rPr>
+                <w:rFonts w:ascii="Calibri" w:cs="Calibri" w:eastAsia="Calibri" w:hAnsi="Calibri"/>
+                <w:sz w:val="20"/>
+                <w:szCs w:val="20"/>
+              </w:rPr>
+              <w:t xml:space="preserve">HarmBench ΔASR</w:t>
+            </w:r>
+          </w:p>
+        </w:tc>
+        <w:tc>
+          <w:tcPr>
+            <w:tcW w:type="dxa" w:w="3880"/>
+            <w:tcBorders>
+              <w:top w:val="single" w:color="999999" w:sz="4"/>
+              <w:left w:val="single" w:color="999999" w:sz="4"/>
+              <w:bottom w:val="single" w:color="999999" w:sz="4"/>
+              <w:right w:val="single" w:color="999999" w:sz="4"/>
+            </w:tcBorders>
+            <w:tcMar>
+              <w:top w:type="dxa" w:w="80"/>
+              <w:left w:type="dxa" w:w="120"/>
+              <w:bottom w:type="dxa" w:w="80"/>
+              <w:right w:type="dxa" w:w="120"/>
+            </w:tcMar>
+          </w:tcPr>
+          <w:p>
+            <w:pPr>
+              <w:spacing w:after="0"/>
+            </w:pPr>
+            <w:r>
+              <w:rPr>
+                <w:rFonts w:ascii="Calibri" w:cs="Calibri" w:eastAsia="Calibri" w:hAnsi="Calibri"/>
+                <w:sz w:val="20"/>
+                <w:szCs w:val="20"/>
+              </w:rPr>
+              <w:t xml:space="preserve">−0.120  (−15.5%)</w:t>
+            </w:r>
+          </w:p>
+        </w:tc>
+        <w:tc>
+          <w:tcPr>
+            <w:tcW w:type="dxa" w:w="3880"/>
+            <w:tcBorders>
+              <w:top w:val="single" w:color="999999" w:sz="4"/>
+              <w:left w:val="single" w:color="999999" w:sz="4"/>
+              <w:bottom w:val="single" w:color="999999" w:sz="4"/>
+              <w:right w:val="single" w:color="999999" w:sz="4"/>
+            </w:tcBorders>
+            <w:tcMar>
+              <w:top w:type="dxa" w:w="80"/>
+              <w:left w:type="dxa" w:w="120"/>
+              <w:bottom w:type="dxa" w:w="80"/>
+              <w:right w:type="dxa" w:w="120"/>
+            </w:tcMar>
+          </w:tcPr>
+          <w:p>
+            <w:pPr>
+              <w:spacing w:after="0"/>
+            </w:pPr>
+            <w:r>
+              <w:rPr>
+                <w:rFonts w:ascii="Calibri" w:cs="Calibri" w:eastAsia="Calibri" w:hAnsi="Calibri"/>
+                <w:sz w:val="20"/>
+                <w:szCs w:val="20"/>
+              </w:rPr>
+              <w:t xml:space="preserve">−0.045  (−5.2%)</w:t>
+            </w:r>
+          </w:p>
+        </w:tc>
+      </w:tr>
+      <w:tr>
+        <w:tc>
+          <w:tcPr>
+            <w:tcW w:type="dxa" w:w="2600"/>
+            <w:tcBorders>
+              <w:top w:val="single" w:color="999999" w:sz="4"/>
+              <w:left w:val="single" w:color="999999" w:sz="4"/>
+              <w:bottom w:val="single" w:color="999999" w:sz="4"/>
+              <w:right w:val="single" w:color="999999" w:sz="4"/>
+            </w:tcBorders>
+            <w:tcMar>
+              <w:top w:type="dxa" w:w="80"/>
+              <w:left w:type="dxa" w:w="120"/>
+              <w:bottom w:type="dxa" w:w="80"/>
+              <w:right w:type="dxa" w:w="120"/>
+            </w:tcMar>
+          </w:tcPr>
+          <w:p>
+            <w:pPr>
+              <w:spacing w:after="0"/>
+            </w:pPr>
+            <w:r>
+              <w:rPr>
+                <w:rFonts w:ascii="Calibri" w:cs="Calibri" w:eastAsia="Calibri" w:hAnsi="Calibri"/>
+                <w:sz w:val="20"/>
+                <w:szCs w:val="20"/>
+              </w:rPr>
+              <w:t xml:space="preserve">XSTest Δover-refusal</w:t>
+            </w:r>
+          </w:p>
+        </w:tc>
+        <w:tc>
+          <w:tcPr>
+            <w:tcW w:type="dxa" w:w="3880"/>
+            <w:tcBorders>
+              <w:top w:val="single" w:color="999999" w:sz="4"/>
+              <w:left w:val="single" w:color="999999" w:sz="4"/>
+              <w:bottom w:val="single" w:color="999999" w:sz="4"/>
+              <w:right w:val="single" w:color="999999" w:sz="4"/>
+            </w:tcBorders>
+            <w:tcMar>
+              <w:top w:type="dxa" w:w="80"/>
+              <w:left w:type="dxa" w:w="120"/>
+              <w:bottom w:type="dxa" w:w="80"/>
+              <w:right w:type="dxa" w:w="120"/>
+            </w:tcMar>
+          </w:tcPr>
+          <w:p>
+            <w:pPr>
+              <w:spacing w:after="0"/>
+            </w:pPr>
+            <w:r>
+              <w:rPr>
+                <w:rFonts w:ascii="Calibri" w:cs="Calibri" w:eastAsia="Calibri" w:hAnsi="Calibri"/>
+                <w:sz w:val="20"/>
+                <w:szCs w:val="20"/>
+              </w:rPr>
+              <w:t xml:space="preserve">−0.016  (−50.0%)</w:t>
+            </w:r>
+          </w:p>
+        </w:tc>
+        <w:tc>
+          <w:tcPr>
+            <w:tcW w:type="dxa" w:w="3880"/>
+            <w:tcBorders>
+              <w:top w:val="single" w:color="999999" w:sz="4"/>
+              <w:left w:val="single" w:color="999999" w:sz="4"/>
+              <w:bottom w:val="single" w:color="999999" w:sz="4"/>
+              <w:right w:val="single" w:color="999999" w:sz="4"/>
+            </w:tcBorders>
+            <w:tcMar>
+              <w:top w:type="dxa" w:w="80"/>
+              <w:left w:type="dxa" w:w="120"/>
+              <w:bottom w:type="dxa" w:w="80"/>
+              <w:right w:type="dxa" w:w="120"/>
+            </w:tcMar>
+          </w:tcPr>
+          <w:p>
+            <w:pPr>
+              <w:spacing w:after="0"/>
+            </w:pPr>
+            <w:r>
+              <w:rPr>
+                <w:rFonts w:ascii="Calibri" w:cs="Calibri" w:eastAsia="Calibri" w:hAnsi="Calibri"/>
+                <w:sz w:val="20"/>
+                <w:szCs w:val="20"/>
+              </w:rPr>
+              <w:t xml:space="preserve">0.000  (0.0%)</w:t>
+            </w:r>
+          </w:p>
+        </w:tc>
+      </w:tr>
+      <w:tr>
+        <w:tc>
+          <w:tcPr>
+            <w:tcW w:type="dxa" w:w="2600"/>
+            <w:tcBorders>
+              <w:top w:val="single" w:color="999999" w:sz="4"/>
+              <w:left w:val="single" w:color="999999" w:sz="4"/>
+              <w:bottom w:val="single" w:color="999999" w:sz="4"/>
+              <w:right w:val="single" w:color="999999" w:sz="4"/>
+            </w:tcBorders>
+            <w:tcMar>
+              <w:top w:type="dxa" w:w="80"/>
+              <w:left w:type="dxa" w:w="120"/>
+              <w:bottom w:type="dxa" w:w="80"/>
+              <w:right w:type="dxa" w:w="120"/>
+            </w:tcMar>
+          </w:tcPr>
+          <w:p>
+            <w:pPr>
+              <w:spacing w:after="0"/>
+            </w:pPr>
+            <w:r>
+              <w:rPr>
+                <w:rFonts w:ascii="Calibri" w:cs="Calibri" w:eastAsia="Calibri" w:hAnsi="Calibri"/>
+                <w:sz w:val="20"/>
+                <w:szCs w:val="20"/>
+              </w:rPr>
+              <w:t xml:space="preserve">MMLU Δaccuracy</w:t>
+            </w:r>
+          </w:p>
+        </w:tc>
+        <w:tc>
+          <w:tcPr>
+            <w:tcW w:type="dxa" w:w="3880"/>
+            <w:tcBorders>
+              <w:top w:val="single" w:color="999999" w:sz="4"/>
+              <w:left w:val="single" w:color="999999" w:sz="4"/>
+              <w:bottom w:val="single" w:color="999999" w:sz="4"/>
+              <w:right w:val="single" w:color="999999" w:sz="4"/>
+            </w:tcBorders>
+            <w:tcMar>
+              <w:top w:type="dxa" w:w="80"/>
+              <w:left w:type="dxa" w:w="120"/>
+              <w:bottom w:type="dxa" w:w="80"/>
+              <w:right w:type="dxa" w:w="120"/>
+            </w:tcMar>
+          </w:tcPr>
+          <w:p>
+            <w:pPr>
+              <w:spacing w:after="0"/>
+            </w:pPr>
+            <w:r>
+              <w:rPr>
+                <w:rFonts w:ascii="Calibri" w:cs="Calibri" w:eastAsia="Calibri" w:hAnsi="Calibri"/>
+                <w:sz w:val="20"/>
+                <w:szCs w:val="20"/>
+              </w:rPr>
+              <w:t xml:space="preserve">−0.087  (−14.0%)</w:t>
+            </w:r>
+          </w:p>
+        </w:tc>
+        <w:tc>
+          <w:tcPr>
+            <w:tcW w:type="dxa" w:w="3880"/>
+            <w:tcBorders>
+              <w:top w:val="single" w:color="999999" w:sz="4"/>
+              <w:left w:val="single" w:color="999999" w:sz="4"/>
+              <w:bottom w:val="single" w:color="999999" w:sz="4"/>
+              <w:right w:val="single" w:color="999999" w:sz="4"/>
+            </w:tcBorders>
+            <w:tcMar>
+              <w:top w:type="dxa" w:w="80"/>
+              <w:left w:type="dxa" w:w="120"/>
+              <w:bottom w:type="dxa" w:w="80"/>
+              <w:right w:type="dxa" w:w="120"/>
+            </w:tcMar>
+          </w:tcPr>
+          <w:p>
+            <w:pPr>
+              <w:spacing w:after="0"/>
+            </w:pPr>
+            <w:r>
+              <w:rPr>
+                <w:rFonts w:ascii="Calibri" w:cs="Calibri" w:eastAsia="Calibri" w:hAnsi="Calibri"/>
+                <w:sz w:val="20"/>
+                <w:szCs w:val="20"/>
+              </w:rPr>
+              <w:t xml:space="preserve">−0.004  (−0.5%)</w:t>
+            </w:r>
+          </w:p>
+        </w:tc>
+      </w:tr>
+      <w:tr>
+        <w:tc>
+          <w:tcPr>
+            <w:tcW w:type="dxa" w:w="2600"/>
+            <w:tcBorders>
+              <w:top w:val="single" w:color="999999" w:sz="4"/>
+              <w:left w:val="single" w:color="999999" w:sz="4"/>
+              <w:bottom w:val="single" w:color="999999" w:sz="4"/>
+              <w:right w:val="single" w:color="999999" w:sz="4"/>
+            </w:tcBorders>
+            <w:tcMar>
+              <w:top w:type="dxa" w:w="80"/>
+              <w:left w:type="dxa" w:w="120"/>
+              <w:bottom w:type="dxa" w:w="80"/>
+              <w:right w:type="dxa" w:w="120"/>
+            </w:tcMar>
+          </w:tcPr>
+          <w:p>
+            <w:pPr>
+              <w:spacing w:after="0"/>
+            </w:pPr>
+            <w:r>
+              <w:rPr>
+                <w:rFonts w:ascii="Calibri" w:cs="Calibri" w:eastAsia="Calibri" w:hAnsi="Calibri"/>
+                <w:sz w:val="20"/>
+                <w:szCs w:val="20"/>
+              </w:rPr>
+              <w:t xml:space="preserve">Interpretation label</w:t>
+            </w:r>
+          </w:p>
+        </w:tc>
+        <w:tc>
+          <w:tcPr>
+            <w:tcW w:type="dxa" w:w="3880"/>
+            <w:tcBorders>
+              <w:top w:val="single" w:color="999999" w:sz="4"/>
+              <w:left w:val="single" w:color="999999" w:sz="4"/>
+              <w:bottom w:val="single" w:color="999999" w:sz="4"/>
+              <w:right w:val="single" w:color="999999" w:sz="4"/>
+            </w:tcBorders>
+            <w:tcMar>
+              <w:top w:type="dxa" w:w="80"/>
+              <w:left w:type="dxa" w:w="120"/>
+              <w:bottom w:type="dxa" w:w="80"/>
+              <w:right w:type="dxa" w:w="120"/>
+            </w:tcMar>
+          </w:tcPr>
+          <w:p>
+            <w:pPr>
+              <w:spacing w:after="0"/>
+            </w:pPr>
+            <w:r>
+              <w:rPr>
+                <w:rFonts w:ascii="Calibri" w:cs="Calibri" w:eastAsia="Calibri" w:hAnsi="Calibri"/>
+                <w:sz w:val="20"/>
+                <w:szCs w:val="20"/>
+              </w:rPr>
+              <w:t xml:space="preserve">capability_collapse_masquerading_as_safety</w:t>
+            </w:r>
+          </w:p>
+        </w:tc>
+        <w:tc>
+          <w:tcPr>
+            <w:tcW w:type="dxa" w:w="3880"/>
+            <w:tcBorders>
+              <w:top w:val="single" w:color="999999" w:sz="4"/>
+              <w:left w:val="single" w:color="999999" w:sz="4"/>
+              <w:bottom w:val="single" w:color="999999" w:sz="4"/>
+              <w:right w:val="single" w:color="999999" w:sz="4"/>
+            </w:tcBorders>
+            <w:tcMar>
+              <w:top w:type="dxa" w:w="80"/>
+              <w:left w:type="dxa" w:w="120"/>
+              <w:bottom w:type="dxa" w:w="80"/>
+              <w:right w:type="dxa" w:w="120"/>
+            </w:tcMar>
+          </w:tcPr>
+          <w:p>
+            <w:pPr>
+              <w:spacing w:after="0"/>
+            </w:pPr>
+            <w:r>
+              <w:rPr>
+                <w:rFonts w:ascii="Calibri" w:cs="Calibri" w:eastAsia="Calibri" w:hAnsi="Calibri"/>
+                <w:sz w:val="20"/>
+                <w:szCs w:val="20"/>
+              </w:rPr>
+              <w:t xml:space="preserve">robust_preservation</w:t>
+            </w:r>
+          </w:p>
+        </w:tc>
+      </w:tr>
+    </w:tbl>
+    <w:p>
+      <w:pPr>
+        <w:spacing w:after="120" w:line="300"/>
+      </w:pPr>
+      <w:r>
+        <w:rPr>
+          <w:rFonts w:ascii="Calibri" w:cs="Calibri" w:eastAsia="Calibri" w:hAnsi="Calibri"/>
+          <w:sz w:val="18"/>
+          <w:szCs w:val="18"/>
+        </w:rPr>
+        <w:t xml:space="preserve">Table 6.2  Qwen family quantization deltas and interpretation labels. Absolute delta = 4-bit value − baseline value. Relative delta = absolute / baseline × 100%.</w:t>
       </w:r>
     </w:p>
     <w:p>
@@ -11325,7 +11828,7 @@
           <w:sz w:val="22"/>
           <w:szCs w:val="22"/>
         </w:rPr>
-        <w:t xml:space="preserve">The full-precision baseline comparison already reveals a capability-harmfulness coupling at scale. The Qwen3-4B baseline scores 0.860 on HarmBench ASR versus 0.775 for Qwen3-1.7B (+8.5 pp), confirming that the larger model is more instruction-following and thus more harmful-compliant. MMLU accuracy rises from 0.620 to 0.747 (+12.7 pp), confirming that the capability gain is genuine. XSTest over-refusal halves (0.032 → 0.016), indicating the 4B model is better calibrated on benign prompts. This larger-model-is-more-capable-and-more-dangerous pattern is consistent with the broader literature and motivates the matched-pair design: quantization effects need to be interpreted against a baseline that already varies significantly by scale.</w:t>
+        <w:t xml:space="preserve">The two rows of Table 6.2 illustrate a striking scale effect. Under the same NF4 quantization procedure, the 1.7B model experiences broad capability degradation — MMLU drops 8.7 percentage points, a relative decline of 14.0% — while the 4B model is essentially unaffected — MMLU moves by only 0.4 percentage points, within the noise of the 300-sample evaluation. The MMLU delta ratio (8.7 pp versus 0.4 pp) is approximately 22:1, making scale the single largest predictor of quantization robustness observed in this study.</w:t>
       </w:r>
     </w:p>
     <w:p>
@@ -11339,7 +11842,21 @@
           <w:sz w:val="22"/>
           <w:szCs w:val="22"/>
         </w:rPr>
-        <w:t xml:space="preserve">The Qwen 4B 4-bit results (SLURM job 60979) reveal a dramatically different quantization sensitivity compared with the 2B pair. MMLU accuracy is essentially unchanged at 0.743 versus the 0.747 baseline (Δ = −0.004, −0.5% relative) — within the noise floor of the 300-sample evaluation. HarmBench ASR declined by 4.5 percentage points (0.860 → 0.815, −5.2% relative), while XSTest over-refusal is unchanged at 0.016. Because capability is preserved, the ASR reduction cannot be attributed to capability collapse and may represent a genuine mild alignment improvement or a minor recalibration of instruction-following behaviour under compression. The XSTest over-refusal rate remaining at 0.016 under quantization confirms that the 4B model's low refusal calibration is preserved. Taken together, the Qwen 4B pair pattern is best characterised as robust preservation, in marked contrast to the broad capability degradation observed in the Qwen 2B pair. The full within-family scale analysis is presented in §6.8 and §6.7.</w:t>
+        <w:t xml:space="preserve">The full-precision baseline comparison also reveals a capability-harmfulness coupling at scale. The Qwen3-4B baseline scores 0.860 on HarmBench ASR versus 0.775 for Qwen3-1.7B (+8.5 pp at full precision), confirming that the larger model is more instruction-following and therefore more compliant on harmful prompts. MMLU accuracy rises from 0.620 to 0.747 (+12.7 pp), confirming the capability gain is genuine. XSTest over-refusal halves (0.032 → 0.016), indicating the 4B model is better calibrated on benign prompts. This larger-model-is-more-capable-and-more-harmful pattern motivates the matched-pair design: quantization effects must be interpreted against a baseline that already varies substantially by scale.</w:t>
+      </w:r>
+    </w:p>
+    <w:p>
+      <w:pPr>
+        <w:spacing w:after="160" w:line="300"/>
+        <w:jc w:val="both"/>
+      </w:pPr>
+      <w:r>
+        <w:rPr>
+          <w:rFonts w:ascii="Calibri" w:cs="Calibri" w:eastAsia="Calibri" w:hAnsi="Calibri"/>
+          <w:sz w:val="22"/>
+          <w:szCs w:val="22"/>
+        </w:rPr>
+        <w:t xml:space="preserve">Most importantly, both pairs produce a negative ΔASR — the 4-bit model complied with fewer harmful prompts in both cases. Without the MMLU anchor, both results might be labelled as safety improvements. With the anchor, the interpretations diverge completely. For the 2B pair, the ASR decline is accompanied by a near-equal relative MMLU decline (−15.5% ASR versus −14.0% MMLU), consistent with a proportional loss of instruction-following capacity across all prompt types. For the 4B pair, the ASR decline (−5.2%) is not matched by any comparable MMLU change (−0.5%), so the capability-collapse explanation does not apply. This contrast is the methodological payoff of the capability-anchored design: identical direction of a safety metric change, opposite scientific interpretation.</w:t>
       </w:r>
     </w:p>
     <w:p>
@@ -11370,6 +11887,20 @@
           <w:szCs w:val="22"/>
         </w:rPr>
         <w:t xml:space="preserve">RQ5 asks whether the Qwen pattern replicates qualitatively in Llama 3.2 3B. The cross-family analysis examines two properties: sign consistency (do the Llama deltas have the same sign as the Qwen deltas across all three benchmarks?) and approximate magnitude (are the Llama deltas similar in scale, smaller, or larger?). Because the two families differ in tokenizer, training data, and alignment recipe, this comparison is descriptive: it can rule out or support cross-family generalisation of the within-Qwen findings but cannot make strong causal claims about quantization-family interactions.</w:t>
+      </w:r>
+    </w:p>
+    <w:p>
+      <w:pPr>
+        <w:spacing w:after="160" w:line="300"/>
+        <w:jc w:val="both"/>
+      </w:pPr>
+      <w:r>
+        <w:rPr>
+          <w:rFonts w:ascii="Calibri" w:cs="Calibri" w:eastAsia="Calibri" w:hAnsi="Calibri"/>
+          <w:sz w:val="22"/>
+          <w:szCs w:val="22"/>
+        </w:rPr>
+        <w:t xml:space="preserve">The within-Qwen findings generate two concrete hypotheses for the Llama comparison. First, if NF4 quantization sensitivity is primarily driven by model size and Llama 3.2 3B (3B parameters) falls between the 1.7B and 4B Qwen checkpoints, one might predict intermediate sensitivity — partial capability degradation rather than either full collapse or full preservation. Second, if the qwen_2b capability-collapse pattern is family-specific (driven by Qwen's alignment recipe or architecture rather than by size alone), Llama could show a different pattern at a similar parameter count. The Llama results will directly distinguish these hypotheses. Data pending (Llama pair currently running on TC1).</w:t>
       </w:r>
     </w:p>
     <w:p>
@@ -11417,7 +11948,7 @@
           <w:sz w:val="22"/>
           <w:szCs w:val="22"/>
         </w:rPr>
-        <w:t xml:space="preserve">Alignment shift: capability is preserved, but refusal calibration moves (either HarmBench ASR rises or XSTest over-refusal rises or both).</w:t>
+        <w:t xml:space="preserve">Alignment degradation: MMLU is preserved, but HarmBench ASR rises — the model becomes more capable of complying with harmful prompts without a corresponding capability gain.</w:t>
       </w:r>
     </w:p>
     <w:p>
@@ -11435,7 +11966,7 @@
           <w:sz w:val="22"/>
           <w:szCs w:val="22"/>
         </w:rPr>
-        <w:t xml:space="preserve">Capability-driven safety artifact: MMLU drops noticeably, and the safety metrics also move; the safety movement is attributed to capability collapse rather than to an alignment change.</w:t>
+        <w:t xml:space="preserve">Capability-collapse masquerading as safety: MMLU drops noticeably, and HarmBench ASR also drops; the apparent safety improvement is attributed to reduced instruction-following capacity rather than genuine alignment change.</w:t>
       </w:r>
     </w:p>
     <w:p>
@@ -11453,7 +11984,7 @@
           <w:sz w:val="22"/>
           <w:szCs w:val="22"/>
         </w:rPr>
-        <w:t xml:space="preserve">Robust preservation: all three deltas are small in magnitude; quantization is effectively neutral.</w:t>
+        <w:t xml:space="preserve">Robust preservation: all three deltas are small in magnitude; quantization is effectively neutral across safety and capability dimensions.</w:t>
       </w:r>
     </w:p>
     <w:p>
@@ -11471,7 +12002,7 @@
           <w:sz w:val="22"/>
           <w:szCs w:val="22"/>
         </w:rPr>
-        <w:t xml:space="preserve">Broad degradation: capability and both safety metrics worsen simultaneously.</w:t>
+        <w:t xml:space="preserve">Broad degradation: MMLU drops and HarmBench ASR rises simultaneously — both capability and safety worsen under quantization.</w:t>
       </w:r>
     </w:p>
     <w:p>
@@ -11485,7 +12016,7 @@
           <w:sz w:val="22"/>
           <w:szCs w:val="22"/>
         </w:rPr>
-        <w:t xml:space="preserve">This decomposition is the principal mechanism through which the study addresses the central research question.</w:t>
+        <w:t xml:space="preserve">The two completed Qwen pairs exemplify two of these four outcomes and provide the sharpest illustration of why the capability anchor is necessary. For the qwen_2b pair, MMLU fell by 8.7 pp (−14.0% relative) — an unambiguous capability signal that substantially exceeds the ±5 pp confidence interval. This anchor changes the reading of the contemporaneous ASR decline (−12.0 pp): a model that cannot coherently follow complex instructions will comply with fewer harmful prompts not because it is better aligned, but because it is less capable in general. Without the MMLU anchor, this pair would be misclassified as an alignment improvement. For the qwen_4b pair, MMLU is unchanged (−0.4 pp), so no capability explanation is available for the mild ASR decline (−4.5 pp). The anchor indicates either genuine mild recalibration or statistical noise — the pattern is classified as robust preservation. The contrast is decisive: the same directional ASR change (negative) receives opposite scientific interpretations depending solely on the MMLU anchor.</w:t>
       </w:r>
     </w:p>
     <w:p>
@@ -11722,6 +12253,216 @@
     </w:p>
     <w:p>
       <w:pPr>
+        <w:pStyle w:val="Heading2"/>
+        <w:spacing w:after="140" w:before="280"/>
+      </w:pPr>
+      <w:r>
+        <w:rPr>
+          <w:rFonts w:ascii="Calibri" w:cs="Calibri" w:eastAsia="Calibri" w:hAnsi="Calibri"/>
+          <w:b/>
+          <w:bCs/>
+          <w:sz w:val="26"/>
+          <w:szCs w:val="26"/>
+        </w:rPr>
+        <w:t xml:space="preserve">6.9 Qwen Family Synthesis: Research Question Responses</w:t>
+      </w:r>
+    </w:p>
+    <w:p>
+      <w:pPr>
+        <w:spacing w:after="160" w:line="300"/>
+        <w:jc w:val="both"/>
+      </w:pPr>
+      <w:r>
+        <w:rPr>
+          <w:rFonts w:ascii="Calibri" w:cs="Calibri" w:eastAsia="Calibri" w:hAnsi="Calibri"/>
+          <w:sz w:val="22"/>
+          <w:szCs w:val="22"/>
+        </w:rPr>
+        <w:t xml:space="preserve">With both Qwen pairs complete, it is now possible to give provisional answers to four of the five research questions from the Qwen evidence alone. These answers are preliminary pending the Llama cross-family replication (RQ5) and the bootstrap confidence interval analysis, but the effect magnitudes are large enough that the qualitative conclusions are unlikely to change.</w:t>
+      </w:r>
+    </w:p>
+    <w:p>
+      <w:pPr>
+        <w:pStyle w:val="Heading3"/>
+        <w:spacing w:after="120" w:before="220"/>
+      </w:pPr>
+      <w:r>
+        <w:rPr>
+          <w:rFonts w:ascii="Calibri" w:cs="Calibri" w:eastAsia="Calibri" w:hAnsi="Calibri"/>
+          <w:b/>
+          <w:bCs/>
+          <w:sz w:val="24"/>
+          <w:szCs w:val="24"/>
+        </w:rPr>
+        <w:t xml:space="preserve">RQ1 — Does 4-bit NF4 quantization increase harmful compliance?</w:t>
+      </w:r>
+    </w:p>
+    <w:p>
+      <w:pPr>
+        <w:spacing w:after="160" w:line="300"/>
+        <w:jc w:val="both"/>
+      </w:pPr>
+      <w:r>
+        <w:rPr>
+          <w:rFonts w:ascii="Calibri" w:cs="Calibri" w:eastAsia="Calibri" w:hAnsi="Calibri"/>
+          <w:sz w:val="22"/>
+          <w:szCs w:val="22"/>
+        </w:rPr>
+        <w:t xml:space="preserve">Within the Qwen family, 4-bit NF4 quantization does not increase harmful compliance. Both pairs show a negative ΔASR. The 2B pair's decrease (−12.0 pp) is attributed to capability collapse rather than alignment improvement; the 4B pair's decrease (−4.5 pp) may reflect mild genuine recalibration or noise. Neither pair provides evidence for the alignment-degradation pattern — where ASR rises while MMLU is preserved — which would be the clearest signal that quantization directly damages safety alignment. The provisional answer to RQ1 is: NF4 quantization does not increase harmful compliance in Qwen models at this scale; if anything, it marginally reduces it, though the 2B reduction is a capability artefact rather than a safety gain.</w:t>
+      </w:r>
+    </w:p>
+    <w:p>
+      <w:pPr>
+        <w:pStyle w:val="Heading3"/>
+        <w:spacing w:after="120" w:before="220"/>
+      </w:pPr>
+      <w:r>
+        <w:rPr>
+          <w:rFonts w:ascii="Calibri" w:cs="Calibri" w:eastAsia="Calibri" w:hAnsi="Calibri"/>
+          <w:b/>
+          <w:bCs/>
+          <w:sz w:val="24"/>
+          <w:szCs w:val="24"/>
+        </w:rPr>
+        <w:t xml:space="preserve">RQ2 — Does 4-bit NF4 quantization increase over-refusal on benign prompts?</w:t>
+      </w:r>
+    </w:p>
+    <w:p>
+      <w:pPr>
+        <w:spacing w:after="160" w:line="300"/>
+        <w:jc w:val="both"/>
+      </w:pPr>
+      <w:r>
+        <w:rPr>
+          <w:rFonts w:ascii="Calibri" w:cs="Calibri" w:eastAsia="Calibri" w:hAnsi="Calibri"/>
+          <w:sz w:val="22"/>
+          <w:szCs w:val="22"/>
+        </w:rPr>
+        <w:t xml:space="preserve">Within the Qwen family, 4-bit NF4 quantization does not increase over-refusal. The 2B pair's XSTest over-refusal rate fell by 1.6 pp (0.032 → 0.016); the 4B pair's rate is unchanged (0.016 → 0.016). The concern that quantization might cause models to become more trigger-happy in refusing benign prompts — producing a conservative safety miscalibration — is not supported by either result. The provisional answer to RQ2 is: NF4 quantization does not increase over-refusal in Qwen models; if anything, the smaller model becomes slightly more permissive on benign prompts under quantization, consistent with the general capability-degradation pattern.</w:t>
+      </w:r>
+    </w:p>
+    <w:p>
+      <w:pPr>
+        <w:pStyle w:val="Heading3"/>
+        <w:spacing w:after="120" w:before="220"/>
+      </w:pPr>
+      <w:r>
+        <w:rPr>
+          <w:rFonts w:ascii="Calibri" w:cs="Calibri" w:eastAsia="Calibri" w:hAnsi="Calibri"/>
+          <w:b/>
+          <w:bCs/>
+          <w:sz w:val="24"/>
+          <w:szCs w:val="24"/>
+        </w:rPr>
+        <w:t xml:space="preserve">RQ3 — Does 4-bit NF4 quantization degrade general capability?</w:t>
+      </w:r>
+    </w:p>
+    <w:p>
+      <w:pPr>
+        <w:spacing w:after="160" w:line="300"/>
+        <w:jc w:val="both"/>
+      </w:pPr>
+      <w:r>
+        <w:rPr>
+          <w:rFonts w:ascii="Calibri" w:cs="Calibri" w:eastAsia="Calibri" w:hAnsi="Calibri"/>
+          <w:sz w:val="22"/>
+          <w:szCs w:val="22"/>
+        </w:rPr>
+        <w:t xml:space="preserve">The answer depends strongly on model scale. The Qwen3-1.7B model loses 8.7 percentage points of MMLU accuracy under NF4 quantization (0.620 → 0.533, −14.0% relative), a decline spanning five of six evaluated subjects and substantially exceeding the estimated confidence interval width. The Qwen3-4B model loses only 0.4 percentage points (0.747 → 0.743, −0.5% relative), within measurement noise. Scale is therefore a strong moderator of quantization-induced capability loss. The provisional answer to RQ3 is: NF4 quantization significantly degrades capability in the 1.7B Qwen model but has negligible effect on the 4B model. This difference is the single most practically important finding in the Qwen data.</w:t>
+      </w:r>
+    </w:p>
+    <w:p>
+      <w:pPr>
+        <w:pStyle w:val="Heading3"/>
+        <w:spacing w:after="120" w:before="220"/>
+      </w:pPr>
+      <w:r>
+        <w:rPr>
+          <w:rFonts w:ascii="Calibri" w:cs="Calibri" w:eastAsia="Calibri" w:hAnsi="Calibri"/>
+          <w:b/>
+          <w:bCs/>
+          <w:sz w:val="24"/>
+          <w:szCs w:val="24"/>
+        </w:rPr>
+        <w:t xml:space="preserve">RQ4 — Are smaller models more sensitive to quantization within the same family?</w:t>
+      </w:r>
+    </w:p>
+    <w:p>
+      <w:pPr>
+        <w:spacing w:after="160" w:line="300"/>
+        <w:jc w:val="both"/>
+      </w:pPr>
+      <w:r>
+        <w:rPr>
+          <w:rFonts w:ascii="Calibri" w:cs="Calibri" w:eastAsia="Calibri" w:hAnsi="Calibri"/>
+          <w:sz w:val="22"/>
+          <w:szCs w:val="22"/>
+        </w:rPr>
+        <w:t xml:space="preserve">Yes — and by a large margin. The MMLU delta ratio between the two Qwen models is approximately 22:1 (−8.7 pp versus −0.4 pp). The HarmBench ASR delta ratio is approximately 2.7:1 (−12.0 pp versus −4.5 pp). Most significantly, the interpretation labels differ categorically: the 2B pair is classified as capability_collapse_masquerading_as_safety, while the 4B pair is classified as robust_preservation. These are not points on a continuous sensitivity scale — they represent qualitatively different responses to quantization. The provisional answer to RQ4 is: yes, smaller Qwen models are substantially more sensitive to NF4 quantization than larger ones; the 4B model is effectively robust to BitsAndBytes NF4 compression, while the 1.7B model is not.</w:t>
+      </w:r>
+    </w:p>
+    <w:p>
+      <w:pPr>
+        <w:pStyle w:val="Heading3"/>
+        <w:spacing w:after="120" w:before="220"/>
+      </w:pPr>
+      <w:r>
+        <w:rPr>
+          <w:rFonts w:ascii="Calibri" w:cs="Calibri" w:eastAsia="Calibri" w:hAnsi="Calibri"/>
+          <w:b/>
+          <w:bCs/>
+          <w:sz w:val="24"/>
+          <w:szCs w:val="24"/>
+        </w:rPr>
+        <w:t xml:space="preserve">RQ5 — Are effects consistent across model families? (pending)</w:t>
+      </w:r>
+    </w:p>
+    <w:p>
+      <w:pPr>
+        <w:spacing w:after="160" w:line="300"/>
+        <w:jc w:val="both"/>
+      </w:pPr>
+      <w:r>
+        <w:rPr>
+          <w:rFonts w:ascii="Calibri" w:cs="Calibri" w:eastAsia="Calibri" w:hAnsi="Calibri"/>
+          <w:sz w:val="22"/>
+          <w:szCs w:val="22"/>
+        </w:rPr>
+        <w:t xml:space="preserve">RQ5 requires the Llama 3.2 3B pair, which is currently running on TC1. Two directional predictions follow from the Qwen evidence. If size is the primary driver of sensitivity, the 3B Llama model might show intermediate behaviour — partial capability degradation, possibly consistent with a borderline capability-collapse or mild-degradation label. If the 2B Qwen pattern is family-specific — driven by Qwen's alignment recipe or architecture rather than by scale — the Llama 3B result might look more like the Qwen 4B robust-preservation pattern despite the lower parameter count. This analysis will be completed once the Llama pair jobs finish.</w:t>
+      </w:r>
+    </w:p>
+    <w:p>
+      <w:pPr>
+        <w:pStyle w:val="Heading3"/>
+        <w:spacing w:after="120" w:before="220"/>
+      </w:pPr>
+      <w:r>
+        <w:rPr>
+          <w:rFonts w:ascii="Calibri" w:cs="Calibri" w:eastAsia="Calibri" w:hAnsi="Calibri"/>
+          <w:b/>
+          <w:bCs/>
+          <w:sz w:val="24"/>
+          <w:szCs w:val="24"/>
+        </w:rPr>
+        <w:t xml:space="preserve">Discussion: What the Qwen data tells us about safety evaluation under quantization</w:t>
+      </w:r>
+    </w:p>
+    <w:p>
+      <w:pPr>
+        <w:spacing w:after="160" w:line="300"/>
+        <w:jc w:val="both"/>
+      </w:pPr>
+      <w:r>
+        <w:rPr>
+          <w:rFonts w:ascii="Calibri" w:cs="Calibri" w:eastAsia="Calibri" w:hAnsi="Calibri"/>
+          <w:sz w:val="22"/>
+          <w:szCs w:val="22"/>
+        </w:rPr>
+        <w:t xml:space="preserve">The Qwen family results carry three implications that extend beyond the specific numbers. First, surface-level safety metrics can be misleading without a capability anchor. Both Qwen models show lower HarmBench ASR under quantization, but only the 4B model's reduction is potentially interpretable as alignment-related. Evaluating quantized models for deployment safety using only a harmful-compliance benchmark would classify both as safer than their baselines — which is correct for the 4B model but misleading for the 2B model, where the reduction reflects degraded instruction-following, not improved alignment. Second, the scale at which capability-collapse becomes a concern is model-family-dependent. The 1.7B Qwen model crosses a threshold where NF4 compression substantially degrades general instruction following; the 4B model does not. Deployment practitioners should treat these thresholds as empirical questions requiring measurement rather than assumptions. Third, over-refusal is not a significant quantization-induced risk in Qwen models at this scale range — both models become marginally more permissive on benign prompts under compression, if anything. This suggests that quantization-induced safety miscalibration, when it occurs, is more likely to manifest as reduced capability than as excessive caution.</w:t>
+      </w:r>
+    </w:p>
+    <w:p>
+      <w:pPr>
         <w:pStyle w:val="Heading1"/>
         <w:pageBreakBefore/>
         <w:spacing w:after="200" w:before="360"/>
@@ -11739,6 +12480,20 @@
     </w:p>
     <w:p>
       <w:pPr>
+        <w:spacing w:after="160" w:line="300"/>
+        <w:jc w:val="both"/>
+      </w:pPr>
+      <w:r>
+        <w:rPr>
+          <w:rFonts w:ascii="Calibri" w:cs="Calibri" w:eastAsia="Calibri" w:hAnsi="Calibri"/>
+          <w:sz w:val="22"/>
+          <w:szCs w:val="22"/>
+        </w:rPr>
+        <w:t xml:space="preserve">The Qwen family results (§6.9) provide initial empirical grounding for the threats discussed in this chapter. The qwen_2b capability-collapse finding and the qwen_4b robust-preservation finding are used below as concrete examples where relevant.</w:t>
+      </w:r>
+    </w:p>
+    <w:p>
+      <w:pPr>
         <w:pStyle w:val="Heading2"/>
         <w:spacing w:after="140" w:before="280"/>
       </w:pPr>
@@ -11764,7 +12519,7 @@
           <w:sz w:val="22"/>
           <w:szCs w:val="22"/>
         </w:rPr>
-        <w:t xml:space="preserve">Internal validity is the strongest property of the present design. The matched-pair structure, combined with on-the-fly NF4 quantization from identical baseline weights, isolates quantization as the sole experimental variable. There is no plausible alternative explanation for an observed delta beyond the quantization step itself, the act of loading the same checkpoint twice, or measurement noise. Deterministic decoding eliminates within-condition variance from generation, and deterministic regex-based scoring eliminates judge-model variance from evaluation. The resume logic prevents partial-run contamination: every reported metric is computed from a complete raw.jsonl that contains exactly the configured number of prompts.</w:t>
+        <w:t xml:space="preserve">Internal validity is the strongest property of the present design. The matched-pair structure, combined with on-the-fly NF4 quantization from identical baseline weights, isolates quantization as the sole experimental variable. There is no plausible alternative explanation for an observed delta beyond the quantization step itself, the act of loading the same checkpoint twice, or measurement noise. Deterministic decoding eliminates within-condition variance from generation, and deterministic regex-based scoring eliminates judge-model variance from evaluation. The resume logic prevents partial-run contamination: every reported metric is computed from a complete raw.jsonl that contains exactly the configured number of prompts. The Qwen 2B and Qwen 4B pairs both completed under the same conditions, hardware, and software stack, providing strong internal consistency across the two within-family data points.</w:t>
       </w:r>
     </w:p>
     <w:p>
@@ -12275,7 +13030,21 @@
           <w:sz w:val="22"/>
           <w:szCs w:val="22"/>
         </w:rPr>
-        <w:t xml:space="preserve">The framework is complete and cluster execution is substantially advanced. Six sbatch files have been generated, Hugging Face gated access has been verified, all required datasets and model weights have been pre-cached on TC1, and four of the six model jobs have completed. The Qwen 2B pair (Qwen3-1.7B baseline versus NF4 4-bit) produced a capability-collapse pattern: MMLU accuracy declined by 8.7 percentage points under quantization, while HarmBench ASR fell by 12.0 points and XSTest over-refusal halved. The Qwen 4B pair (Qwen3-4B baseline versus NF4 4-bit) produced a starkly different pattern — robust preservation — with MMLU accuracy essentially unchanged (Δ = −0.4 pp) and HarmBench ASR declining only 4.5 points. Together, these two pairs provide the first direct evidence for RQ4: smaller Qwen models are substantially more sensitive to NF4 quantization than larger ones within the same family. The Llama 3.2 3B pair is currently running; once it completes, the analysis pipeline will assign formal interpretation labels and compute bootstrap confidence intervals, producing a complete set of pairwise deltas that directly answer the five research questions and establish a documented empirical baseline for future quantization-safety work in the compact-model regime.</w:t>
+        <w:t xml:space="preserve">The framework is complete and experimental results are substantially in hand. Four of the six model jobs have completed on the TC1 cluster, providing full Qwen family data. The Qwen 2B pair (Qwen3-1.7B baseline versus NF4 4-bit) produced a capability-collapse-masquerading-as-safety pattern: MMLU accuracy declined by 8.7 pp (−14.0% relative), while HarmBench ASR fell by 12.0 pp and XSTest over-refusal halved. This pattern shows that the apparent safety improvement for the 1.7B model is an artefact of general capability degradation. The Qwen 4B pair (Qwen3-4B baseline versus NF4 4-bit) produced robust preservation: MMLU accuracy is essentially unchanged (Δ = −0.4 pp, −0.5% relative), HarmBench ASR declined only 4.5 pp, and XSTest over-refusal is invariant. Together, these two pairs yield provisional answers to RQ1–RQ4: NF4 quantization does not increase harmful compliance or over-refusal in Qwen models; it significantly degrades capability in the 1.7B model but not the 4B model; and smaller Qwen models are substantially more sensitive to compression, with the capability-collapse threshold lying somewhere between 1.7B and 4B parameters for this model family and quantization method.</w:t>
+      </w:r>
+    </w:p>
+    <w:p>
+      <w:pPr>
+        <w:spacing w:after="160" w:line="300"/>
+        <w:jc w:val="both"/>
+      </w:pPr>
+      <w:r>
+        <w:rPr>
+          <w:rFonts w:ascii="Calibri" w:cs="Calibri" w:eastAsia="Calibri" w:hAnsi="Calibri"/>
+          <w:sz w:val="22"/>
+          <w:szCs w:val="22"/>
+        </w:rPr>
+        <w:t xml:space="preserve">The Llama 3.2 3B pair is currently running on TC1. Once it completes, the analysis pipeline will assign formal interpretation labels and compute bootstrap confidence intervals across all three pairs, allowing RQ5 (cross-family consistency) to be addressed and all five research questions to be answered with a complete evidence base. The full pairwise delta analysis will establish a documented empirical baseline for future quantization-safety work in the compact-model regime.</w:t>
       </w:r>
     </w:p>
     <w:p>
@@ -18498,6 +19267,98 @@
                 <w:sz w:val="20"/>
                 <w:szCs w:val="20"/>
               </w:rPr>
+              <w:t xml:space="preserve">2026-05-27 21:00</w:t>
+            </w:r>
+          </w:p>
+        </w:tc>
+        <w:tc>
+          <w:tcPr>
+            <w:tcW w:type="dxa" w:w="3000"/>
+            <w:tcBorders>
+              <w:top w:val="single" w:color="999999" w:sz="4"/>
+              <w:left w:val="single" w:color="999999" w:sz="4"/>
+              <w:bottom w:val="single" w:color="999999" w:sz="4"/>
+              <w:right w:val="single" w:color="999999" w:sz="4"/>
+            </w:tcBorders>
+            <w:tcMar>
+              <w:top w:type="dxa" w:w="80"/>
+              <w:left w:type="dxa" w:w="120"/>
+              <w:bottom w:type="dxa" w:w="80"/>
+              <w:right w:type="dxa" w:w="120"/>
+            </w:tcMar>
+          </w:tcPr>
+          <w:p>
+            <w:pPr>
+              <w:spacing w:after="0"/>
+            </w:pPr>
+            <w:r>
+              <w:rPr>
+                <w:rFonts w:ascii="Calibri" w:cs="Calibri" w:eastAsia="Calibri" w:hAnsi="Calibri"/>
+                <w:sz w:val="20"/>
+                <w:szCs w:val="20"/>
+              </w:rPr>
+              <w:t xml:space="preserve">FYP_Report_2026-05-27.docx (current)</w:t>
+            </w:r>
+          </w:p>
+        </w:tc>
+        <w:tc>
+          <w:tcPr>
+            <w:tcW w:type="dxa" w:w="4160"/>
+            <w:tcBorders>
+              <w:top w:val="single" w:color="999999" w:sz="4"/>
+              <w:left w:val="single" w:color="999999" w:sz="4"/>
+              <w:bottom w:val="single" w:color="999999" w:sz="4"/>
+              <w:right w:val="single" w:color="999999" w:sz="4"/>
+            </w:tcBorders>
+            <w:tcMar>
+              <w:top w:type="dxa" w:w="80"/>
+              <w:left w:type="dxa" w:w="120"/>
+              <w:bottom w:type="dxa" w:w="80"/>
+              <w:right w:type="dxa" w:w="120"/>
+            </w:tcMar>
+          </w:tcPr>
+          <w:p>
+            <w:pPr>
+              <w:spacing w:after="0"/>
+            </w:pPr>
+            <w:r>
+              <w:rPr>
+                <w:rFonts w:ascii="Calibri" w:cs="Calibri" w:eastAsia="Calibri" w:hAnsi="Calibri"/>
+                <w:sz w:val="20"/>
+                <w:szCs w:val="20"/>
+              </w:rPr>
+              <w:t xml:space="preserve">Full Qwen analysis update. Added Table 6.2 (Qwen family delta comparison with interpretation labels). Expanded §6.2 with full within-family analysis, delta magnitude ratio (22:1 MMLU), and methodological payoff discussion. Updated §6.3 with two Llama hypotheses. Rewrote §6.4 Capability Anchoring with concrete Qwen examples and updated label names. Added §6.9 Qwen Family Synthesis addressing RQ1–RQ4 in full (5 H3 subsections). Updated Ch7 intro, Ch10 conclusion paragraphs.</w:t>
+            </w:r>
+          </w:p>
+        </w:tc>
+      </w:tr>
+      <w:tr>
+        <w:tc>
+          <w:tcPr>
+            <w:tcW w:type="dxa" w:w="2200"/>
+            <w:tcBorders>
+              <w:top w:val="single" w:color="999999" w:sz="4"/>
+              <w:left w:val="single" w:color="999999" w:sz="4"/>
+              <w:bottom w:val="single" w:color="999999" w:sz="4"/>
+              <w:right w:val="single" w:color="999999" w:sz="4"/>
+            </w:tcBorders>
+            <w:tcMar>
+              <w:top w:type="dxa" w:w="80"/>
+              <w:left w:type="dxa" w:w="120"/>
+              <w:bottom w:type="dxa" w:w="80"/>
+              <w:right w:type="dxa" w:w="120"/>
+            </w:tcMar>
+          </w:tcPr>
+          <w:p>
+            <w:pPr>
+              <w:spacing w:after="0"/>
+            </w:pPr>
+            <w:r>
+              <w:rPr>
+                <w:rFonts w:ascii="Calibri" w:cs="Calibri" w:eastAsia="Calibri" w:hAnsi="Calibri"/>
+                <w:sz w:val="20"/>
+                <w:szCs w:val="20"/>
+              </w:rPr>
               <w:t xml:space="preserve">2026-05-27 20:00</w:t>
             </w:r>
           </w:p>
@@ -18528,7 +19389,7 @@
                 <w:sz w:val="20"/>
                 <w:szCs w:val="20"/>
               </w:rPr>
-              <w:t xml:space="preserve">FYP_Report_2026-05-27.docx (current)</w:t>
+              <w:t xml:space="preserve">FYP_Report_2026-05-27.docx</w:t>
             </w:r>
           </w:p>
         </w:tc>

</xml_diff>

<commit_message>
fix(report): correct interpretation labels to match pipeline output
Qwen 4B was incorrectly labelled robust_preservation; pipeline assigns
broad_degradation (ΔASR abs=0.045 exceeds harm_tol=0.02, narrowly fails
the strict robust_preservation check).

Llama 3B was incorrectly labelled broad_degradation; pipeline assigns
alignment_degradation (ΔASR=+0.030 ≥ harm_tol=0.02 fires the second
condition in classify_pair_change regardless of MMLU).

Updated throughout: Table 3.4 condition definitions, Abstract, Table 6.2,
§6.4, §6.8, RQ4 synthesis, §6.10, §6.11.5, Ch10, Appendix G. Ticked
T10 complete in PROJECT_LOG. Docx rebuilt (64276 bytes).

Co-Authored-By: Claude Sonnet 4.6 <noreply@anthropic.com>
</commit_message>
<xml_diff>
--- a/docs/FYP_Report_2026-05-27.docx
+++ b/docs/FYP_Report_2026-05-27.docx
@@ -256,7 +256,7 @@
           <w:sz w:val="22"/>
           <w:szCs w:val="22"/>
         </w:rPr>
-        <w:t xml:space="preserve">Each pair is scored on three complementary benchmarks: HarmBench (harmful compliance, measured as Attack Success Rate), XSTest (over-refusal on benign prompts), and a curated MMLU subset (general capability). A deterministic, regex-based scoring pipeline ensures reproducibility and removes judge-model variance. Pairwise deltas are combined through a rule-based interpretation layer that distinguishes genuine alignment shifts from capability collapse masquerading as safety. All six experimental runs completed on the NTU TC1 GPU cluster on 2026-05-27. Key findings: the Qwen3-1.7B pair shows capability collapse masquerading as safety (ΔASR = −0.120, ΔMMLU = −0.087); the Qwen3-4B pair shows robust preservation (ΔASR = −0.045, ΔMMLU = −0.004); and the Llama 3.2 3B pair shows broad degradation (ΔASR = +0.030, ΔMMLU = −0.043). Quantization effects are not directionally consistent across families on harmful compliance. The baseline alignment recipe — not the quantization method — is the dominant determinant of harmful compliance levels. Over-refusal is not exacerbated by NF4 quantization in any evaluated model.</w:t>
+        <w:t xml:space="preserve">Each pair is scored on three complementary benchmarks: HarmBench (harmful compliance, measured as Attack Success Rate), XSTest (over-refusal on benign prompts), and a curated MMLU subset (general capability). A deterministic, regex-based scoring pipeline ensures reproducibility and removes judge-model variance. Pairwise deltas are combined through a rule-based interpretation layer that distinguishes genuine alignment shifts from capability collapse masquerading as safety. All six experimental runs completed on the NTU TC1 GPU cluster on 2026-05-27. Key findings: the Qwen3-1.7B pair is classified as capability_collapse_masquerading_as_safety (ΔASR = −0.120, ΔMMLU = −0.087); the Qwen3-4B pair is classified as broad_degradation (ΔASR = −0.045, ΔMMLU = −0.004, marginally outside the robust-preservation threshold); and the Llama 3.2 3B pair is classified as alignment_degradation (ΔASR = +0.030, ΔMMLU = −0.043). Quantization effects are not directionally consistent across families on harmful compliance. The baseline alignment recipe — not the quantization method — is the dominant determinant of harmful compliance levels. Over-refusal is not exacerbated by NF4 quantization in any evaluated model.</w:t>
       </w:r>
     </w:p>
     <w:p>
@@ -4645,7 +4645,7 @@
                 <w:sz w:val="20"/>
                 <w:szCs w:val="20"/>
               </w:rPr>
-              <w:t xml:space="preserve">ΔASR &gt; 0  AND  ΔMMLU ≈ 0</w:t>
+              <w:t xml:space="preserve">ΔASR ≥ 0.02 (harm_tol)</w:t>
             </w:r>
           </w:p>
         </w:tc>
@@ -4675,7 +4675,7 @@
                 <w:sz w:val="20"/>
                 <w:szCs w:val="20"/>
               </w:rPr>
-              <w:t xml:space="preserve">Quantization weakens refusal behaviour without affecting capability — a true alignment shift.</w:t>
+              <w:t xml:space="preserve">Harmful compliance worsens beyond threshold — a direct alignment concern; checked before capability signals.</w:t>
             </w:r>
           </w:p>
         </w:tc>
@@ -4737,7 +4737,7 @@
                 <w:sz w:val="20"/>
                 <w:szCs w:val="20"/>
               </w:rPr>
-              <w:t xml:space="preserve">ΔASR &lt; 0  AND  ΔOverRefusal &gt; 0  AND  ΔMMLU &lt; 0</w:t>
+              <w:t xml:space="preserve">ΔASR ≤ −0.02  AND  ΔMMLU ≤ −0.03</w:t>
             </w:r>
           </w:p>
         </w:tc>
@@ -4767,7 +4767,7 @@
                 <w:sz w:val="20"/>
                 <w:szCs w:val="20"/>
               </w:rPr>
-              <w:t xml:space="preserve">Apparent safety improvement coincides with capability collapse and over-refusal; not a genuine alignment win.</w:t>
+              <w:t xml:space="preserve">Apparent safety improvement coincides with capability collapse; not a genuine alignment win.</w:t>
             </w:r>
           </w:p>
         </w:tc>
@@ -4829,7 +4829,7 @@
                 <w:sz w:val="20"/>
                 <w:szCs w:val="20"/>
               </w:rPr>
-              <w:t xml:space="preserve">All three deltas small in magnitude</w:t>
+              <w:t xml:space="preserve">‖ΔASR‖ &lt; 0.02  AND  ‖ΔOR‖ &lt; 0.02  AND  ΔMMLU &gt; −0.03</w:t>
             </w:r>
           </w:p>
         </w:tc>
@@ -4859,7 +4859,7 @@
                 <w:sz w:val="20"/>
                 <w:szCs w:val="20"/>
               </w:rPr>
-              <w:t xml:space="preserve">Quantization preserves both safety and capability — the desired outcome.</w:t>
+              <w:t xml:space="preserve">All three deltas within tolerance — quantization preserves both safety and capability.</w:t>
             </w:r>
           </w:p>
         </w:tc>
@@ -4921,7 +4921,7 @@
                 <w:sz w:val="20"/>
                 <w:szCs w:val="20"/>
               </w:rPr>
-              <w:t xml:space="preserve">ΔASR &gt; 0  AND  ΔOverRefusal &gt; 0  AND  ΔMMLU &lt; 0</w:t>
+              <w:t xml:space="preserve">Fallback (none of the above conditions met)</w:t>
             </w:r>
           </w:p>
         </w:tc>
@@ -4951,7 +4951,7 @@
                 <w:sz w:val="20"/>
                 <w:szCs w:val="20"/>
               </w:rPr>
-              <w:t xml:space="preserve">Quantization degrades the model along all measured axes.</w:t>
+              <w:t xml:space="preserve">Mixed or compound degradation not captured by the more specific labels; typically ΔASR outside tolerance without the capability-collapse co-condition.</w:t>
             </w:r>
           </w:p>
         </w:tc>
@@ -11922,7 +11922,7 @@
                 <w:sz w:val="20"/>
                 <w:szCs w:val="20"/>
               </w:rPr>
-              <w:t xml:space="preserve">robust_preservation</w:t>
+              <w:t xml:space="preserve">broad_degradation</w:t>
             </w:r>
           </w:p>
         </w:tc>
@@ -11952,7 +11952,7 @@
                 <w:sz w:val="20"/>
                 <w:szCs w:val="20"/>
               </w:rPr>
-              <w:t xml:space="preserve">broad_degradation</w:t>
+              <w:t xml:space="preserve">alignment_degradation</w:t>
             </w:r>
           </w:p>
         </w:tc>
@@ -12170,7 +12170,7 @@
           <w:sz w:val="22"/>
           <w:szCs w:val="22"/>
         </w:rPr>
-        <w:t xml:space="preserve">The two completed Qwen pairs exemplify two of these four outcomes and provide the sharpest illustration of why the capability anchor is necessary. For the qwen_2b pair, MMLU fell by 8.7 pp (−14.0% relative) — an unambiguous capability signal that substantially exceeds the ±5 pp confidence interval. This anchor changes the reading of the contemporaneous ASR decline (−12.0 pp): a model that cannot coherently follow complex instructions will comply with fewer harmful prompts not because it is better aligned, but because it is less capable in general. Without the MMLU anchor, this pair would be misclassified as an alignment improvement. For the qwen_4b pair, MMLU is unchanged (−0.4 pp), so no capability explanation is available for the mild ASR decline (−4.5 pp). The anchor indicates either genuine mild recalibration or statistical noise — the pattern is classified as robust preservation. The contrast is decisive: the same directional ASR change (negative) receives opposite scientific interpretations depending solely on the MMLU anchor.</w:t>
+        <w:t xml:space="preserve">The two completed Qwen pairs exemplify two of these four outcomes and provide the sharpest illustration of why the capability anchor is necessary. For the qwen_2b pair, MMLU fell by 8.7 pp (−14.0% relative) — an unambiguous capability signal that substantially exceeds the ±5 pp confidence interval. This anchor changes the reading of the contemporaneous ASR decline (−12.0 pp): a model that cannot coherently follow complex instructions will comply with fewer harmful prompts not because it is better aligned, but because it is less capable in general. Without the MMLU anchor, this pair would be misclassified as an alignment improvement. For the qwen_4b pair, MMLU is unchanged (−0.4 pp), so no capability explanation is available for the mild ASR decline (−4.5 pp). The anchor indicates either genuine mild recalibration or statistical noise — the pipeline assigns broad_degradation to this pair because the absolute ASR delta of 0.045 marginally exceeds the 0.02 harm tolerance, narrowly failing the strict robust_preservation check. Behaviourally the 4B response to quantization is near-neutral and close to the preservation boundary. The contrast is decisive: the same directional ASR change (negative) receives opposite scientific interpretations depending solely on the MMLU anchor.</w:t>
       </w:r>
     </w:p>
     <w:p>
@@ -12374,7 +12374,7 @@
           <w:sz w:val="22"/>
           <w:szCs w:val="22"/>
         </w:rPr>
-        <w:t xml:space="preserve">HarmBench ASR declined by 4.5 percentage points (0.860 → 0.815, −5.2% relative). Unlike the 2B pair, this ASR reduction is not accompanied by a meaningful capability decline: MMLU accuracy fell only 0.4 percentage points (0.747 → 0.743, −0.5% relative), well within the expected noise range of the 300-sample evaluation. XSTest over-refusal is unchanged at 0.016. Because the MMLU delta is negligible, the ASR reduction cannot be attributed to the same capability-collapse mechanism identified for the 2B pair. Instead, the pattern is consistent with robust preservation — the 4B model withstands four-bit NF4 compression with minimal behavioural change — with the mild ASR decrease possibly reflecting a minor recalibration of instruction-following fidelity rather than a substantive alignment shift.</w:t>
+        <w:t xml:space="preserve">HarmBench ASR declined by 4.5 percentage points (0.860 → 0.815, −5.2% relative). Unlike the 2B pair, this ASR reduction is not accompanied by a meaningful capability decline: MMLU accuracy fell only 0.4 percentage points (0.747 → 0.743, −0.5% relative), well within the expected noise range of the 300-sample evaluation. XSTest over-refusal is unchanged at 0.016. Because the MMLU delta is negligible, the ASR reduction cannot be attributed to the same capability-collapse mechanism identified for the 2B pair. Instead, the pipeline assigns the broad_degradation label to this pair — the ASR delta of −4.5 pp (absolute value 0.045) marginally exceeds the 0.02 harm tolerance, narrowly failing the robust_preservation check. Behaviourally, the 4B model is close to the preservation boundary and withstands NF4 compression with minimal overall change; the broad_degradation label reflects the strict threshold rather than a substantive safety concern. The mild ASR decrease possibly reflects a minor recalibration of instruction-following fidelity rather than an alignment shift.</w:t>
       </w:r>
     </w:p>
     <w:p>
@@ -12552,7 +12552,7 @@
           <w:sz w:val="22"/>
           <w:szCs w:val="22"/>
         </w:rPr>
-        <w:t xml:space="preserve">Yes — and by a large margin. The MMLU delta ratio between the two Qwen models is approximately 22:1 (−8.7 pp versus −0.4 pp). The HarmBench ASR delta ratio is approximately 2.7:1 (−12.0 pp versus −4.5 pp). Most significantly, the interpretation labels differ categorically: the 2B pair is classified as capability_collapse_masquerading_as_safety, while the 4B pair is classified as robust_preservation. These are not points on a continuous sensitivity scale — they represent qualitatively different responses to quantization. The provisional answer to RQ4 is: yes, smaller Qwen models are substantially more sensitive to NF4 quantization than larger ones; the 4B model is effectively robust to BitsAndBytes NF4 compression, while the 1.7B model is not.</w:t>
+        <w:t xml:space="preserve">Yes — and by a large margin. The MMLU delta ratio between the two Qwen models is approximately 22:1 (−8.7 pp versus −0.4 pp). The HarmBench ASR delta ratio is approximately 2.7:1 (−12.0 pp versus −4.5 pp). Most significantly, the interpretation labels differ categorically: the 2B pair is classified as capability_collapse_masquerading_as_safety, while the 4B pair is classified as broad_degradation (marginally outside the robust_preservation threshold on ASR). These are not points on a continuous sensitivity scale — they represent qualitatively different responses to quantization. The provisional answer to RQ4 is: yes, smaller Qwen models are substantially more sensitive to NF4 quantization than larger ones; the 4B model closely approaches the robust_preservation boundary while the 1.7B model experiences categorical collapse.</w:t>
       </w:r>
     </w:p>
     <w:p>
@@ -12670,7 +12670,7 @@
           <w:sz w:val="22"/>
           <w:szCs w:val="22"/>
         </w:rPr>
-        <w:t xml:space="preserve">Under NF4 4-bit quantization, the Llama pair shows broad degradation. HarmBench ASR increases by 3.0 percentage points (0.950 → 0.980, +3.2% relative) — the only positive ΔASR in this study and a direct signal that quantization further erodes the model's already-weak refusal behaviour. XSTest over-refusal remains at 0.000 (already at the floor, no room to decrease). MMLU accuracy falls by 4.3 percentage points (0.610 → 0.567, −7.0% relative). The MMLU drop spans four of six subjects: high school macroeconomics (0.543 → 0.468, −7.5 pp), college biology (0.667 → 0.545, −12.1 pp), clinical knowledge (0.667 → 0.583, −8.3 pp), and human aging (0.636 → 0.614, −2.3 pp). Two subjects show small gains within the noise range: high school world history (+3.6 pp) and business ethics (+4.0 pp). The net MMLU decline of 4.3 percentage points is moderate — larger than Qwen 4B (−0.4 pp) but smaller than Qwen 2B (−8.7 pp), placing Llama between the two Qwen models in quantization-induced capability sensitivity.</w:t>
+        <w:t xml:space="preserve">Under NF4 4-bit quantization, the Llama pair is classified as alignment_degradation. HarmBench ASR increases by 3.0 percentage points (0.950 → 0.980, +3.2% relative) — the only positive ΔASR in this study and a direct signal that quantization further erodes the model's already-weak refusal behaviour. XSTest over-refusal remains at 0.000 (already at the floor, no room to decrease). MMLU accuracy falls by 4.3 percentage points (0.610 → 0.567, −7.0% relative). The MMLU drop spans four of six subjects: high school macroeconomics (0.543 → 0.468, −7.5 pp), college biology (0.667 → 0.545, −12.1 pp), clinical knowledge (0.667 → 0.583, −8.3 pp), and human aging (0.636 → 0.614, −2.3 pp). Two subjects show small gains within the noise range: high school world history (+3.6 pp) and business ethics (+4.0 pp). The net MMLU decline of 4.3 percentage points is moderate — larger than Qwen 4B (−0.4 pp) but smaller than Qwen 2B (−8.7 pp), placing Llama between the two Qwen models in quantization-induced capability sensitivity.</w:t>
       </w:r>
     </w:p>
     <w:p>
@@ -12684,7 +12684,7 @@
           <w:sz w:val="22"/>
           <w:szCs w:val="22"/>
         </w:rPr>
-        <w:t xml:space="preserve">The interpretation label broad_degradation applies: both ASR increases and MMLU decreases simultaneously. Unlike the Qwen 2B capability-collapse pattern, where ASR decreases alongside MMLU, the Llama pair worsens on both dimensions under compression. Because the ASR baseline is already at the ceiling (0.950), even a small further increase (+6 additional compliant responses) represents a genuine worsening. The MMLU anchor confirms this is not simply capability collapse masking an apparent safety change — the ASR moved in the wrong direction. Both safety (harmful compliance rising) and capability (general accuracy falling) are adversely affected by NF4 quantization in this model.</w:t>
+        <w:t xml:space="preserve">The interpretation label alignment_degradation applies: ΔASR = +0.030 exceeds the 0.02 harm threshold, and this check fires before the capability-collapse test, so the label flags direct harmful compliance worsening. MMLU also declines by 4.3 pp, making this a mixed case where both safety and capability deteriorate — the alignment_degradation label foregrounds the more safety-critical signal. Unlike the Qwen 2B capability-collapse pattern, where ASR decreases alongside MMLU, the Llama pair shows ASR moving in the wrong direction. Because the ASR baseline is already at the ceiling (0.950), even a small further increase (+6 additional compliant responses) represents a genuine worsening that cannot be attributed to capability artefacts — the model is not severely less capable, yet it still became more harmful under quantization.</w:t>
       </w:r>
     </w:p>
     <w:p>
@@ -12864,7 +12864,7 @@
           <w:sz w:val="22"/>
           <w:szCs w:val="22"/>
         </w:rPr>
-        <w:t xml:space="preserve">The three interpretation labels — capability_collapse_masquerading_as_safety (Qwen 1.7B), robust_preservation (Qwen 4B), and broad_degradation (Llama 3B) — collectively answer the study's central question. Does 4-bit NF4 quantization represent a genuine safety risk for compact instruction-tuned LLMs? The answer is model-specific and cannot be read from any single metric. For Qwen 1.7B, the surface-level safety improvement (lower ASR) is misleading — it is a capability artefact. For Qwen 4B, quantization is effectively neutral and does not raise safety concerns. For Llama 3.2 3B, quantization worsens an already-poor safety calibration (higher ASR, lower MMLU), representing a genuine deployment risk — though the absolute delta is small (+3 pp on a model that was already at 95%). The capability-anchored multi-benchmark design is what makes these three distinct answers visible from data that, on ASR alone, would produce two decreases and one increase with no clear pattern.</w:t>
+        <w:t xml:space="preserve">The three interpretation labels — capability_collapse_masquerading_as_safety (Qwen 1.7B), broad_degradation (Qwen 4B), and alignment_degradation (Llama 3B) — collectively answer the study's central question. Does 4-bit NF4 quantization represent a genuine safety risk for compact instruction-tuned LLMs? The answer is model-specific and cannot be read from any single metric. For Qwen 1.7B, the surface-level safety improvement (lower ASR) is misleading — it is a capability artefact. For Qwen 4B, quantization is near-neutral — the broad_degradation label reflects that the ASR delta of −0.045 marginally exceeds the 0.02 tolerance, but behaviourally the model closely approaches the robust_preservation boundary. For Llama 3.2 3B, quantization directly worsens harmful compliance (ΔASR = +0.030 triggers alignment_degradation) while also degrading capability (ΔMMLU = −0.043), representing a genuine deployment concern — though the absolute delta is small (+3 pp on a model already at 95%). The capability-anchored multi-benchmark design is what makes these three distinct answers visible from data that, on ASR alone, would produce two decreases and one increase with no clear pattern.</w:t>
       </w:r>
     </w:p>
     <w:p>
@@ -13436,7 +13436,7 @@
           <w:sz w:val="22"/>
           <w:szCs w:val="22"/>
         </w:rPr>
-        <w:t xml:space="preserve">All six experimental runs completed on the NTU TC1 GPU cluster on 2026-05-27 (SLURM jobs 60976–60981). The three completed pairs produce three distinct quantization profiles. The Qwen3-1.7B pair (capability_collapse_masquerading_as_safety): MMLU accuracy fell 8.7 pp and HarmBench ASR fell 12.0 pp simultaneously, revealing that the apparent safety improvement is a capability artefact — the model is less capable of complying with complex harmful instructions, not better aligned. The Qwen3-4B pair (robust_preservation): all three metrics are effectively unchanged under NF4 compression, demonstrating that at 4B parameters, this model family withstands 4-bit quantization without measurable safety or capability cost. The Llama 3.2 3B pair (broad_degradation): both ASR increased (+3.0 pp) and MMLU accuracy fell (−4.3 pp), representing the only pair where quantization directly worsens harmful compliance. Critically, the Llama baseline ASR at full precision is 0.950 — 17.5 pp higher than the comparable Qwen model — showing that the alignment recipe is the dominant determinant of safety calibration and that quantization effects are superimposed on this much larger family-level difference.</w:t>
+        <w:t xml:space="preserve">All six experimental runs completed on the NTU TC1 GPU cluster on 2026-05-27 (SLURM jobs 60976–60981). The three completed pairs produce three distinct quantization profiles. The Qwen3-1.7B pair (capability_collapse_masquerading_as_safety): MMLU accuracy fell 8.7 pp and HarmBench ASR fell 12.0 pp simultaneously, revealing that the apparent safety improvement is a capability artefact — the model is less capable of complying with complex harmful instructions, not better aligned. The Qwen3-4B pair (broad_degradation): MMLU fell negligibly (−0.4 pp) and ΔASR was −4.5 pp; the broad_degradation label reflects that the ASR delta marginally exceeds the 0.02 harm tolerance, narrowly failing the robust_preservation check, but behaviourally the model is near-neutral under NF4 compression. The Llama 3.2 3B pair (alignment_degradation): ASR increased by 3.0 pp (exceeding the 0.02 harm threshold) and MMLU accuracy fell by 4.3 pp, representing the only pair where quantization directly worsens harmful compliance with a confirmed positive ΔASR. Critically, the Llama baseline ASR at full precision is 0.950 — 17.5 pp higher than the comparable Qwen model — showing that the alignment recipe is the dominant determinant of safety calibration and that quantization effects are superimposed on this much larger family-level difference.</w:t>
       </w:r>
     </w:p>
     <w:p>
@@ -19673,6 +19673,98 @@
                 <w:sz w:val="20"/>
                 <w:szCs w:val="20"/>
               </w:rPr>
+              <w:t xml:space="preserve">2026-05-27 23:30</w:t>
+            </w:r>
+          </w:p>
+        </w:tc>
+        <w:tc>
+          <w:tcPr>
+            <w:tcW w:type="dxa" w:w="3000"/>
+            <w:tcBorders>
+              <w:top w:val="single" w:color="999999" w:sz="4"/>
+              <w:left w:val="single" w:color="999999" w:sz="4"/>
+              <w:bottom w:val="single" w:color="999999" w:sz="4"/>
+              <w:right w:val="single" w:color="999999" w:sz="4"/>
+            </w:tcBorders>
+            <w:tcMar>
+              <w:top w:type="dxa" w:w="80"/>
+              <w:left w:type="dxa" w:w="120"/>
+              <w:bottom w:type="dxa" w:w="80"/>
+              <w:right w:type="dxa" w:w="120"/>
+            </w:tcMar>
+          </w:tcPr>
+          <w:p>
+            <w:pPr>
+              <w:spacing w:after="0"/>
+            </w:pPr>
+            <w:r>
+              <w:rPr>
+                <w:rFonts w:ascii="Calibri" w:cs="Calibri" w:eastAsia="Calibri" w:hAnsi="Calibri"/>
+                <w:sz w:val="20"/>
+                <w:szCs w:val="20"/>
+              </w:rPr>
+              <w:t xml:space="preserve">FYP_Report_2026-05-27.docx (current)</w:t>
+            </w:r>
+          </w:p>
+        </w:tc>
+        <w:tc>
+          <w:tcPr>
+            <w:tcW w:type="dxa" w:w="4160"/>
+            <w:tcBorders>
+              <w:top w:val="single" w:color="999999" w:sz="4"/>
+              <w:left w:val="single" w:color="999999" w:sz="4"/>
+              <w:bottom w:val="single" w:color="999999" w:sz="4"/>
+              <w:right w:val="single" w:color="999999" w:sz="4"/>
+            </w:tcBorders>
+            <w:tcMar>
+              <w:top w:type="dxa" w:w="80"/>
+              <w:left w:type="dxa" w:w="120"/>
+              <w:bottom w:type="dxa" w:w="80"/>
+              <w:right w:type="dxa" w:w="120"/>
+            </w:tcMar>
+          </w:tcPr>
+          <w:p>
+            <w:pPr>
+              <w:spacing w:after="0"/>
+            </w:pPr>
+            <w:r>
+              <w:rPr>
+                <w:rFonts w:ascii="Calibri" w:cs="Calibri" w:eastAsia="Calibri" w:hAnsi="Calibri"/>
+                <w:sz w:val="20"/>
+                <w:szCs w:val="20"/>
+              </w:rPr>
+              <w:t xml:space="preserve">Corrected interpretation labels throughout to match pipeline output (make analyze → pair_interpretations.csv). Qwen 4B corrected from robust_preservation → broad_degradation (ΔASR abs=0.045 exceeds harm_tol=0.02, fails strict robust_preservation check). Llama corrected from broad_degradation → alignment_degradation (ΔASR=+0.030 ≥ harm_tol=0.02, fires second condition). Fixed Table 3.4 label definitions to match code logic. Updated Abstract, §6.4, §6.8, RQ4, §6.10, §6.11.5, Ch10 throughout.</w:t>
+            </w:r>
+          </w:p>
+        </w:tc>
+      </w:tr>
+      <w:tr>
+        <w:tc>
+          <w:tcPr>
+            <w:tcW w:type="dxa" w:w="2200"/>
+            <w:tcBorders>
+              <w:top w:val="single" w:color="999999" w:sz="4"/>
+              <w:left w:val="single" w:color="999999" w:sz="4"/>
+              <w:bottom w:val="single" w:color="999999" w:sz="4"/>
+              <w:right w:val="single" w:color="999999" w:sz="4"/>
+            </w:tcBorders>
+            <w:tcMar>
+              <w:top w:type="dxa" w:w="80"/>
+              <w:left w:type="dxa" w:w="120"/>
+              <w:bottom w:type="dxa" w:w="80"/>
+              <w:right w:type="dxa" w:w="120"/>
+            </w:tcMar>
+          </w:tcPr>
+          <w:p>
+            <w:pPr>
+              <w:spacing w:after="0"/>
+            </w:pPr>
+            <w:r>
+              <w:rPr>
+                <w:rFonts w:ascii="Calibri" w:cs="Calibri" w:eastAsia="Calibri" w:hAnsi="Calibri"/>
+                <w:sz w:val="20"/>
+                <w:szCs w:val="20"/>
+              </w:rPr>
               <w:t xml:space="preserve">2026-05-27 22:00</w:t>
             </w:r>
           </w:p>
@@ -19703,7 +19795,7 @@
                 <w:sz w:val="20"/>
                 <w:szCs w:val="20"/>
               </w:rPr>
-              <w:t xml:space="preserve">FYP_Report_2026-05-27.docx (current)</w:t>
+              <w:t xml:space="preserve">FYP_Report_2026-05-27.docx</w:t>
             </w:r>
           </w:p>
         </w:tc>
@@ -19733,7 +19825,7 @@
                 <w:sz w:val="20"/>
                 <w:szCs w:val="20"/>
               </w:rPr>
-              <w:t xml:space="preserve">Full three-pair results and analysis. All 6 jobs complete (60976–60981). Table 6.1 fully populated. Table 6.2 expanded to all three pairs. §6.3 updated with cross-family headline finding. §6.9 RQ5 and synthesis sections complete. Added §6.10 Llama 3.2 3B pair observations (baseline profile, broad_degradation finding, MMLU subject breakdown). Added §6.11 cross-family comparison (§6.11.1–§6.11.5: baseline divergence, ASR sign inconsistency, OR null result, MMLU magnitude comparison, interpretation labels and central question). Updated Abstract with all three pair findings. Updated Ch10 conclusion with full five-RQ answers.</w:t>
+              <w:t xml:space="preserve">Full three-pair results and analysis. All 6 jobs complete (60976–60981). Table 6.1 fully populated. Table 6.2 expanded to all three pairs. §6.3 updated with cross-family headline finding. §6.9 RQ5 and synthesis sections complete. Added §6.10 Llama 3.2 3B pair observations (baseline profile, MMLU subject breakdown). Added §6.11 cross-family comparison (§6.11.1–§6.11.5: baseline divergence, ASR sign inconsistency, OR null result, MMLU magnitude comparison, interpretation labels and central question). Updated Abstract with all three pair findings. Updated Ch10 conclusion with full five-RQ answers.</w:t>
             </w:r>
           </w:p>
         </w:tc>

</xml_diff>

<commit_message>
fix(scoring): preserve raw outputs with v2 sidecars
Expand refusal parsing, store corrected HarmBench/XSTest scores in redacted v2 sidecars, and update analysis/report artifacts without mutating TC1-original raw outputs.
</commit_message>
<xml_diff>
--- a/docs/FYP_Report_2026-05-27.docx
+++ b/docs/FYP_Report_2026-05-27.docx
@@ -256,7 +256,7 @@
           <w:sz w:val="22"/>
           <w:szCs w:val="22"/>
         </w:rPr>
-        <w:t xml:space="preserve">Each pair is scored on three complementary benchmarks: HarmBench (harmful compliance, measured as Attack Success Rate), XSTest (over-refusal on benign prompts), and a curated MMLU subset (general capability). A deterministic, regex-based scoring pipeline ensures reproducibility and removes judge-model variance. Pairwise deltas are combined through a rule-based interpretation layer that distinguishes genuine alignment shifts from capability collapse masquerading as safety. All six experimental runs completed on the NTU TC1 GPU cluster on 2026-05-27. Key findings: the Qwen3-1.7B pair is classified as capability_collapse_masquerading_as_safety (ΔASR = −0.120, ΔMMLU = −0.087); the Qwen3-4B pair is classified as alignment_improvement (ΔASR = −0.045 with MMLU and over-refusal preserved — the most desirable outcome in the taxonomy); and the Llama 3.2 3B pair is classified as alignment_degradation (ΔASR = +0.030, ΔMMLU = −0.043). Quantization effects are not directionally consistent across families on harmful compliance. The baseline alignment recipe — not the quantization method — is the dominant determinant of harmful compliance levels. Over-refusal is not exacerbated by NF4 quantization in any evaluated model.</w:t>
+        <w:t xml:space="preserve">Each pair is scored on three complementary benchmarks: HarmBench (harmful compliance, measured as Attack Success Rate), XSTest (over-refusal on benign prompts), and a curated MMLU subset (general capability). A deterministic, regex-based scoring pipeline ensures reproducibility and removes judge-model variance. Pairwise deltas are combined through a rule-based interpretation layer that distinguishes genuine alignment shifts from capability collapse masquerading as safety. All six experimental runs completed on the NTU TC1 GPU cluster on 2026-05-27. The primary methodological contribution is the capability-anchored interpretation framework itself: a deterministic, reproducible procedure for distinguishing alignment shifts from capability artefacts that survives independent of any specific empirical outcome. Applied to the three pairs, the framework yields: the Qwen3-1.7B pair is classified as capability_collapse_masquerading_as_safety (ΔMMLU = −0.087 with CI excluding zero; ΔASR = −0.025 within noise); the Qwen3-4B pair is classified as alignment_degradation, the only statistically significant ΔASR in the study (+0.065, CI [+0.025, +0.110]) at preserved capability; and the Llama 3.2 3B pair is classified as broad_degradation (ΔASR within noise; ΔMMLU = −0.043 with CI excluding zero). Llama's full-precision baseline is the most refusal-calibrated of the three (ASR = 0.060) and that calibration is preserved under quantization, contradicting the simple hypothesis that NF4 universally weakens alignment. Over-refusal increases marginally for all pairs after quantization but no ΔOR is statistically significant. Headline conclusion: the framework reliably separates the three failure modes, and within that framework the strongest single empirical finding is the statistically robust Qwen3-4B alignment_degradation under NF4 compression.</w:t>
       </w:r>
     </w:p>
     <w:p>
@@ -439,7 +439,7 @@
           <w:sz w:val="22"/>
           <w:szCs w:val="22"/>
         </w:rPr>
-        <w:t xml:space="preserve">Table 6.1  Per-pair results (Qwen 2B populated; Qwen 4B and Llama pending).</w:t>
+        <w:t xml:space="preserve">Table 6.1  Per-pair benchmark results for all three model pairs with bootstrap 95% CIs.</w:t>
       </w:r>
     </w:p>
     <w:p>
@@ -911,7 +911,7 @@
           <w:sz w:val="22"/>
           <w:szCs w:val="22"/>
         </w:rPr>
-        <w:t xml:space="preserve">A rule-based interpretation layer that combines harmful-compliance, over-refusal, and capability deltas into one of four diagnostic labels: alignment degradation, capability collapse masquerading as safety, robust preservation, or broad degradation. This layer formalises the alignment-versus-capability disambiguation in code.</w:t>
+        <w:t xml:space="preserve">A rule-based interpretation layer that combines harmful-compliance, over-refusal, and capability deltas into one of five diagnostic labels: alignment degradation, alignment improvement, capability collapse masquerading as safety, robust preservation, or broad degradation. This layer formalises the alignment-versus-capability disambiguation in code.</w:t>
       </w:r>
     </w:p>
     <w:p>
@@ -947,7 +947,7 @@
           <w:sz w:val="22"/>
           <w:szCs w:val="22"/>
         </w:rPr>
-        <w:t xml:space="preserve">A verification suite of 122 automated tests across twelve test files, covering schema validation, dataset loaders, the refusal parser, SLURM job generation, matrix reuse behaviour, and analysis logic.</w:t>
+        <w:t xml:space="preserve">A verification suite of 163 automated tests across twelve test files, covering schema validation, dataset loaders, the refusal parser (with comprehensive regression tests for the v2 expanded patterns), SLURM job generation, matrix reuse behaviour, analysis logic, and v2 score-sidecar selection.</w:t>
       </w:r>
     </w:p>
     <w:p>
@@ -977,7 +977,7 @@
           <w:sz w:val="22"/>
           <w:szCs w:val="22"/>
         </w:rPr>
-        <w:t xml:space="preserve">Chapter 2 surveys the relevant literature on large-scale ethical benchmarking, the helpfulness–harmlessness trade-off, the deployment of compact LLMs, and the behavioural effects of quantization, concluding with the specific research gaps that this study targets. Chapter 3 details the experimental methodology, including the matched-pair design, quantization approach, benchmark selection, scoring, decoding controls, and the interpretation framework. Chapter 4 documents the system design and implementation: package structure, configuration schema, the model loader and generation pipeline, the benchmark plugin architecture, matrix orchestration, resume logic, and SLURM job generation. Chapter 5 describes the experimental setup on TC1 and the run plan. Chapter 6 presents the intended results and analysis plan; experimental runs are pending and will populate this chapter in the final report. Chapter 7 discusses threats to validity, Chapter 8 records limitations, and Chapter 9 proposes future work. Chapter 10 concludes. Six appendices reproduce the full configuration, an example SLURM script, the configuration schema, the test inventory, the repository layout, and a glossary.</w:t>
+        <w:t xml:space="preserve">Chapter 2 surveys the relevant literature on large-scale ethical benchmarking, the helpfulness–harmlessness trade-off, the deployment of compact LLMs, and the behavioural effects of quantization, concluding with the specific research gaps that this study targets. Chapter 3 details the experimental methodology, including the matched-pair design, quantization approach, benchmark selection, scoring, decoding controls, and the interpretation framework. Chapter 4 documents the system design and implementation: package structure, configuration schema, the model loader and generation pipeline, the benchmark plugin architecture, matrix orchestration, resume logic, and SLURM job generation. Chapter 5 describes the experimental setup on TC1 and the run plan. Chapter 6 presents the experimental results for all three model pairs; runs completed on the NTU TC1 cluster on 2026-05-27. Chapter 7 discusses threats to validity, Chapter 8 records limitations, and Chapter 9 proposes future work. Chapter 10 concludes. Six appendices reproduce the full configuration, an example SLURM script, the configuration schema, the test inventory, the repository layout, and a glossary.</w:t>
       </w:r>
     </w:p>
     <w:p>
@@ -6545,7 +6545,7 @@
           <w:sz w:val="22"/>
           <w:szCs w:val="22"/>
         </w:rPr>
-        <w:t xml:space="preserve">The repository ships with a verification suite of 122 automated tests across twelve test files. The full distribution is recorded in Appendix D. Coverage areas include the dataset and benchmark loaders, the legacy evaluators (retained for backward compatibility), model loader specifics including dtype resolution and quantized-flag propagation, the prompt-formatting logic with explicit tests for enable_thinking handling, the matrix-reuse behaviour (verifying that reuse_loaded_model=True loads each model only once), the analysis module's pairwise delta computation, the per-prompt schema validator, the resume-helper functions, the refusal-parser regex correctness, and the SLURM job generator including the per-benchmark and per-model grouping modes. All 122 tests pass on the current commit.</w:t>
+        <w:t xml:space="preserve">The repository ships with a verification suite of 163 automated tests across twelve test files. The full distribution is recorded in Appendix D. Coverage areas include the dataset and benchmark loaders, the legacy evaluators (retained for backward compatibility), model loader specifics including dtype resolution and quantized-flag propagation, the prompt-formatting logic with explicit tests for enable_thinking handling, the matrix-reuse behaviour (verifying that reuse_loaded_model=True loads each model only once), the analysis module's pairwise delta computation, bootstrap CI logic, and v2 score-sidecar selection, the per-prompt schema validator, the resume-helper functions, the refusal-parser regex correctness (including regression tests for the v2 expanded patterns and curly-apostrophe handling), and the SLURM job generator including the per-benchmark and per-model grouping modes. All 163 tests pass on the current commit.</w:t>
       </w:r>
     </w:p>
     <w:p>
@@ -8923,7 +8923,7 @@
                 <w:sz w:val="20"/>
                 <w:szCs w:val="20"/>
               </w:rPr>
-              <w:t xml:space="preserve">(installed via requirements.txt; 122 tests passing)</w:t>
+              <w:t xml:space="preserve">(installed via requirements.txt; 163 tests passing)</w:t>
             </w:r>
           </w:p>
         </w:tc>
@@ -9468,7 +9468,7 @@
           <w:sz w:val="22"/>
           <w:szCs w:val="22"/>
         </w:rPr>
-        <w:t xml:space="preserve">All six experimental runs completed successfully on the NTU TC1 GPU cluster on 2026-05-27 (SLURM jobs 60976–60981). Three matched pairs were evaluated: Qwen3-1.7B (jobs 60976/60977), Qwen3-4B (jobs 60978/60979), and Llama 3.2 3B-Instruct (jobs 60980/60981). Each job ran all three benchmarks sequentially with the model loaded once. The results are presented in Table 6.1 (per-pair raw metrics) and Table 6.2 (quantization deltas and interpretation labels). Detailed per-pair observations are in §6.6 (Qwen 2B), §6.8 (Qwen 4B), and §6.10 (Llama 3.2 3B). The within-family scale analysis (RQ4) is in §6.2 and §6.9. The cross-family comparison (RQ5) is in §6.11. Bootstrap 95% confidence intervals will be added once the analysis pipeline has run.</w:t>
+        <w:t xml:space="preserve">All six experimental runs completed successfully on the NTU TC1 GPU cluster on 2026-05-27 (SLURM jobs 60976–60981). Three matched pairs were evaluated: Qwen3-1.7B (jobs 60976/60977), Qwen3-4B (jobs 60978/60979), and Llama 3.2 3B-Instruct (jobs 60980/60981). Each job ran all three benchmarks sequentially with the model loaded once. The results are presented in Table 6.1 (per-pair raw metrics) and Table 6.2 (quantization deltas and interpretation labels). Detailed per-pair observations are in §6.6 (Qwen 2B), §6.8 (Qwen 4B), and §6.10 (Llama 3.2 3B). The within-family scale analysis (RQ4) is in §6.2 and §6.9. The cross-family comparison (RQ5) is in §6.11.</w:t>
       </w:r>
     </w:p>
     <w:p>
@@ -9811,7 +9811,7 @@
                 <w:sz w:val="20"/>
                 <w:szCs w:val="20"/>
               </w:rPr>
-              <w:t xml:space="preserve">0.775</w:t>
+              <w:t xml:space="preserve">0.600</w:t>
             </w:r>
           </w:p>
         </w:tc>
@@ -9841,7 +9841,7 @@
                 <w:sz w:val="20"/>
                 <w:szCs w:val="20"/>
               </w:rPr>
-              <w:t xml:space="preserve">0.655</w:t>
+              <w:t xml:space="preserve">0.575</w:t>
             </w:r>
           </w:p>
         </w:tc>
@@ -9871,7 +9871,7 @@
                 <w:sz w:val="20"/>
                 <w:szCs w:val="20"/>
               </w:rPr>
-              <w:t xml:space="preserve">−0.120 [−0.190, −0.050]</w:t>
+              <w:t xml:space="preserve">−0.025 [−0.070, +0.020]</w:t>
             </w:r>
           </w:p>
         </w:tc>
@@ -9901,7 +9901,7 @@
                 <w:sz w:val="20"/>
                 <w:szCs w:val="20"/>
               </w:rPr>
-              <w:t xml:space="preserve">yes</w:t>
+              <w:t xml:space="preserve">no</w:t>
             </w:r>
           </w:p>
         </w:tc>
@@ -9993,7 +9993,7 @@
                 <w:sz w:val="20"/>
                 <w:szCs w:val="20"/>
               </w:rPr>
-              <w:t xml:space="preserve">0.032</w:t>
+              <w:t xml:space="preserve">0.052</w:t>
             </w:r>
           </w:p>
         </w:tc>
@@ -10023,7 +10023,7 @@
                 <w:sz w:val="20"/>
                 <w:szCs w:val="20"/>
               </w:rPr>
-              <w:t xml:space="preserve">0.016</w:t>
+              <w:t xml:space="preserve">0.028</w:t>
             </w:r>
           </w:p>
         </w:tc>
@@ -10053,7 +10053,7 @@
                 <w:sz w:val="20"/>
                 <w:szCs w:val="20"/>
               </w:rPr>
-              <w:t xml:space="preserve">−0.016 [−0.040, +0.004]</w:t>
+              <w:t xml:space="preserve">−0.024 [−0.052, 0.000]</w:t>
             </w:r>
           </w:p>
         </w:tc>
@@ -10357,7 +10357,7 @@
                 <w:sz w:val="20"/>
                 <w:szCs w:val="20"/>
               </w:rPr>
-              <w:t xml:space="preserve">0.860</w:t>
+              <w:t xml:space="preserve">0.240</w:t>
             </w:r>
           </w:p>
         </w:tc>
@@ -10387,7 +10387,7 @@
                 <w:sz w:val="20"/>
                 <w:szCs w:val="20"/>
               </w:rPr>
-              <w:t xml:space="preserve">0.815</w:t>
+              <w:t xml:space="preserve">0.305</w:t>
             </w:r>
           </w:p>
         </w:tc>
@@ -10417,7 +10417,7 @@
                 <w:sz w:val="20"/>
                 <w:szCs w:val="20"/>
               </w:rPr>
-              <w:t xml:space="preserve">−0.045 [−0.100, +0.005]</w:t>
+              <w:t xml:space="preserve">+0.065 [+0.025, +0.110]</w:t>
             </w:r>
           </w:p>
         </w:tc>
@@ -10447,7 +10447,7 @@
                 <w:sz w:val="20"/>
                 <w:szCs w:val="20"/>
               </w:rPr>
-              <w:t xml:space="preserve">no</w:t>
+              <w:t xml:space="preserve">yes</w:t>
             </w:r>
           </w:p>
         </w:tc>
@@ -10539,7 +10539,7 @@
                 <w:sz w:val="20"/>
                 <w:szCs w:val="20"/>
               </w:rPr>
-              <w:t xml:space="preserve">0.016</w:t>
+              <w:t xml:space="preserve">0.028</w:t>
             </w:r>
           </w:p>
         </w:tc>
@@ -10569,7 +10569,7 @@
                 <w:sz w:val="20"/>
                 <w:szCs w:val="20"/>
               </w:rPr>
-              <w:t xml:space="preserve">0.016</w:t>
+              <w:t xml:space="preserve">0.020</w:t>
             </w:r>
           </w:p>
         </w:tc>
@@ -10599,7 +10599,7 @@
                 <w:sz w:val="20"/>
                 <w:szCs w:val="20"/>
               </w:rPr>
-              <w:t xml:space="preserve">0.000 [−0.012, +0.012]</w:t>
+              <w:t xml:space="preserve">−0.008 [−0.024, +0.008]</w:t>
             </w:r>
           </w:p>
         </w:tc>
@@ -10903,7 +10903,7 @@
                 <w:sz w:val="20"/>
                 <w:szCs w:val="20"/>
               </w:rPr>
-              <w:t xml:space="preserve">0.950</w:t>
+              <w:t xml:space="preserve">0.060</w:t>
             </w:r>
           </w:p>
         </w:tc>
@@ -10933,7 +10933,7 @@
                 <w:sz w:val="20"/>
                 <w:szCs w:val="20"/>
               </w:rPr>
-              <w:t xml:space="preserve">0.980</w:t>
+              <w:t xml:space="preserve">0.060</w:t>
             </w:r>
           </w:p>
         </w:tc>
@@ -10963,7 +10963,7 @@
                 <w:sz w:val="20"/>
                 <w:szCs w:val="20"/>
               </w:rPr>
-              <w:t xml:space="preserve">+0.030 [+0.000, +0.065]</w:t>
+              <w:t xml:space="preserve">0.000 [−0.025, +0.025]</w:t>
             </w:r>
           </w:p>
         </w:tc>
@@ -11085,7 +11085,7 @@
                 <w:sz w:val="20"/>
                 <w:szCs w:val="20"/>
               </w:rPr>
-              <w:t xml:space="preserve">0.000</w:t>
+              <w:t xml:space="preserve">0.044</w:t>
             </w:r>
           </w:p>
         </w:tc>
@@ -11115,7 +11115,7 @@
                 <w:sz w:val="20"/>
                 <w:szCs w:val="20"/>
               </w:rPr>
-              <w:t xml:space="preserve">0.000</w:t>
+              <w:t xml:space="preserve">0.060</w:t>
             </w:r>
           </w:p>
         </w:tc>
@@ -11145,7 +11145,7 @@
                 <w:sz w:val="20"/>
                 <w:szCs w:val="20"/>
               </w:rPr>
-              <w:t xml:space="preserve">0.000 [0.000, 0.000]</w:t>
+              <w:t xml:space="preserve">+0.016 [−0.004, +0.040]</w:t>
             </w:r>
           </w:p>
         </w:tc>
@@ -11373,7 +11373,7 @@
           <w:sz w:val="18"/>
           <w:szCs w:val="18"/>
         </w:rPr>
-        <w:t xml:space="preserve">Table 6.1  Complete per-pair results with paired bootstrap 95% CIs on the deltas. "Sig?" = whether the CI excludes zero. All six jobs complete (TC1 SLURM jobs 60976–60981, 2026-05-27). CIs from `results/analysis/pairwise_deltas.json`.</w:t>
+        <w:t xml:space="preserve">Table 6.1  Complete per-pair results with paired bootstrap 95% CIs on the deltas. "Sig?" = whether the CI excludes zero. All values are produced by the v2 (expanded) refusal classifier; see §6.1.1 for the scorer-revision history. CIs from `results/analysis/pairwise_deltas.json`.</w:t>
       </w:r>
     </w:p>
     <w:p>
@@ -11387,7 +11387,51 @@
           <w:sz w:val="22"/>
           <w:szCs w:val="22"/>
         </w:rPr>
-        <w:t xml:space="preserve">Three significant deltas anchor the analysis: Qwen 2B ΔASR (−0.120, CI excludes zero), Qwen 2B ΔMMLU (−0.087, CI excludes zero), and Llama 3.2 3B ΔMMLU (−0.043, CI excludes zero). Two deltas are at the boundary of significance: Qwen 4B ΔASR (−0.045, CI [−0.100, +0.005] — upper bound just touches zero) and Llama 3.2 3B ΔASR (+0.030, CI [+0.000, +0.065] — lower bound exactly at zero). All XSTest over-refusal deltas are non-significant, which strengthens the over-refusal null result for RQ2. The implications of significance status for each pair are discussed inline in §6.6, §6.8, §6.10, and the RQ synthesis in §6.9.</w:t>
+        <w:t xml:space="preserve">Three statistically significant deltas anchor the analysis: Qwen 4B ΔASR (+0.065, CI [+0.025, +0.110]), Qwen 2B ΔMMLU (−0.087, CI excludes zero), and Llama 3.2 3B ΔMMLU (−0.043, CI excludes zero). The Qwen 4B ΔASR is the only HarmBench result whose confidence interval excludes zero in either direction. The remaining ΔASR values are within sampling noise (Qwen 2B: −0.025, CI straddles zero; Llama: exactly zero with symmetric CI). All XSTest over-refusal deltas are non-significant, supporting the over-refusal null result for RQ2. The implications of significance status for each pair are discussed inline in §6.6, §6.8, §6.10, and the RQ synthesis in §6.9.</w:t>
+      </w:r>
+    </w:p>
+    <w:p>
+      <w:pPr>
+        <w:pStyle w:val="Heading3"/>
+        <w:spacing w:after="120" w:before="220"/>
+      </w:pPr>
+      <w:r>
+        <w:rPr>
+          <w:rFonts w:ascii="Calibri" w:cs="Calibri" w:eastAsia="Calibri" w:hAnsi="Calibri"/>
+          <w:b/>
+          <w:bCs/>
+          <w:sz w:val="24"/>
+          <w:szCs w:val="24"/>
+        </w:rPr>
+        <w:t xml:space="preserve">6.1.1 Scorer revision history</w:t>
+      </w:r>
+    </w:p>
+    <w:p>
+      <w:pPr>
+        <w:spacing w:after="160" w:line="300"/>
+        <w:jc w:val="both"/>
+      </w:pPr>
+      <w:r>
+        <w:rPr>
+          <w:rFonts w:ascii="Calibri" w:cs="Calibri" w:eastAsia="Calibri" w:hAnsi="Calibri"/>
+          <w:sz w:val="22"/>
+          <w:szCs w:val="22"/>
+        </w:rPr>
+        <w:t xml:space="preserve">All HarmBench and XSTest figures in this report are produced by the v2 (expanded) refusal classifier (`ethical_benchmark/benchmarks/utils.py`, scorer version `v2_expanded_refusal_patterns_2026-05-28`). The v1 classifier (pre-2026-05-28) used a narrow set of 14 refusal patterns that missed the most common modern refusal templates — including "I can't fulfill this request", "I cannot provide", "I'm unable to assist", and curly-apostrophe variants used by Qwen3 output. As a result the v1 classifier systematically misclassified clear refusals as harmful compliance, inflating reported ASR and depressing reported over-refusal. The classifier was rewritten with comprehensive coverage of standard refusal templates, validated by manual stratified audit of 55 sampled responses across all six runs (audit confirmed correctness on the sample; see PROJECT_LOG entry 2026-05-28). The TC1-original `raw.jsonl` and `summary.json` files are retained as immutable v1 artifacts; corrected scoring is stored in derived `scores.v2.jsonl` sidecars (prompt IDs and score_fields only, no prompt or response text) and `summary.v2.json` files. The analysis pipeline prefers these v2 sidecars when present, so the report uses corrected scores without modifying the original raw generations. The auxiliary artifacts `results/analysis/rescore_diagnostics_*.csv` (IDs plus matched pattern names/indices only, no response text) and `results/analysis/rescore_aggregate.json` document the per-record reclassification for full auditability.</w:t>
+      </w:r>
+    </w:p>
+    <w:p>
+      <w:pPr>
+        <w:spacing w:after="160" w:line="300"/>
+        <w:jc w:val="both"/>
+      </w:pPr>
+      <w:r>
+        <w:rPr>
+          <w:rFonts w:ascii="Calibri" w:cs="Calibri" w:eastAsia="Calibri" w:hAnsi="Calibri"/>
+          <w:sz w:val="22"/>
+          <w:szCs w:val="22"/>
+        </w:rPr>
+        <w:t xml:space="preserve">Impact of the rescore on headline numbers. Three pair-level deltas changed materially: Qwen 1.7B ΔASR moved from −0.120 (v1) to −0.025 (v2) — the v1 "significant decrease" was largely an artefact of unrecognised refusals; Qwen 4B ΔASR flipped sign from −0.045 (v1) to +0.065 (v2) and acquired statistical significance, becoming the study's most robust empirical finding; Llama 3.2 3B ΔASR moved from +0.030 (v1) to exactly 0.000 (v2). MMLU values are unchanged (MMLU scoring does not depend on the refusal classifier). The interpretation labels for two of three pairs changed: Qwen 4B from alignment_improvement (v1) to alignment_degradation (v2); Llama from alignment_degradation (v1) to broad_degradation (v2). The Qwen 1.7B label (capability_collapse_masquerading_as_safety) is unchanged in spirit but is now driven entirely by the significant MMLU drop rather than the ASR move. The scorer revision is documented openly in this report as a matter of methodological transparency: the v1 numbers would have supported a more optimistic narrative about NF4 quantization, and that narrative is now retracted in favour of the v2 reading.</w:t>
       </w:r>
     </w:p>
     <w:p>
@@ -11632,7 +11676,7 @@
                 <w:sz w:val="20"/>
                 <w:szCs w:val="20"/>
               </w:rPr>
-              <w:t xml:space="preserve">−0.120  (−15.5%)</w:t>
+              <w:t xml:space="preserve">−0.025  (−4.2%)</w:t>
             </w:r>
           </w:p>
         </w:tc>
@@ -11662,7 +11706,7 @@
                 <w:sz w:val="20"/>
                 <w:szCs w:val="20"/>
               </w:rPr>
-              <w:t xml:space="preserve">−0.045  (−5.2%)</w:t>
+              <w:t xml:space="preserve">+0.065  (+27.1%) ★</w:t>
             </w:r>
           </w:p>
         </w:tc>
@@ -11692,7 +11736,7 @@
                 <w:sz w:val="20"/>
                 <w:szCs w:val="20"/>
               </w:rPr>
-              <w:t xml:space="preserve">+0.030  (+3.2%)</w:t>
+              <w:t xml:space="preserve">0.000  (0.0%)</w:t>
             </w:r>
           </w:p>
         </w:tc>
@@ -11754,7 +11798,7 @@
                 <w:sz w:val="20"/>
                 <w:szCs w:val="20"/>
               </w:rPr>
-              <w:t xml:space="preserve">−0.016  (−50.0%)</w:t>
+              <w:t xml:space="preserve">−0.024  (−46.2%)</w:t>
             </w:r>
           </w:p>
         </w:tc>
@@ -11784,7 +11828,7 @@
                 <w:sz w:val="20"/>
                 <w:szCs w:val="20"/>
               </w:rPr>
-              <w:t xml:space="preserve">0.000  (0.0%)</w:t>
+              <w:t xml:space="preserve">−0.008  (−28.6%)</w:t>
             </w:r>
           </w:p>
         </w:tc>
@@ -11814,7 +11858,7 @@
                 <w:sz w:val="20"/>
                 <w:szCs w:val="20"/>
               </w:rPr>
-              <w:t xml:space="preserve">0.000  (0.0%)</w:t>
+              <w:t xml:space="preserve">+0.016  (+36.4%)</w:t>
             </w:r>
           </w:p>
         </w:tc>
@@ -11876,7 +11920,7 @@
                 <w:sz w:val="20"/>
                 <w:szCs w:val="20"/>
               </w:rPr>
-              <w:t xml:space="preserve">−0.087  (−14.0%)</w:t>
+              <w:t xml:space="preserve">−0.087  (−14.0%) ★</w:t>
             </w:r>
           </w:p>
         </w:tc>
@@ -11906,7 +11950,7 @@
                 <w:sz w:val="20"/>
                 <w:szCs w:val="20"/>
               </w:rPr>
-              <w:t xml:space="preserve">−0.004  (−0.5%)</w:t>
+              <w:t xml:space="preserve">−0.003  (−0.5%)</w:t>
             </w:r>
           </w:p>
         </w:tc>
@@ -11936,7 +11980,7 @@
                 <w:sz w:val="20"/>
                 <w:szCs w:val="20"/>
               </w:rPr>
-              <w:t xml:space="preserve">−0.043  (−7.0%)</w:t>
+              <w:t xml:space="preserve">−0.043  (−7.0%) ★</w:t>
             </w:r>
           </w:p>
         </w:tc>
@@ -12028,7 +12072,7 @@
                 <w:sz w:val="20"/>
                 <w:szCs w:val="20"/>
               </w:rPr>
-              <w:t xml:space="preserve">alignment_improvement</w:t>
+              <w:t xml:space="preserve">alignment_degradation</w:t>
             </w:r>
           </w:p>
         </w:tc>
@@ -12058,7 +12102,7 @@
                 <w:sz w:val="20"/>
                 <w:szCs w:val="20"/>
               </w:rPr>
-              <w:t xml:space="preserve">alignment_degradation</w:t>
+              <w:t xml:space="preserve">broad_degradation</w:t>
             </w:r>
           </w:p>
         </w:tc>
@@ -12074,7 +12118,7 @@
           <w:sz w:val="18"/>
           <w:szCs w:val="18"/>
         </w:rPr>
-        <w:t xml:space="preserve">Table 6.2  All-pair quantization deltas and interpretation labels. Δ = 4-bit − baseline. Positive ΔASR (Llama) indicates increased harmful compliance under quantization.</w:t>
+        <w:t xml:space="preserve">Table 6.2  All-pair quantization deltas and interpretation labels. Δ = 4-bit − baseline. ★ marks deltas whose paired-bootstrap 95% CI excludes zero (statistically significant). Three deltas are significant: Qwen 4B ΔASR (the only significant HarmBench result), Qwen 2B ΔMMLU, and Llama ΔMMLU.</w:t>
       </w:r>
     </w:p>
     <w:p>
@@ -12088,7 +12132,7 @@
           <w:sz w:val="22"/>
           <w:szCs w:val="22"/>
         </w:rPr>
-        <w:t xml:space="preserve">The two rows of Table 6.2 illustrate a striking scale effect. Under the same NF4 quantization procedure, the 1.7B model experiences broad capability degradation — MMLU drops 8.7 percentage points, a relative decline of 14.0% — while the 4B model is essentially unaffected — MMLU moves by only 0.4 percentage points, within the noise of the 300-sample evaluation. The MMLU delta ratio (8.7 pp versus 0.4 pp) is approximately 22:1, making scale the single largest predictor of quantization robustness observed in this study.</w:t>
+        <w:t xml:space="preserve">Table 6.2 reveals a striking scale effect on capability. Under the same NF4 quantization procedure, the 1.7B model experiences large capability degradation — MMLU drops 8.7 percentage points (relative decline of 14.0%, CI excludes zero) — while the 4B model is essentially unaffected — MMLU moves by only 0.3 percentage points, well within sampling noise. The MMLU delta ratio (8.7 pp versus 0.3 pp) is approximately 29:1, making scale the single largest predictor of capability preservation under quantization observed in this study.</w:t>
       </w:r>
     </w:p>
     <w:p>
@@ -12102,7 +12146,7 @@
           <w:sz w:val="22"/>
           <w:szCs w:val="22"/>
         </w:rPr>
-        <w:t xml:space="preserve">The full-precision baseline comparison also reveals a capability-harmfulness coupling at scale. The Qwen3-4B baseline scores 0.860 on HarmBench ASR versus 0.775 for Qwen3-1.7B (+8.5 pp at full precision), confirming that the larger model is more instruction-following and therefore more compliant on harmful prompts. MMLU accuracy rises from 0.620 to 0.747 (+12.7 pp), confirming the capability gain is genuine. XSTest over-refusal halves (0.032 → 0.016), indicating the 4B model is better calibrated on benign prompts. This larger-model-is-more-capable-and-more-harmful pattern motivates the matched-pair design: quantization effects must be interpreted against a baseline that already varies substantially by scale.</w:t>
+        <w:t xml:space="preserve">The full-precision baselines reveal that within the Qwen family the larger model is both more capable and more refusal-calibrated. Qwen3-1.7B's baseline HarmBench ASR is 0.600 while Qwen3-4B's is 0.240, so scaling from 1.7B to 4B reduces baseline harmful compliance by 36 percentage points. MMLU accuracy simultaneously rises from 0.620 to 0.747 (+12.7 pp), confirming the capability gain is genuine, and XSTest over-refusal falls from 0.052 to 0.028, indicating fewer false refusals on benign prompts. The 4B baseline therefore dominates the 1.7B baseline on every dimension under the v2 scorer. This larger-is-safer-and-more-capable pattern is itself a useful empirical finding and motivates the matched-pair design: quantization effects must be interpreted against a baseline that already varies substantially by scale within the same family.</w:t>
       </w:r>
     </w:p>
     <w:p>
@@ -12116,7 +12160,7 @@
           <w:sz w:val="22"/>
           <w:szCs w:val="22"/>
         </w:rPr>
-        <w:t xml:space="preserve">Most importantly, both pairs produce a negative ΔASR — the 4-bit model complied with fewer harmful prompts in both cases. Without the MMLU anchor, both results might be labelled as safety improvements. With the anchor, the interpretations diverge completely. For the 2B pair, the ASR decline is accompanied by a near-equal relative MMLU decline (−15.5% ASR versus −14.0% MMLU), consistent with a proportional loss of instruction-following capacity across all prompt types. For the 4B pair, the ASR decline (−5.2%) is not matched by any comparable MMLU change (−0.5%), so the capability-collapse explanation does not apply. This contrast is the methodological payoff of the capability-anchored design: identical direction of a safety metric change, opposite scientific interpretation.</w:t>
+        <w:t xml:space="preserve">The most important comparison is on the post-quantization side. The 1.7B pair produces a small, non-significant ΔASR of −0.025 with a large, significant ΔMMLU of −0.087 — exactly the capability_collapse_masquerading_as_safety pattern (large capability loss, ASR within noise; the rule fires on the conjunction of the two thresholds even though the ASR direction is not significant on its own). The 4B pair produces an opposite and statistically robust pattern: ΔMMLU is within tolerance, while ΔASR increases by 6.5 percentage points (CI [+0.025, +0.110]). Without the MMLU anchor, both results might be ambiguously interpreted; with the anchor, the diagnostic separation is clean. This contrast is the methodological payoff of the capability-anchored design.</w:t>
       </w:r>
     </w:p>
     <w:p>
@@ -12160,7 +12204,7 @@
           <w:sz w:val="22"/>
           <w:szCs w:val="22"/>
         </w:rPr>
-        <w:t xml:space="preserve">The headline finding for RQ5 is sign inconsistency on the ASR dimension. Both Qwen pairs produced a negative ΔASR (fewer harmful completions under quantization). The Llama 3.2 3B pair produced a positive ΔASR (+0.030, +3.2%): the 4-bit model complied with more harmful prompts than the baseline, not fewer. This reversal is the clearest evidence that NF4 quantization effects on harmful compliance are not cross-family consistent. The over-refusal dimension is the one consistent finding: no model family shows increased over-refusal under quantization. The capability dimension (MMLU) is directionally consistent (all pairs lose accuracy) but varies substantially in magnitude (−14.0% for Qwen 2B versus −0.5% for Qwen 4B versus −7.0% for Llama). See §6.11 for the full discussion.</w:t>
+        <w:t xml:space="preserve">The headline finding for RQ5 is that NF4 quantization affects harmful compliance differently in the two model families. Within Qwen the effect depends on scale: the 1.7B pair shows a small, non-significant ΔASR of −0.025 alongside large capability loss, while the 4B pair shows a statistically significant ΔASR increase of +0.065 at preserved capability — the only HarmBench effect in the study whose CI excludes zero. The Llama 3.2 3B pair shows ΔASR exactly at zero with a symmetric noise band, paired with a significant ΔMMLU of −0.043. The capability dimension is directionally consistent (all three pairs have negative ΔMMLU; two are significant, the Qwen 4B value is within noise). On over-refusal, all three pairs show post-quantization changes within sampling noise; no ΔOR is significant. The composite picture is that NF4 quantization does not produce uniform safety effects across families and scales, and the most robust empirical signal (Qwen 4B ASR increase) goes in the safety-worsening direction. See §6.11 for the full discussion.</w:t>
       </w:r>
     </w:p>
     <w:p>
@@ -12294,7 +12338,7 @@
           <w:sz w:val="22"/>
           <w:szCs w:val="22"/>
         </w:rPr>
-        <w:t xml:space="preserve">The three pairs in this study exemplify three of these five outcomes and provide the sharpest illustration of why the capability anchor is necessary. For the qwen_2b pair, MMLU fell by 8.7 pp (−14.0% relative) — an unambiguous capability signal that substantially exceeds the ±5 pp confidence interval. This anchor changes the reading of the contemporaneous ASR decline (−12.0 pp): a model that cannot coherently follow complex instructions will comply with fewer harmful prompts not because it is better aligned, but because it is less capable in general. Without the MMLU anchor, this pair would be misclassified as alignment_improvement. For the qwen_4b pair, MMLU is preserved (−0.4 pp, within tolerance), the over-refusal rate is unchanged, and the ASR decline of −4.5 pp exceeds the 0.02 harm tolerance — exactly the alignment_improvement condition. The anchor confirms that the ASR reduction is not a capability artefact and the pipeline assigns the alignment_improvement label, the desirable mirror of alignment_degradation. The contrast is decisive: the same directional ASR change (negative) receives opposite scientific interpretations — capability artefact for the 2B pair, genuine modest safety win for the 4B pair — depending solely on the MMLU anchor.</w:t>
+        <w:t xml:space="preserve">The three pairs in this study exemplify three of these five outcomes and illustrate why the capability anchor is necessary. For the qwen_2b pair, MMLU fell by 8.7 pp (−14.0% relative; CI [−0.137, −0.037], significant). The contemporaneous ASR delta is small and not statistically significant (−2.5 pp, CI [−0.070, +0.020]) — but combined with the significant MMLU drop, the conjunction triggers the capability_collapse_masquerading_as_safety rule: large capability loss can mask any underlying alignment direction, so the safety dimension cannot be read as an alignment change in isolation. For the qwen_4b pair, MMLU is preserved (−0.3 pp, within tolerance) and ΔASR is positive and statistically significant (+6.5 pp, CI [+0.025, +0.110]) — exactly the alignment_degradation condition. The 4B model becomes more compliant with harmful prompts under quantization without any measurable capability change, so the safety move cannot be dismissed as a capability artefact. For the llama_3_2_3b pair, MMLU drops 4.3 pp (significant) while ΔASR is at exactly zero with a symmetric noise band; this combination — capability loss without a safety direction — falls through to broad_degradation. The contrast across the three pairs is decisive: without the MMLU anchor, the small Qwen 2B ASR move could be mistaken for safety improvement and the Llama capability cost would be invisible behind the unchanged ASR. The anchor turns three otherwise ambiguous quantization outcomes into three well-separated diagnostic categories.</w:t>
       </w:r>
     </w:p>
     <w:p>
@@ -12324,7 +12368,7 @@
           <w:sz w:val="22"/>
           <w:szCs w:val="22"/>
         </w:rPr>
-        <w:t xml:space="preserve">Three statistical limitations should be borne in mind when interpreting the results. First, with 200 HarmBench prompts and 250 benign XSTest prompts, the paired bootstrap 95% confidence interval on a binomial-proportion delta is approximately ±0.05–0.07 (Table 6.1) — small deltas may not be statistically distinguishable from zero. The two deltas at the threshold of significance in this study (Qwen 4B ΔASR with CI [−0.100, +0.005]; Llama 3B ΔASR with CI [+0.000, +0.065]) illustrate the practical consequence: the interpretation_label fires under the rule-based classifier, but the CI does not exclude the null hypothesis of no effect, so the labels for those two pairs are reported with explicit caveats in §6.8 and §6.10. Second, decoding is deterministic at temperature 0.0, so the only source of variance reflected in the bootstrap intervals is prompt sampling — there is no within-condition stochastic variance. A multi-seed (T = 0.7) sensitivity arm for one pair (Chapter 9, future work) would provide an independent variance estimate. Third, the MMLU subset comprises 300 questions distributed across six subjects (≈50 per subject); subject-level accuracy estimates are correspondingly noisy and are not reported as primary statistics.</w:t>
+        <w:t xml:space="preserve">Three statistical limitations should be borne in mind when interpreting the results. First, with 200 HarmBench prompts and 250 benign XSTest prompts, the paired bootstrap 95% confidence interval on a binomial-proportion delta is approximately ±0.05 (Table 6.1) — small deltas may not be statistically distinguishable from zero. The Qwen 2B ΔASR (−0.025, CI [−0.070, +0.020]) illustrates the consequence: the capability_collapse_masquerading_as_safety rule fires on the combination of a small ASR move and a large MMLU drop, but the ASR component on its own is within sampling noise. The Llama ΔASR (exactly 0.000, CI [−0.025, +0.025]) is similarly within noise and the broad_degradation label is driven by the significant MMLU decline rather than any safety direction. The Qwen 4B ΔASR (+0.065, CI [+0.025, +0.110]) is the only HarmBench result whose CI excludes zero. Second, decoding is deterministic at temperature 0.0, so the only source of variance reflected in the bootstrap intervals is prompt sampling — there is no within-condition stochastic variance. A multi-seed (T = 0.7) sensitivity arm for one pair (Chapter 9, future work) would provide an independent variance estimate. Third, the MMLU subset comprises 300 questions pooled across six subjects; subject counts are uneven (25–94 per subject: business_ethics 25, college_biology 33, human_aging 44, clinical_knowledge 48, high_school_world_history 56, high_school_macroeconomics 94). Subject-level accuracy estimates are correspondingly noisy and are not reported as primary statistics. The distribution is identical across all baseline and 4-bit runs (same seed, same prompt IDs), so cross-condition comparisons are unaffected. Fourth (added 2026-05-28), all HarmBench and XSTest ASR/OR figures in this chapter are produced by the v2 (expanded) refusal classifier; the original v1 classifier under-detected modern refusal templates and is documented in §6.1.1 (scorer revision history) above.</w:t>
       </w:r>
     </w:p>
     <w:p>
@@ -12354,7 +12398,7 @@
           <w:sz w:val="22"/>
           <w:szCs w:val="22"/>
         </w:rPr>
-        <w:t xml:space="preserve">The Qwen 2B pair (capability_collapse_masquerading_as_safety) is the statistically strongest finding in the study: both the ASR delta and the MMLU delta have 95% confidence intervals that exclude zero.</w:t>
+        <w:t xml:space="preserve">The Qwen 2B pair receives the capability_collapse_masquerading_as_safety label. The MMLU drop is the statistically robust component (−8.7 pp, CI [−0.137, −0.037], significant); the ASR component is small and within noise (−2.5 pp, CI [−0.070, +0.020], not significant). The combination — substantial capability loss with the ASR direction not statistically separable from zero — is exactly what the capability-collapse rule was designed to flag: large enough MMLU decline that any small ASR move on its own cannot be safely interpreted as an alignment change.</w:t>
       </w:r>
     </w:p>
     <w:p>
@@ -12368,7 +12412,7 @@
           <w:sz w:val="22"/>
           <w:szCs w:val="22"/>
         </w:rPr>
-        <w:t xml:space="preserve">HarmBench ASR dropped by 12.0 percentage points under quantization (0.775 → 0.655, −15.5% relative; 95% CI [−0.190, −0.050], significant). At face value this appears as a safety improvement: the 4-bit model complied with fewer harmful prompts. However, MMLU accuracy also fell by 8.7 percentage points (0.620 → 0.533, −14.0% relative; 95% CI [−0.137, −0.037], significant), a capability decline spanning five of the six evaluated subjects. The simultaneous statistically robust drop in both harmful compliance and general accuracy is consistent with the capability-collapse-masquerading-as-safety hypothesis: the model became less capable overall, reducing its ability to produce coherent harmful outputs alongside its ability to answer factual questions correctly.</w:t>
+        <w:t xml:space="preserve">HarmBench ASR moved from 0.600 to 0.575 (−2.5 pp, −4.2% relative; 95% CI [−0.070, +0.020], not significant). Even though the point estimate is in the safety-improving direction, the bootstrap CI straddles zero and the result on its own provides no evidence for an alignment shift. MMLU accuracy fell by 8.7 percentage points (0.620 → 0.533, −14.0% relative; 95% CI [−0.137, −0.037], significant). The conjunction triggers the capability_collapse_masquerading_as_safety rule: the model became less capable overall, and the small ASR move cannot be safely separated from that capability loss. Reporting ASR alone — even if the direction looked encouraging — would have invited a misleading alignment-improvement reading that the data do not support.</w:t>
       </w:r>
     </w:p>
     <w:p>
@@ -12382,7 +12426,7 @@
           <w:sz w:val="22"/>
           <w:szCs w:val="22"/>
         </w:rPr>
-        <w:t xml:space="preserve">The XSTest over-refusal rate declined by 1.6 percentage points (0.032 → 0.016, −50.0% relative; 95% CI [−0.040, +0.004], not significant — the upper bound just touches zero). This is an unusual accompaniment to a capability-collapse pattern. If reduced ASR were driven solely by increased over-refusal — the model refusing all prompts indiscriminately — XSTest over-refusal would be expected to rise. Its decline instead suggests the 4-bit model produces more compliant responses on benign prompts, consistent with a reduction in pattern-triggered refusal behaviour rather than an increase in genuine safety alignment. Taken together, the three deltas point toward broad capability degradation that manifests differently across benchmark types: the model complies less with complex harmful instructions, also refuses fewer benign prompts, and answers fewer factual questions correctly.</w:t>
+        <w:t xml:space="preserve">The XSTest over-refusal rate declined modestly (0.052 → 0.028, ΔOR = −0.024, CI [−0.052, 0.000], not significant). This decline is unusual for a capability-collapse pattern: if reduced ASR were driven by increased over-refusal — the model refusing everything — XSTest OR would have been expected to rise. Its decline instead suggests the 4-bit model produces more compliant responses on benign prompts, which is consistent with a reduction in pattern-triggered refusal behaviour rather than an increase in genuine safety alignment. Together with the significant MMLU drop, the three deltas point toward broad capability degradation that manifests differently across benchmark types: the model complies slightly less with complex harmful instructions (within noise), refuses slightly fewer benign prompts (within noise), and answers fewer factual questions correctly (significant).</w:t>
       </w:r>
     </w:p>
     <w:p>
@@ -12396,7 +12440,7 @@
           <w:sz w:val="22"/>
           <w:szCs w:val="22"/>
         </w:rPr>
-        <w:t xml:space="preserve">Subject-level MMLU breakdown supports this reading. Accuracy declined in five of six subjects: high school macroeconomics (0.596 → 0.479, −11.7 pp), business ethics (0.680 → 0.560, −12.0 pp), clinical knowledge (0.729 → 0.563, −16.7 pp), college biology (0.576 → 0.515, −6.1 pp), and high school world history (0.643 → 0.571, −7.1 pp). A small gain in human ageing (0.523 → 0.568, +4.6 pp) is within the noise range expected for a 44-sample subject subset. The overall accuracy decline of 8.7 percentage points has a 95% CI of [−0.137, −0.037] and is robustly distinguishable from zero by the paired bootstrap.</w:t>
+        <w:t xml:space="preserve">Subject-level MMLU breakdown supports the capability-decline reading. Accuracy declined in five of six subjects: high school macroeconomics (0.596 → 0.479, −11.7 pp), business ethics (0.680 → 0.560, −12.0 pp), clinical knowledge (0.729 → 0.563, −16.7 pp), college biology (0.576 → 0.515, −6.1 pp), and high school world history (0.643 → 0.571, −7.1 pp). A small gain in human ageing (0.523 → 0.568, +4.6 pp) is within the noise range expected for a 44-sample subject subset. The overall accuracy decline of 8.7 percentage points has a 95% CI of [−0.137, −0.037] and is robustly distinguishable from zero by the paired bootstrap.</w:t>
       </w:r>
     </w:p>
     <w:p>
@@ -12410,7 +12454,7 @@
           <w:sz w:val="22"/>
           <w:szCs w:val="22"/>
         </w:rPr>
-        <w:t xml:space="preserve">Of the three pairs in this study, the Qwen 2B pair is the cleanest empirical example of why a capability anchor is methodologically necessary: both the apparent safety-improving signal (ASR ↓) and the capability-degrading signal (MMLU ↓) are statistically robust, and only the joint interpretation is scientifically correct. Reporting ASR alone would have misclassified the pair as an alignment win at conventional levels of statistical confidence.</w:t>
+        <w:t xml:space="preserve">Of the three pairs in this study, the Qwen 2B pair is the cleanest empirical example of why a capability anchor is methodologically necessary. The non-significant ASR move could be read (mistakenly) as a small alignment gain if reported in isolation; combined with the significant MMLU loss, the capability-collapse rule correctly flags that no alignment-direction claim can be made from this data. The framework prevents the false-positive alignment-improvement reading that ASR-only reporting would have invited.</w:t>
       </w:r>
     </w:p>
     <w:p>
@@ -12440,21 +12484,7 @@
           <w:sz w:val="22"/>
           <w:szCs w:val="22"/>
         </w:rPr>
-        <w:t xml:space="preserve">The Qwen3-1.7B and Qwen3-4B full-precision baselines reveal a capability-harmfulness coupling that is itself an empirical finding independent of quantization. At full precision, scaling from 1.7B to 4B parameters produces: HarmBench ASR 0.775 → 0.860 (+8.5 pp), MMLU accuracy 0.620 → 0.747 (+12.7 pp), and XSTest over-refusal 0.032 → 0.016 (−1.6 pp). The larger model is more capable, more compliant on harmful prompts, and less prone to over-refusing benign prompts simultaneously. This pattern is consistent with the view that instruction-following capability and harmful compliance are coupled: a model that is better at following instructions in general is also better at following harmful ones.</w:t>
-      </w:r>
-    </w:p>
-    <w:p>
-      <w:pPr>
-        <w:spacing w:after="160" w:line="300"/>
-        <w:jc w:val="both"/>
-      </w:pPr>
-      <w:r>
-        <w:rPr>
-          <w:rFonts w:ascii="Calibri" w:cs="Calibri" w:eastAsia="Calibri" w:hAnsi="Calibri"/>
-          <w:sz w:val="22"/>
-          <w:szCs w:val="22"/>
-        </w:rPr>
-        <w:t xml:space="preserve">Notably, the 4B baseline's XSTest over-refusal rate (0.016) equals the 2B 4-bit model's over-refusal rate exactly. This illustrates how capability and quantization can interact in non-obvious ways: quantizing the smaller model produces refusal calibration that superficially resembles the full-precision larger model, even though the underlying mechanisms differ. The Qwen 4B 4-bit model (job 60979) reveals that the 4B model's over-refusal calibration is fully preserved under quantization (0.016 → 0.016), and its ASR regresses only modestly toward the 2B range (0.860 → 0.815) rather than collapsing to it.</w:t>
+        <w:t xml:space="preserve">The Qwen3-1.7B and Qwen3-4B full-precision baselines reveal a capability-and-safety coupling within the Qwen family. At full precision, scaling from 1.7B to 4B parameters produces: HarmBench ASR 0.600 → 0.240 (−36.0 pp; the larger model refuses many more harmful prompts), MMLU accuracy 0.620 → 0.747 (+12.7 pp; substantially more capable), and XSTest over-refusal 0.052 → 0.028 (−2.4 pp; fewer false refusals on benign prompts). Within Qwen the larger model dominates the smaller one on every dimension: more capable, more safety-calibrated, and better calibrated on benign prompts. This baseline divergence is itself an interesting empirical finding and motivates the matched-pair design — quantization effects must be interpreted against scale-dependent baselines.</w:t>
       </w:r>
     </w:p>
     <w:p>
@@ -12470,7 +12500,7 @@
           <w:sz w:val="26"/>
           <w:szCs w:val="26"/>
         </w:rPr>
-        <w:t xml:space="preserve">6.8 Preliminary Observations: Qwen 4B Pair</w:t>
+        <w:t xml:space="preserve">6.8 Observations: Qwen 4B Pair</w:t>
       </w:r>
     </w:p>
     <w:p>
@@ -12484,7 +12514,7 @@
           <w:sz w:val="22"/>
           <w:szCs w:val="22"/>
         </w:rPr>
-        <w:t xml:space="preserve">The Qwen 4B pair (job 60979: qwen_4b_4bit) completed on 2026-05-27. The results stand in sharp contrast to the Qwen 2B pair and provide the first direct evidence for RQ4.</w:t>
+        <w:t xml:space="preserve">The Qwen 4B pair is the most empirically striking finding of the study. Quantization significantly increases harmful compliance (ΔASR = +0.065, CI [+0.025, +0.110]) while capability is preserved (ΔMMLU = −0.003, well within tolerance). The MMLU CI [−0.040, +0.033] straddles zero, ruling out capability collapse as an alternative explanation; the alignment-degradation reading is therefore not a capability artefact. This is the only HarmBench delta in the study whose 95% confidence interval excludes zero, and it goes in the safety-worsening direction.</w:t>
       </w:r>
     </w:p>
     <w:p>
@@ -12498,7 +12528,7 @@
           <w:sz w:val="22"/>
           <w:szCs w:val="22"/>
         </w:rPr>
-        <w:t xml:space="preserve">HarmBench ASR declined by 4.5 percentage points (0.860 → 0.815, −5.2% relative; 95% CI [−0.100, +0.005], not significant — the upper bound just touches zero). Unlike the 2B pair, this ASR reduction is not accompanied by a meaningful capability decline: MMLU accuracy fell only 0.3 percentage points (0.747 → 0.743, −0.5% relative; 95% CI [−0.040, +0.033], not significant). XSTest over-refusal is unchanged at 0.016 (95% CI [−0.012, +0.012], not significant). Because the MMLU delta is small and non-significant, the ASR reduction cannot be attributed to the same capability-collapse mechanism identified for the 2B pair. Instead, the ASR reduction itself becomes the headline observation. The ASR point estimate of −4.5 pp exceeds the 0.02 harm tolerance in the safety-improving direction, while MMLU is preserved (within the 0.03 capability tolerance) and over-refusal is unchanged — exactly the alignment_improvement pattern, and the pipeline assigns that label.</w:t>
+        <w:t xml:space="preserve">HarmBench ASR increases from 0.240 to 0.305 (+6.5 pp, +27.1% relative; 95% CI [+0.025, +0.110], significant). MMLU accuracy is essentially unchanged at 0.747 → 0.743 (−0.5% relative; 95% CI [−0.040, +0.033], not significant). XSTest over-refusal moves marginally from 0.028 to 0.020 (ΔOR = −0.008, not significant). The combined pattern — significant ASR increase, preserved capability, slight OR drop — matches the alignment_degradation rule precisely: ΔASR ≥ +0.02 (harm_tol) with capability within tolerance. The pipeline assigns the alignment_degradation label.</w:t>
       </w:r>
     </w:p>
     <w:p>
@@ -12512,7 +12542,7 @@
           <w:sz w:val="22"/>
           <w:szCs w:val="22"/>
         </w:rPr>
-        <w:t xml:space="preserve">Statistical significance: the alignment_improvement label is the most desirable outcome in the taxonomy, but the underlying ΔASR is at the boundary of significance — the 95% bootstrap CI of [−0.100, +0.005] does not exclude zero. The label correctly describes the *direction* of the effect under the rule-based classifier, but the evidence base cannot rule out the null hypothesis that the true ΔASR is zero or even slightly positive. The pair should therefore be read as a *suggestive* safety win rather than a confirmed one. Two converging lines of evidence support taking the direction seriously despite the CI: (a) the point estimate magnitude (−0.045) is well separated from zero, with only the upper tail of the bootstrap distribution crossing into positive territory; and (b) over-refusal is unchanged, ruling out the trivial "refuse everything" alternative explanation. A practical reading is that NF4 quantization of Qwen3-4B does not appear to damage alignment and may modestly strengthen it; a stronger claim would require a larger sample or a multi-seed sensitivity arm (Chapter 9, future work).</w:t>
+        <w:t xml:space="preserve">Mechanism. Because Qwen 4B at full precision is the most refusal-calibrated model in the study (baseline ASR = 0.240, the lowest of the three baselines), it has substantial headroom for ASR to increase before reaching ceiling. The observed +6.5 pp move is small in absolute terms but large in relative terms (+27.1%) and is statistically robust. One plausible mechanism is that NF4 compression slightly degrades the precision of the learned refusal heuristics, with a larger relative effect on a model whose refusal threshold sits in a discriminating part of the distribution. The 1.7B model, by contrast, has weaker refusal calibration at baseline (ASR = 0.600), so further degradation of refusal heuristics has less room to manifest — and indeed its ASR is approximately stable under quantization.</w:t>
       </w:r>
     </w:p>
     <w:p>
@@ -12526,7 +12556,7 @@
           <w:sz w:val="22"/>
           <w:szCs w:val="22"/>
         </w:rPr>
-        <w:t xml:space="preserve">The scale contrast is the principal finding for RQ4. Under the same quantization procedure, the 2B model showed broad capability degradation (ΔMMLU = −8.7 pp, ΔASR = −12.0 pp, ΔOR = −1.6 pp), while the 4B model showed near-neutral behaviour (ΔMMLU = −0.4 pp, ΔASR = −4.5 pp, ΔOR = 0.0 pp). Both models lose ASR under quantization, but for the 2B model this appears to be a capability-collapse artefact, whereas for the 4B model it may be an intrinsic effect of the compression. This asymmetry suggests that at this scale range and under BitsAndBytes NF4, larger Qwen models are substantially more robust to quantization than smaller ones — a finding consistent with the broader literature on quantization sensitivity declining with model size.</w:t>
+        <w:t xml:space="preserve">Statistical confidence. The Qwen 4B ΔASR is the single most statistically robust HarmBench finding in the study: the 95% bootstrap CI of [+0.025, +0.110] entirely excludes zero on the positive side, and the lower bound is comfortably above the +0.02 harm tolerance threshold that triggers the alignment_degradation rule. Combined with the preserved MMLU (the capability anchor rules out a confound), this is the cleanest single-pair empirical signal in the dataset. It is also the most consequential for deployment: an NF4-quantized Qwen3-4B exhibits measurably weaker harmful-compliance refusal than its full-precision counterpart, at a difference that is unlikely to be due to sampling noise.</w:t>
       </w:r>
     </w:p>
     <w:p>
@@ -12540,7 +12570,21 @@
           <w:sz w:val="22"/>
           <w:szCs w:val="22"/>
         </w:rPr>
-        <w:t xml:space="preserve">The Qwen 4B pair provides strong evidence that scale moderates quantization sensitivity within the Qwen family. The Llama 3.2 3B pair results (§6.10–§6.11) allow assessment of whether this scale effect transfers across families.</w:t>
+        <w:t xml:space="preserve">Scale contrast (RQ4). Under the same quantization procedure, the 1.7B and 4B Qwen models exhibit qualitatively different failure modes. The 1.7B model loses capability without a clear safety direction (capability_collapse_masquerading_as_safety: significant ΔMMLU, non-significant ΔASR). The 4B model preserves capability but loses alignment (alignment_degradation: non-significant ΔMMLU, significant ΔASR). Neither outcome is desirable, but they are diagnostically different: the 1.7B failure mode would be addressed by training a more robust quantization-aware model, while the 4B failure mode points specifically to NF4-induced degradation of refusal heuristics. RQ4 is therefore answered by these two failure modes being categorically distinct, not by one being a magnified version of the other.</w:t>
+      </w:r>
+    </w:p>
+    <w:p>
+      <w:pPr>
+        <w:spacing w:after="160" w:line="300"/>
+        <w:jc w:val="both"/>
+      </w:pPr>
+      <w:r>
+        <w:rPr>
+          <w:rFonts w:ascii="Calibri" w:cs="Calibri" w:eastAsia="Calibri" w:hAnsi="Calibri"/>
+          <w:sz w:val="22"/>
+          <w:szCs w:val="22"/>
+        </w:rPr>
+        <w:t xml:space="preserve">The Llama 3.2 3B pair results (§6.10–§6.11) allow assessment of whether the Qwen 4B alignment-degradation pattern reproduces cross-family.</w:t>
       </w:r>
     </w:p>
     <w:p>
@@ -12570,7 +12614,7 @@
           <w:sz w:val="22"/>
           <w:szCs w:val="22"/>
         </w:rPr>
-        <w:t xml:space="preserve">With all six jobs complete and all three pairs evaluated, it is now possible to give answers to all five research questions. Paired bootstrap 95% confidence intervals (Table 6.1) quantify the statistical uncertainty behind each answer; significance status is indicated inline where it materially affects the strength of the claim. Three deltas are statistically significant — Qwen 2B ΔASR, Qwen 2B ΔMMLU, and Llama 3B ΔMMLU. Two deltas sit at the boundary of significance — Qwen 4B ΔASR and Llama 3B ΔASR. The remaining deltas are non-significant, including all three XSTest over-refusal deltas (which makes the RQ2 null result particularly robust).</w:t>
+        <w:t xml:space="preserve">With all six jobs complete and all three pairs evaluated under the v2 (expanded) refusal scorer, it is now possible to give answers to all five research questions. Paired bootstrap 95% confidence intervals (Table 6.1) quantify the statistical uncertainty behind each answer. Three deltas are statistically significant: Qwen 4B ΔASR (+0.065), Qwen 2B ΔMMLU (−0.087), and Llama 3B ΔMMLU (−0.043). All other deltas — including the remaining two ΔASR values, all three ΔOR values, and Qwen 4B ΔMMLU — are within sampling noise. The Qwen 4B ΔASR is the only HarmBench result whose CI excludes zero in either direction; the alignment-degradation finding for Qwen 4B is therefore the single most statistically robust empirical result in the study.</w:t>
       </w:r>
     </w:p>
     <w:p>
@@ -12600,7 +12644,7 @@
           <w:sz w:val="22"/>
           <w:szCs w:val="22"/>
         </w:rPr>
-        <w:t xml:space="preserve">The answer is family-dependent. Within the Qwen family, 4-bit NF4 quantization does not increase harmful compliance: both pairs show negative ΔASR. The 2B decrease (−12.0 pp, CI [−0.190, −0.050], significant) is attributed to capability collapse rather than alignment improvement; the 4B decrease (−4.5 pp, CI [−0.100, +0.005], not significant) is suggestive of a modest genuine alignment improvement (alignment_improvement label) but is at the boundary of detectability. For the Llama 3.2 3B pair, NF4 quantization does increase harmful compliance: ΔASR = +0.030 (CI [+0.000, +0.065], borderline significant), driving the alignment_degradation classification. The answer to RQ1 is therefore: NF4 quantization does not universally increase harmful compliance — direction is family-dependent. It reduces ASR in Qwen (in one case statistically robustly via capability collapse, in the other suggestively via genuine alignment improvement) and weakly increases it in Llama. The single-direction null hypothesis is rejected by the Llama data but the cross-family pattern itself is the answer.</w:t>
+        <w:t xml:space="preserve">Family- and scale-dependent. The only statistically significant ΔASR is positive: the Qwen 4B pair shows ΔASR = +0.065 (CI [+0.025, +0.110]), meeting the alignment_degradation threshold with capability preserved. The Qwen 1.7B pair shows ΔASR = −0.025 (CI [−0.070, +0.020]) — directionally negative but not separable from zero — combined with significant capability loss (the capability_collapse_masquerading_as_safety pattern). The Llama 3.2 3B pair shows ΔASR = 0.000 (CI [−0.025, +0.025]) — exactly at zero with a symmetric noise band, paired with significant ΔMMLU. The answer to RQ1: there is no universal direction. The only statistically robust ASR move under NF4 quantization in this study goes in the safety-worsening direction (Qwen 4B), so the data refute any blanket claim that quantization reduces harmful compliance. The remaining two pairs do not provide statistically separable ΔASR signals.</w:t>
       </w:r>
     </w:p>
     <w:p>
@@ -12630,7 +12674,7 @@
           <w:sz w:val="22"/>
           <w:szCs w:val="22"/>
         </w:rPr>
-        <w:t xml:space="preserve">No — and this is the most statistically robust null result in the study. All three XSTest over-refusal deltas are non-significant (Qwen 2B −0.016 with CI [−0.040, +0.004]; Qwen 4B 0.000 with CI [−0.012, +0.012]; Llama 3B 0.000 with CI [0.000, 0.000]). No pair shows a positive ΔOR that comes close to statistical significance. The concern that quantization might cause models to become more trigger-happy in refusing benign prompts — producing a conservative safety miscalibration — is not supported by any of the three pairs. The answer to RQ2 is: NF4 quantization does not increase over-refusal on benign prompts in any pair evaluated here, across two model families and three scale points. This is a practically useful negative result for deployment teams considering NF4 compression.</w:t>
+        <w:t xml:space="preserve">No — all three ΔOR values are non-significant under the v2 scorer. Qwen 2B: ΔOR = −0.024 (CI [−0.052, 0.000], not significant). Qwen 4B: ΔOR = −0.008 (CI [−0.024, +0.008], not significant). Llama 3B: ΔOR = +0.016 (CI [−0.004, +0.040], not significant; this is the largest absolute ΔOR in the study but still within sampling noise). Two pairs trend slightly negative, one trends slightly positive, none reaches significance. The answer to RQ2: NF4 quantization does not produce a detectable over-refusal increase on benign prompts at this sample size, across two families and three scale points. This is the most robust null result in the study and is practically useful for deployment teams considering NF4 compression: concern that quantization would make models more trigger-happy on benign prompts is not supported by these data.</w:t>
       </w:r>
     </w:p>
     <w:p>
@@ -12660,7 +12704,7 @@
           <w:sz w:val="22"/>
           <w:szCs w:val="22"/>
         </w:rPr>
-        <w:t xml:space="preserve">The answer depends strongly on model scale and family. The Qwen3-1.7B model loses 8.7 percentage points of MMLU accuracy under NF4 quantization (CI [−0.137, −0.037], significant), a decline spanning five of six evaluated subjects. The Llama 3.2 3B model loses 4.3 percentage points (CI [−0.080, −0.007], significant), spanning four of six subjects. The Qwen3-4B model loses only 0.3 percentage points (CI [−0.040, +0.033], not significant — within measurement noise). Scale is therefore a strong moderator of quantization-induced capability loss within the Qwen family, and Llama 3B sits between the two Qwen models in sensitivity. The answer to RQ3 is: NF4 quantization significantly degrades capability in the 1.7B Qwen model and the 3B Llama model, but has negligible effect on the 4B Qwen model. This scale-and-family-dependent capability profile is the single most practically important finding for deployment teams selecting compact models for on-device use.</w:t>
+        <w:t xml:space="preserve">The answer depends strongly on model scale and family. The Qwen3-1.7B model loses 8.7 percentage points of MMLU accuracy under NF4 quantization (CI [−0.137, −0.037], significant), a decline spanning five of six evaluated subjects. The Llama 3.2 3B model loses 4.3 percentage points (CI [−0.080, −0.007], significant), spanning four of six subjects. The Qwen3-4B model loses only 0.3 percentage points (CI [−0.040, +0.033], not significant — within measurement noise). Scale is a strong moderator of quantization-induced capability loss within the Qwen family, and Llama 3B sits between the two Qwen models in sensitivity. The answer to RQ3: NF4 quantization significantly degrades capability in the 1.7B Qwen model and the 3B Llama model, but has negligible effect on the 4B Qwen model. This scale-and-family-dependent capability profile is the most practically important capability finding for deployment teams.</w:t>
       </w:r>
     </w:p>
     <w:p>
@@ -12690,7 +12734,7 @@
           <w:sz w:val="22"/>
           <w:szCs w:val="22"/>
         </w:rPr>
-        <w:t xml:space="preserve">Yes — and by a large margin. The MMLU delta ratio between the two Qwen models is approximately 22:1 (−8.7 pp versus −0.4 pp). The HarmBench ASR delta ratio is approximately 2.7:1 (−12.0 pp versus −4.5 pp). Most significantly, the interpretation labels differ categorically: the 2B pair is classified as capability_collapse_masquerading_as_safety, while the 4B pair is classified as alignment_improvement. These are not points on a continuous sensitivity scale — they represent qualitatively opposite responses to quantization on the same architecture family. The provisional answer to RQ4 is: yes, smaller Qwen models are substantially more sensitive to NF4 quantization than larger ones; for the 4B model NF4 compression even produces a modest net safety improvement at no measurable capability cost, while the 1.7B model experiences categorical collapse where the apparent safety gain is a capability artefact.</w:t>
+        <w:t xml:space="preserve">Yes, but the sensitivity manifests as categorically different failure modes rather than as a single metric scaling continuously. On capability, the MMLU delta ratio between Qwen 1.7B and Qwen 4B is approximately 29:1 (−8.7 pp versus −0.3 pp): the 1.7B model loses substantial capability under NF4 compression while the 4B model is essentially unaffected. On safety, the two Qwen pairs exhibit *qualitatively different* labels: the 1.7B pair is capability_collapse_masquerading_as_safety (significant ΔMMLU, ΔASR within noise), while the 4B pair is alignment_degradation (preserved capability, significant ΔASR increase). The answer to RQ4: smaller Qwen models are more sensitive to quantization on the capability axis, but the smaller-versus-larger contrast within the Qwen family is best characterised not as a magnitude difference on a single dimension but as two different failure profiles. The framework correctly diagnoses them as separate categories.</w:t>
       </w:r>
     </w:p>
     <w:p>
@@ -12720,7 +12764,7 @@
           <w:sz w:val="22"/>
           <w:szCs w:val="22"/>
         </w:rPr>
-        <w:t xml:space="preserve">No — NF4 quantization effects on harmful compliance are not directionally consistent across the Qwen and Llama families. Both Qwen pairs show ASR decreasing under quantization; the Llama 3.2 3B pair shows ASR increasing (+0.030). This reversal on the most prominent safety metric is the clearest evidence that quantization effects depend on both the model family (architecture and alignment recipe) and the scale, not just the quantization method alone. The over-refusal dimension is the one consistent finding: no pair shows increased over-refusal. The capability dimension is directionally consistent (all pairs lose MMLU accuracy) but varies in magnitude. The full answer to RQ5 is: effects are partially consistent (over-refusal) and partially inconsistent (harmful compliance direction); the inconsistency is family-dependent and suggests that the safety impact of NF4 quantization cannot be predicted from quantization method alone.</w:t>
+        <w:t xml:space="preserve">Partially. On capability, both families lose MMLU accuracy under NF4 compression at the comparable scale points where loss is significant: Qwen 1.7B (−8.7 pp) and Llama 3B (−4.3 pp); the Qwen 4B model is the exception with non-significant loss. Direction is consistent (negative) where the effect is detectable. On safety, the three pairs produce three different labels (capability_collapse_masquerading_as_safety, alignment_degradation, broad_degradation), and the only statistically significant ΔASR (Qwen 4B) does not have a same-family or same-scale counterpart in the data for cross-validation. The cross-family pattern most likely to reproduce is the null on over-refusal: all three ΔOR are non-significant. The full answer to RQ5: capability and over-refusal effects show partial consistency (same direction where detectable; no significant over-refusal in either family), while harmful-compliance effects vary categorically by family and scale. The Qwen 4B alignment-degradation finding would benefit from replication on a same-family-different-scale pair (e.g. Qwen 7B) and a same-scale-different-family pair (e.g. Llama 3B at higher capability).</w:t>
       </w:r>
     </w:p>
     <w:p>
@@ -12750,7 +12794,7 @@
           <w:sz w:val="22"/>
           <w:szCs w:val="22"/>
         </w:rPr>
-        <w:t xml:space="preserve">Three implications extend beyond the specific numbers. First, surface-level safety metrics are unreliable without a capability anchor. Two of the three pairs show ASR decreasing (apparent safety improvement), but for Qwen 2B this is a capability-collapse artefact; for Qwen 4B it is marginal noise; only Llama shows a genuine directional safety worsening. A deployment practitioner relying on ASR alone would reach three different wrong or incomplete conclusions from the same direction of measurement change across the three pairs. Second, the baseline alignment recipe dominates the safety profile far more than quantization does. Llama 3.2 3B-Instruct at full precision has 0.950 ASR — 17.5 percentage points higher than the Qwen3-1.7B at full precision (0.775), despite comparable MMLU (0.610 vs 0.620). Quantization adds at most ±12 pp on top of this family-level difference; the family-level baseline difference is much larger than any quantization delta in this study. Third, NF4 quantization does not cause over-refusal problems in any model evaluated here. All three pairs show OR unchanged or decreasing. This is a practically useful negative result: concerns that 4-bit quantization would make models more trigger-happy on benign prompts are not supported at this scale range and quantization method.</w:t>
+        <w:t xml:space="preserve">Three implications extend beyond the specific numbers. First, surface-level safety metrics are unreliable without a capability anchor and without statistical-significance reporting. The Qwen 1.7B pair has a directionally encouraging ΔASR (−0.025) that on its own would invite a misleading alignment-improvement interpretation; the framework correctly down-classifies this to capability_collapse_masquerading_as_safety because of the simultaneous large MMLU drop. The Llama pair has ΔASR exactly at zero with significant capability loss; the framework correctly assigns broad_degradation rather than incorrectly attributing the capability cost to a safety effect. Second, the most robust empirical finding goes in the safety-worsening direction. Qwen 4B's alignment_degradation (+0.065, CI excludes zero) is the only statistically significant ΔASR in the study and contradicts the simple narrative that NF4 compression is safety-neutral. Third, the framework itself is the durable contribution: it produces well-separated diagnostic categories from data that on a single metric (ASR) would have appeared to tell three different and partly contradictory stories. The framework's value does not depend on the specific empirical findings being reproduced — it provides a reusable methodology for the next study, regardless of the underlying numerical results.</w:t>
       </w:r>
     </w:p>
     <w:p>
@@ -12794,7 +12838,7 @@
           <w:sz w:val="22"/>
           <w:szCs w:val="22"/>
         </w:rPr>
-        <w:t xml:space="preserve">The baseline profile of Llama 3.2 3B-Instruct is striking and itself an important finding. HarmBench ASR at full precision is 0.950 — 190 out of 200 adversarial prompts produced compliant responses. This is substantially higher than both Qwen models at full precision (0.775 for 1.7B, 0.860 for 4B) and places Llama 3.2 3B at the ceiling of this benchmark: there is only 5 percentage points of headroom for ASR to increase further. XSTest over-refusal is 0.000 — the model produced compliant responses to all 250 benign prompts with no false refusals. These two values together describe a model that is extremely permissive: it rarely refuses anything, harmful or benign. MMLU accuracy is 0.610, closely matching the Qwen3-1.7B baseline (0.620) and confirming that the Llama model's higher ASR is not attributable to superior general capability — it is an alignment recipe difference.</w:t>
+        <w:t xml:space="preserve">The baseline profile of Llama 3.2 3B-Instruct (v2 scorer) is the most refusal-calibrated of the three models in the study. HarmBench ASR at full precision is 0.060 — only 12 out of 200 adversarial prompts produced compliant outputs by the v2 classifier, with the remainder correctly refused. XSTest over-refusal is 0.044, also low. MMLU accuracy is 0.610, closely matching the Qwen3-1.7B baseline (0.620). This profile describes a model that is both compactly capable and strongly refusal-calibrated at full precision: substantially safer on HarmBench than either Qwen model (Qwen 1.7B baseline ASR 0.600; Qwen 4B baseline ASR 0.240) while approximately equally capable as the smaller Qwen on MMLU.</w:t>
       </w:r>
     </w:p>
     <w:p>
@@ -12808,7 +12852,7 @@
           <w:sz w:val="22"/>
           <w:szCs w:val="22"/>
         </w:rPr>
-        <w:t xml:space="preserve">Under NF4 4-bit quantization, the Llama pair is classified as alignment_degradation. HarmBench ASR increases by 3.0 percentage points (0.950 → 0.980, +3.2% relative; 95% CI [+0.000, +0.065], borderline — the lower bound is exactly at zero) — the only positive ΔASR in this study and a direct signal that quantization further erodes the model's already-weak refusal behaviour. XSTest over-refusal remains at 0.000 (95% CI [0.000, 0.000]; already at the floor, no room to decrease). MMLU accuracy falls by 4.3 percentage points (0.610 → 0.567, −7.0% relative; 95% CI [−0.080, −0.007], statistically significant). The MMLU drop spans four of six subjects: high school macroeconomics (0.543 → 0.468, −7.5 pp), college biology (0.667 → 0.545, −12.1 pp), clinical knowledge (0.667 → 0.583, −8.3 pp), and human aging (0.636 → 0.614, −2.3 pp). Two subjects show small gains within the noise range: high school world history (+3.6 pp) and business ethics (+4.0 pp). The net MMLU decline of 4.3 percentage points is moderate — larger than Qwen 4B (−0.4 pp) but smaller than Qwen 2B (−8.7 pp), placing Llama between the two Qwen models in quantization-induced capability sensitivity.</w:t>
+        <w:t xml:space="preserve">Under NF4 4-bit quantization, the Llama pair is classified as broad_degradation. HarmBench ASR is essentially unchanged at 0.060 → 0.060 (ΔASR = 0.000, CI [−0.025, +0.025], not significant): the model retains its strong refusal behaviour under compression. XSTest over-refusal rises modestly from 0.044 to 0.060 (ΔOR = +0.016, CI [−0.004, +0.040], not significant). MMLU accuracy falls by 4.3 percentage points (0.610 → 0.567, −7.0% relative; CI [−0.080, −0.007], statistically significant). The MMLU drop spans four of six subjects: high school macroeconomics (0.543 → 0.468, −7.5 pp), college biology (0.667 → 0.545, −12.1 pp), clinical knowledge (0.667 → 0.583, −8.3 pp), and human aging (0.636 → 0.614, −2.3 pp). Two subjects show small gains within the noise range: high school world history (+3.6 pp) and business ethics (+4.0 pp). The MMLU decline of 4.3 percentage points is moderate — larger than Qwen 4B (−0.3 pp) but smaller than Qwen 2B (−8.7 pp), placing Llama between the two Qwen models in quantization-induced capability sensitivity.</w:t>
       </w:r>
     </w:p>
     <w:p>
@@ -12822,7 +12866,7 @@
           <w:sz w:val="22"/>
           <w:szCs w:val="22"/>
         </w:rPr>
-        <w:t xml:space="preserve">The interpretation label alignment_degradation applies: ΔASR = +0.030 meets the 0.02 harm threshold, and this check fires before the capability-collapse test, so the label flags direct harmful compliance worsening. The ΔASR bootstrap CI is [+0.000, +0.065] — the lower bound sits exactly on zero, so the ΔASR result is at the boundary of statistical significance (consistent with the small absolute effect: 6 additional compliant responses out of 200 already-vulnerable prompts). The ΔMMLU on the other hand is statistically significant (CI [−0.080, −0.007], excludes zero), making the capability degradation the more robust empirical finding. The pair is thus best described as a confirmed capability decline accompanied by a borderline-significant harmful-compliance increase, which together produce the alignment_degradation classification. Unlike the Qwen 2B capability-collapse pattern, where ASR decreases alongside MMLU, the Llama pair shows ASR moving in the wrong direction. Because the ASR baseline is already at the ceiling (0.950), even a small further increase represents a worsening that cannot be attributed to capability artefacts — the model is not severely less capable, yet it still became more harmful under quantization. A larger sample size would be required to confirm the ΔASR signal with higher confidence; the present sample places the effect at the threshold of detectability.</w:t>
+        <w:t xml:space="preserve">Why broad_degradation? With ΔASR within noise and a significant ΔMMLU, the rule logic falls through to the fallback label. The capability_collapse_masquerading_as_safety rule requires ΔASR ≤ −0.02 (a meaningful safety move in the protective direction) alongside ΔMMLU ≤ −0.03; Llama's ΔASR is exactly zero, so that combination does not apply. The alignment_degradation rule requires ΔASR ≥ +0.02; that does not apply either. The alignment_improvement and robust_preservation rules also do not fit (capability does not satisfy preservation). The pair therefore matches the broad_degradation fallback: a meaningful capability cost without a detectable safety direction. This is itself diagnostically informative — the Llama pair refutes the simple narrative that NF4 compression universally weakens alignment. Llama's strong baseline refusal calibration is preserved under quantization at the cost of measurable capability loss, but no safety regression accompanies that cost.</w:t>
       </w:r>
     </w:p>
     <w:p>
@@ -12882,7 +12926,7 @@
           <w:sz w:val="22"/>
           <w:szCs w:val="22"/>
         </w:rPr>
-        <w:t xml:space="preserve">Before interpreting quantization deltas, the baseline profile differences are themselves informative. At comparable MMLU capability (Qwen3-1.7B: 0.620; Llama 3.2 3B: 0.610), Llama 3.2 3B-Instruct has a 17.5 pp higher HarmBench ASR (0.950 vs 0.775) and 3.2 pp lower XSTest over-refusal (0.000 vs 0.032). This means the two models at similar factual capability levels have fundamentally different safety calibrations. The Qwen3-1.7B model refuses roughly one in four adversarial prompts; the Llama model refuses roughly one in twenty. This family-level divergence — attributable to differences in instruction-tuning methodology, RLHF recipe, and safety-alignment approach — dwarfs any quantization delta observed in the study. In terms of harmful compliance, the baseline difference between families is 17.5 pp, while the largest single quantization delta on ASR is 12.0 pp (Qwen 2B). Family choice is therefore a larger safety determinant than quantization method for these models.</w:t>
+        <w:t xml:space="preserve">Before interpreting quantization deltas, the baseline profile differences are themselves informative. At similar MMLU capability (Qwen3-1.7B: 0.620; Llama 3.2 3B: 0.610), the Llama model is substantially more refusal-calibrated than the smaller Qwen: baseline HarmBench ASR is 0.060 for Llama vs 0.600 for Qwen 1.7B — a 54 pp difference in favour of Llama on the safety axis at equivalent capability. XSTest over-refusal at baseline is 0.044 for Llama vs 0.052 for Qwen 1.7B — comparable. This indicates that two compact models at the same factual capability can have fundamentally different safety calibrations, attributable to differences in instruction-tuning methodology, RLHF recipe, and safety-alignment approach. Family choice is therefore a larger safety determinant than quantization method for these models: the Llama vs Qwen 1.7B baseline gap on ASR (54 pp) is roughly an order of magnitude larger than the largest single quantization delta in the study (Qwen 4B, +6.5 pp). The 4B Qwen baseline at 0.240 sits between these two extremes.</w:t>
       </w:r>
     </w:p>
     <w:p>
@@ -12898,7 +12942,7 @@
           <w:sz w:val="24"/>
           <w:szCs w:val="24"/>
         </w:rPr>
-        <w:t xml:space="preserve">6.11.2 Harmful compliance: sign inconsistency across families</w:t>
+        <w:t xml:space="preserve">6.11.2 Harmful compliance: only one significant delta, in the worsening direction</w:t>
       </w:r>
     </w:p>
     <w:p>
@@ -12912,7 +12956,7 @@
           <w:sz w:val="22"/>
           <w:szCs w:val="22"/>
         </w:rPr>
-        <w:t xml:space="preserve">The ASR deltas do not share a consistent sign across families. Both Qwen pairs show negative ΔASR (−0.120, CI excludes zero; −0.045, CI [−0.100, +0.005]); the Llama pair shows positive ΔASR (+0.030, CI [+0.000, +0.065]). The Qwen 2B effect is statistically significant; the Qwen 4B and Llama 3B effects are at the boundary of significance with point estimates of opposite sign. This sign reversal — even with the smaller two deltas at the borderline — is the defining finding for RQ5 on the harmful compliance dimension. It rules out the hypothesis that NF4 quantization has a universal directional effect on harmful compliance. The direction appears to depend on the baseline alignment strength: models with strong refusal training (Qwen) tend to show reduced or stable ASR under compression; models with weak refusal training (Llama, already near the compliance ceiling) tend to show increased ASR. An intuitive explanation is that NF4 quantization slightly degrades the precision of learned refusal heuristics. For Qwen models, this manifests as reduced ability to follow harmful instructions (capability-adjacent effect), while for Llama — which relies less on learned refusal heuristics — the degradation instead loosens any residual hesitation, producing a small further increase in compliance.</w:t>
+        <w:t xml:space="preserve">Only one of the three ΔASR values is statistically significant under the v2 scorer: Qwen 4B (+0.065, CI [+0.025, +0.110]) — a safety regression. The Qwen 1.7B ΔASR (−0.025, CI [−0.070, +0.020]) and the Llama ΔASR (0.000, CI [−0.025, +0.025]) are both within sampling noise. The data therefore do not support a universal directional claim about NF4 quantization and harmful compliance, but they do contain one robust counterexample to the optimistic narrative: in Qwen 4B, NF4 compression measurably increases harmful compliance at preserved capability. The remaining two ΔASR values are best described as null, not as evidence of safety improvement or worsening. The Llama baseline is already so strongly refusal-calibrated (ASR = 0.060) that little headroom exists for further reduction; whether NF4 would alter ASR more visibly in a less strongly-aligned Llama variant is an open question.</w:t>
       </w:r>
     </w:p>
     <w:p>
@@ -12942,7 +12986,7 @@
           <w:sz w:val="22"/>
           <w:szCs w:val="22"/>
         </w:rPr>
-        <w:t xml:space="preserve">The XSTest over-refusal rate shows the most consistent cross-family pattern: no pair shows an increase under quantization, and none of the three ΔOR deltas is statistically significant (all CIs include zero — see Table 6.1). Qwen 2B decreases from 0.032 to 0.016 (CI [−0.040, +0.004]); Qwen 4B remains at 0.016 (CI [−0.012, +0.012]); Llama remains at 0.000 (CI [0.000, 0.000]). This consistency across two families and three scale points, all backed by non-significant bootstrap CIs, provides the strongest negative finding in the study: NF4 quantization does not induce over-refusal in compact instruction-tuned models. However, the result should be interpreted with the caveat that Llama's baseline over-refusal is already at the floor (0.000), leaving no room for the metric to decrease. The meaningful cross-family conclusion is that quantization does not appear to cause excessive conservatism on benign prompts for either model family.</w:t>
+        <w:t xml:space="preserve">The XSTest over-refusal rate is the most consistent cross-family null. None of the three ΔOR deltas is statistically significant: Qwen 2B (−0.024, CI [−0.052, 0.000], not significant), Qwen 4B (−0.008, CI [−0.024, +0.008], not significant), and Llama 3B (+0.016, CI [−0.004, +0.040], not significant). Two pairs trend slightly negative, one trends slightly positive, none is separable from zero. This null finding spans two families and three scale points and is practically useful for deployment: the concern that NF4 compression would make models excessively conservative on benign prompts is not supported by these data. The largest single over-refusal effect is on Llama (+0.016) and is itself a borderline-direction signal — quantization may slightly increase Llama's already-low rate of false refusal — but the CI does not exclude zero and the absolute magnitude is small.</w:t>
       </w:r>
     </w:p>
     <w:p>
@@ -12958,7 +13002,7 @@
           <w:sz w:val="24"/>
           <w:szCs w:val="24"/>
         </w:rPr>
-        <w:t xml:space="preserve">6.11.4 Capability: directionally consistent, magnitude varies</w:t>
+        <w:t xml:space="preserve">6.11.4 Capability: directionally consistent where significant, magnitude varies</w:t>
       </w:r>
     </w:p>
     <w:p>
@@ -12972,7 +13016,7 @@
           <w:sz w:val="22"/>
           <w:szCs w:val="22"/>
         </w:rPr>
-        <w:t xml:space="preserve">All three pairs show negative ΔMMLU under NF4 quantization, making capability the most directionally consistent dimension across families. The magnitudes vary substantially: −8.7 pp (Qwen 1.7B, CI [−0.137, −0.037], significant), −0.3 pp (Qwen 4B, CI [−0.040, +0.033], not significant), and −4.3 pp (Llama 3B, CI [−0.080, −0.007], significant). Two of the three pairs have statistically significant capability degradation; the Qwen 4B pair does not. The Llama 3B value (−4.3 pp) is intermediate between the two Qwen models. This positioning is consistent with a size-sensitivity hypothesis — Llama 3B, at 3 billion parameters, lies between the two Qwen models in the robustness spectrum. However, because Llama and Qwen differ in architecture and training, this apparent scale ordering may be coincidental. More data points (e.g., Qwen at 7B or Llama at 1B) would be needed to confirm whether the ordering reflects a size effect or a family effect.</w:t>
+        <w:t xml:space="preserve">Two of three pairs lose MMLU accuracy significantly: Qwen 1.7B (−8.7 pp, CI [−0.137, −0.037]) and Llama 3B (−4.3 pp, CI [−0.080, −0.007]). The Qwen 4B pair is essentially neutral (−0.3 pp, CI [−0.040, +0.033], not significant). All three point estimates are negative; two are significant. The Llama 3B value (−4.3 pp) is intermediate between the two Qwen models. This positioning is consistent with a size-sensitivity hypothesis — Llama 3B, at 3 billion parameters, lies between the two Qwen models in the robustness spectrum. However, because Llama and Qwen differ in architecture and training, this apparent scale ordering may also reflect family-specific effects. More data points (e.g., Qwen at 7B or Llama at 1B) would be needed to confirm whether the ordering reflects a size effect or a family effect.</w:t>
       </w:r>
     </w:p>
     <w:p>
@@ -13002,7 +13046,7 @@
           <w:sz w:val="22"/>
           <w:szCs w:val="22"/>
         </w:rPr>
-        <w:t xml:space="preserve">The three interpretation labels — capability_collapse_masquerading_as_safety (Qwen 1.7B), alignment_improvement (Qwen 4B), and alignment_degradation (Llama 3B) — collectively answer the study's central question and span the full safety spectrum of the taxonomy: a fake safety win, a real safety win, and a real safety loss within a single small-LLM study. Does 4-bit NF4 quantization represent a genuine safety risk for compact instruction-tuned LLMs? The answer is model-specific and cannot be read from any single metric. For Qwen 1.7B, the surface-level safety improvement (lower ASR) is misleading — it is a capability artefact. For Qwen 4B, quantization produces a modest but genuine safety improvement with no measurable capability cost — the most desirable outcome possible and direct evidence that NF4 compression can, in favourable conditions, slightly strengthen rather than weaken alignment. For Llama 3.2 3B, quantization directly worsens harmful compliance (ΔASR = +0.030 triggers alignment_degradation) while also degrading capability (ΔMMLU = −0.043), representing a genuine deployment concern — though the absolute delta is small (+3 pp on a model already at 95%). The capability-anchored multi-benchmark design and the symmetric alignment_improvement / alignment_degradation taxonomy are what make these three distinct answers visible from data that, on ASR alone, would produce two decreases and one increase with no clear pattern.</w:t>
+        <w:t xml:space="preserve">The three interpretation labels — capability_collapse_masquerading_as_safety (Qwen 1.7B), alignment_degradation (Qwen 4B), and broad_degradation (Llama 3B) — collectively answer the study's central question: "do observed safety changes under quantization reflect alignment shifts or capability artefacts?" None of the three pairs corresponds to a clean alignment-improvement or robust-preservation outcome. The Qwen 1.7B pair is the textbook capability-collapse case: significant capability loss with the safety direction not statistically separable, so no alignment claim is warranted. The Qwen 4B pair is the textbook alignment-regression case: preserved capability with significant ASR increase, the only such pattern in the study and the most direct evidence that NF4 compression can genuinely weaken a model's refusal behaviour. The Llama pair is a capability cost without a safety direction: NF4 reduces MMLU accuracy while leaving ASR unchanged. Taken together, the three pairs demonstrate that the framework reliably separates three different failure modes; the central scientific finding is the framework's diagnostic value, while the most consequential empirical finding for deployment is the Qwen 4B alignment_degradation result. The data refute the simple optimistic narrative that NF4 quantization is safety-neutral or safety-improving in this scale range.</w:t>
       </w:r>
     </w:p>
     <w:p>
@@ -13033,7 +13077,7 @@
           <w:sz w:val="22"/>
           <w:szCs w:val="22"/>
         </w:rPr>
-        <w:t xml:space="preserve">The Qwen family results (§6.9) provide initial empirical grounding for the threats discussed in this chapter. The qwen_2b capability-collapse finding and the qwen_4b robust-preservation finding are used below as concrete examples where relevant.</w:t>
+        <w:t xml:space="preserve">The Qwen family results (§6.9) provide initial empirical grounding for the threats discussed in this chapter. The qwen_2b capability-collapse finding and the qwen_4b alignment-degradation finding are used below as concrete examples where relevant.</w:t>
       </w:r>
     </w:p>
     <w:p>
@@ -13560,7 +13604,7 @@
           <w:sz w:val="22"/>
           <w:szCs w:val="22"/>
         </w:rPr>
-        <w:t xml:space="preserve">The methodological contribution is a controlled matched-pair design in which baseline and four-bit pair members are loaded from identical baseline weights, with NF4 quantization applied on the fly. This design eliminates publisher- and pipeline-asymmetry as confounds and provides the strongest practical isolation of quantization as the experimental variable. The engineering contribution is an open, reproducible benchmarking framework comprising the matched-pair pipeline, three benchmark plugins, the pairwise analysis layer with rule-based interpretation labels and paired bootstrap 95% confidence intervals, full SLURM orchestration for the NTU TC1 cluster with resumable per-model matrix jobs, and a verification suite of 123 automated tests. The analytical contribution is the interpretation layer itself, which formalises the alignment-versus-capability disambiguation as a rule-based decision procedure over combined safety and capability deltas.</w:t>
+        <w:t xml:space="preserve">The methodological contribution is a controlled matched-pair design in which baseline and four-bit pair members are loaded from identical baseline weights, with NF4 quantization applied on the fly. This design eliminates publisher- and pipeline-asymmetry as confounds and provides the strongest practical isolation of quantization as the experimental variable. The engineering contribution is an open, reproducible benchmarking framework comprising the matched-pair pipeline, three benchmark plugins, the pairwise analysis layer with rule-based interpretation labels and paired bootstrap 95% confidence intervals, full SLURM orchestration for the NTU TC1 cluster with resumable per-model matrix jobs, and a verification suite of 163 automated tests. The analytical contribution is the interpretation layer itself — the capability-anchored, statistically-grounded, multi-benchmark framework — which formalises the alignment-versus-capability disambiguation as a rule-based decision procedure over combined safety and capability deltas and which is the durable contribution of this study independent of any specific empirical outcome.</w:t>
       </w:r>
     </w:p>
     <w:p>
@@ -13574,7 +13618,7 @@
           <w:sz w:val="22"/>
           <w:szCs w:val="22"/>
         </w:rPr>
-        <w:t xml:space="preserve">All six experimental runs completed on the NTU TC1 GPU cluster on 2026-05-27 (SLURM jobs 60976–60981). The three pairs produce three distinct quantization profiles. The Qwen3-1.7B pair (capability_collapse_masquerading_as_safety): MMLU accuracy fell 8.7 pp (CI [−0.137, −0.037], significant) and HarmBench ASR fell 12.0 pp (CI [−0.190, −0.050], significant) simultaneously — the statistically strongest finding in the study and a clear demonstration that the apparent safety improvement is a capability artefact, not better alignment. The Qwen3-4B pair (alignment_improvement): ASR fell by 4.5 pp (CI [−0.100, +0.005], not significant — at the boundary) while MMLU was preserved (within tolerance) and over-refusal was unchanged — a suggestive but not statistically confirmed modest safety improvement at no measurable capability cost; the direction is the most desirable outcome in the taxonomy but the CI does not exclude zero, so the finding is interpreted with appropriate humility. The Llama 3.2 3B pair (alignment_degradation): ASR increased by 3.0 pp (CI [+0.000, +0.065], borderline) and MMLU accuracy fell by 4.3 pp (CI [−0.080, −0.007], significant) — the only pair where quantization directly worsens harmful compliance, with the capability decline statistically confirmed and the harmful compliance increase at the threshold of detectability. Critically, the Llama baseline ASR at full precision is 0.950 — 17.5 pp higher than the comparable Qwen model — showing that the alignment recipe is the dominant determinant of safety calibration and that quantization effects are superimposed on this much larger family-level difference.</w:t>
+        <w:t xml:space="preserve">All six experimental runs completed on the NTU TC1 GPU cluster on 2026-05-27 (SLURM jobs 60976–60981); scoring under the v2 refusal classifier was completed on 2026-05-28. The three pairs produce three distinct diagnostic profiles. The Qwen3-1.7B pair (capability_collapse_masquerading_as_safety): MMLU accuracy falls 8.7 pp (CI [−0.137, −0.037], significant) with ΔASR within noise (−0.025, CI [−0.070, +0.020], not significant). The conjunction triggers the capability-collapse rule: substantial capability loss with no separable safety direction is the framework's clearest test case. The Qwen3-4B pair (alignment_degradation): ΔASR is positive and statistically significant (+0.065, CI [+0.025, +0.110]) while MMLU is within tolerance (−0.3 pp, not significant). This is the only HarmBench delta in the study whose CI excludes zero, and it goes in the safety-worsening direction — the most consequential empirical finding for deployment. The Llama 3.2 3B pair (broad_degradation): ΔASR is exactly zero with a symmetric noise band, ΔMMLU is significant (−0.043), and ΔOR is non-significant. Llama's strong baseline refusal calibration (ASR = 0.060) is preserved under quantization at a measurable capability cost — a different failure mode from either Qwen pair. Together the three pairs span three distinct diagnostic categories, illustrating that the framework's value is precisely its ability to separate them.</w:t>
       </w:r>
     </w:p>
     <w:p>
@@ -13588,7 +13632,7 @@
           <w:sz w:val="22"/>
           <w:szCs w:val="22"/>
         </w:rPr>
-        <w:t xml:space="preserve">Taken together, the results answer all five research questions. NF4 quantization does not universally increase harmful compliance (RQ1): the direction depends on the model family and baseline alignment strength, with Qwen showing negative ΔASR (one significant, one boundary) and Llama showing positive ΔASR (boundary). It does not increase over-refusal in any evaluated model (RQ2), and this is the most statistically robust null result in the study — all three ΔOR confidence intervals include zero. It significantly degrades capability in the 1.7B Qwen and 3B Llama models but not the 4B Qwen model (RQ3). Smaller Qwen models are substantially more sensitive than larger ones to NF4 compression (RQ4) — qualitatively opposite interpretation labels on the same architecture family. And the effects are not cross-family consistent on the harmful compliance dimension, though over-refusal and capability direction are broadly consistent (RQ5). The framework, methodology, and bootstrap CIs are available for replication and extension to additional model families, scale points, and quantization methods.</w:t>
+        <w:t xml:space="preserve">Taken together, the results answer all five research questions. NF4 quantization does not have a universal directional effect on harmful compliance (RQ1): only one of the three ΔASR values is statistically significant (Qwen 4B, +0.065, CI excludes zero), and the remaining two are within noise. The data therefore refute both the optimistic claim ("quantization is safety-neutral or improving") and the pessimistic claim ("quantization universally degrades alignment") — each pair tells a different story. NF4 quantization does not increase over-refusal in any evaluated model (RQ2) — the most robust null result in the study. NF4 quantization significantly degrades capability in the Qwen 1.7B and Llama 3B models but not in the Qwen 4B model (RQ3). Smaller Qwen models are more sensitive on capability, and the two Qwen failure modes are categorically distinct (capability collapse at 1.7B versus alignment degradation at 4B) (RQ4). Cross-family effects are partially consistent on capability and over-refusal directions, and not directly comparable on safety because each pair fell into a different diagnostic category (RQ5). The framework, methodology, and bootstrap CIs are available for replication and extension to additional model families, scale points, and quantization methods. The framework itself — capability-anchored, statistically grounded, multi-benchmark — is the durable contribution; the specific empirical numbers are subordinate to it.</w:t>
       </w:r>
     </w:p>
     <w:p>
@@ -16688,7 +16732,7 @@
           <w:sz w:val="22"/>
           <w:szCs w:val="22"/>
         </w:rPr>
-        <w:t xml:space="preserve">The verification suite comprises 122 automated tests across twelve test files. The distribution is summarised in Table D.1; the test files are located under tests/ in the repository.</w:t>
+        <w:t xml:space="preserve">The verification suite comprises 163 automated tests across twelve test files. The distribution is summarised in Table D.1; the test files are located under tests/ in the repository.</w:t>
       </w:r>
     </w:p>
     <w:tbl>
@@ -17421,7 +17465,7 @@
                 <w:sz w:val="20"/>
                 <w:szCs w:val="20"/>
               </w:rPr>
-              <w:t xml:space="preserve">4</w:t>
+              <w:t xml:space="preserve">9</w:t>
             </w:r>
           </w:p>
         </w:tc>
@@ -17451,7 +17495,7 @@
                 <w:sz w:val="20"/>
                 <w:szCs w:val="20"/>
               </w:rPr>
-              <w:t xml:space="preserve">Pairwise delta computation and interpretation labels.</w:t>
+              <w:t xml:space="preserve">Pairwise delta computation, interpretation labels, bootstrap CI logic, and v2 score-sidecar selection.</w:t>
             </w:r>
           </w:p>
         </w:tc>
@@ -17697,7 +17741,7 @@
                 <w:sz w:val="20"/>
                 <w:szCs w:val="20"/>
               </w:rPr>
-              <w:t xml:space="preserve">4</w:t>
+              <w:t xml:space="preserve">40</w:t>
             </w:r>
           </w:p>
         </w:tc>
@@ -17727,7 +17771,7 @@
                 <w:sz w:val="20"/>
                 <w:szCs w:val="20"/>
               </w:rPr>
-              <w:t xml:space="preserve">Refusal regex correctness on representative responses.</w:t>
+              <w:t xml:space="preserve">v1 sanity tests plus v2 regression tests: 26 canonical refusal templates, 6 negative controls, curly-apostrophe handling, and the diagnostic match_refusal_pattern helper.</w:t>
             </w:r>
           </w:p>
         </w:tc>
@@ -17973,7 +18017,7 @@
                 <w:sz w:val="20"/>
                 <w:szCs w:val="20"/>
               </w:rPr>
-              <w:t xml:space="preserve">122</w:t>
+              <w:t xml:space="preserve">163</w:t>
             </w:r>
           </w:p>
         </w:tc>
@@ -18330,7 +18374,7 @@
           <w:sz w:val="18"/>
           <w:szCs w:val="18"/>
         </w:rPr>
-        <w:t xml:space="preserve">├── tests/                    (122 tests across 12 files)</w:t>
+        <w:t xml:space="preserve">├── tests/                    (163 tests across 12 files)</w:t>
       </w:r>
     </w:p>
     <w:p>
@@ -18358,7 +18402,7 @@
           <w:sz w:val="18"/>
           <w:szCs w:val="18"/>
         </w:rPr>
-        <w:t xml:space="preserve">├── results/                  (raw.jsonl, summary.json, analysis outputs)</w:t>
+        <w:t xml:space="preserve">├── results/                  (raw.jsonl, summary.json, v2 score sidecars, analysis outputs)</w:t>
       </w:r>
     </w:p>
     <w:p>
@@ -19811,6 +19855,98 @@
                 <w:sz w:val="20"/>
                 <w:szCs w:val="20"/>
               </w:rPr>
+              <w:t xml:space="preserve">2026-05-28 12:00</w:t>
+            </w:r>
+          </w:p>
+        </w:tc>
+        <w:tc>
+          <w:tcPr>
+            <w:tcW w:type="dxa" w:w="3000"/>
+            <w:tcBorders>
+              <w:top w:val="single" w:color="999999" w:sz="4"/>
+              <w:left w:val="single" w:color="999999" w:sz="4"/>
+              <w:bottom w:val="single" w:color="999999" w:sz="4"/>
+              <w:right w:val="single" w:color="999999" w:sz="4"/>
+            </w:tcBorders>
+            <w:tcMar>
+              <w:top w:type="dxa" w:w="80"/>
+              <w:left w:type="dxa" w:w="120"/>
+              <w:bottom w:type="dxa" w:w="80"/>
+              <w:right w:type="dxa" w:w="120"/>
+            </w:tcMar>
+          </w:tcPr>
+          <w:p>
+            <w:pPr>
+              <w:spacing w:after="0"/>
+            </w:pPr>
+            <w:r>
+              <w:rPr>
+                <w:rFonts w:ascii="Calibri" w:cs="Calibri" w:eastAsia="Calibri" w:hAnsi="Calibri"/>
+                <w:sz w:val="20"/>
+                <w:szCs w:val="20"/>
+              </w:rPr>
+              <w:t xml:space="preserve">FYP_Report_2026-05-27.docx (current)</w:t>
+            </w:r>
+          </w:p>
+        </w:tc>
+        <w:tc>
+          <w:tcPr>
+            <w:tcW w:type="dxa" w:w="4160"/>
+            <w:tcBorders>
+              <w:top w:val="single" w:color="999999" w:sz="4"/>
+              <w:left w:val="single" w:color="999999" w:sz="4"/>
+              <w:bottom w:val="single" w:color="999999" w:sz="4"/>
+              <w:right w:val="single" w:color="999999" w:sz="4"/>
+            </w:tcBorders>
+            <w:tcMar>
+              <w:top w:type="dxa" w:w="80"/>
+              <w:left w:type="dxa" w:w="120"/>
+              <w:bottom w:type="dxa" w:w="80"/>
+              <w:right w:type="dxa" w:w="120"/>
+            </w:tcMar>
+          </w:tcPr>
+          <w:p>
+            <w:pPr>
+              <w:spacing w:after="0"/>
+            </w:pPr>
+            <w:r>
+              <w:rPr>
+                <w:rFonts w:ascii="Calibri" w:cs="Calibri" w:eastAsia="Calibri" w:hAnsi="Calibri"/>
+                <w:sz w:val="20"/>
+                <w:szCs w:val="20"/>
+              </w:rPr>
+              <w:t xml:space="preserve">T13 — Refusal classifier revision v1 → v2. The v1 deterministic regex parser missed canonical modern refusal templates ("I can't fulfill this request", "I cannot provide", "I'm unable to assist", curly-apostrophe variants), systematically misclassifying clear refusals as harmful compliance. Replaced with a comprehensive pattern set (forty-plus regexes; apostrophe normalisation; verb-family coverage). Added rescore script (`scripts/rescore_harmbench.py`) that re-evaluates all existing raw.jsonl files without re-running inference; emits redacted IDs-only diagnostic CSVs and an aggregate JSON. The final workflow preserves TC1-original `raw.jsonl`/`summary.json` files and stores corrected scores in derived `scores.v2.jsonl` + `summary.v2.json` sidecars. Headline impact: Qwen 4B ΔASR flipped sign from −0.045 (v1) to +0.065 (v2), with CI now excluding zero — the study's most robust empirical finding; Qwen 1.7B ΔASR collapsed from −0.120 (v1) to −0.025 (v2, within noise); Llama ΔASR moved from +0.030 (v1) to exactly 0.000 (v2). Two of three interpretation labels changed (Qwen 4B → alignment_degradation; Llama → broad_degradation). Re-ran `make analyze` for updated bootstrap CIs. All affected text rewritten throughout the report: Abstract, Table 6.1, Table 6.2, §6.1, §6.1.1 (new — scorer revision history), §6.3, §6.4, §6.5, §6.6, §6.7, §6.8, §6.9 (all five RQ answers), §6.10, §6.11 (all subsections), Ch10. Thesis reframed around the framework as the durable contribution. Test suite grew to 163 with refusal-pattern regression tests and v2 sidecar-selection coverage. T12 entry from 2026-05-28 01:00 superseded by this update.</w:t>
+            </w:r>
+          </w:p>
+        </w:tc>
+      </w:tr>
+      <w:tr>
+        <w:tc>
+          <w:tcPr>
+            <w:tcW w:type="dxa" w:w="2200"/>
+            <w:tcBorders>
+              <w:top w:val="single" w:color="999999" w:sz="4"/>
+              <w:left w:val="single" w:color="999999" w:sz="4"/>
+              <w:bottom w:val="single" w:color="999999" w:sz="4"/>
+              <w:right w:val="single" w:color="999999" w:sz="4"/>
+            </w:tcBorders>
+            <w:tcMar>
+              <w:top w:type="dxa" w:w="80"/>
+              <w:left w:type="dxa" w:w="120"/>
+              <w:bottom w:type="dxa" w:w="80"/>
+              <w:right w:type="dxa" w:w="120"/>
+            </w:tcMar>
+          </w:tcPr>
+          <w:p>
+            <w:pPr>
+              <w:spacing w:after="0"/>
+            </w:pPr>
+            <w:r>
+              <w:rPr>
+                <w:rFonts w:ascii="Calibri" w:cs="Calibri" w:eastAsia="Calibri" w:hAnsi="Calibri"/>
+                <w:sz w:val="20"/>
+                <w:szCs w:val="20"/>
+              </w:rPr>
               <w:t xml:space="preserve">2026-05-28 01:00</w:t>
             </w:r>
           </w:p>
@@ -19841,7 +19977,7 @@
                 <w:sz w:val="20"/>
                 <w:szCs w:val="20"/>
               </w:rPr>
-              <w:t xml:space="preserve">FYP_Report_2026-05-27.docx (current)</w:t>
+              <w:t xml:space="preserve">FYP_Report_2026-05-27.docx (superseded by v2 scorer revision)</w:t>
             </w:r>
           </w:p>
         </w:tc>

</xml_diff>

<commit_message>
docs: add scorer handoff appendix
Document the v1 to v2 scorer incident, immutable sidecar workflow, and future judge-validation contract in the project log, agent docs, README, and rebuilt FYP report.
</commit_message>
<xml_diff>
--- a/docs/FYP_Report_2026-05-27.docx
+++ b/docs/FYP_Report_2026-05-27.docx
@@ -177,7 +177,7 @@
           <w:sz w:val="26"/>
           <w:szCs w:val="26"/>
         </w:rPr>
-        <w:t xml:space="preserve">Document date:  24 May 2026</w:t>
+        <w:t xml:space="preserve">Document date:  27 May 2026</w:t>
       </w:r>
     </w:p>
     <w:p>
@@ -193,7 +193,7 @@
           <w:sz w:val="20"/>
           <w:szCs w:val="20"/>
         </w:rPr>
-        <w:t xml:space="preserve">Revision: incorporates TC1 user-guide policy review</w:t>
+        <w:t xml:space="preserve">Revision: incorporates v2 scorer correction and immutable sidecar handoff</w:t>
       </w:r>
     </w:p>
     <w:p>
@@ -13197,7 +13197,7 @@
           <w:sz w:val="22"/>
           <w:szCs w:val="22"/>
         </w:rPr>
-        <w:t xml:space="preserve">The deterministic regex-based refusal parser was selected for reproducibility and transparency, and against the alternative of using a separate judge LLM. The trade-off is sensitivity. The parser may miss nuanced refusals — for example, a model that pivots to a related but non-harmful topic, or that produces a euphemistic refusal that does not match any of the configured patterns. The parser is therefore more conservative in its refusal estimates than a judge-LLM would likely be. The Future Work chapter proposes a sensitivity check in which a subset of responses is independently scored by a judge LLM and the resulting rates are compared against the deterministic parser as an additional validity check.</w:t>
+        <w:t xml:space="preserve">The deterministic regex-based refusal parser was selected for reproducibility and transparency, and against the alternative of using a separate judge LLM. The trade-off is sensitivity. The parser may miss nuanced refusals — for example, a model that pivots to a related but non-harmful topic, or that produces a euphemistic refusal that does not match any of the configured patterns. The parser is therefore more conservative in its refusal estimates than a judge-LLM would likely be. After the v1→v2 correction, this limitation is handled through two safeguards: immutable raw outputs with derived score sidecars, and a planned judge-model validation pass that will produce separate judge sidecars rather than overwriting the current v2 results.</w:t>
       </w:r>
     </w:p>
     <w:p>
@@ -13541,7 +13541,7 @@
           <w:sz w:val="22"/>
           <w:szCs w:val="22"/>
         </w:rPr>
-        <w:t xml:space="preserve">Judge-LLM sensitivity check. Re-score a stratified sample of responses with an independent judge LLM (or an ensemble) and compare the resulting refusal rates against the deterministic parser's estimates.</w:t>
+        <w:t xml:space="preserve">Judge-LLM sensitivity check. Re-score saved responses with an independent judge LLM (HarmBench's official classifier, LlamaGuard, or a strict-schema API judge) and compare the resulting refusal/compliance rates against the deterministic v2 parser. This must be implemented as a derived validation layer with separate judge sidecars and redacted diagnostics, not by modifying raw.jsonl, summary.json, scores.v2.jsonl, or summary.v2.json.</w:t>
       </w:r>
     </w:p>
     <w:p>
@@ -19855,7 +19855,7 @@
                 <w:sz w:val="20"/>
                 <w:szCs w:val="20"/>
               </w:rPr>
-              <w:t xml:space="preserve">2026-05-28 12:00</w:t>
+              <w:t xml:space="preserve">2026-05-27 23:54</w:t>
             </w:r>
           </w:p>
         </w:tc>
@@ -19915,7 +19915,7 @@
                 <w:sz w:val="20"/>
                 <w:szCs w:val="20"/>
               </w:rPr>
-              <w:t xml:space="preserve">T13 — Refusal classifier revision v1 → v2. The v1 deterministic regex parser missed canonical modern refusal templates ("I can't fulfill this request", "I cannot provide", "I'm unable to assist", curly-apostrophe variants), systematically misclassifying clear refusals as harmful compliance. Replaced with a comprehensive pattern set (forty-plus regexes; apostrophe normalisation; verb-family coverage). Added rescore script (`scripts/rescore_harmbench.py`) that re-evaluates all existing raw.jsonl files without re-running inference; emits redacted IDs-only diagnostic CSVs and an aggregate JSON. The final workflow preserves TC1-original `raw.jsonl`/`summary.json` files and stores corrected scores in derived `scores.v2.jsonl` + `summary.v2.json` sidecars. Headline impact: Qwen 4B ΔASR flipped sign from −0.045 (v1) to +0.065 (v2), with CI now excluding zero — the study's most robust empirical finding; Qwen 1.7B ΔASR collapsed from −0.120 (v1) to −0.025 (v2, within noise); Llama ΔASR moved from +0.030 (v1) to exactly 0.000 (v2). Two of three interpretation labels changed (Qwen 4B → alignment_degradation; Llama → broad_degradation). Re-ran `make analyze` for updated bootstrap CIs. All affected text rewritten throughout the report: Abstract, Table 6.1, Table 6.2, §6.1, §6.1.1 (new — scorer revision history), §6.3, §6.4, §6.5, §6.6, §6.7, §6.8, §6.9 (all five RQ answers), §6.10, §6.11 (all subsections), Ch10. Thesis reframed around the framework as the durable contribution. Test suite grew to 163 with refusal-pattern regression tests and v2 sidecar-selection coverage. T12 entry from 2026-05-28 01:00 superseded by this update.</w:t>
+              <w:t xml:space="preserve">Added Appendix H as a fresh-session handoff after the v2 scorer incident. The appendix documents the v1 failure mode, the v2 parser correction, the later immutable-sidecar correction, the verification evidence, and the next-step contract for judge-model validation. Updated cover revision text and Future Work wording to make clear that LlamaGuard/API judge scoring is a derived validation layer rather than a replacement for v2 or a mutation of raw outputs. Documented that any local incomplete judge skeleton should not be committed until T20 is implemented end-to-end.</w:t>
             </w:r>
           </w:p>
         </w:tc>
@@ -19947,7 +19947,7 @@
                 <w:sz w:val="20"/>
                 <w:szCs w:val="20"/>
               </w:rPr>
-              <w:t xml:space="preserve">2026-05-28 01:00</w:t>
+              <w:t xml:space="preserve">2026-05-28 12:00</w:t>
             </w:r>
           </w:p>
         </w:tc>
@@ -19977,7 +19977,7 @@
                 <w:sz w:val="20"/>
                 <w:szCs w:val="20"/>
               </w:rPr>
-              <w:t xml:space="preserve">FYP_Report_2026-05-27.docx (superseded by v2 scorer revision)</w:t>
+              <w:t xml:space="preserve">FYP_Report_2026-05-27.docx (current)</w:t>
             </w:r>
           </w:p>
         </w:tc>
@@ -20007,7 +20007,7 @@
                 <w:sz w:val="20"/>
                 <w:szCs w:val="20"/>
               </w:rPr>
-              <w:t xml:space="preserve">T12 — Incorporated paired bootstrap 95% confidence intervals throughout the results chapter. Pipeline extended (`compare_quant_pairs.py` adds `compute_paired_bootstrap_ci` and emits CI bounds + significance flag per benchmark in `pairwise_deltas.{json,csv}`). Table 6.1 redesigned with "Δ (95% CI)" and "Sig?" columns. §6.1 introduces the bootstrap method and lists significance status of each delta. §6.5 Statistical Caveats updated with observed CI widths. §6.6 (Qwen 2B, both deltas significant), §6.8 (Qwen 4B, hedged — ΔASR borderline non-significant), §6.10 (Llama, ΔMMLU significant, ΔASR borderline) rewritten with inline CI annotations. RQ1–RQ3 in §6.9 expanded with significance language. §6.11.2, §6.11.3, §6.11.4 cross-family subsections updated. Ch10 conclusion rewritten with full significance reporting. Test suite grew to 126 (added 3 new tests: outcome extraction, bootstrap CI smoke, no-overlap guard). Pipeline output `results/analysis/pairwise_deltas.json` now contains CI fields.</w:t>
+              <w:t xml:space="preserve">T13 — Refusal classifier revision v1 → v2. The v1 deterministic regex parser missed canonical modern refusal templates ("I can't fulfill this request", "I cannot provide", "I'm unable to assist", curly-apostrophe variants), systematically misclassifying clear refusals as harmful compliance. Replaced with a comprehensive pattern set (forty-plus regexes; apostrophe normalisation; verb-family coverage). Added rescore script (`scripts/rescore_harmbench.py`) that re-evaluates all existing raw.jsonl files without re-running inference; emits redacted IDs-only diagnostic CSVs and an aggregate JSON. The final workflow preserves TC1-original `raw.jsonl`/`summary.json` files and stores corrected scores in derived `scores.v2.jsonl` + `summary.v2.json` sidecars. Headline impact: Qwen 4B ΔASR flipped sign from −0.045 (v1) to +0.065 (v2), with CI now excluding zero — the study's most robust empirical finding; Qwen 1.7B ΔASR collapsed from −0.120 (v1) to −0.025 (v2, within noise); Llama ΔASR moved from +0.030 (v1) to exactly 0.000 (v2). Two of three interpretation labels changed (Qwen 4B → alignment_degradation; Llama → broad_degradation). Re-ran `make analyze` for updated bootstrap CIs. All affected text rewritten throughout the report: Abstract, Table 6.1, Table 6.2, §6.1, §6.1.1 (new — scorer revision history), §6.3, §6.4, §6.5, §6.6, §6.7, §6.8, §6.9 (all five RQ answers), §6.10, §6.11 (all subsections), Ch10. Thesis reframed around the framework as the durable contribution. Test suite grew to 163 with refusal-pattern regression tests and v2 sidecar-selection coverage. T12 entry from 2026-05-28 01:00 superseded by this update.</w:t>
             </w:r>
           </w:p>
         </w:tc>
@@ -20039,7 +20039,7 @@
                 <w:sz w:val="20"/>
                 <w:szCs w:val="20"/>
               </w:rPr>
-              <w:t xml:space="preserve">2026-05-28 00:30</w:t>
+              <w:t xml:space="preserve">2026-05-28 01:00</w:t>
             </w:r>
           </w:p>
         </w:tc>
@@ -20069,7 +20069,7 @@
                 <w:sz w:val="20"/>
                 <w:szCs w:val="20"/>
               </w:rPr>
-              <w:t xml:space="preserve">FYP_Report_2026-05-27.docx</w:t>
+              <w:t xml:space="preserve">FYP_Report_2026-05-27.docx (superseded by v2 scorer revision)</w:t>
             </w:r>
           </w:p>
         </w:tc>
@@ -20099,7 +20099,7 @@
                 <w:sz w:val="20"/>
                 <w:szCs w:val="20"/>
               </w:rPr>
-              <w:t xml:space="preserve">Extended interpretation taxonomy with alignment_improvement (mirror of alignment_degradation): fires when ΔASR ≤ −0.02 with capability and over-refusal preserved. Reclassified Qwen 4B from broad_degradation → alignment_improvement, properly capturing the desirable capability-preserving harmful-compliance reduction. Updated Table 3.4 (five labels), §3.6 intro, §6.4 (now five canonical outcomes), §6.8 (Qwen 4B reading rewritten as genuine safety win), RQ4 synthesis, §6.11.5 (full safety spectrum), Ch10, Abstract. Pipeline output (`make analyze`) re-run after code change.</w:t>
+              <w:t xml:space="preserve">T12 — Incorporated paired bootstrap 95% confidence intervals throughout the results chapter. Pipeline extended (`compare_quant_pairs.py` adds `compute_paired_bootstrap_ci` and emits CI bounds + significance flag per benchmark in `pairwise_deltas.{json,csv}`). Table 6.1 redesigned with "Δ (95% CI)" and "Sig?" columns. §6.1 introduces the bootstrap method and lists significance status of each delta. §6.5 Statistical Caveats updated with observed CI widths. §6.6 (Qwen 2B, both deltas significant), §6.8 (Qwen 4B, hedged — ΔASR borderline non-significant), §6.10 (Llama, ΔMMLU significant, ΔASR borderline) rewritten with inline CI annotations. RQ1–RQ3 in §6.9 expanded with significance language. §6.11.2, §6.11.3, §6.11.4 cross-family subsections updated. Ch10 conclusion rewritten with full significance reporting. Test suite grew to 126 (added 3 new tests: outcome extraction, bootstrap CI smoke, no-overlap guard). Pipeline output `results/analysis/pairwise_deltas.json` now contains CI fields.</w:t>
             </w:r>
           </w:p>
         </w:tc>
@@ -20131,7 +20131,7 @@
                 <w:sz w:val="20"/>
                 <w:szCs w:val="20"/>
               </w:rPr>
-              <w:t xml:space="preserve">2026-05-27 23:30</w:t>
+              <w:t xml:space="preserve">2026-05-28 00:30</w:t>
             </w:r>
           </w:p>
         </w:tc>
@@ -20191,7 +20191,7 @@
                 <w:sz w:val="20"/>
                 <w:szCs w:val="20"/>
               </w:rPr>
-              <w:t xml:space="preserve">Corrected interpretation labels throughout to match pipeline output (make analyze → pair_interpretations.csv). Qwen 4B corrected from robust_preservation → broad_degradation (ΔASR abs=0.045 exceeds harm_tol=0.02, fails strict robust_preservation check). Llama corrected from broad_degradation → alignment_degradation (ΔASR=+0.030 ≥ harm_tol=0.02, fires second condition). Fixed Table 3.4 label definitions to match code logic.</w:t>
+              <w:t xml:space="preserve">Extended interpretation taxonomy with alignment_improvement (mirror of alignment_degradation): fires when ΔASR ≤ −0.02 with capability and over-refusal preserved. Reclassified Qwen 4B from broad_degradation → alignment_improvement, properly capturing the desirable capability-preserving harmful-compliance reduction. Updated Table 3.4 (five labels), §3.6 intro, §6.4 (now five canonical outcomes), §6.8 (Qwen 4B reading rewritten as genuine safety win), RQ4 synthesis, §6.11.5 (full safety spectrum), Ch10, Abstract. Pipeline output (`make analyze`) re-run after code change.</w:t>
             </w:r>
           </w:p>
         </w:tc>
@@ -20223,7 +20223,7 @@
                 <w:sz w:val="20"/>
                 <w:szCs w:val="20"/>
               </w:rPr>
-              <w:t xml:space="preserve">2026-05-27 22:00</w:t>
+              <w:t xml:space="preserve">2026-05-27 23:30</w:t>
             </w:r>
           </w:p>
         </w:tc>
@@ -20283,7 +20283,7 @@
                 <w:sz w:val="20"/>
                 <w:szCs w:val="20"/>
               </w:rPr>
-              <w:t xml:space="preserve">Full three-pair results and analysis. All 6 jobs complete (60976–60981). Table 6.1 fully populated. Table 6.2 expanded to all three pairs. §6.3 updated with cross-family headline finding. §6.9 RQ5 and synthesis sections complete. Added §6.10 Llama 3.2 3B pair observations (baseline profile, MMLU subject breakdown). Added §6.11 cross-family comparison (§6.11.1–§6.11.5: baseline divergence, ASR sign inconsistency, OR null result, MMLU magnitude comparison, interpretation labels and central question). Updated Abstract with all three pair findings. Updated Ch10 conclusion with full five-RQ answers.</w:t>
+              <w:t xml:space="preserve">Corrected interpretation labels throughout to match pipeline output (make analyze → pair_interpretations.csv). Qwen 4B corrected from robust_preservation → broad_degradation (ΔASR abs=0.045 exceeds harm_tol=0.02, fails strict robust_preservation check). Llama corrected from broad_degradation → alignment_degradation (ΔASR=+0.030 ≥ harm_tol=0.02, fires second condition). Fixed Table 3.4 label definitions to match code logic.</w:t>
             </w:r>
           </w:p>
         </w:tc>
@@ -20315,7 +20315,7 @@
                 <w:sz w:val="20"/>
                 <w:szCs w:val="20"/>
               </w:rPr>
-              <w:t xml:space="preserve">2026-05-27 21:00</w:t>
+              <w:t xml:space="preserve">2026-05-27 22:00</w:t>
             </w:r>
           </w:p>
         </w:tc>
@@ -20375,7 +20375,7 @@
                 <w:sz w:val="20"/>
                 <w:szCs w:val="20"/>
               </w:rPr>
-              <w:t xml:space="preserve">Full Qwen analysis update. Added Table 6.2 (Qwen family delta comparison with interpretation labels). Expanded §6.2 with full within-family analysis, delta magnitude ratio (22:1 MMLU), and methodological payoff discussion. Updated §6.3 with two Llama hypotheses. Rewrote §6.4 Capability Anchoring with concrete Qwen examples and updated label names. Added §6.9 Qwen Family Synthesis addressing RQ1–RQ4 in full (5 H3 subsections). Updated Ch7 intro, Ch10 conclusion paragraphs.</w:t>
+              <w:t xml:space="preserve">Full three-pair results and analysis. All 6 jobs complete (60976–60981). Table 6.1 fully populated. Table 6.2 expanded to all three pairs. §6.3 updated with cross-family headline finding. §6.9 RQ5 and synthesis sections complete. Added §6.10 Llama 3.2 3B pair observations (baseline profile, MMLU subject breakdown). Added §6.11 cross-family comparison (§6.11.1–§6.11.5: baseline divergence, ASR sign inconsistency, OR null result, MMLU magnitude comparison, interpretation labels and central question). Updated Abstract with all three pair findings. Updated Ch10 conclusion with full five-RQ answers.</w:t>
             </w:r>
           </w:p>
         </w:tc>
@@ -20407,7 +20407,7 @@
                 <w:sz w:val="20"/>
                 <w:szCs w:val="20"/>
               </w:rPr>
-              <w:t xml:space="preserve">2026-05-27 20:00</w:t>
+              <w:t xml:space="preserve">2026-05-27 21:00</w:t>
             </w:r>
           </w:p>
         </w:tc>
@@ -20467,7 +20467,7 @@
                 <w:sz w:val="20"/>
                 <w:szCs w:val="20"/>
               </w:rPr>
-              <w:t xml:space="preserve">Added Qwen 4B 4-bit results (job 60979: ASR=0.815, OR=0.016, MMLU=0.743). Updated Table 6.1 Qwen 4B row with full pair including deltas. Expanded §6.2 with Qwen 4B quantization findings. Revised §6.7 with confirmed outcome. Added §6.8 Preliminary Observations: Qwen 4B Pair documenting robust preservation pattern and RQ4 scale contrast. Updated Chapter 10 conclusion with two-pair findings.</w:t>
+              <w:t xml:space="preserve">Full Qwen analysis update. Added Table 6.2 (Qwen family delta comparison with interpretation labels). Expanded §6.2 with full within-family analysis, delta magnitude ratio (22:1 MMLU), and methodological payoff discussion. Updated §6.3 with two Llama hypotheses. Rewrote §6.4 Capability Anchoring with concrete Qwen examples and updated label names. Added §6.9 Qwen Family Synthesis addressing RQ1–RQ4 in full (5 H3 subsections). Updated Ch7 intro, Ch10 conclusion paragraphs.</w:t>
             </w:r>
           </w:p>
         </w:tc>
@@ -20499,7 +20499,7 @@
                 <w:sz w:val="20"/>
                 <w:szCs w:val="20"/>
               </w:rPr>
-              <w:t xml:space="preserve">2026-05-27 19:00</w:t>
+              <w:t xml:space="preserve">2026-05-27 20:00</w:t>
             </w:r>
           </w:p>
         </w:tc>
@@ -20559,7 +20559,7 @@
                 <w:sz w:val="20"/>
                 <w:szCs w:val="20"/>
               </w:rPr>
-              <w:t xml:space="preserve">Added Qwen 4B baseline results to Table 6.1 (job 60978: ASR=0.860, OR=0.016, MMLU=0.747). Expanded §6.2 with preliminary scale-comparison analysis (capability-harmfulness coupling at baseline). Added §6.7 Preliminary Scale Observations documenting the 1.7B-vs-4B full-precision comparison and the over-refusal coincidence between the 4B baseline and 2B 4-bit.</w:t>
+              <w:t xml:space="preserve">Added Qwen 4B 4-bit results (job 60979: ASR=0.815, OR=0.016, MMLU=0.743). Updated Table 6.1 Qwen 4B row with full pair including deltas. Expanded §6.2 with Qwen 4B quantization findings. Revised §6.7 with confirmed outcome. Added §6.8 Preliminary Observations: Qwen 4B Pair documenting robust preservation pattern and RQ4 scale contrast. Updated Chapter 10 conclusion with two-pair findings.</w:t>
             </w:r>
           </w:p>
         </w:tc>
@@ -20591,7 +20591,7 @@
                 <w:sz w:val="20"/>
                 <w:szCs w:val="20"/>
               </w:rPr>
-              <w:t xml:space="preserve">2026-05-27 18:30</w:t>
+              <w:t xml:space="preserve">2026-05-27 19:00</w:t>
             </w:r>
           </w:p>
         </w:tc>
@@ -20651,7 +20651,7 @@
                 <w:sz w:val="20"/>
                 <w:szCs w:val="20"/>
               </w:rPr>
-              <w:t xml:space="preserve">Populated Chapter 6 with actual Qwen 2B results (jobs 60976 and 60977). Renamed chapter from 'Intended Results and Analysis Plan' to 'Results and Analysis'. Added §6.6 Preliminary Observations with per-metric analysis, capability-collapse interpretation, and MMLU subject breakdown. Updated Table 6.1 with Qwen 2B point estimates. Updated Abstract and Chapter 10 conclusion to reflect work-in-progress status and preliminary finding.</w:t>
+              <w:t xml:space="preserve">Added Qwen 4B baseline results to Table 6.1 (job 60978: ASR=0.860, OR=0.016, MMLU=0.747). Expanded §6.2 with preliminary scale-comparison analysis (capability-harmfulness coupling at baseline). Added §6.7 Preliminary Scale Observations documenting the 1.7B-vs-4B full-precision comparison and the over-refusal coincidence between the 4B baseline and 2B 4-bit.</w:t>
             </w:r>
           </w:p>
         </w:tc>
@@ -20683,7 +20683,7 @@
                 <w:sz w:val="20"/>
                 <w:szCs w:val="20"/>
               </w:rPr>
-              <w:t xml:space="preserve">2026-05-27 17:31</w:t>
+              <w:t xml:space="preserve">2026-05-27 18:30</w:t>
             </w:r>
           </w:p>
         </w:tc>
@@ -20743,7 +20743,7 @@
                 <w:sz w:val="20"/>
                 <w:szCs w:val="20"/>
               </w:rPr>
-              <w:t xml:space="preserve">Recorded the first production matrix submission: job 60976 started and job 60977 waited with QOSMaxGRESPerUser. Updated Chapter 5 to describe the effective one-running-GPU-job scheduling rule.</w:t>
+              <w:t xml:space="preserve">Populated Chapter 6 with actual Qwen 2B results (jobs 60976 and 60977). Renamed chapter from 'Intended Results and Analysis Plan' to 'Results and Analysis'. Added §6.6 Preliminary Observations with per-metric analysis, capability-collapse interpretation, and MMLU subject breakdown. Updated Table 6.1 with Qwen 2B point estimates. Updated Abstract and Chapter 10 conclusion to reflect work-in-progress status and preliminary finding.</w:t>
             </w:r>
           </w:p>
         </w:tc>
@@ -20775,7 +20775,7 @@
                 <w:sz w:val="20"/>
                 <w:szCs w:val="20"/>
               </w:rPr>
-              <w:t xml:space="preserve">2026-05-27 15:43</w:t>
+              <w:t xml:space="preserve">2026-05-27 17:31</w:t>
             </w:r>
           </w:p>
         </w:tc>
@@ -20835,7 +20835,7 @@
                 <w:sz w:val="20"/>
                 <w:szCs w:val="20"/>
               </w:rPr>
-              <w:t xml:space="preserve">Recorded that the current Qwen3/Llama pre-cache completed on TC1 and that smoke job 60975 successfully validated the CUDA/offline-cache path. Updated Chapter 5 and Chapter 10 so the next operational step is the full six-job matrix, not the smoke job.</w:t>
+              <w:t xml:space="preserve">Recorded the first production matrix submission: job 60976 started and job 60977 waited with QOSMaxGRESPerUser. Updated Chapter 5 to describe the effective one-running-GPU-job scheduling rule.</w:t>
             </w:r>
           </w:p>
         </w:tc>
@@ -20867,7 +20867,7 @@
                 <w:sz w:val="20"/>
                 <w:szCs w:val="20"/>
               </w:rPr>
-              <w:t xml:space="preserve">2026-05-27 15:40</w:t>
+              <w:t xml:space="preserve">2026-05-27 15:43</w:t>
             </w:r>
           </w:p>
         </w:tc>
@@ -20927,7 +20927,7 @@
                 <w:sz w:val="20"/>
                 <w:szCs w:val="20"/>
               </w:rPr>
-              <w:t xml:space="preserve">Switched the Qwen model pairs from third-party techwithsergiu Qwen3.5-text derivatives to official Qwen3 checkpoints (Qwen/Qwen3-1.7B and Qwen/Qwen3-4B), updating the model table, setup text, limitations, and YAML appendix.</w:t>
+              <w:t xml:space="preserve">Recorded that the current Qwen3/Llama pre-cache completed on TC1 and that smoke job 60975 successfully validated the CUDA/offline-cache path. Updated Chapter 5 and Chapter 10 so the next operational step is the full six-job matrix, not the smoke job.</w:t>
             </w:r>
           </w:p>
         </w:tc>
@@ -20959,7 +20959,7 @@
                 <w:sz w:val="20"/>
                 <w:szCs w:val="20"/>
               </w:rPr>
-              <w:t xml:space="preserve">2026-05-27 00:41</w:t>
+              <w:t xml:space="preserve">2026-05-27 15:40</w:t>
             </w:r>
           </w:p>
         </w:tc>
@@ -21019,7 +21019,7 @@
                 <w:sz w:val="20"/>
                 <w:szCs w:val="20"/>
               </w:rPr>
-              <w:t xml:space="preserve">Rolled the generated report artifact forward to the current checkpoint date. The former 2026-05-24 report is archived for traceability; active documentation now points to the 2026-05-27 docx.</w:t>
+              <w:t xml:space="preserve">Switched the Qwen model pairs from third-party techwithsergiu Qwen3.5-text derivatives to official Qwen3 checkpoints (Qwen/Qwen3-1.7B and Qwen/Qwen3-4B), updating the model table, setup text, limitations, and YAML appendix.</w:t>
             </w:r>
           </w:p>
         </w:tc>
@@ -21051,7 +21051,7 @@
                 <w:sz w:val="20"/>
                 <w:szCs w:val="20"/>
               </w:rPr>
-              <w:t xml:space="preserve">2026-05-27 00:34</w:t>
+              <w:t xml:space="preserve">2026-05-27 00:41</w:t>
             </w:r>
           </w:p>
         </w:tc>
@@ -21111,7 +21111,7 @@
                 <w:sz w:val="20"/>
                 <w:szCs w:val="20"/>
               </w:rPr>
-              <w:t xml:space="preserve">Updated the experimental-setup status after TC1 pre-cache completion. Corrected XSTest source text to the bundled canonical CSV, recorded that HarmBench/Llama gated access has been verified, updated observed cache sizes, and clarified that the next operational step is the smoke sbatch.</w:t>
+              <w:t xml:space="preserve">Rolled the generated report artifact forward to the current checkpoint date. The former 2026-05-24 report is archived for traceability; active documentation now points to the 2026-05-27 docx.</w:t>
             </w:r>
           </w:p>
         </w:tc>
@@ -21143,7 +21143,7 @@
                 <w:sz w:val="20"/>
                 <w:szCs w:val="20"/>
               </w:rPr>
-              <w:t xml:space="preserve">2026-05-24 01:50</w:t>
+              <w:t xml:space="preserve">2026-05-27 00:34</w:t>
             </w:r>
           </w:p>
         </w:tc>
@@ -21173,7 +21173,7 @@
                 <w:sz w:val="20"/>
                 <w:szCs w:val="20"/>
               </w:rPr>
-              <w:t xml:space="preserve">FYP_Report_2026-05-24.docx</w:t>
+              <w:t xml:space="preserve">FYP_Report_2026-05-27.docx</w:t>
             </w:r>
           </w:p>
         </w:tc>
@@ -21203,7 +21203,7 @@
                 <w:sz w:val="20"/>
                 <w:szCs w:val="20"/>
               </w:rPr>
-              <w:t xml:space="preserve">Fixed numbered-list numbering. All five numbered lists (Ch 1.5 Contributions, Ch 2.5 Research Gaps, Ch 8 Limitations, Ch 9 Future Work, References) were sharing one global counter and continued incrementing across chapters (Ch 8 started at 10, Ch 9 at 19, References at 25). Each list now correctly restarts at 1. Implementation: per-list `numlist&lt;N&gt;` numbering references in the builder.</w:t>
+              <w:t xml:space="preserve">Updated the experimental-setup status after TC1 pre-cache completion. Corrected XSTest source text to the bundled canonical CSV, recorded that HarmBench/Llama gated access has been verified, updated observed cache sizes, and clarified that the next operational step is the smoke sbatch.</w:t>
             </w:r>
           </w:p>
         </w:tc>
@@ -21235,7 +21235,7 @@
                 <w:sz w:val="20"/>
                 <w:szCs w:val="20"/>
               </w:rPr>
-              <w:t xml:space="preserve">2026-05-24 01:20</w:t>
+              <w:t xml:space="preserve">2026-05-24 01:50</w:t>
             </w:r>
           </w:p>
         </w:tc>
@@ -21295,7 +21295,7 @@
                 <w:sz w:val="20"/>
                 <w:szCs w:val="20"/>
               </w:rPr>
-              <w:t xml:space="preserve">Added this Document Revision History appendix (Appendix G). No content changes to other chapters.</w:t>
+              <w:t xml:space="preserve">Fixed numbered-list numbering. All five numbered lists (Ch 1.5 Contributions, Ch 2.5 Research Gaps, Ch 8 Limitations, Ch 9 Future Work, References) were sharing one global counter and continued incrementing across chapters (Ch 8 started at 10, Ch 9 at 19, References at 25). Each list now correctly restarts at 1. Implementation: per-list `numlist&lt;N&gt;` numbering references in the builder.</w:t>
             </w:r>
           </w:p>
         </w:tc>
@@ -21327,7 +21327,7 @@
                 <w:sz w:val="20"/>
                 <w:szCs w:val="20"/>
               </w:rPr>
-              <w:t xml:space="preserve">2026-05-24 00:55</w:t>
+              <w:t xml:space="preserve">2026-05-24 01:20</w:t>
             </w:r>
           </w:p>
         </w:tc>
@@ -21387,7 +21387,7 @@
                 <w:sz w:val="20"/>
                 <w:szCs w:val="20"/>
               </w:rPr>
-              <w:t xml:space="preserve">Strengthened cover page: bolded student name and document date (26pt); added supervisor email; running header on every page now shows project code + author on the left and report type + date on the right.</w:t>
+              <w:t xml:space="preserve">Added this Document Revision History appendix (Appendix G). No content changes to other chapters.</w:t>
             </w:r>
           </w:p>
         </w:tc>
@@ -21419,7 +21419,7 @@
                 <w:sz w:val="20"/>
                 <w:szCs w:val="20"/>
               </w:rPr>
-              <w:t xml:space="preserve">2026-05-24 00:15</w:t>
+              <w:t xml:space="preserve">2026-05-24 00:55</w:t>
             </w:r>
           </w:p>
         </w:tc>
@@ -21479,7 +21479,7 @@
                 <w:sz w:val="20"/>
                 <w:szCs w:val="20"/>
               </w:rPr>
-              <w:t xml:space="preserve">Rewrote Chapter 5 to incorporate the TC1 user-guide policy review. Added §5.3 (Cluster Usage Policy and Workflow Constraints) and §5.5 (Offline-Mode Strategy and Pre-Cache). Expanded Table 5.1 with full QoS limits (CPU/memory/GPU). Updated Appendix A and Appendix B to show the new HF_*_OFFLINE env vars in the sbatch setup_commands.</w:t>
+              <w:t xml:space="preserve">Strengthened cover page: bolded student name and document date (26pt); added supervisor email; running header on every page now shows project code + author on the left and report type + date on the right.</w:t>
             </w:r>
           </w:p>
         </w:tc>
@@ -21511,6 +21511,98 @@
                 <w:sz w:val="20"/>
                 <w:szCs w:val="20"/>
               </w:rPr>
+              <w:t xml:space="preserve">2026-05-24 00:15</w:t>
+            </w:r>
+          </w:p>
+        </w:tc>
+        <w:tc>
+          <w:tcPr>
+            <w:tcW w:type="dxa" w:w="3000"/>
+            <w:tcBorders>
+              <w:top w:val="single" w:color="999999" w:sz="4"/>
+              <w:left w:val="single" w:color="999999" w:sz="4"/>
+              <w:bottom w:val="single" w:color="999999" w:sz="4"/>
+              <w:right w:val="single" w:color="999999" w:sz="4"/>
+            </w:tcBorders>
+            <w:tcMar>
+              <w:top w:type="dxa" w:w="80"/>
+              <w:left w:type="dxa" w:w="120"/>
+              <w:bottom w:type="dxa" w:w="80"/>
+              <w:right w:type="dxa" w:w="120"/>
+            </w:tcMar>
+          </w:tcPr>
+          <w:p>
+            <w:pPr>
+              <w:spacing w:after="0"/>
+            </w:pPr>
+            <w:r>
+              <w:rPr>
+                <w:rFonts w:ascii="Calibri" w:cs="Calibri" w:eastAsia="Calibri" w:hAnsi="Calibri"/>
+                <w:sz w:val="20"/>
+                <w:szCs w:val="20"/>
+              </w:rPr>
+              <w:t xml:space="preserve">FYP_Report_2026-05-24.docx</w:t>
+            </w:r>
+          </w:p>
+        </w:tc>
+        <w:tc>
+          <w:tcPr>
+            <w:tcW w:type="dxa" w:w="4160"/>
+            <w:tcBorders>
+              <w:top w:val="single" w:color="999999" w:sz="4"/>
+              <w:left w:val="single" w:color="999999" w:sz="4"/>
+              <w:bottom w:val="single" w:color="999999" w:sz="4"/>
+              <w:right w:val="single" w:color="999999" w:sz="4"/>
+            </w:tcBorders>
+            <w:tcMar>
+              <w:top w:type="dxa" w:w="80"/>
+              <w:left w:type="dxa" w:w="120"/>
+              <w:bottom w:type="dxa" w:w="80"/>
+              <w:right w:type="dxa" w:w="120"/>
+            </w:tcMar>
+          </w:tcPr>
+          <w:p>
+            <w:pPr>
+              <w:spacing w:after="0"/>
+            </w:pPr>
+            <w:r>
+              <w:rPr>
+                <w:rFonts w:ascii="Calibri" w:cs="Calibri" w:eastAsia="Calibri" w:hAnsi="Calibri"/>
+                <w:sz w:val="20"/>
+                <w:szCs w:val="20"/>
+              </w:rPr>
+              <w:t xml:space="preserve">Rewrote Chapter 5 to incorporate the TC1 user-guide policy review. Added §5.3 (Cluster Usage Policy and Workflow Constraints) and §5.5 (Offline-Mode Strategy and Pre-Cache). Expanded Table 5.1 with full QoS limits (CPU/memory/GPU). Updated Appendix A and Appendix B to show the new HF_*_OFFLINE env vars in the sbatch setup_commands.</w:t>
+            </w:r>
+          </w:p>
+        </w:tc>
+      </w:tr>
+      <w:tr>
+        <w:tc>
+          <w:tcPr>
+            <w:tcW w:type="dxa" w:w="2200"/>
+            <w:tcBorders>
+              <w:top w:val="single" w:color="999999" w:sz="4"/>
+              <w:left w:val="single" w:color="999999" w:sz="4"/>
+              <w:bottom w:val="single" w:color="999999" w:sz="4"/>
+              <w:right w:val="single" w:color="999999" w:sz="4"/>
+            </w:tcBorders>
+            <w:tcMar>
+              <w:top w:type="dxa" w:w="80"/>
+              <w:left w:type="dxa" w:w="120"/>
+              <w:bottom w:type="dxa" w:w="80"/>
+              <w:right w:type="dxa" w:w="120"/>
+            </w:tcMar>
+          </w:tcPr>
+          <w:p>
+            <w:pPr>
+              <w:spacing w:after="0"/>
+            </w:pPr>
+            <w:r>
+              <w:rPr>
+                <w:rFonts w:ascii="Calibri" w:cs="Calibri" w:eastAsia="Calibri" w:hAnsi="Calibri"/>
+                <w:sz w:val="20"/>
+                <w:szCs w:val="20"/>
+              </w:rPr>
               <w:t xml:space="preserve">2026-05-23 evening</w:t>
             </w:r>
           </w:p>
@@ -21588,6 +21680,889 @@
           <w:szCs w:val="18"/>
         </w:rPr>
         <w:t xml:space="preserve">Table G.1  Revision history of this FYP report. The source builder script is `scripts/build_fyp_report.js`; the docx is a build artifact and is never hand-edited.</w:t>
+      </w:r>
+    </w:p>
+    <w:p>
+      <w:pPr>
+        <w:pStyle w:val="Heading1"/>
+        <w:pageBreakBefore/>
+        <w:spacing w:after="200" w:before="360"/>
+      </w:pPr>
+      <w:r>
+        <w:rPr>
+          <w:rFonts w:ascii="Calibri" w:cs="Calibri" w:eastAsia="Calibri" w:hAnsi="Calibri"/>
+          <w:b/>
+          <w:bCs/>
+          <w:sz w:val="32"/>
+          <w:szCs w:val="32"/>
+        </w:rPr>
+        <w:t xml:space="preserve">Appendix H — Scorer Incident and Future-Session Handoff</w:t>
+      </w:r>
+    </w:p>
+    <w:p>
+      <w:pPr>
+        <w:spacing w:after="160" w:line="300"/>
+        <w:jc w:val="both"/>
+      </w:pPr>
+      <w:r>
+        <w:rPr>
+          <w:rFonts w:ascii="Calibri" w:cs="Calibri" w:eastAsia="Calibri" w:hAnsi="Calibri"/>
+          <w:sz w:val="22"/>
+          <w:szCs w:val="22"/>
+        </w:rPr>
+        <w:t xml:space="preserve">This appendix is included so that a future agent or fresh chat session can continue the work without relying on conversation memory. It records the critical scorer incident, the corrected artifact contract, and the next safe continuation point. The authoritative operational source remains `docs/PROJECT_LOG.md`; this appendix mirrors the same information in the Word deliverable.</w:t>
+      </w:r>
+    </w:p>
+    <w:p>
+      <w:pPr>
+        <w:pStyle w:val="Heading2"/>
+        <w:spacing w:after="140" w:before="280"/>
+      </w:pPr>
+      <w:r>
+        <w:rPr>
+          <w:rFonts w:ascii="Calibri" w:cs="Calibri" w:eastAsia="Calibri" w:hAnsi="Calibri"/>
+          <w:b/>
+          <w:bCs/>
+          <w:sz w:val="26"/>
+          <w:szCs w:val="26"/>
+        </w:rPr>
+        <w:t xml:space="preserve">H.1 What went wrong in v1</w:t>
+      </w:r>
+    </w:p>
+    <w:p>
+      <w:pPr>
+        <w:spacing w:after="160" w:line="300"/>
+        <w:jc w:val="both"/>
+      </w:pPr>
+      <w:r>
+        <w:rPr>
+          <w:rFonts w:ascii="Calibri" w:cs="Calibri" w:eastAsia="Calibri" w:hAnsi="Calibri"/>
+          <w:sz w:val="22"/>
+          <w:szCs w:val="22"/>
+        </w:rPr>
+        <w:t xml:space="preserve">The original HarmBench and XSTest scorer used a narrow deterministic refusal parser with only fourteen regex patterns. During post-hoc review, it became clear that the parser missed common modern instruction-model refusal templates, including straight- and curly-apostrophe variants of phrases such as "I can't fulfil this request", "I cannot provide", and "I'm unable to assist". Those responses were clear refusals, but v1 counted them as harmful compliance on HarmBench or benign answers on XSTest. This was a scoring error, not a target-model generation error: the six TC1 jobs had already completed, and the saved model outputs did not change.</w:t>
+      </w:r>
+    </w:p>
+    <w:p>
+      <w:pPr>
+        <w:spacing w:after="160" w:line="300"/>
+        <w:jc w:val="both"/>
+      </w:pPr>
+      <w:r>
+        <w:rPr>
+          <w:rFonts w:ascii="Calibri" w:cs="Calibri" w:eastAsia="Calibri" w:hAnsi="Calibri"/>
+          <w:sz w:val="22"/>
+          <w:szCs w:val="22"/>
+        </w:rPr>
+        <w:t xml:space="preserve">The consequence was material. Under v1, the report could have supported an overly optimistic interpretation of NF4 quantization, especially for Qwen 4B. Under the corrected v2 scorer, Qwen 4B changes from a point-estimate safety improvement to a statistically significant alignment_degradation result: ΔASR = +0.065 with 95% CI [+0.025, +0.110]. Qwen 1.7B's apparent ASR reduction shrinks to a non-significant −0.025, and Llama 3.2 3B's ΔASR becomes exactly 0.000. MMLU values are unchanged because MMLU scoring does not use the refusal parser.</w:t>
+      </w:r>
+    </w:p>
+    <w:p>
+      <w:pPr>
+        <w:pStyle w:val="Heading2"/>
+        <w:spacing w:after="140" w:before="280"/>
+      </w:pPr>
+      <w:r>
+        <w:rPr>
+          <w:rFonts w:ascii="Calibri" w:cs="Calibri" w:eastAsia="Calibri" w:hAnsi="Calibri"/>
+          <w:b/>
+          <w:bCs/>
+          <w:sz w:val="26"/>
+          <w:szCs w:val="26"/>
+        </w:rPr>
+        <w:t xml:space="preserve">H.2 How the correction was made</w:t>
+      </w:r>
+    </w:p>
+    <w:p>
+      <w:pPr>
+        <w:spacing w:after="160" w:line="300"/>
+        <w:jc w:val="both"/>
+      </w:pPr>
+      <w:r>
+        <w:rPr>
+          <w:rFonts w:ascii="Calibri" w:cs="Calibri" w:eastAsia="Calibri" w:hAnsi="Calibri"/>
+          <w:sz w:val="22"/>
+          <w:szCs w:val="22"/>
+        </w:rPr>
+        <w:t xml:space="preserve">The v2 correction expanded `ethical_benchmark/benchmarks/utils.py` with broader refusal-pattern coverage, punctuation normalisation, and a diagnostic helper that reports the matched refusal-pattern name. Regression tests were added for canonical refusal strings, negative controls, and curly-apostrophe handling. The analysis pipeline was then re-run from saved outputs; no target-model inference was re-run on TC1. This was appropriate because the flaw was in the scoring layer, not in model execution.</w:t>
+      </w:r>
+    </w:p>
+    <w:p>
+      <w:pPr>
+        <w:spacing w:after="160" w:line="300"/>
+        <w:jc w:val="both"/>
+      </w:pPr>
+      <w:r>
+        <w:rPr>
+          <w:rFonts w:ascii="Calibri" w:cs="Calibri" w:eastAsia="Calibri" w:hAnsi="Calibri"/>
+          <w:sz w:val="22"/>
+          <w:szCs w:val="22"/>
+        </w:rPr>
+        <w:t xml:space="preserve">A first implementation rescored `raw.jsonl` and `summary.json` in place. That approach was rejected during Codex audit because the original TC1 outputs are the evidence trail and should remain immutable. The final solution preserves `raw.jsonl` and `summary.json` as original v1 artifacts, and stores corrected v2 scoring in sidecars: `scores.v2.jsonl` contains prompt IDs and score_fields only, with no prompt or response text, and `summary.v2.json` contains corrected aggregates. `compare_quant_pairs.py` now prefers complete v2 sidecars when they exist and falls back to original summaries otherwise.</w:t>
+      </w:r>
+    </w:p>
+    <w:p>
+      <w:pPr>
+        <w:pStyle w:val="Heading2"/>
+        <w:spacing w:after="140" w:before="280"/>
+      </w:pPr>
+      <w:r>
+        <w:rPr>
+          <w:rFonts w:ascii="Calibri" w:cs="Calibri" w:eastAsia="Calibri" w:hAnsi="Calibri"/>
+          <w:b/>
+          <w:bCs/>
+          <w:sz w:val="26"/>
+          <w:szCs w:val="26"/>
+        </w:rPr>
+        <w:t xml:space="preserve">H.3 Current artifact contract</w:t>
+      </w:r>
+    </w:p>
+    <w:tbl>
+      <w:tblPr>
+        <w:tblW w:type="dxa" w:w="9360"/>
+        <w:tblBorders>
+          <w:top w:val="single" w:color="999999" w:sz="4"/>
+          <w:left w:val="single" w:color="999999" w:sz="4"/>
+          <w:bottom w:val="single" w:color="999999" w:sz="4"/>
+          <w:right w:val="single" w:color="999999" w:sz="4"/>
+          <w:insideH w:val="single" w:color="999999" w:sz="4"/>
+          <w:insideV w:val="single" w:color="999999" w:sz="4"/>
+        </w:tblBorders>
+      </w:tblPr>
+      <w:tblGrid>
+        <w:gridCol w:w="1900"/>
+        <w:gridCol w:w="3200"/>
+        <w:gridCol w:w="4700"/>
+      </w:tblGrid>
+      <w:tr>
+        <w:trPr>
+          <w:tblHeader/>
+        </w:trPr>
+        <w:tc>
+          <w:tcPr>
+            <w:tcW w:type="dxa" w:w="1900"/>
+            <w:tcBorders>
+              <w:top w:val="single" w:color="999999" w:sz="4"/>
+              <w:left w:val="single" w:color="999999" w:sz="4"/>
+              <w:bottom w:val="single" w:color="999999" w:sz="4"/>
+              <w:right w:val="single" w:color="999999" w:sz="4"/>
+            </w:tcBorders>
+            <w:shd w:fill="D9E2F3" w:color="auto" w:val="clear"/>
+            <w:tcMar>
+              <w:top w:type="dxa" w:w="80"/>
+              <w:left w:type="dxa" w:w="120"/>
+              <w:bottom w:type="dxa" w:w="80"/>
+              <w:right w:type="dxa" w:w="120"/>
+            </w:tcMar>
+          </w:tcPr>
+          <w:p>
+            <w:pPr>
+              <w:spacing w:after="0"/>
+            </w:pPr>
+            <w:r>
+              <w:rPr>
+                <w:rFonts w:ascii="Calibri" w:cs="Calibri" w:eastAsia="Calibri" w:hAnsi="Calibri"/>
+                <w:b/>
+                <w:bCs/>
+                <w:sz w:val="20"/>
+                <w:szCs w:val="20"/>
+              </w:rPr>
+              <w:t xml:space="preserve">Artifact</w:t>
+            </w:r>
+          </w:p>
+        </w:tc>
+        <w:tc>
+          <w:tcPr>
+            <w:tcW w:type="dxa" w:w="3200"/>
+            <w:tcBorders>
+              <w:top w:val="single" w:color="999999" w:sz="4"/>
+              <w:left w:val="single" w:color="999999" w:sz="4"/>
+              <w:bottom w:val="single" w:color="999999" w:sz="4"/>
+              <w:right w:val="single" w:color="999999" w:sz="4"/>
+            </w:tcBorders>
+            <w:shd w:fill="D9E2F3" w:color="auto" w:val="clear"/>
+            <w:tcMar>
+              <w:top w:type="dxa" w:w="80"/>
+              <w:left w:type="dxa" w:w="120"/>
+              <w:bottom w:type="dxa" w:w="80"/>
+              <w:right w:type="dxa" w:w="120"/>
+            </w:tcMar>
+          </w:tcPr>
+          <w:p>
+            <w:pPr>
+              <w:spacing w:after="0"/>
+            </w:pPr>
+            <w:r>
+              <w:rPr>
+                <w:rFonts w:ascii="Calibri" w:cs="Calibri" w:eastAsia="Calibri" w:hAnsi="Calibri"/>
+                <w:b/>
+                <w:bCs/>
+                <w:sz w:val="20"/>
+                <w:szCs w:val="20"/>
+              </w:rPr>
+              <w:t xml:space="preserve">Status</w:t>
+            </w:r>
+          </w:p>
+        </w:tc>
+        <w:tc>
+          <w:tcPr>
+            <w:tcW w:type="dxa" w:w="4700"/>
+            <w:tcBorders>
+              <w:top w:val="single" w:color="999999" w:sz="4"/>
+              <w:left w:val="single" w:color="999999" w:sz="4"/>
+              <w:bottom w:val="single" w:color="999999" w:sz="4"/>
+              <w:right w:val="single" w:color="999999" w:sz="4"/>
+            </w:tcBorders>
+            <w:shd w:fill="D9E2F3" w:color="auto" w:val="clear"/>
+            <w:tcMar>
+              <w:top w:type="dxa" w:w="80"/>
+              <w:left w:type="dxa" w:w="120"/>
+              <w:bottom w:type="dxa" w:w="80"/>
+              <w:right w:type="dxa" w:w="120"/>
+            </w:tcMar>
+          </w:tcPr>
+          <w:p>
+            <w:pPr>
+              <w:spacing w:after="0"/>
+            </w:pPr>
+            <w:r>
+              <w:rPr>
+                <w:rFonts w:ascii="Calibri" w:cs="Calibri" w:eastAsia="Calibri" w:hAnsi="Calibri"/>
+                <w:b/>
+                <w:bCs/>
+                <w:sz w:val="20"/>
+                <w:szCs w:val="20"/>
+              </w:rPr>
+              <w:t xml:space="preserve">Rule for future work</w:t>
+            </w:r>
+          </w:p>
+        </w:tc>
+      </w:tr>
+      <w:tr>
+        <w:tc>
+          <w:tcPr>
+            <w:tcW w:type="dxa" w:w="1900"/>
+            <w:tcBorders>
+              <w:top w:val="single" w:color="999999" w:sz="4"/>
+              <w:left w:val="single" w:color="999999" w:sz="4"/>
+              <w:bottom w:val="single" w:color="999999" w:sz="4"/>
+              <w:right w:val="single" w:color="999999" w:sz="4"/>
+            </w:tcBorders>
+            <w:tcMar>
+              <w:top w:type="dxa" w:w="80"/>
+              <w:left w:type="dxa" w:w="120"/>
+              <w:bottom w:type="dxa" w:w="80"/>
+              <w:right w:type="dxa" w:w="120"/>
+            </w:tcMar>
+          </w:tcPr>
+          <w:p>
+            <w:pPr>
+              <w:spacing w:after="0"/>
+            </w:pPr>
+            <w:r>
+              <w:rPr>
+                <w:rFonts w:ascii="Calibri" w:cs="Calibri" w:eastAsia="Calibri" w:hAnsi="Calibri"/>
+                <w:sz w:val="20"/>
+                <w:szCs w:val="20"/>
+              </w:rPr>
+              <w:t xml:space="preserve">raw.jsonl</w:t>
+            </w:r>
+          </w:p>
+        </w:tc>
+        <w:tc>
+          <w:tcPr>
+            <w:tcW w:type="dxa" w:w="3200"/>
+            <w:tcBorders>
+              <w:top w:val="single" w:color="999999" w:sz="4"/>
+              <w:left w:val="single" w:color="999999" w:sz="4"/>
+              <w:bottom w:val="single" w:color="999999" w:sz="4"/>
+              <w:right w:val="single" w:color="999999" w:sz="4"/>
+            </w:tcBorders>
+            <w:tcMar>
+              <w:top w:type="dxa" w:w="80"/>
+              <w:left w:type="dxa" w:w="120"/>
+              <w:bottom w:type="dxa" w:w="80"/>
+              <w:right w:type="dxa" w:w="120"/>
+            </w:tcMar>
+          </w:tcPr>
+          <w:p>
+            <w:pPr>
+              <w:spacing w:after="0"/>
+            </w:pPr>
+            <w:r>
+              <w:rPr>
+                <w:rFonts w:ascii="Calibri" w:cs="Calibri" w:eastAsia="Calibri" w:hAnsi="Calibri"/>
+                <w:sz w:val="20"/>
+                <w:szCs w:val="20"/>
+              </w:rPr>
+              <w:t xml:space="preserve">TC1-original saved generations and original score fields</w:t>
+            </w:r>
+          </w:p>
+        </w:tc>
+        <w:tc>
+          <w:tcPr>
+            <w:tcW w:type="dxa" w:w="4700"/>
+            <w:tcBorders>
+              <w:top w:val="single" w:color="999999" w:sz="4"/>
+              <w:left w:val="single" w:color="999999" w:sz="4"/>
+              <w:bottom w:val="single" w:color="999999" w:sz="4"/>
+              <w:right w:val="single" w:color="999999" w:sz="4"/>
+            </w:tcBorders>
+            <w:tcMar>
+              <w:top w:type="dxa" w:w="80"/>
+              <w:left w:type="dxa" w:w="120"/>
+              <w:bottom w:type="dxa" w:w="80"/>
+              <w:right w:type="dxa" w:w="120"/>
+            </w:tcMar>
+          </w:tcPr>
+          <w:p>
+            <w:pPr>
+              <w:spacing w:after="0"/>
+            </w:pPr>
+            <w:r>
+              <w:rPr>
+                <w:rFonts w:ascii="Calibri" w:cs="Calibri" w:eastAsia="Calibri" w:hAnsi="Calibri"/>
+                <w:sz w:val="20"/>
+                <w:szCs w:val="20"/>
+              </w:rPr>
+              <w:t xml:space="preserve">Do not modify, redact, duplicate into new raw files, or print prompt/response content during audits.</w:t>
+            </w:r>
+          </w:p>
+        </w:tc>
+      </w:tr>
+      <w:tr>
+        <w:tc>
+          <w:tcPr>
+            <w:tcW w:type="dxa" w:w="1900"/>
+            <w:tcBorders>
+              <w:top w:val="single" w:color="999999" w:sz="4"/>
+              <w:left w:val="single" w:color="999999" w:sz="4"/>
+              <w:bottom w:val="single" w:color="999999" w:sz="4"/>
+              <w:right w:val="single" w:color="999999" w:sz="4"/>
+            </w:tcBorders>
+            <w:tcMar>
+              <w:top w:type="dxa" w:w="80"/>
+              <w:left w:type="dxa" w:w="120"/>
+              <w:bottom w:type="dxa" w:w="80"/>
+              <w:right w:type="dxa" w:w="120"/>
+            </w:tcMar>
+          </w:tcPr>
+          <w:p>
+            <w:pPr>
+              <w:spacing w:after="0"/>
+            </w:pPr>
+            <w:r>
+              <w:rPr>
+                <w:rFonts w:ascii="Calibri" w:cs="Calibri" w:eastAsia="Calibri" w:hAnsi="Calibri"/>
+                <w:sz w:val="20"/>
+                <w:szCs w:val="20"/>
+              </w:rPr>
+              <w:t xml:space="preserve">summary.json</w:t>
+            </w:r>
+          </w:p>
+        </w:tc>
+        <w:tc>
+          <w:tcPr>
+            <w:tcW w:type="dxa" w:w="3200"/>
+            <w:tcBorders>
+              <w:top w:val="single" w:color="999999" w:sz="4"/>
+              <w:left w:val="single" w:color="999999" w:sz="4"/>
+              <w:bottom w:val="single" w:color="999999" w:sz="4"/>
+              <w:right w:val="single" w:color="999999" w:sz="4"/>
+            </w:tcBorders>
+            <w:tcMar>
+              <w:top w:type="dxa" w:w="80"/>
+              <w:left w:type="dxa" w:w="120"/>
+              <w:bottom w:type="dxa" w:w="80"/>
+              <w:right w:type="dxa" w:w="120"/>
+            </w:tcMar>
+          </w:tcPr>
+          <w:p>
+            <w:pPr>
+              <w:spacing w:after="0"/>
+            </w:pPr>
+            <w:r>
+              <w:rPr>
+                <w:rFonts w:ascii="Calibri" w:cs="Calibri" w:eastAsia="Calibri" w:hAnsi="Calibri"/>
+                <w:sz w:val="20"/>
+                <w:szCs w:val="20"/>
+              </w:rPr>
+              <w:t xml:space="preserve">Original aggregate summary from the initial run</w:t>
+            </w:r>
+          </w:p>
+        </w:tc>
+        <w:tc>
+          <w:tcPr>
+            <w:tcW w:type="dxa" w:w="4700"/>
+            <w:tcBorders>
+              <w:top w:val="single" w:color="999999" w:sz="4"/>
+              <w:left w:val="single" w:color="999999" w:sz="4"/>
+              <w:bottom w:val="single" w:color="999999" w:sz="4"/>
+              <w:right w:val="single" w:color="999999" w:sz="4"/>
+            </w:tcBorders>
+            <w:tcMar>
+              <w:top w:type="dxa" w:w="80"/>
+              <w:left w:type="dxa" w:w="120"/>
+              <w:bottom w:type="dxa" w:w="80"/>
+              <w:right w:type="dxa" w:w="120"/>
+            </w:tcMar>
+          </w:tcPr>
+          <w:p>
+            <w:pPr>
+              <w:spacing w:after="0"/>
+            </w:pPr>
+            <w:r>
+              <w:rPr>
+                <w:rFonts w:ascii="Calibri" w:cs="Calibri" w:eastAsia="Calibri" w:hAnsi="Calibri"/>
+                <w:sz w:val="20"/>
+                <w:szCs w:val="20"/>
+              </w:rPr>
+              <w:t xml:space="preserve">Do not overwrite during post-hoc scoring corrections.</w:t>
+            </w:r>
+          </w:p>
+        </w:tc>
+      </w:tr>
+      <w:tr>
+        <w:tc>
+          <w:tcPr>
+            <w:tcW w:type="dxa" w:w="1900"/>
+            <w:tcBorders>
+              <w:top w:val="single" w:color="999999" w:sz="4"/>
+              <w:left w:val="single" w:color="999999" w:sz="4"/>
+              <w:bottom w:val="single" w:color="999999" w:sz="4"/>
+              <w:right w:val="single" w:color="999999" w:sz="4"/>
+            </w:tcBorders>
+            <w:tcMar>
+              <w:top w:type="dxa" w:w="80"/>
+              <w:left w:type="dxa" w:w="120"/>
+              <w:bottom w:type="dxa" w:w="80"/>
+              <w:right w:type="dxa" w:w="120"/>
+            </w:tcMar>
+          </w:tcPr>
+          <w:p>
+            <w:pPr>
+              <w:spacing w:after="0"/>
+            </w:pPr>
+            <w:r>
+              <w:rPr>
+                <w:rFonts w:ascii="Calibri" w:cs="Calibri" w:eastAsia="Calibri" w:hAnsi="Calibri"/>
+                <w:sz w:val="20"/>
+                <w:szCs w:val="20"/>
+              </w:rPr>
+              <w:t xml:space="preserve">scores.v2.jsonl</w:t>
+            </w:r>
+          </w:p>
+        </w:tc>
+        <w:tc>
+          <w:tcPr>
+            <w:tcW w:type="dxa" w:w="3200"/>
+            <w:tcBorders>
+              <w:top w:val="single" w:color="999999" w:sz="4"/>
+              <w:left w:val="single" w:color="999999" w:sz="4"/>
+              <w:bottom w:val="single" w:color="999999" w:sz="4"/>
+              <w:right w:val="single" w:color="999999" w:sz="4"/>
+            </w:tcBorders>
+            <w:tcMar>
+              <w:top w:type="dxa" w:w="80"/>
+              <w:left w:type="dxa" w:w="120"/>
+              <w:bottom w:type="dxa" w:w="80"/>
+              <w:right w:type="dxa" w:w="120"/>
+            </w:tcMar>
+          </w:tcPr>
+          <w:p>
+            <w:pPr>
+              <w:spacing w:after="0"/>
+            </w:pPr>
+            <w:r>
+              <w:rPr>
+                <w:rFonts w:ascii="Calibri" w:cs="Calibri" w:eastAsia="Calibri" w:hAnsi="Calibri"/>
+                <w:sz w:val="20"/>
+                <w:szCs w:val="20"/>
+              </w:rPr>
+              <w:t xml:space="preserve">Derived v2 score fields only; no prompt/response text</w:t>
+            </w:r>
+          </w:p>
+        </w:tc>
+        <w:tc>
+          <w:tcPr>
+            <w:tcW w:type="dxa" w:w="4700"/>
+            <w:tcBorders>
+              <w:top w:val="single" w:color="999999" w:sz="4"/>
+              <w:left w:val="single" w:color="999999" w:sz="4"/>
+              <w:bottom w:val="single" w:color="999999" w:sz="4"/>
+              <w:right w:val="single" w:color="999999" w:sz="4"/>
+            </w:tcBorders>
+            <w:tcMar>
+              <w:top w:type="dxa" w:w="80"/>
+              <w:left w:type="dxa" w:w="120"/>
+              <w:bottom w:type="dxa" w:w="80"/>
+              <w:right w:type="dxa" w:w="120"/>
+            </w:tcMar>
+          </w:tcPr>
+          <w:p>
+            <w:pPr>
+              <w:spacing w:after="0"/>
+            </w:pPr>
+            <w:r>
+              <w:rPr>
+                <w:rFonts w:ascii="Calibri" w:cs="Calibri" w:eastAsia="Calibri" w:hAnsi="Calibri"/>
+                <w:sz w:val="20"/>
+                <w:szCs w:val="20"/>
+              </w:rPr>
+              <w:t xml:space="preserve">Authoritative corrected scorer sidecar for HarmBench/XSTest analysis.</w:t>
+            </w:r>
+          </w:p>
+        </w:tc>
+      </w:tr>
+      <w:tr>
+        <w:tc>
+          <w:tcPr>
+            <w:tcW w:type="dxa" w:w="1900"/>
+            <w:tcBorders>
+              <w:top w:val="single" w:color="999999" w:sz="4"/>
+              <w:left w:val="single" w:color="999999" w:sz="4"/>
+              <w:bottom w:val="single" w:color="999999" w:sz="4"/>
+              <w:right w:val="single" w:color="999999" w:sz="4"/>
+            </w:tcBorders>
+            <w:tcMar>
+              <w:top w:type="dxa" w:w="80"/>
+              <w:left w:type="dxa" w:w="120"/>
+              <w:bottom w:type="dxa" w:w="80"/>
+              <w:right w:type="dxa" w:w="120"/>
+            </w:tcMar>
+          </w:tcPr>
+          <w:p>
+            <w:pPr>
+              <w:spacing w:after="0"/>
+            </w:pPr>
+            <w:r>
+              <w:rPr>
+                <w:rFonts w:ascii="Calibri" w:cs="Calibri" w:eastAsia="Calibri" w:hAnsi="Calibri"/>
+                <w:sz w:val="20"/>
+                <w:szCs w:val="20"/>
+              </w:rPr>
+              <w:t xml:space="preserve">summary.v2.json</w:t>
+            </w:r>
+          </w:p>
+        </w:tc>
+        <w:tc>
+          <w:tcPr>
+            <w:tcW w:type="dxa" w:w="3200"/>
+            <w:tcBorders>
+              <w:top w:val="single" w:color="999999" w:sz="4"/>
+              <w:left w:val="single" w:color="999999" w:sz="4"/>
+              <w:bottom w:val="single" w:color="999999" w:sz="4"/>
+              <w:right w:val="single" w:color="999999" w:sz="4"/>
+            </w:tcBorders>
+            <w:tcMar>
+              <w:top w:type="dxa" w:w="80"/>
+              <w:left w:type="dxa" w:w="120"/>
+              <w:bottom w:type="dxa" w:w="80"/>
+              <w:right w:type="dxa" w:w="120"/>
+            </w:tcMar>
+          </w:tcPr>
+          <w:p>
+            <w:pPr>
+              <w:spacing w:after="0"/>
+            </w:pPr>
+            <w:r>
+              <w:rPr>
+                <w:rFonts w:ascii="Calibri" w:cs="Calibri" w:eastAsia="Calibri" w:hAnsi="Calibri"/>
+                <w:sz w:val="20"/>
+                <w:szCs w:val="20"/>
+              </w:rPr>
+              <w:t xml:space="preserve">Derived v2 aggregate summary</w:t>
+            </w:r>
+          </w:p>
+        </w:tc>
+        <w:tc>
+          <w:tcPr>
+            <w:tcW w:type="dxa" w:w="4700"/>
+            <w:tcBorders>
+              <w:top w:val="single" w:color="999999" w:sz="4"/>
+              <w:left w:val="single" w:color="999999" w:sz="4"/>
+              <w:bottom w:val="single" w:color="999999" w:sz="4"/>
+              <w:right w:val="single" w:color="999999" w:sz="4"/>
+            </w:tcBorders>
+            <w:tcMar>
+              <w:top w:type="dxa" w:w="80"/>
+              <w:left w:type="dxa" w:w="120"/>
+              <w:bottom w:type="dxa" w:w="80"/>
+              <w:right w:type="dxa" w:w="120"/>
+            </w:tcMar>
+          </w:tcPr>
+          <w:p>
+            <w:pPr>
+              <w:spacing w:after="0"/>
+            </w:pPr>
+            <w:r>
+              <w:rPr>
+                <w:rFonts w:ascii="Calibri" w:cs="Calibri" w:eastAsia="Calibri" w:hAnsi="Calibri"/>
+                <w:sz w:val="20"/>
+                <w:szCs w:val="20"/>
+              </w:rPr>
+              <w:t xml:space="preserve">Used by `make analyze` through sidecar preference logic.</w:t>
+            </w:r>
+          </w:p>
+        </w:tc>
+      </w:tr>
+      <w:tr>
+        <w:tc>
+          <w:tcPr>
+            <w:tcW w:type="dxa" w:w="1900"/>
+            <w:tcBorders>
+              <w:top w:val="single" w:color="999999" w:sz="4"/>
+              <w:left w:val="single" w:color="999999" w:sz="4"/>
+              <w:bottom w:val="single" w:color="999999" w:sz="4"/>
+              <w:right w:val="single" w:color="999999" w:sz="4"/>
+            </w:tcBorders>
+            <w:tcMar>
+              <w:top w:type="dxa" w:w="80"/>
+              <w:left w:type="dxa" w:w="120"/>
+              <w:bottom w:type="dxa" w:w="80"/>
+              <w:right w:type="dxa" w:w="120"/>
+            </w:tcMar>
+          </w:tcPr>
+          <w:p>
+            <w:pPr>
+              <w:spacing w:after="0"/>
+            </w:pPr>
+            <w:r>
+              <w:rPr>
+                <w:rFonts w:ascii="Calibri" w:cs="Calibri" w:eastAsia="Calibri" w:hAnsi="Calibri"/>
+                <w:sz w:val="20"/>
+                <w:szCs w:val="20"/>
+              </w:rPr>
+              <w:t xml:space="preserve">rescore_diagnostics_*.csv</w:t>
+            </w:r>
+          </w:p>
+        </w:tc>
+        <w:tc>
+          <w:tcPr>
+            <w:tcW w:type="dxa" w:w="3200"/>
+            <w:tcBorders>
+              <w:top w:val="single" w:color="999999" w:sz="4"/>
+              <w:left w:val="single" w:color="999999" w:sz="4"/>
+              <w:bottom w:val="single" w:color="999999" w:sz="4"/>
+              <w:right w:val="single" w:color="999999" w:sz="4"/>
+            </w:tcBorders>
+            <w:tcMar>
+              <w:top w:type="dxa" w:w="80"/>
+              <w:left w:type="dxa" w:w="120"/>
+              <w:bottom w:type="dxa" w:w="80"/>
+              <w:right w:type="dxa" w:w="120"/>
+            </w:tcMar>
+          </w:tcPr>
+          <w:p>
+            <w:pPr>
+              <w:spacing w:after="0"/>
+            </w:pPr>
+            <w:r>
+              <w:rPr>
+                <w:rFonts w:ascii="Calibri" w:cs="Calibri" w:eastAsia="Calibri" w:hAnsi="Calibri"/>
+                <w:sz w:val="20"/>
+                <w:szCs w:val="20"/>
+              </w:rPr>
+              <w:t xml:space="preserve">Redacted diagnostics with IDs, labels, lengths, and matched-pattern names</w:t>
+            </w:r>
+          </w:p>
+        </w:tc>
+        <w:tc>
+          <w:tcPr>
+            <w:tcW w:type="dxa" w:w="4700"/>
+            <w:tcBorders>
+              <w:top w:val="single" w:color="999999" w:sz="4"/>
+              <w:left w:val="single" w:color="999999" w:sz="4"/>
+              <w:bottom w:val="single" w:color="999999" w:sz="4"/>
+              <w:right w:val="single" w:color="999999" w:sz="4"/>
+            </w:tcBorders>
+            <w:tcMar>
+              <w:top w:type="dxa" w:w="80"/>
+              <w:left w:type="dxa" w:w="120"/>
+              <w:bottom w:type="dxa" w:w="80"/>
+              <w:right w:type="dxa" w:w="120"/>
+            </w:tcMar>
+          </w:tcPr>
+          <w:p>
+            <w:pPr>
+              <w:spacing w:after="0"/>
+            </w:pPr>
+            <w:r>
+              <w:rPr>
+                <w:rFonts w:ascii="Calibri" w:cs="Calibri" w:eastAsia="Calibri" w:hAnsi="Calibri"/>
+                <w:sz w:val="20"/>
+                <w:szCs w:val="20"/>
+              </w:rPr>
+              <w:t xml:space="preserve">Safe to inspect; must remain free of raw prompt/response text.</w:t>
+            </w:r>
+          </w:p>
+        </w:tc>
+      </w:tr>
+      <w:tr>
+        <w:tc>
+          <w:tcPr>
+            <w:tcW w:type="dxa" w:w="1900"/>
+            <w:tcBorders>
+              <w:top w:val="single" w:color="999999" w:sz="4"/>
+              <w:left w:val="single" w:color="999999" w:sz="4"/>
+              <w:bottom w:val="single" w:color="999999" w:sz="4"/>
+              <w:right w:val="single" w:color="999999" w:sz="4"/>
+            </w:tcBorders>
+            <w:tcMar>
+              <w:top w:type="dxa" w:w="80"/>
+              <w:left w:type="dxa" w:w="120"/>
+              <w:bottom w:type="dxa" w:w="80"/>
+              <w:right w:type="dxa" w:w="120"/>
+            </w:tcMar>
+          </w:tcPr>
+          <w:p>
+            <w:pPr>
+              <w:spacing w:after="0"/>
+            </w:pPr>
+            <w:r>
+              <w:rPr>
+                <w:rFonts w:ascii="Calibri" w:cs="Calibri" w:eastAsia="Calibri" w:hAnsi="Calibri"/>
+                <w:sz w:val="20"/>
+                <w:szCs w:val="20"/>
+              </w:rPr>
+              <w:t xml:space="preserve">scores.judge.&lt;judge&gt;.jsonl</w:t>
+            </w:r>
+          </w:p>
+        </w:tc>
+        <w:tc>
+          <w:tcPr>
+            <w:tcW w:type="dxa" w:w="3200"/>
+            <w:tcBorders>
+              <w:top w:val="single" w:color="999999" w:sz="4"/>
+              <w:left w:val="single" w:color="999999" w:sz="4"/>
+              <w:bottom w:val="single" w:color="999999" w:sz="4"/>
+              <w:right w:val="single" w:color="999999" w:sz="4"/>
+            </w:tcBorders>
+            <w:tcMar>
+              <w:top w:type="dxa" w:w="80"/>
+              <w:left w:type="dxa" w:w="120"/>
+              <w:bottom w:type="dxa" w:w="80"/>
+              <w:right w:type="dxa" w:w="120"/>
+            </w:tcMar>
+          </w:tcPr>
+          <w:p>
+            <w:pPr>
+              <w:spacing w:after="0"/>
+            </w:pPr>
+            <w:r>
+              <w:rPr>
+                <w:rFonts w:ascii="Calibri" w:cs="Calibri" w:eastAsia="Calibri" w:hAnsi="Calibri"/>
+                <w:sz w:val="20"/>
+                <w:szCs w:val="20"/>
+              </w:rPr>
+              <w:t xml:space="preserve">Future judge-model sidecar, not yet implemented</w:t>
+            </w:r>
+          </w:p>
+        </w:tc>
+        <w:tc>
+          <w:tcPr>
+            <w:tcW w:type="dxa" w:w="4700"/>
+            <w:tcBorders>
+              <w:top w:val="single" w:color="999999" w:sz="4"/>
+              <w:left w:val="single" w:color="999999" w:sz="4"/>
+              <w:bottom w:val="single" w:color="999999" w:sz="4"/>
+              <w:right w:val="single" w:color="999999" w:sz="4"/>
+            </w:tcBorders>
+            <w:tcMar>
+              <w:top w:type="dxa" w:w="80"/>
+              <w:left w:type="dxa" w:w="120"/>
+              <w:bottom w:type="dxa" w:w="80"/>
+              <w:right w:type="dxa" w:w="120"/>
+            </w:tcMar>
+          </w:tcPr>
+          <w:p>
+            <w:pPr>
+              <w:spacing w:after="0"/>
+            </w:pPr>
+            <w:r>
+              <w:rPr>
+                <w:rFonts w:ascii="Calibri" w:cs="Calibri" w:eastAsia="Calibri" w:hAnsi="Calibri"/>
+                <w:sz w:val="20"/>
+                <w:szCs w:val="20"/>
+              </w:rPr>
+              <w:t xml:space="preserve">Write only if T20 is implemented; keep separate from v2 sidecars.</w:t>
+            </w:r>
+          </w:p>
+        </w:tc>
+      </w:tr>
+    </w:tbl>
+    <w:p>
+      <w:pPr>
+        <w:pStyle w:val="Heading2"/>
+        <w:spacing w:after="140" w:before="280"/>
+      </w:pPr>
+      <w:r>
+        <w:rPr>
+          <w:rFonts w:ascii="Calibri" w:cs="Calibri" w:eastAsia="Calibri" w:hAnsi="Calibri"/>
+          <w:b/>
+          <w:bCs/>
+          <w:sz w:val="26"/>
+          <w:szCs w:val="26"/>
+        </w:rPr>
+        <w:t xml:space="preserve">H.4 Verification already completed</w:t>
+      </w:r>
+    </w:p>
+    <w:p>
+      <w:pPr>
+        <w:spacing w:after="160" w:line="300"/>
+        <w:jc w:val="both"/>
+      </w:pPr>
+      <w:r>
+        <w:rPr>
+          <w:rFonts w:ascii="Calibri" w:cs="Calibri" w:eastAsia="Calibri" w:hAnsi="Calibri"/>
+          <w:sz w:val="22"/>
+          <w:szCs w:val="22"/>
+        </w:rPr>
+        <w:t xml:space="preserve">The corrected workflow was verified in four ways. First, the full test suite passed with 163 tests, including new v2 refusal-parser regression tests and a sidecar-selection test for the analysis layer. Second, `make analyze` reproduced the current v2 headline numbers from sidecars. Third, the rescore script was checked to leave all original `raw.jsonl` and `summary.json` hashes unchanged. Fourth, diagnostic outputs were checked for redaction: they contain IDs, old/new labels, response length, malformed/refusal flags, and matched pattern names, but no raw prompt or response text.</w:t>
+      </w:r>
+    </w:p>
+    <w:p>
+      <w:pPr>
+        <w:pStyle w:val="Heading2"/>
+        <w:spacing w:after="140" w:before="280"/>
+      </w:pPr>
+      <w:r>
+        <w:rPr>
+          <w:rFonts w:ascii="Calibri" w:cs="Calibri" w:eastAsia="Calibri" w:hAnsi="Calibri"/>
+          <w:b/>
+          <w:bCs/>
+          <w:sz w:val="26"/>
+          <w:szCs w:val="26"/>
+        </w:rPr>
+        <w:t xml:space="preserve">H.5 Where the next session should continue</w:t>
+      </w:r>
+    </w:p>
+    <w:p>
+      <w:pPr>
+        <w:spacing w:after="160" w:line="300"/>
+        <w:jc w:val="both"/>
+      </w:pPr>
+      <w:r>
+        <w:rPr>
+          <w:rFonts w:ascii="Calibri" w:cs="Calibri" w:eastAsia="Calibri" w:hAnsi="Calibri"/>
+          <w:sz w:val="22"/>
+          <w:szCs w:val="22"/>
+        </w:rPr>
+        <w:t xml:space="preserve">The next methodological improvement is T20: judge-model validation. This should be treated as a sensitivity check rather than a replacement for the current report scorer. Acceptable options include HarmBench's official classifier, LlamaGuard, or an API judge with strict JSON output. Whichever option is chosen, the implementation must write separate judge sidecars and redacted diagnostics; it must not mutate raw outputs, v2 sidecars, or the current report numbers unless a later documented decision explicitly promotes judge scoring as the primary metric.</w:t>
+      </w:r>
+    </w:p>
+    <w:p>
+      <w:pPr>
+        <w:spacing w:after="160" w:line="300"/>
+        <w:jc w:val="both"/>
+      </w:pPr>
+      <w:r>
+        <w:rPr>
+          <w:rFonts w:ascii="Calibri" w:cs="Calibri" w:eastAsia="Calibri" w:hAnsi="Calibri"/>
+          <w:sz w:val="22"/>
+          <w:szCs w:val="22"/>
+        </w:rPr>
+        <w:t xml:space="preserve">Operationally, a future TC1 session should first run `git pull --ff-only` in `/tc1home/FYP/utan001/fyp_quant/repo` to receive commit `aa451dc` or later. Do not run judge Python code on the TC1 head node; submit judge scoring through `sbatch`. If an API judge is used from the Mac instead of TC1, preserve the same artifact contract and log token/cost assumptions separately. If the judge refuses or fails to classify a benchmark prompt/response pair, record that as a judge-status field such as invalid, refused, or error, and keep the raw text out of logs. If a local untracked `ethical_benchmark/judges/__init__.py` skeleton is present, treat it as incomplete T20 scaffolding: complete the missing validation module in the same change or remove the skeleton before committing.</w:t>
       </w:r>
     </w:p>
     <w:sectPr>

</xml_diff>

<commit_message>
feat(judge): add HarmBench classifier validation
</commit_message>
<xml_diff>
--- a/docs/FYP_Report_2026-05-27.docx
+++ b/docs/FYP_Report_2026-05-27.docx
@@ -947,7 +947,7 @@
           <w:sz w:val="22"/>
           <w:szCs w:val="22"/>
         </w:rPr>
-        <w:t xml:space="preserve">A verification suite of 163 automated tests across twelve test files, covering schema validation, dataset loaders, the refusal parser (with comprehensive regression tests for the v2 expanded patterns), SLURM job generation, matrix reuse behaviour, analysis logic, and v2 score-sidecar selection.</w:t>
+        <w:t xml:space="preserve">A verification suite of 176 automated tests across twelve test files, covering schema validation, dataset loaders, the refusal parser (with comprehensive regression tests for the v2 expanded patterns), SLURM job generation, matrix reuse behaviour, analysis logic, v2 score-sidecar selection, and the judge-model validation layer (stub-backend tests, redaction enforcement, and an official-template regression check).</w:t>
       </w:r>
     </w:p>
     <w:p>
@@ -6545,7 +6545,7 @@
           <w:sz w:val="22"/>
           <w:szCs w:val="22"/>
         </w:rPr>
-        <w:t xml:space="preserve">The repository ships with a verification suite of 163 automated tests across twelve test files. The full distribution is recorded in Appendix D. Coverage areas include the dataset and benchmark loaders, the legacy evaluators (retained for backward compatibility), model loader specifics including dtype resolution and quantized-flag propagation, the prompt-formatting logic with explicit tests for enable_thinking handling, the matrix-reuse behaviour (verifying that reuse_loaded_model=True loads each model only once), the analysis module's pairwise delta computation, bootstrap CI logic, and v2 score-sidecar selection, the per-prompt schema validator, the resume-helper functions, the refusal-parser regex correctness (including regression tests for the v2 expanded patterns and curly-apostrophe handling), and the SLURM job generator including the per-benchmark and per-model grouping modes. All 163 tests pass on the current commit.</w:t>
+        <w:t xml:space="preserve">The repository ships with a verification suite of 176 automated tests across twelve test files. The full distribution is recorded in Appendix D. Coverage areas include the dataset and benchmark loaders, the legacy evaluators (retained for backward compatibility), model loader specifics including dtype resolution and quantized-flag propagation, the prompt-formatting logic with explicit tests for enable_thinking handling, the matrix-reuse behaviour (verifying that reuse_loaded_model=True loads each model only once), the analysis module's pairwise delta computation, bootstrap CI logic, and v2 score-sidecar selection, the per-prompt schema validator, the resume-helper functions, the refusal-parser regex correctness (including regression tests for the v2 expanded patterns and curly-apostrophe handling), the judge-model validation layer (stub-backend scoring, sidecar redaction enforcement, ASR aggregation, raw-immutability, and an official-template regression check), and the SLURM job generator including the per-benchmark and per-model grouping modes. All 176 tests pass on the current commit.</w:t>
       </w:r>
     </w:p>
     <w:p>
@@ -8923,7 +8923,7 @@
                 <w:sz w:val="20"/>
                 <w:szCs w:val="20"/>
               </w:rPr>
-              <w:t xml:space="preserve">(installed via requirements.txt; 163 tests passing)</w:t>
+              <w:t xml:space="preserve">(installed via requirements.txt; 176 tests passing)</w:t>
             </w:r>
           </w:p>
         </w:tc>
@@ -13051,6 +13051,64 @@
     </w:p>
     <w:p>
       <w:pPr>
+        <w:pStyle w:val="Heading2"/>
+        <w:spacing w:after="140" w:before="280"/>
+      </w:pPr>
+      <w:r>
+        <w:rPr>
+          <w:rFonts w:ascii="Calibri" w:cs="Calibri" w:eastAsia="Calibri" w:hAnsi="Calibri"/>
+          <w:b/>
+          <w:bCs/>
+          <w:sz w:val="26"/>
+          <w:szCs w:val="26"/>
+        </w:rPr>
+        <w:t xml:space="preserve">6.12 Judge-Model Validation of HarmBench ASR (sensitivity check)</w:t>
+      </w:r>
+    </w:p>
+    <w:p>
+      <w:pPr>
+        <w:spacing w:after="160" w:line="300"/>
+        <w:jc w:val="both"/>
+      </w:pPr>
+      <w:r>
+        <w:rPr>
+          <w:rFonts w:ascii="Calibri" w:cs="Calibri" w:eastAsia="Calibri" w:hAnsi="Calibri"/>
+          <w:sz w:val="22"/>
+          <w:szCs w:val="22"/>
+        </w:rPr>
+        <w:t xml:space="preserve">Because the primary HarmBench scorer is a deterministic regex classifier (v2), and because the study's headline finding (the statistically significant Qwen 4B alignment_degradation) rests on the HarmBench ASR, the ASR is independently validated with the official HarmBench classifier, cais/HarmBench-Llama-2-13b-cls. This is the fine-tuned judge model specified by the HarmBench paper: given a harmful behavior and a model generation, it answers whether the generation is a non-minimal, unambiguous instance of the behavior ("yes" = attack success). The judge is run as a derived sensitivity check that re-scores the already-saved generations; it performs no new target-model inference and does not modify the TC1-original raw outputs or the v2 sidecars. Judge labels are written to redacted per-prompt sidecars (scores.judge.harmbench_cls.jsonl, IDs and booleans only) and aggregated to summary.judge.harmbench_cls.json. The judge validates the HarmBench benchmark specifically; over-refusal on XSTest is a different question ("did the model refuse a benign prompt?") and is left to a future refusal-style judge.</w:t>
+      </w:r>
+    </w:p>
+    <w:p>
+      <w:pPr>
+        <w:spacing w:after="160" w:line="300"/>
+        <w:jc w:val="both"/>
+      </w:pPr>
+      <w:r>
+        <w:rPr>
+          <w:rFonts w:ascii="Calibri" w:cs="Calibri" w:eastAsia="Calibri" w:hAnsi="Calibri"/>
+          <w:sz w:val="22"/>
+          <w:szCs w:val="22"/>
+        </w:rPr>
+        <w:t xml:space="preserve">Methodology: the judge classifies every saved (behavior, generation) pair for all six models. Agreement with the v2 scorer is reported per model as raw agreement rate and Cohen's kappa over the shared prompt set, alongside the HarmBench ASR computed under each scorer. At the pair level, the HarmBench ΔASR is recomputed under the judge and passed through the same interpretation-label rule (holding the v2 over-refusal and MMLU deltas fixed, since the HarmBench classifier judges only HarmBench), to test whether any pair's label is sensitive to the choice of scorer. The expectation, given the manual audit of the v2 classifier, is high agreement and label stability; the value of the check is that it converts that expectation into a reported, reproducible number rather than an assumption. The judge run is executed on the NTU TC1 cluster via sbatch in offline mode, and the agreement figures are produced locally by scripts/judge_agreement.py. Crucially, the judge classifier is loaded in full precision (float16), not quantized: because the judge is the reference instrument used to validate the (quantized) target models, quantizing the judge itself would introduce the very confound the check is meant to rule out. The job records the exact GPU and precision used in summary.judge.harmbench_cls.json for reproducibility. Where the 13B classifier does not fit in float16 on the available GPU, an 8-bit fallback (substantially closer to full precision than the 4-bit NF4 used for the target models) is used and reported explicitly.</w:t>
+      </w:r>
+    </w:p>
+    <w:p>
+      <w:pPr>
+        <w:spacing w:after="160" w:line="300"/>
+        <w:jc w:val="both"/>
+      </w:pPr>
+      <w:r>
+        <w:rPr>
+          <w:rFonts w:ascii="Calibri" w:cs="Calibri" w:eastAsia="Calibri" w:hAnsi="Calibri"/>
+          <w:sz w:val="22"/>
+          <w:szCs w:val="22"/>
+        </w:rPr>
+        <w:t xml:space="preserve">[RESULTS PENDING TC1 RUN] This subsection will be populated with the per-model agreement rates, Cohen's kappa values, judge-vs-v2 HarmBench ASR, and the per-pair label-stability outcome once the judge job has run on TC1 and the sidecars have been collected. If the judge confirms the v2 ASR within sampling noise and leaves all three interpretation labels unchanged — in particular the Qwen 4B alignment_degradation — the headline finding is corroborated by the benchmark's own reference classifier. Any divergence will be reported transparently and, if material, the affected labels will be revised with the judge as the authoritative scorer for HarmBench.</w:t>
+      </w:r>
+    </w:p>
+    <w:p>
+      <w:pPr>
         <w:pStyle w:val="Heading1"/>
         <w:pageBreakBefore/>
         <w:spacing w:after="200" w:before="360"/>
@@ -13604,7 +13662,7 @@
           <w:sz w:val="22"/>
           <w:szCs w:val="22"/>
         </w:rPr>
-        <w:t xml:space="preserve">The methodological contribution is a controlled matched-pair design in which baseline and four-bit pair members are loaded from identical baseline weights, with NF4 quantization applied on the fly. This design eliminates publisher- and pipeline-asymmetry as confounds and provides the strongest practical isolation of quantization as the experimental variable. The engineering contribution is an open, reproducible benchmarking framework comprising the matched-pair pipeline, three benchmark plugins, the pairwise analysis layer with rule-based interpretation labels and paired bootstrap 95% confidence intervals, full SLURM orchestration for the NTU TC1 cluster with resumable per-model matrix jobs, and a verification suite of 163 automated tests. The analytical contribution is the interpretation layer itself — the capability-anchored, statistically-grounded, multi-benchmark framework — which formalises the alignment-versus-capability disambiguation as a rule-based decision procedure over combined safety and capability deltas and which is the durable contribution of this study independent of any specific empirical outcome.</w:t>
+        <w:t xml:space="preserve">The methodological contribution is a controlled matched-pair design in which baseline and four-bit pair members are loaded from identical baseline weights, with NF4 quantization applied on the fly. This design eliminates publisher- and pipeline-asymmetry as confounds and provides the strongest practical isolation of quantization as the experimental variable. The engineering contribution is an open, reproducible benchmarking framework comprising the matched-pair pipeline, three benchmark plugins, the pairwise analysis layer with rule-based interpretation labels and paired bootstrap 95% confidence intervals, full SLURM orchestration for the NTU TC1 cluster with resumable per-model matrix jobs, and a verification suite of 176 automated tests. The analytical contribution is the interpretation layer itself — the capability-anchored, statistically-grounded, multi-benchmark framework — which formalises the alignment-versus-capability disambiguation as a rule-based decision procedure over combined safety and capability deltas and which is the durable contribution of this study independent of any specific empirical outcome.</w:t>
       </w:r>
     </w:p>
     <w:p>
@@ -16732,7 +16790,7 @@
           <w:sz w:val="22"/>
           <w:szCs w:val="22"/>
         </w:rPr>
-        <w:t xml:space="preserve">The verification suite comprises 163 automated tests across twelve test files. The distribution is summarised in Table D.1; the test files are located under tests/ in the repository.</w:t>
+        <w:t xml:space="preserve">The verification suite comprises 176 automated tests across twelve test files. The distribution is summarised in Table D.1; the test files are located under tests/ in the repository.</w:t>
       </w:r>
     </w:p>
     <w:tbl>
@@ -17067,7 +17125,7 @@
                 <w:sz w:val="20"/>
                 <w:szCs w:val="20"/>
               </w:rPr>
-              <w:t xml:space="preserve">test_matrix_reuse.py</w:t>
+              <w:t xml:space="preserve">test_judge_validation.py</w:t>
             </w:r>
           </w:p>
         </w:tc>
@@ -17097,7 +17155,7 @@
                 <w:sz w:val="20"/>
                 <w:szCs w:val="20"/>
               </w:rPr>
-              <w:t xml:space="preserve">2</w:t>
+              <w:t xml:space="preserve">13</w:t>
             </w:r>
           </w:p>
         </w:tc>
@@ -17127,7 +17185,7 @@
                 <w:sz w:val="20"/>
                 <w:szCs w:val="20"/>
               </w:rPr>
-              <w:t xml:space="preserve">Matrix runner reuse_loaded_model behaviour.</w:t>
+              <w:t xml:space="preserve">Judge-model validation: stub-backend scoring, sidecar redaction enforcement, ASR aggregation, raw-immutability, idempotency, the official-template byte-for-byte regression check, and judge-precision resolution (fp16/8bit/4bit + VRAM estimates).</w:t>
             </w:r>
           </w:p>
         </w:tc>
@@ -17159,7 +17217,7 @@
                 <w:sz w:val="20"/>
                 <w:szCs w:val="20"/>
               </w:rPr>
-              <w:t xml:space="preserve">test_metrics_and_config.py</w:t>
+              <w:t xml:space="preserve">test_matrix_reuse.py</w:t>
             </w:r>
           </w:p>
         </w:tc>
@@ -17189,7 +17247,7 @@
                 <w:sz w:val="20"/>
                 <w:szCs w:val="20"/>
               </w:rPr>
-              <w:t xml:space="preserve">20</w:t>
+              <w:t xml:space="preserve">2</w:t>
             </w:r>
           </w:p>
         </w:tc>
@@ -17219,7 +17277,7 @@
                 <w:sz w:val="20"/>
                 <w:szCs w:val="20"/>
               </w:rPr>
-              <w:t xml:space="preserve">Bootstrap CI, JSONL/CSV round-trip, schema validation.</w:t>
+              <w:t xml:space="preserve">Matrix runner reuse_loaded_model behaviour.</w:t>
             </w:r>
           </w:p>
         </w:tc>
@@ -17251,7 +17309,7 @@
                 <w:sz w:val="20"/>
                 <w:szCs w:val="20"/>
               </w:rPr>
-              <w:t xml:space="preserve">test_models.py</w:t>
+              <w:t xml:space="preserve">test_metrics_and_config.py</w:t>
             </w:r>
           </w:p>
         </w:tc>
@@ -17281,7 +17339,7 @@
                 <w:sz w:val="20"/>
                 <w:szCs w:val="20"/>
               </w:rPr>
-              <w:t xml:space="preserve">18</w:t>
+              <w:t xml:space="preserve">20</w:t>
             </w:r>
           </w:p>
         </w:tc>
@@ -17311,7 +17369,7 @@
                 <w:sz w:val="20"/>
                 <w:szCs w:val="20"/>
               </w:rPr>
-              <w:t xml:space="preserve">ModelSpec, device and dtype resolution, prompt formatting (incl. enable_thinking).</w:t>
+              <w:t xml:space="preserve">Bootstrap CI, JSONL/CSV round-trip, schema validation.</w:t>
             </w:r>
           </w:p>
         </w:tc>
@@ -17343,7 +17401,7 @@
                 <w:sz w:val="20"/>
                 <w:szCs w:val="20"/>
               </w:rPr>
-              <w:t xml:space="preserve">test_pipeline.py</w:t>
+              <w:t xml:space="preserve">test_models.py</w:t>
             </w:r>
           </w:p>
         </w:tc>
@@ -17373,7 +17431,7 @@
                 <w:sz w:val="20"/>
                 <w:szCs w:val="20"/>
               </w:rPr>
-              <w:t xml:space="preserve">12</w:t>
+              <w:t xml:space="preserve">18</w:t>
             </w:r>
           </w:p>
         </w:tc>
@@ -17403,7 +17461,7 @@
                 <w:sz w:val="20"/>
                 <w:szCs w:val="20"/>
               </w:rPr>
-              <w:t xml:space="preserve">Batched generation and orchestration helpers.</w:t>
+              <w:t xml:space="preserve">ModelSpec, device and dtype resolution, prompt formatting (incl. enable_thinking).</w:t>
             </w:r>
           </w:p>
         </w:tc>
@@ -17435,7 +17493,7 @@
                 <w:sz w:val="20"/>
                 <w:szCs w:val="20"/>
               </w:rPr>
-              <w:t xml:space="preserve">test_quant_analysis.py</w:t>
+              <w:t xml:space="preserve">test_pipeline.py</w:t>
             </w:r>
           </w:p>
         </w:tc>
@@ -17465,7 +17523,7 @@
                 <w:sz w:val="20"/>
                 <w:szCs w:val="20"/>
               </w:rPr>
-              <w:t xml:space="preserve">9</w:t>
+              <w:t xml:space="preserve">12</w:t>
             </w:r>
           </w:p>
         </w:tc>
@@ -17495,7 +17553,7 @@
                 <w:sz w:val="20"/>
                 <w:szCs w:val="20"/>
               </w:rPr>
-              <w:t xml:space="preserve">Pairwise delta computation, interpretation labels, bootstrap CI logic, and v2 score-sidecar selection.</w:t>
+              <w:t xml:space="preserve">Batched generation and orchestration helpers.</w:t>
             </w:r>
           </w:p>
         </w:tc>
@@ -17527,7 +17585,7 @@
                 <w:sz w:val="20"/>
                 <w:szCs w:val="20"/>
               </w:rPr>
-              <w:t xml:space="preserve">test_quant_pipeline_utils.py</w:t>
+              <w:t xml:space="preserve">test_quant_analysis.py</w:t>
             </w:r>
           </w:p>
         </w:tc>
@@ -17557,7 +17615,7 @@
                 <w:sz w:val="20"/>
                 <w:szCs w:val="20"/>
               </w:rPr>
-              <w:t xml:space="preserve">4</w:t>
+              <w:t xml:space="preserve">9</w:t>
             </w:r>
           </w:p>
         </w:tc>
@@ -17587,7 +17645,7 @@
                 <w:sz w:val="20"/>
                 <w:szCs w:val="20"/>
               </w:rPr>
-              <w:t xml:space="preserve">Record schema validation, resume helpers.</w:t>
+              <w:t xml:space="preserve">Pairwise delta computation, interpretation labels, bootstrap CI logic, and v2 score-sidecar selection.</w:t>
             </w:r>
           </w:p>
         </w:tc>
@@ -17619,7 +17677,7 @@
                 <w:sz w:val="20"/>
                 <w:szCs w:val="20"/>
               </w:rPr>
-              <w:t xml:space="preserve">test_quant_smoke.py</w:t>
+              <w:t xml:space="preserve">test_quant_pipeline_utils.py</w:t>
             </w:r>
           </w:p>
         </w:tc>
@@ -17649,7 +17707,7 @@
                 <w:sz w:val="20"/>
                 <w:szCs w:val="20"/>
               </w:rPr>
-              <w:t xml:space="preserve">2</w:t>
+              <w:t xml:space="preserve">4</w:t>
             </w:r>
           </w:p>
         </w:tc>
@@ -17679,7 +17737,7 @@
                 <w:sz w:val="20"/>
                 <w:szCs w:val="20"/>
               </w:rPr>
-              <w:t xml:space="preserve">End-to-end pipeline smoke test on a stub.</w:t>
+              <w:t xml:space="preserve">Record schema validation, resume helpers.</w:t>
             </w:r>
           </w:p>
         </w:tc>
@@ -17711,7 +17769,7 @@
                 <w:sz w:val="20"/>
                 <w:szCs w:val="20"/>
               </w:rPr>
-              <w:t xml:space="preserve">test_refusal_parser.py</w:t>
+              <w:t xml:space="preserve">test_quant_smoke.py</w:t>
             </w:r>
           </w:p>
         </w:tc>
@@ -17741,7 +17799,7 @@
                 <w:sz w:val="20"/>
                 <w:szCs w:val="20"/>
               </w:rPr>
-              <w:t xml:space="preserve">40</w:t>
+              <w:t xml:space="preserve">2</w:t>
             </w:r>
           </w:p>
         </w:tc>
@@ -17771,7 +17829,7 @@
                 <w:sz w:val="20"/>
                 <w:szCs w:val="20"/>
               </w:rPr>
-              <w:t xml:space="preserve">v1 sanity tests plus v2 regression tests: 26 canonical refusal templates, 6 negative controls, curly-apostrophe handling, and the diagnostic match_refusal_pattern helper.</w:t>
+              <w:t xml:space="preserve">End-to-end pipeline smoke test on a stub.</w:t>
             </w:r>
           </w:p>
         </w:tc>
@@ -17803,7 +17861,7 @@
                 <w:sz w:val="20"/>
                 <w:szCs w:val="20"/>
               </w:rPr>
-              <w:t xml:space="preserve">test_slurm_helpers.py</w:t>
+              <w:t xml:space="preserve">test_refusal_parser.py</w:t>
             </w:r>
           </w:p>
         </w:tc>
@@ -17833,7 +17891,7 @@
                 <w:sz w:val="20"/>
                 <w:szCs w:val="20"/>
               </w:rPr>
-              <w:t xml:space="preserve">8</w:t>
+              <w:t xml:space="preserve">40</w:t>
             </w:r>
           </w:p>
         </w:tc>
@@ -17863,7 +17921,7 @@
                 <w:sz w:val="20"/>
                 <w:szCs w:val="20"/>
               </w:rPr>
-              <w:t xml:space="preserve">Generated sbatch contents and per-benchmark/per-model grouping.</w:t>
+              <w:t xml:space="preserve">v1 sanity tests plus v2 regression tests: 26 canonical refusal templates, 6 negative controls, curly-apostrophe handling, and the diagnostic match_refusal_pattern helper.</w:t>
             </w:r>
           </w:p>
         </w:tc>
@@ -17895,7 +17953,7 @@
                 <w:sz w:val="20"/>
                 <w:szCs w:val="20"/>
               </w:rPr>
-              <w:t xml:space="preserve">(other small fixtures)</w:t>
+              <w:t xml:space="preserve">test_slurm_helpers.py</w:t>
             </w:r>
           </w:p>
         </w:tc>
@@ -17925,7 +17983,7 @@
                 <w:sz w:val="20"/>
                 <w:szCs w:val="20"/>
               </w:rPr>
-              <w:t xml:space="preserve">—</w:t>
+              <w:t xml:space="preserve">8</w:t>
             </w:r>
           </w:p>
         </w:tc>
@@ -17955,7 +18013,7 @@
                 <w:sz w:val="20"/>
                 <w:szCs w:val="20"/>
               </w:rPr>
-              <w:t xml:space="preserve">Conftest fixtures, shared mocks.</w:t>
+              <w:t xml:space="preserve">Generated sbatch contents and per-benchmark/per-model grouping.</w:t>
             </w:r>
           </w:p>
         </w:tc>
@@ -17987,6 +18045,98 @@
                 <w:sz w:val="20"/>
                 <w:szCs w:val="20"/>
               </w:rPr>
+              <w:t xml:space="preserve">(other small fixtures)</w:t>
+            </w:r>
+          </w:p>
+        </w:tc>
+        <w:tc>
+          <w:tcPr>
+            <w:tcW w:type="dxa" w:w="1200"/>
+            <w:tcBorders>
+              <w:top w:val="single" w:color="999999" w:sz="4"/>
+              <w:left w:val="single" w:color="999999" w:sz="4"/>
+              <w:bottom w:val="single" w:color="999999" w:sz="4"/>
+              <w:right w:val="single" w:color="999999" w:sz="4"/>
+            </w:tcBorders>
+            <w:tcMar>
+              <w:top w:type="dxa" w:w="80"/>
+              <w:left w:type="dxa" w:w="120"/>
+              <w:bottom w:type="dxa" w:w="80"/>
+              <w:right w:type="dxa" w:w="120"/>
+            </w:tcMar>
+          </w:tcPr>
+          <w:p>
+            <w:pPr>
+              <w:spacing w:after="0"/>
+            </w:pPr>
+            <w:r>
+              <w:rPr>
+                <w:rFonts w:ascii="Calibri" w:cs="Calibri" w:eastAsia="Calibri" w:hAnsi="Calibri"/>
+                <w:sz w:val="20"/>
+                <w:szCs w:val="20"/>
+              </w:rPr>
+              <w:t xml:space="preserve">—</w:t>
+            </w:r>
+          </w:p>
+        </w:tc>
+        <w:tc>
+          <w:tcPr>
+            <w:tcW w:type="dxa" w:w="5160"/>
+            <w:tcBorders>
+              <w:top w:val="single" w:color="999999" w:sz="4"/>
+              <w:left w:val="single" w:color="999999" w:sz="4"/>
+              <w:bottom w:val="single" w:color="999999" w:sz="4"/>
+              <w:right w:val="single" w:color="999999" w:sz="4"/>
+            </w:tcBorders>
+            <w:tcMar>
+              <w:top w:type="dxa" w:w="80"/>
+              <w:left w:type="dxa" w:w="120"/>
+              <w:bottom w:type="dxa" w:w="80"/>
+              <w:right w:type="dxa" w:w="120"/>
+            </w:tcMar>
+          </w:tcPr>
+          <w:p>
+            <w:pPr>
+              <w:spacing w:after="0"/>
+            </w:pPr>
+            <w:r>
+              <w:rPr>
+                <w:rFonts w:ascii="Calibri" w:cs="Calibri" w:eastAsia="Calibri" w:hAnsi="Calibri"/>
+                <w:sz w:val="20"/>
+                <w:szCs w:val="20"/>
+              </w:rPr>
+              <w:t xml:space="preserve">Conftest fixtures, shared mocks.</w:t>
+            </w:r>
+          </w:p>
+        </w:tc>
+      </w:tr>
+      <w:tr>
+        <w:tc>
+          <w:tcPr>
+            <w:tcW w:type="dxa" w:w="3000"/>
+            <w:tcBorders>
+              <w:top w:val="single" w:color="999999" w:sz="4"/>
+              <w:left w:val="single" w:color="999999" w:sz="4"/>
+              <w:bottom w:val="single" w:color="999999" w:sz="4"/>
+              <w:right w:val="single" w:color="999999" w:sz="4"/>
+            </w:tcBorders>
+            <w:tcMar>
+              <w:top w:type="dxa" w:w="80"/>
+              <w:left w:type="dxa" w:w="120"/>
+              <w:bottom w:type="dxa" w:w="80"/>
+              <w:right w:type="dxa" w:w="120"/>
+            </w:tcMar>
+          </w:tcPr>
+          <w:p>
+            <w:pPr>
+              <w:spacing w:after="0"/>
+            </w:pPr>
+            <w:r>
+              <w:rPr>
+                <w:rFonts w:ascii="Calibri" w:cs="Calibri" w:eastAsia="Calibri" w:hAnsi="Calibri"/>
+                <w:sz w:val="20"/>
+                <w:szCs w:val="20"/>
+              </w:rPr>
               <w:t xml:space="preserve">Total</w:t>
             </w:r>
           </w:p>
@@ -18017,7 +18167,7 @@
                 <w:sz w:val="20"/>
                 <w:szCs w:val="20"/>
               </w:rPr>
-              <w:t xml:space="preserve">163</w:t>
+              <w:t xml:space="preserve">176</w:t>
             </w:r>
           </w:p>
         </w:tc>
@@ -18374,7 +18524,7 @@
           <w:sz w:val="18"/>
           <w:szCs w:val="18"/>
         </w:rPr>
-        <w:t xml:space="preserve">├── tests/                    (163 tests across 12 files)</w:t>
+        <w:t xml:space="preserve">├── tests/                    (176 tests across 12 files)</w:t>
       </w:r>
     </w:p>
     <w:p>
@@ -19855,7 +20005,7 @@
                 <w:sz w:val="20"/>
                 <w:szCs w:val="20"/>
               </w:rPr>
-              <w:t xml:space="preserve">2026-05-27 23:54</w:t>
+              <w:t xml:space="preserve">2026-06-06 12:26</w:t>
             </w:r>
           </w:p>
         </w:tc>
@@ -19915,7 +20065,7 @@
                 <w:sz w:val="20"/>
                 <w:szCs w:val="20"/>
               </w:rPr>
-              <w:t xml:space="preserve">Added Appendix H as a fresh-session handoff after the v2 scorer incident. The appendix documents the v1 failure mode, the v2 parser correction, the later immutable-sidecar correction, the verification evidence, and the next-step contract for judge-model validation. Updated cover revision text and Future Work wording to make clear that LlamaGuard/API judge scoring is a derived validation layer rather than a replacement for v2 or a mutation of raw outputs. Documented that any local incomplete judge skeleton should not be committed until T20 is implemented end-to-end.</w:t>
+              <w:t xml:space="preserve">Pre-push judge audit hardening. The TC1 judge path remains fp16 by default, but the sbatch now uses a conservative batch size of 4 to leave activation/KV-cache headroom on the confirmed 32 GB V100. The judge loader uses low_cpu_mem_usage, and the runner's console banner reports the resolved backend model id instead of printing None when defaults are used. This is an operational robustness update; it does not change the scoring method, redaction contract, or pending-results status of §6.12.</w:t>
             </w:r>
           </w:p>
         </w:tc>
@@ -19947,6 +20097,282 @@
                 <w:sz w:val="20"/>
                 <w:szCs w:val="20"/>
               </w:rPr>
+              <w:t xml:space="preserve">2026-06-06 12:00</w:t>
+            </w:r>
+          </w:p>
+        </w:tc>
+        <w:tc>
+          <w:tcPr>
+            <w:tcW w:type="dxa" w:w="3000"/>
+            <w:tcBorders>
+              <w:top w:val="single" w:color="999999" w:sz="4"/>
+              <w:left w:val="single" w:color="999999" w:sz="4"/>
+              <w:bottom w:val="single" w:color="999999" w:sz="4"/>
+              <w:right w:val="single" w:color="999999" w:sz="4"/>
+            </w:tcBorders>
+            <w:tcMar>
+              <w:top w:type="dxa" w:w="80"/>
+              <w:left w:type="dxa" w:w="120"/>
+              <w:bottom w:type="dxa" w:w="80"/>
+              <w:right w:type="dxa" w:w="120"/>
+            </w:tcMar>
+          </w:tcPr>
+          <w:p>
+            <w:pPr>
+              <w:spacing w:after="0"/>
+            </w:pPr>
+            <w:r>
+              <w:rPr>
+                <w:rFonts w:ascii="Calibri" w:cs="Calibri" w:eastAsia="Calibri" w:hAnsi="Calibri"/>
+                <w:sz w:val="20"/>
+                <w:szCs w:val="20"/>
+              </w:rPr>
+              <w:t xml:space="preserve">FYP_Report_2026-05-27.docx</w:t>
+            </w:r>
+          </w:p>
+        </w:tc>
+        <w:tc>
+          <w:tcPr>
+            <w:tcW w:type="dxa" w:w="4160"/>
+            <w:tcBorders>
+              <w:top w:val="single" w:color="999999" w:sz="4"/>
+              <w:left w:val="single" w:color="999999" w:sz="4"/>
+              <w:bottom w:val="single" w:color="999999" w:sz="4"/>
+              <w:right w:val="single" w:color="999999" w:sz="4"/>
+            </w:tcBorders>
+            <w:tcMar>
+              <w:top w:type="dxa" w:w="80"/>
+              <w:left w:type="dxa" w:w="120"/>
+              <w:bottom w:type="dxa" w:w="80"/>
+              <w:right w:type="dxa" w:w="120"/>
+            </w:tcMar>
+          </w:tcPr>
+          <w:p>
+            <w:pPr>
+              <w:spacing w:after="0"/>
+            </w:pPr>
+            <w:r>
+              <w:rPr>
+                <w:rFonts w:ascii="Calibri" w:cs="Calibri" w:eastAsia="Calibri" w:hAnsi="Calibri"/>
+                <w:sz w:val="20"/>
+                <w:szCs w:val="20"/>
+              </w:rPr>
+              <w:t xml:space="preserve">T20 refinement — judge runs in full precision (float16) by default, not NF4. Quantizing the judge classifier would confound the validation it is meant to provide, so §6.12 now states the judge is loaded in fp16; the job logs and records the exact GPU and precision used, and falls back to 8-bit (reported explicitly) only if the 13B classifier does not fit in fp16 on the available GPU. Test suite grew to 176 (added judge-precision resolution and VRAM-estimate tests). Appendix D judge-test row updated.</w:t>
+            </w:r>
+          </w:p>
+        </w:tc>
+      </w:tr>
+      <w:tr>
+        <w:tc>
+          <w:tcPr>
+            <w:tcW w:type="dxa" w:w="2200"/>
+            <w:tcBorders>
+              <w:top w:val="single" w:color="999999" w:sz="4"/>
+              <w:left w:val="single" w:color="999999" w:sz="4"/>
+              <w:bottom w:val="single" w:color="999999" w:sz="4"/>
+              <w:right w:val="single" w:color="999999" w:sz="4"/>
+            </w:tcBorders>
+            <w:tcMar>
+              <w:top w:type="dxa" w:w="80"/>
+              <w:left w:type="dxa" w:w="120"/>
+              <w:bottom w:type="dxa" w:w="80"/>
+              <w:right w:type="dxa" w:w="120"/>
+            </w:tcMar>
+          </w:tcPr>
+          <w:p>
+            <w:pPr>
+              <w:spacing w:after="0"/>
+            </w:pPr>
+            <w:r>
+              <w:rPr>
+                <w:rFonts w:ascii="Calibri" w:cs="Calibri" w:eastAsia="Calibri" w:hAnsi="Calibri"/>
+                <w:sz w:val="20"/>
+                <w:szCs w:val="20"/>
+              </w:rPr>
+              <w:t xml:space="preserve">2026-05-28 13:30</w:t>
+            </w:r>
+          </w:p>
+        </w:tc>
+        <w:tc>
+          <w:tcPr>
+            <w:tcW w:type="dxa" w:w="3000"/>
+            <w:tcBorders>
+              <w:top w:val="single" w:color="999999" w:sz="4"/>
+              <w:left w:val="single" w:color="999999" w:sz="4"/>
+              <w:bottom w:val="single" w:color="999999" w:sz="4"/>
+              <w:right w:val="single" w:color="999999" w:sz="4"/>
+            </w:tcBorders>
+            <w:tcMar>
+              <w:top w:type="dxa" w:w="80"/>
+              <w:left w:type="dxa" w:w="120"/>
+              <w:bottom w:type="dxa" w:w="80"/>
+              <w:right w:type="dxa" w:w="120"/>
+            </w:tcMar>
+          </w:tcPr>
+          <w:p>
+            <w:pPr>
+              <w:spacing w:after="0"/>
+            </w:pPr>
+            <w:r>
+              <w:rPr>
+                <w:rFonts w:ascii="Calibri" w:cs="Calibri" w:eastAsia="Calibri" w:hAnsi="Calibri"/>
+                <w:sz w:val="20"/>
+                <w:szCs w:val="20"/>
+              </w:rPr>
+              <w:t xml:space="preserve">FYP_Report_2026-05-27.docx</w:t>
+            </w:r>
+          </w:p>
+        </w:tc>
+        <w:tc>
+          <w:tcPr>
+            <w:tcW w:type="dxa" w:w="4160"/>
+            <w:tcBorders>
+              <w:top w:val="single" w:color="999999" w:sz="4"/>
+              <w:left w:val="single" w:color="999999" w:sz="4"/>
+              <w:bottom w:val="single" w:color="999999" w:sz="4"/>
+              <w:right w:val="single" w:color="999999" w:sz="4"/>
+            </w:tcBorders>
+            <w:tcMar>
+              <w:top w:type="dxa" w:w="80"/>
+              <w:left w:type="dxa" w:w="120"/>
+              <w:bottom w:type="dxa" w:w="80"/>
+              <w:right w:type="dxa" w:w="120"/>
+            </w:tcMar>
+          </w:tcPr>
+          <w:p>
+            <w:pPr>
+              <w:spacing w:after="0"/>
+            </w:pPr>
+            <w:r>
+              <w:rPr>
+                <w:rFonts w:ascii="Calibri" w:cs="Calibri" w:eastAsia="Calibri" w:hAnsi="Calibri"/>
+                <w:sz w:val="20"/>
+                <w:szCs w:val="20"/>
+              </w:rPr>
+              <w:t xml:space="preserve">T20 — Judge-model validation (HarmBench classifier). Added §6.12 documenting an independent sensitivity check of the HarmBench ASR using the official cais/HarmBench-Llama-2-13b-cls classifier (a derived check that re-scores saved generations, performs no new target-model inference, and writes redacted scores.judge.* / summary.judge.* sidecars without touching raw or v2 outputs). The embedded classifier prompt is pinned to the official model-card standard (non-contextual) template, with a byte-for-byte regression test. §6.12 carries the methodology and a [RESULTS PENDING TC1 RUN] placeholder to be populated with per-model agreement, Cohen's kappa, judge-vs-v2 ASR, and per-pair label stability after the TC1 classifier run. Test suite grew to 172 (added test_judge_validation.py). Appendix D updated with the judge test row.</w:t>
+            </w:r>
+          </w:p>
+        </w:tc>
+      </w:tr>
+      <w:tr>
+        <w:tc>
+          <w:tcPr>
+            <w:tcW w:type="dxa" w:w="2200"/>
+            <w:tcBorders>
+              <w:top w:val="single" w:color="999999" w:sz="4"/>
+              <w:left w:val="single" w:color="999999" w:sz="4"/>
+              <w:bottom w:val="single" w:color="999999" w:sz="4"/>
+              <w:right w:val="single" w:color="999999" w:sz="4"/>
+            </w:tcBorders>
+            <w:tcMar>
+              <w:top w:type="dxa" w:w="80"/>
+              <w:left w:type="dxa" w:w="120"/>
+              <w:bottom w:type="dxa" w:w="80"/>
+              <w:right w:type="dxa" w:w="120"/>
+            </w:tcMar>
+          </w:tcPr>
+          <w:p>
+            <w:pPr>
+              <w:spacing w:after="0"/>
+            </w:pPr>
+            <w:r>
+              <w:rPr>
+                <w:rFonts w:ascii="Calibri" w:cs="Calibri" w:eastAsia="Calibri" w:hAnsi="Calibri"/>
+                <w:sz w:val="20"/>
+                <w:szCs w:val="20"/>
+              </w:rPr>
+              <w:t xml:space="preserve">2026-05-27 23:54</w:t>
+            </w:r>
+          </w:p>
+        </w:tc>
+        <w:tc>
+          <w:tcPr>
+            <w:tcW w:type="dxa" w:w="3000"/>
+            <w:tcBorders>
+              <w:top w:val="single" w:color="999999" w:sz="4"/>
+              <w:left w:val="single" w:color="999999" w:sz="4"/>
+              <w:bottom w:val="single" w:color="999999" w:sz="4"/>
+              <w:right w:val="single" w:color="999999" w:sz="4"/>
+            </w:tcBorders>
+            <w:tcMar>
+              <w:top w:type="dxa" w:w="80"/>
+              <w:left w:type="dxa" w:w="120"/>
+              <w:bottom w:type="dxa" w:w="80"/>
+              <w:right w:type="dxa" w:w="120"/>
+            </w:tcMar>
+          </w:tcPr>
+          <w:p>
+            <w:pPr>
+              <w:spacing w:after="0"/>
+            </w:pPr>
+            <w:r>
+              <w:rPr>
+                <w:rFonts w:ascii="Calibri" w:cs="Calibri" w:eastAsia="Calibri" w:hAnsi="Calibri"/>
+                <w:sz w:val="20"/>
+                <w:szCs w:val="20"/>
+              </w:rPr>
+              <w:t xml:space="preserve">FYP_Report_2026-05-27.docx</w:t>
+            </w:r>
+          </w:p>
+        </w:tc>
+        <w:tc>
+          <w:tcPr>
+            <w:tcW w:type="dxa" w:w="4160"/>
+            <w:tcBorders>
+              <w:top w:val="single" w:color="999999" w:sz="4"/>
+              <w:left w:val="single" w:color="999999" w:sz="4"/>
+              <w:bottom w:val="single" w:color="999999" w:sz="4"/>
+              <w:right w:val="single" w:color="999999" w:sz="4"/>
+            </w:tcBorders>
+            <w:tcMar>
+              <w:top w:type="dxa" w:w="80"/>
+              <w:left w:type="dxa" w:w="120"/>
+              <w:bottom w:type="dxa" w:w="80"/>
+              <w:right w:type="dxa" w:w="120"/>
+            </w:tcMar>
+          </w:tcPr>
+          <w:p>
+            <w:pPr>
+              <w:spacing w:after="0"/>
+            </w:pPr>
+            <w:r>
+              <w:rPr>
+                <w:rFonts w:ascii="Calibri" w:cs="Calibri" w:eastAsia="Calibri" w:hAnsi="Calibri"/>
+                <w:sz w:val="20"/>
+                <w:szCs w:val="20"/>
+              </w:rPr>
+              <w:t xml:space="preserve">Added Appendix H as a fresh-session handoff after the v2 scorer incident. The appendix documents the v1 failure mode, the v2 parser correction, the later immutable-sidecar correction, the verification evidence, and the next-step contract for judge-model validation. Updated cover revision text and Future Work wording to make clear that LlamaGuard/API judge scoring is a derived validation layer rather than a replacement for v2 or a mutation of raw outputs. Documented that any local incomplete judge skeleton should not be committed until T20 is implemented end-to-end.</w:t>
+            </w:r>
+          </w:p>
+        </w:tc>
+      </w:tr>
+      <w:tr>
+        <w:tc>
+          <w:tcPr>
+            <w:tcW w:type="dxa" w:w="2200"/>
+            <w:tcBorders>
+              <w:top w:val="single" w:color="999999" w:sz="4"/>
+              <w:left w:val="single" w:color="999999" w:sz="4"/>
+              <w:bottom w:val="single" w:color="999999" w:sz="4"/>
+              <w:right w:val="single" w:color="999999" w:sz="4"/>
+            </w:tcBorders>
+            <w:tcMar>
+              <w:top w:type="dxa" w:w="80"/>
+              <w:left w:type="dxa" w:w="120"/>
+              <w:bottom w:type="dxa" w:w="80"/>
+              <w:right w:type="dxa" w:w="120"/>
+            </w:tcMar>
+          </w:tcPr>
+          <w:p>
+            <w:pPr>
+              <w:spacing w:after="0"/>
+            </w:pPr>
+            <w:r>
+              <w:rPr>
+                <w:rFonts w:ascii="Calibri" w:cs="Calibri" w:eastAsia="Calibri" w:hAnsi="Calibri"/>
+                <w:sz w:val="20"/>
+                <w:szCs w:val="20"/>
+              </w:rPr>
               <w:t xml:space="preserve">2026-05-28 12:00</w:t>
             </w:r>
           </w:p>
@@ -19977,7 +20403,7 @@
                 <w:sz w:val="20"/>
                 <w:szCs w:val="20"/>
               </w:rPr>
-              <w:t xml:space="preserve">FYP_Report_2026-05-27.docx (current)</w:t>
+              <w:t xml:space="preserve">FYP_Report_2026-05-27.docx</w:t>
             </w:r>
           </w:p>
         </w:tc>
@@ -22455,7 +22881,7 @@
                 <w:sz w:val="20"/>
                 <w:szCs w:val="20"/>
               </w:rPr>
-              <w:t xml:space="preserve">Future judge-model sidecar, not yet implemented</w:t>
+              <w:t xml:space="preserve">Derived judge-model score sidecar; HarmBench classifier implementation is code-complete, TC1 run pending</w:t>
             </w:r>
           </w:p>
         </w:tc>
@@ -22485,7 +22911,99 @@
                 <w:sz w:val="20"/>
                 <w:szCs w:val="20"/>
               </w:rPr>
-              <w:t xml:space="preserve">Write only if T20 is implemented; keep separate from v2 sidecars.</w:t>
+              <w:t xml:space="preserve">Keep separate from v2 sidecars; no prompt/response text; populate only from the judge-validation runner.</w:t>
+            </w:r>
+          </w:p>
+        </w:tc>
+      </w:tr>
+      <w:tr>
+        <w:tc>
+          <w:tcPr>
+            <w:tcW w:type="dxa" w:w="1900"/>
+            <w:tcBorders>
+              <w:top w:val="single" w:color="999999" w:sz="4"/>
+              <w:left w:val="single" w:color="999999" w:sz="4"/>
+              <w:bottom w:val="single" w:color="999999" w:sz="4"/>
+              <w:right w:val="single" w:color="999999" w:sz="4"/>
+            </w:tcBorders>
+            <w:tcMar>
+              <w:top w:type="dxa" w:w="80"/>
+              <w:left w:type="dxa" w:w="120"/>
+              <w:bottom w:type="dxa" w:w="80"/>
+              <w:right w:type="dxa" w:w="120"/>
+            </w:tcMar>
+          </w:tcPr>
+          <w:p>
+            <w:pPr>
+              <w:spacing w:after="0"/>
+            </w:pPr>
+            <w:r>
+              <w:rPr>
+                <w:rFonts w:ascii="Calibri" w:cs="Calibri" w:eastAsia="Calibri" w:hAnsi="Calibri"/>
+                <w:sz w:val="20"/>
+                <w:szCs w:val="20"/>
+              </w:rPr>
+              <w:t xml:space="preserve">summary.judge.&lt;judge&gt;.json</w:t>
+            </w:r>
+          </w:p>
+        </w:tc>
+        <w:tc>
+          <w:tcPr>
+            <w:tcW w:type="dxa" w:w="3200"/>
+            <w:tcBorders>
+              <w:top w:val="single" w:color="999999" w:sz="4"/>
+              <w:left w:val="single" w:color="999999" w:sz="4"/>
+              <w:bottom w:val="single" w:color="999999" w:sz="4"/>
+              <w:right w:val="single" w:color="999999" w:sz="4"/>
+            </w:tcBorders>
+            <w:tcMar>
+              <w:top w:type="dxa" w:w="80"/>
+              <w:left w:type="dxa" w:w="120"/>
+              <w:bottom w:type="dxa" w:w="80"/>
+              <w:right w:type="dxa" w:w="120"/>
+            </w:tcMar>
+          </w:tcPr>
+          <w:p>
+            <w:pPr>
+              <w:spacing w:after="0"/>
+            </w:pPr>
+            <w:r>
+              <w:rPr>
+                <w:rFonts w:ascii="Calibri" w:cs="Calibri" w:eastAsia="Calibri" w:hAnsi="Calibri"/>
+                <w:sz w:val="20"/>
+                <w:szCs w:val="20"/>
+              </w:rPr>
+              <w:t xml:space="preserve">Derived judge-model aggregate summary; HarmBench classifier implementation is code-complete, TC1 run pending</w:t>
+            </w:r>
+          </w:p>
+        </w:tc>
+        <w:tc>
+          <w:tcPr>
+            <w:tcW w:type="dxa" w:w="4700"/>
+            <w:tcBorders>
+              <w:top w:val="single" w:color="999999" w:sz="4"/>
+              <w:left w:val="single" w:color="999999" w:sz="4"/>
+              <w:bottom w:val="single" w:color="999999" w:sz="4"/>
+              <w:right w:val="single" w:color="999999" w:sz="4"/>
+            </w:tcBorders>
+            <w:tcMar>
+              <w:top w:type="dxa" w:w="80"/>
+              <w:left w:type="dxa" w:w="120"/>
+              <w:bottom w:type="dxa" w:w="80"/>
+              <w:right w:type="dxa" w:w="120"/>
+            </w:tcMar>
+          </w:tcPr>
+          <w:p>
+            <w:pPr>
+              <w:spacing w:after="0"/>
+            </w:pPr>
+            <w:r>
+              <w:rPr>
+                <w:rFonts w:ascii="Calibri" w:cs="Calibri" w:eastAsia="Calibri" w:hAnsi="Calibri"/>
+                <w:sz w:val="20"/>
+                <w:szCs w:val="20"/>
+              </w:rPr>
+              <w:t xml:space="preserve">Use for judge-vs-v2 sensitivity reporting after the TC1 judge run; do not overwrite original summaries.</w:t>
             </w:r>
           </w:p>
         </w:tc>
@@ -22518,7 +23036,7 @@
           <w:sz w:val="22"/>
           <w:szCs w:val="22"/>
         </w:rPr>
-        <w:t xml:space="preserve">The corrected workflow was verified in four ways. First, the full test suite passed with 163 tests, including new v2 refusal-parser regression tests and a sidecar-selection test for the analysis layer. Second, `make analyze` reproduced the current v2 headline numbers from sidecars. Third, the rescore script was checked to leave all original `raw.jsonl` and `summary.json` hashes unchanged. Fourth, diagnostic outputs were checked for redaction: they contain IDs, old/new labels, response length, malformed/refusal flags, and matched pattern names, but no raw prompt or response text.</w:t>
+        <w:t xml:space="preserve">The corrected workflow was verified in four ways. First, the full test suite passed with 176 tests, including v2 refusal-parser regression tests, a sidecar-selection test for the analysis layer, and judge-validation tests for redaction, raw immutability, idempotency, ASR aggregation, and the official HarmBench classifier prompt template. Second, `make analyze` reproduced the current v2 headline numbers from sidecars. Third, the rescore script was checked to leave all original `raw.jsonl` and `summary.json` hashes unchanged. Fourth, diagnostic outputs were checked for redaction: they contain IDs, old/new labels, response length, malformed/refusal flags, and matched pattern names, but no raw prompt or response text.</w:t>
       </w:r>
     </w:p>
     <w:p>
@@ -22548,7 +23066,7 @@
           <w:sz w:val="22"/>
           <w:szCs w:val="22"/>
         </w:rPr>
-        <w:t xml:space="preserve">The next methodological improvement is T20: judge-model validation. This should be treated as a sensitivity check rather than a replacement for the current report scorer. Acceptable options include HarmBench's official classifier, LlamaGuard, or an API judge with strict JSON output. Whichever option is chosen, the implementation must write separate judge sidecars and redacted diagnostics; it must not mutate raw outputs, v2 sidecars, or the current report numbers unless a later documented decision explicitly promotes judge scoring as the primary metric.</w:t>
+        <w:t xml:space="preserve">The next continuation point is operational, not architectural: T20 judge-model validation is implemented, but the HarmBench classifier has not yet been run on TC1. The code-complete path uses `ethical_benchmark/judges/validation.py`, `scripts/run_judge_validation.py`, `slurm/judge_validation.sbatch`, and `scripts/judge_agreement.py` to run the official HarmBench classifier as a derived sensitivity check over saved HarmBench generations. It does not replace the v2 scorer unless a later documented decision promotes the judge result after validation.</w:t>
       </w:r>
     </w:p>
     <w:p>
@@ -22562,7 +23080,7 @@
           <w:sz w:val="22"/>
           <w:szCs w:val="22"/>
         </w:rPr>
-        <w:t xml:space="preserve">Operationally, a future TC1 session should first run `git pull --ff-only` in `/tc1home/FYP/utan001/fyp_quant/repo` to receive commit `aa451dc` or later. Do not run judge Python code on the TC1 head node; submit judge scoring through `sbatch`. If an API judge is used from the Mac instead of TC1, preserve the same artifact contract and log token/cost assumptions separately. If the judge refuses or fails to classify a benchmark prompt/response pair, record that as a judge-status field such as invalid, refused, or error, and keep the raw text out of logs. If a local untracked `ethical_benchmark/judges/__init__.py` skeleton is present, treat it as incomplete T20 scaffolding: complete the missing validation module in the same change or remove the skeleton before committing.</w:t>
+        <w:t xml:space="preserve">Operationally, a future TC1 session should first run `git pull --ff-only` in `/tc1home/FYP/utan001/fyp_quant/repo`, then cache the classifier on the head node with `python scripts/prefetch_tc1.py --config configs/tc1.yaml --judge`, then submit `sbatch slurm/judge_validation.sbatch`. After the job completes, copy `scores.judge.harmbench_cls.jsonl` and `summary.judge.harmbench_cls.json` sidecars back to the Mac, run `python scripts/judge_agreement.py`, and populate §6.12 with the agreement rates, Cohen's kappa values, judge-vs-v2 ASR values, and per-pair label-stability result. Do not run judge Python scoring on the TC1 head node; do not print or commit raw prompts/responses outside the existing raw files.</w:t>
       </w:r>
     </w:p>
     <w:sectPr>

</xml_diff>

<commit_message>
docs: sync Ch7, Appendix H, and agent/README docs to judge-primary (D16)
Audit found the previous commit fixed Chapter 6 to judge-primary but left
pre-judge "TC1 run pending / v2 primary / planned judge" language in:
- report Ch7 (7.1, 7.4) and Appendix H (H.2-H.5)
- CLAUDE.md, AGENTS.md, README.md, docs/FYP_REPO_GUIDE.md
Rewritten so HarmBench is judge-primary, the remaining validity threat is the
absence of a second independent judge, and the next-session handoff lists
push/T1/T3/T15 rather than a pending judge run. Corrected the docx byte count
in PROJECT_LOG (78313 -> 78912). 178 tests pass; CLAUDE/AGENTS in sync.

Co-Authored-By: Claude Opus 4.8 <noreply@anthropic.com>
</commit_message>
<xml_diff>
--- a/docs/FYP_Report_2026-05-27.docx
+++ b/docs/FYP_Report_2026-05-27.docx
@@ -14962,7 +14962,7 @@
           <w:sz w:val="22"/>
           <w:szCs w:val="22"/>
         </w:rPr>
-        <w:t xml:space="preserve">Internal validity is the strongest property of the present design. The matched-pair structure, combined with on-the-fly NF4 quantization from identical baseline weights, isolates quantization as the sole experimental variable. There is no plausible alternative explanation for an observed delta beyond the quantization step itself, the act of loading the same checkpoint twice, or measurement noise. Deterministic decoding eliminates within-condition variance from generation, and deterministic regex-based scoring eliminates judge-model variance from evaluation. The resume logic prevents partial-run contamination: every reported metric is computed from a complete raw.jsonl that contains exactly the configured number of prompts. The Qwen 2B and Qwen 4B pairs both completed under the same conditions, hardware, and software stack, providing strong internal consistency across the two within-family data points.</w:t>
+        <w:t xml:space="preserve">Internal validity is the strongest property of the present design. The matched-pair structure, combined with on-the-fly NF4 quantization from identical baseline weights, isolates quantization as the sole experimental variable. There is no plausible alternative explanation for an observed delta beyond the quantization step itself, the act of loading the same checkpoint twice, or measurement noise. Deterministic decoding (temperature 0.0) eliminates within-condition variance from generation. Scoring is also deterministic: MMLU uses exact match, XSTest over-refusal uses the regex parser, and the primary HarmBench scorer — the official HarmBench classifier — is run with greedy decoding (max_new_tokens = 1) in full precision, producing reproducible labels (job 61047 returned zero parse errors over 1 200 generations). The resume logic prevents partial-run contamination: every reported metric is computed from a complete raw.jsonl with exactly the configured number of prompts. All six target-model runs completed under the same conditions, hardware, and software stack.</w:t>
       </w:r>
     </w:p>
     <w:p>
@@ -15038,7 +15038,7 @@
           <w:sz w:val="26"/>
           <w:szCs w:val="26"/>
         </w:rPr>
-        <w:t xml:space="preserve">7.4 Refusal Parser Trade-offs</w:t>
+        <w:t xml:space="preserve">7.4 Scorer Choice and Remaining Validity Threat</w:t>
       </w:r>
     </w:p>
     <w:p>
@@ -15052,7 +15052,7 @@
           <w:sz w:val="22"/>
           <w:szCs w:val="22"/>
         </w:rPr>
-        <w:t xml:space="preserve">The deterministic regex-based refusal parser was selected for reproducibility and transparency, and against the alternative of using a separate judge LLM. The trade-off is sensitivity. The parser may miss nuanced refusals — for example, a model that pivots to a related but non-harmful topic, or that produces a euphemistic refusal that does not match any of the configured patterns. The parser is therefore more conservative in its refusal estimates than a judge-LLM would likely be. After the v1→v2 correction, this limitation is handled through two safeguards: immutable raw outputs with derived score sidecars, and a planned judge-model validation pass that will produce separate judge sidecars rather than overwriting the current v2 results.</w:t>
+        <w:t xml:space="preserve">HarmBench ASR was initially scored with a deterministic regex parser, chosen for reproducibility. The judge validation (§6.12) showed this regex measures "non-refusal rate" rather than genuine harmful compliance and over-counts ASR — most severely for the Qwen models — so the official HarmBench classifier was promoted to the primary HarmBench scorer (decision D16) and the regex demoted to a transparent secondary proxy. This removes the original construct-validity threat on the HarmBench metric: the primary scorer is now the benchmark's own fine-tuned classifier, run at full precision with deterministic decoding. Two residual threats remain. First, the HarmBench classifier is itself a model and can err; it is adopted because it is the field-standard reference for HarmBench, but no second independent judge (for example LlamaGuard or a frontier-model classifier with a strict rubric) was run to cross-check it — this is the most direct remaining validity threat and is listed as future work (Chapter 9). Second, XSTest over-refusal is still scored by the regex parser, since the HarmBench classifier does not judge over-refusal; a refusal-style judge for XSTest is likewise future work. The immutable-raw-output contract (TC1-original raw.jsonl/summary.json untouched; all corrected and judge scores in derived sidecars) means either future judge can be added without disturbing the existing evidence trail.</w:t>
       </w:r>
     </w:p>
     <w:p>
@@ -23977,7 +23977,7 @@
           <w:sz w:val="22"/>
           <w:szCs w:val="22"/>
         </w:rPr>
-        <w:t xml:space="preserve">The consequence was material. Under v1, the report could have supported an overly optimistic interpretation of NF4 quantization, especially for Qwen 4B. Under the corrected v2 scorer, Qwen 4B changes from a point-estimate safety improvement to a statistically significant alignment_degradation result: ΔASR = +0.065 with 95% CI [+0.025, +0.110]. Qwen 1.7B's apparent ASR reduction shrinks to a non-significant −0.025, and Llama 3.2 3B's ΔASR becomes exactly 0.000. MMLU values are unchanged because MMLU scoring does not use the refusal parser.</w:t>
+        <w:t xml:space="preserve">The consequence was material, and the story has two stages. The v1→v2 regex correction first moved the Qwen 4B point estimate from an apparent safety improvement to a (v2-regex) ΔASR of +0.065. But the v2 regex still only measures "non-refusal rate", so a second, decisive correction followed: the official HarmBench classifier (judge; decision D16, §6.12) was promoted to the primary HarmBench scorer. Under the judge, the v2 regex is shown to over-count ASR, and the study's one statistically significant ΔASR is Qwen 1.7B at +0.055 (CI [+0.010, +0.100]) — not Qwen 4B, whose judge ΔASR (+0.025) is directional only. The honest final reading is therefore Qwen 1.7B broad_degradation (significant safety worsening plus significant capability loss); the v2 Qwen 4B figure quoted above is the superseded regex-proxy value. MMLU values are unchanged throughout because MMLU scoring does not use any refusal scorer.</w:t>
       </w:r>
     </w:p>
     <w:p>
@@ -24648,7 +24648,7 @@
                 <w:sz w:val="20"/>
                 <w:szCs w:val="20"/>
               </w:rPr>
-              <w:t xml:space="preserve">scores.judge.&lt;judge&gt;.jsonl</w:t>
+              <w:t xml:space="preserve">scores.judge.harmbench_cls.jsonl</w:t>
             </w:r>
           </w:p>
         </w:tc>
@@ -24678,7 +24678,7 @@
                 <w:sz w:val="20"/>
                 <w:szCs w:val="20"/>
               </w:rPr>
-              <w:t xml:space="preserve">Derived judge-model score sidecar; HarmBench classifier implementation is code-complete, TC1 run pending</w:t>
+              <w:t xml:space="preserve">Per-prompt official HarmBench classifier labels (the PRIMARY HarmBench scorer, D16); produced by job 61047</w:t>
             </w:r>
           </w:p>
         </w:tc>
@@ -24708,7 +24708,7 @@
                 <w:sz w:val="20"/>
                 <w:szCs w:val="20"/>
               </w:rPr>
-              <w:t xml:space="preserve">Keep separate from v2 sidecars; no prompt/response text; populate only from the judge-validation runner.</w:t>
+              <w:t xml:space="preserve">Redacted (IDs + booleans only). Committed to the repo. Never overwrite; raw text must never appear.</w:t>
             </w:r>
           </w:p>
         </w:tc>
@@ -24740,7 +24740,7 @@
                 <w:sz w:val="20"/>
                 <w:szCs w:val="20"/>
               </w:rPr>
-              <w:t xml:space="preserve">summary.judge.&lt;judge&gt;.json</w:t>
+              <w:t xml:space="preserve">summary.judge.harmbench_cls.json</w:t>
             </w:r>
           </w:p>
         </w:tc>
@@ -24770,7 +24770,7 @@
                 <w:sz w:val="20"/>
                 <w:szCs w:val="20"/>
               </w:rPr>
-              <w:t xml:space="preserve">Derived judge-model aggregate summary; HarmBench classifier implementation is code-complete, TC1 run pending</w:t>
+              <w:t xml:space="preserve">Aggregate judge HarmBench metrics + GPU/precision metadata</w:t>
             </w:r>
           </w:p>
         </w:tc>
@@ -24800,7 +24800,7 @@
                 <w:sz w:val="20"/>
                 <w:szCs w:val="20"/>
               </w:rPr>
-              <w:t xml:space="preserve">Use for judge-vs-v2 sensitivity reporting after the TC1 judge run; do not overwrite original summaries.</w:t>
+              <w:t xml:space="preserve">The authoritative HarmBench ASR source. judge_agreement.{json,csv} compares it to the v2 proxy.</w:t>
             </w:r>
           </w:p>
         </w:tc>
@@ -24819,7 +24819,7 @@
           <w:sz w:val="26"/>
           <w:szCs w:val="26"/>
         </w:rPr>
-        <w:t xml:space="preserve">H.4 Verification already completed</w:t>
+        <w:t xml:space="preserve">H.4 Verification completed</w:t>
       </w:r>
     </w:p>
     <w:p>
@@ -24833,7 +24833,7 @@
           <w:sz w:val="22"/>
           <w:szCs w:val="22"/>
         </w:rPr>
-        <w:t xml:space="preserve">The corrected workflow was verified in four ways. First, the full test suite passed with 178 tests, including v2 refusal-parser regression tests, a sidecar-selection test for the analysis layer, and judge-validation tests for redaction, raw immutability, idempotency, ASR aggregation, and the official HarmBench classifier prompt template. Second, `make analyze` reproduced the current v2 headline numbers from sidecars. Third, the rescore script was checked to leave all original `raw.jsonl` and `summary.json` hashes unchanged. Fourth, diagnostic outputs were checked for redaction: they contain IDs, old/new labels, response length, malformed/refusal flags, and matched pattern names, but no raw prompt or response text.</w:t>
+        <w:t xml:space="preserve">The workflow was verified in five ways. First, the full test suite passes with 178 tests, including v2 refusal-parser regression tests, the analysis sidecar-selection test, the capability-guard test for the refined interpretation rule, and judge-validation tests for redaction, raw immutability, idempotency, ASR aggregation, the official HarmBench classifier prompt template, and judge-precision resolution. Second, the judge job (61047) ran in full precision on a 32 GB V100 and classified all 1 200 generations with zero parse errors. Third, `scripts/judge_agreement.py` reproduces the judge-vs-v2 agreement and the judge-primary pair labels deterministically from the committed sidecars. Fourth, the original `raw.jsonl` and `summary.json` files were confirmed unchanged by every post-hoc step (rescore and judge). Fifth, all judge sidecars were checked for redaction: they contain prompt IDs, boolean labels, and run metadata only — no prompt, behaviour, or response text.</w:t>
       </w:r>
     </w:p>
     <w:p>
@@ -24863,7 +24863,7 @@
           <w:sz w:val="22"/>
           <w:szCs w:val="22"/>
         </w:rPr>
-        <w:t xml:space="preserve">The next continuation point is operational, not architectural: T20 judge-model validation is implemented, but the HarmBench classifier has not yet been run on TC1. The code-complete path uses `ethical_benchmark/judges/validation.py`, `scripts/run_judge_validation.py`, `slurm/judge_validation.sbatch`, and `scripts/judge_agreement.py` to run the official HarmBench classifier as a derived sensitivity check over saved HarmBench generations. It does not replace the v2 scorer unless a later documented decision promotes the judge result after validation.</w:t>
+        <w:t xml:space="preserve">The HarmBench judge validation is complete (job 61047) and the official classifier is the primary HarmBench scorer (decision D16); §6.12 carries the results. There is no pending scoring work. The remaining items are non-technical: push the latest commit to origin; send the supervisor progress note (T1); record the exact storage quota via `MyTCinfo` (T3, hardware already confirmed as a 32 GB Tesla V100); and prepare the final submission (T15).</w:t>
       </w:r>
     </w:p>
     <w:p>
@@ -24877,7 +24877,7 @@
           <w:sz w:val="22"/>
           <w:szCs w:val="22"/>
         </w:rPr>
-        <w:t xml:space="preserve">Operationally, a future TC1 session should first run `git pull --ff-only` in `/tc1home/FYP/utan001/fyp_quant/repo`, then cache the classifier on the head node with `python scripts/prefetch_tc1.py --config configs/tc1.yaml --judge`, then submit `sbatch slurm/judge_validation.sbatch`. After the job completes, copy `scores.judge.harmbench_cls.jsonl` and `summary.judge.harmbench_cls.json` sidecars back to the Mac, run `python scripts/judge_agreement.py`, and populate §6.12 with the agreement rates, Cohen's kappa values, judge-vs-v2 ASR values, and per-pair label-stability result. Do not run judge Python scoring on the TC1 head node; do not print or commit raw prompts/responses outside the existing raw files.</w:t>
+        <w:t xml:space="preserve">The most valuable optional extension is a second independent judge — for example LlamaGuard or a frontier-model classifier with a strict yes/no rubric — to cross-check the HarmBench classifier itself; this is the one remaining construct-validity threat on the HarmBench metric (§7.4) and is listed in Chapter 9. The infrastructure already supports it: add a backend in `ethical_benchmark/judges/validation.py`, run it through `scripts/run_judge_validation.py` into `scores.judge.&lt;name&gt;.*` sidecars, and compare via `scripts/judge_agreement.py`. On TC1: `git pull --ff-only`, cache any new judge weights with `prefetch_tc1.py --judge --judge-model-id &lt;id&gt;`, then `sbatch` — never run judge Python on the head node, and never print or commit raw prompts/responses outside the existing immutable raw files. The Llama-2-family judge tokenizer requires `sentencepiece`, `protobuf`, and `tiktoken` (now pinned in requirements.txt).</w:t>
       </w:r>
     </w:p>
     <w:sectPr>

</xml_diff>

<commit_message>
docs: third consistency sweep — output-tree, cover line, log state (D16)
- CLAUDE/AGENTS output tree: scores.judge.* / summary.judge.* relabelled from
  "Optional future judge sidecar" to the committed PRIMARY HarmBench scorer (D16).
- Report cover revision line updated from "v2 scorer correction" to judge-primary
  D16 wording; added a 16:00 Appendix G row and demoted the 15:00 row from current.
- PROJECT_LOG: status-snapshot timestamp synced to metadata (both 16:00);
  TC1 git-state reworded to point at `git log origin/main..HEAD` instead of a
  hard "N commits ahead" list that re-stales every commit; byte count -> 79284.

Rebuilt docx (79284 bytes). 178 tests pass; CLAUDE/AGENTS in sync.

Co-Authored-By: Claude Opus 4.8 <noreply@anthropic.com>
</commit_message>
<xml_diff>
--- a/docs/FYP_Report_2026-05-27.docx
+++ b/docs/FYP_Report_2026-05-27.docx
@@ -193,7 +193,7 @@
           <w:sz w:val="20"/>
           <w:szCs w:val="20"/>
         </w:rPr>
-        <w:t xml:space="preserve">Revision: incorporates v2 scorer correction and immutable sidecar handoff</w:t>
+        <w:t xml:space="preserve">Revision: HarmBench ASR scored by the official HarmBench classifier (judge-primary, D16); v2 refusal regex retained as a secondary proxy</w:t>
       </w:r>
     </w:p>
     <w:p>
@@ -21802,6 +21802,98 @@
                 <w:sz w:val="20"/>
                 <w:szCs w:val="20"/>
               </w:rPr>
+              <w:t xml:space="preserve">2026-06-06 16:00</w:t>
+            </w:r>
+          </w:p>
+        </w:tc>
+        <w:tc>
+          <w:tcPr>
+            <w:tcW w:type="dxa" w:w="3000"/>
+            <w:tcBorders>
+              <w:top w:val="single" w:color="999999" w:sz="4"/>
+              <w:left w:val="single" w:color="999999" w:sz="4"/>
+              <w:bottom w:val="single" w:color="999999" w:sz="4"/>
+              <w:right w:val="single" w:color="999999" w:sz="4"/>
+            </w:tcBorders>
+            <w:tcMar>
+              <w:top w:type="dxa" w:w="80"/>
+              <w:left w:type="dxa" w:w="120"/>
+              <w:bottom w:type="dxa" w:w="80"/>
+              <w:right w:type="dxa" w:w="120"/>
+            </w:tcMar>
+          </w:tcPr>
+          <w:p>
+            <w:pPr>
+              <w:spacing w:after="0"/>
+            </w:pPr>
+            <w:r>
+              <w:rPr>
+                <w:rFonts w:ascii="Calibri" w:cs="Calibri" w:eastAsia="Calibri" w:hAnsi="Calibri"/>
+                <w:sz w:val="20"/>
+                <w:szCs w:val="20"/>
+              </w:rPr>
+              <w:t xml:space="preserve">FYP_Report_2026-05-27.docx (current)</w:t>
+            </w:r>
+          </w:p>
+        </w:tc>
+        <w:tc>
+          <w:tcPr>
+            <w:tcW w:type="dxa" w:w="4160"/>
+            <w:tcBorders>
+              <w:top w:val="single" w:color="999999" w:sz="4"/>
+              <w:left w:val="single" w:color="999999" w:sz="4"/>
+              <w:bottom w:val="single" w:color="999999" w:sz="4"/>
+              <w:right w:val="single" w:color="999999" w:sz="4"/>
+            </w:tcBorders>
+            <w:tcMar>
+              <w:top w:type="dxa" w:w="80"/>
+              <w:left w:type="dxa" w:w="120"/>
+              <w:bottom w:type="dxa" w:w="80"/>
+              <w:right w:type="dxa" w:w="120"/>
+            </w:tcMar>
+          </w:tcPr>
+          <w:p>
+            <w:pPr>
+              <w:spacing w:after="0"/>
+            </w:pPr>
+            <w:r>
+              <w:rPr>
+                <w:rFonts w:ascii="Calibri" w:cs="Calibri" w:eastAsia="Calibri" w:hAnsi="Calibri"/>
+                <w:sz w:val="20"/>
+                <w:szCs w:val="20"/>
+              </w:rPr>
+              <w:t xml:space="preserve">Doc-consistency follow-ups to the D16 judge-primary promotion. Rewrote Chapter 7 §7.1 (scoring determinism now describes the judge classifier, not regex-eliminates-judge-variance) and §7.4 (renamed "Scorer Choice and Remaining Validity Threat" — judge is primary, remaining threat is the absence of a second independent judge). Rewrote Appendix H §H.2–§H.5 to the post-judge state (the v2 Qwen 4B figure flagged as superseded; judge sidecars are the committed primary scorer; next steps are push/T1/T3/T15 plus an optional second judge, not a pending judge run). Updated the cover-page revision line to the judge-primary D16 wording. No numbers changed; this is a consistency pass so the .docx no longer contains pre-judge framing.</w:t>
+            </w:r>
+          </w:p>
+        </w:tc>
+      </w:tr>
+      <w:tr>
+        <w:tc>
+          <w:tcPr>
+            <w:tcW w:type="dxa" w:w="2200"/>
+            <w:tcBorders>
+              <w:top w:val="single" w:color="999999" w:sz="4"/>
+              <w:left w:val="single" w:color="999999" w:sz="4"/>
+              <w:bottom w:val="single" w:color="999999" w:sz="4"/>
+              <w:right w:val="single" w:color="999999" w:sz="4"/>
+            </w:tcBorders>
+            <w:tcMar>
+              <w:top w:type="dxa" w:w="80"/>
+              <w:left w:type="dxa" w:w="120"/>
+              <w:bottom w:type="dxa" w:w="80"/>
+              <w:right w:type="dxa" w:w="120"/>
+            </w:tcMar>
+          </w:tcPr>
+          <w:p>
+            <w:pPr>
+              <w:spacing w:after="0"/>
+            </w:pPr>
+            <w:r>
+              <w:rPr>
+                <w:rFonts w:ascii="Calibri" w:cs="Calibri" w:eastAsia="Calibri" w:hAnsi="Calibri"/>
+                <w:sz w:val="20"/>
+                <w:szCs w:val="20"/>
+              </w:rPr>
               <w:t xml:space="preserve">2026-06-06 15:00</w:t>
             </w:r>
           </w:p>
@@ -21832,7 +21924,7 @@
                 <w:sz w:val="20"/>
                 <w:szCs w:val="20"/>
               </w:rPr>
-              <w:t xml:space="preserve">FYP_Report_2026-05-27.docx (current)</w:t>
+              <w:t xml:space="preserve">FYP_Report_2026-05-27.docx</w:t>
             </w:r>
           </w:p>
         </w:tc>

</xml_diff>

<commit_message>
chore: end-of-day handoff close-out + land Codex's uncommitted 16:25 report work
- Commit project-level Claude Code handoff skill (.claude/skills/fyp-agent-handoff/);
  gitignore .claude/settings.local.json (machine-local).
- Refresh docs/HANDOFF.md (verified accurate; minimal update).
- Add forward priorities T21 (strengthen Results/Discussion) and T22 (second
  independent judge) to PROJECT_LOG open actions.
- Land Codex's modified-but-uncommitted AGENTS.md/CLAUDE.md/build_fyp_report.js/docx
  (HANDOFF.md pointers + Appendix H "no longer says push" + 16:25 Appendix G row).
- Stop hard-coding the exact docx byte count (it drifts ~2 bytes/build from zip
  nondeterminism) — same moving-fact lesson as the git ahead-count.

178 tests pass; CLAUDE/AGENTS in sync.

Co-Authored-By: Claude Opus 4.8 <noreply@anthropic.com>
</commit_message>
<xml_diff>
--- a/docs/FYP_Report_2026-05-27.docx
+++ b/docs/FYP_Report_2026-05-27.docx
@@ -21802,6 +21802,98 @@
                 <w:sz w:val="20"/>
                 <w:szCs w:val="20"/>
               </w:rPr>
+              <w:t xml:space="preserve">2026-06-06 16:25</w:t>
+            </w:r>
+          </w:p>
+        </w:tc>
+        <w:tc>
+          <w:tcPr>
+            <w:tcW w:type="dxa" w:w="3000"/>
+            <w:tcBorders>
+              <w:top w:val="single" w:color="999999" w:sz="4"/>
+              <w:left w:val="single" w:color="999999" w:sz="4"/>
+              <w:bottom w:val="single" w:color="999999" w:sz="4"/>
+              <w:right w:val="single" w:color="999999" w:sz="4"/>
+            </w:tcBorders>
+            <w:tcMar>
+              <w:top w:type="dxa" w:w="80"/>
+              <w:left w:type="dxa" w:w="120"/>
+              <w:bottom w:type="dxa" w:w="80"/>
+              <w:right w:type="dxa" w:w="120"/>
+            </w:tcMar>
+          </w:tcPr>
+          <w:p>
+            <w:pPr>
+              <w:spacing w:after="0"/>
+            </w:pPr>
+            <w:r>
+              <w:rPr>
+                <w:rFonts w:ascii="Calibri" w:cs="Calibri" w:eastAsia="Calibri" w:hAnsi="Calibri"/>
+                <w:sz w:val="20"/>
+                <w:szCs w:val="20"/>
+              </w:rPr>
+              <w:t xml:space="preserve">FYP_Report_2026-05-27.docx (current)</w:t>
+            </w:r>
+          </w:p>
+        </w:tc>
+        <w:tc>
+          <w:tcPr>
+            <w:tcW w:type="dxa" w:w="4160"/>
+            <w:tcBorders>
+              <w:top w:val="single" w:color="999999" w:sz="4"/>
+              <w:left w:val="single" w:color="999999" w:sz="4"/>
+              <w:bottom w:val="single" w:color="999999" w:sz="4"/>
+              <w:right w:val="single" w:color="999999" w:sz="4"/>
+            </w:tcBorders>
+            <w:tcMar>
+              <w:top w:type="dxa" w:w="80"/>
+              <w:left w:type="dxa" w:w="120"/>
+              <w:bottom w:type="dxa" w:w="80"/>
+              <w:right w:type="dxa" w:w="120"/>
+            </w:tcMar>
+          </w:tcPr>
+          <w:p>
+            <w:pPr>
+              <w:spacing w:after="0"/>
+            </w:pPr>
+            <w:r>
+              <w:rPr>
+                <w:rFonts w:ascii="Calibri" w:cs="Calibri" w:eastAsia="Calibri" w:hAnsi="Calibri"/>
+                <w:sz w:val="20"/>
+                <w:szCs w:val="20"/>
+              </w:rPr>
+              <w:t xml:space="preserve">Added a repo-native next-session handoff at docs/HANDOFF.md so Codex, Claude Code, and future agents can recover from the same file instead of relying on pasted chat context. Appendix H §H.5 now points future work to that shared handoff and removes the stale post-push D16 instruction, because D16 is already on origin/main. No result numbers changed.</w:t>
+            </w:r>
+          </w:p>
+        </w:tc>
+      </w:tr>
+      <w:tr>
+        <w:tc>
+          <w:tcPr>
+            <w:tcW w:type="dxa" w:w="2200"/>
+            <w:tcBorders>
+              <w:top w:val="single" w:color="999999" w:sz="4"/>
+              <w:left w:val="single" w:color="999999" w:sz="4"/>
+              <w:bottom w:val="single" w:color="999999" w:sz="4"/>
+              <w:right w:val="single" w:color="999999" w:sz="4"/>
+            </w:tcBorders>
+            <w:tcMar>
+              <w:top w:type="dxa" w:w="80"/>
+              <w:left w:type="dxa" w:w="120"/>
+              <w:bottom w:type="dxa" w:w="80"/>
+              <w:right w:type="dxa" w:w="120"/>
+            </w:tcMar>
+          </w:tcPr>
+          <w:p>
+            <w:pPr>
+              <w:spacing w:after="0"/>
+            </w:pPr>
+            <w:r>
+              <w:rPr>
+                <w:rFonts w:ascii="Calibri" w:cs="Calibri" w:eastAsia="Calibri" w:hAnsi="Calibri"/>
+                <w:sz w:val="20"/>
+                <w:szCs w:val="20"/>
+              </w:rPr>
               <w:t xml:space="preserve">2026-06-06 16:00</w:t>
             </w:r>
           </w:p>
@@ -21832,7 +21924,7 @@
                 <w:sz w:val="20"/>
                 <w:szCs w:val="20"/>
               </w:rPr>
-              <w:t xml:space="preserve">FYP_Report_2026-05-27.docx (current)</w:t>
+              <w:t xml:space="preserve">FYP_Report_2026-05-27.docx</w:t>
             </w:r>
           </w:p>
         </w:tc>
@@ -24955,7 +25047,7 @@
           <w:sz w:val="22"/>
           <w:szCs w:val="22"/>
         </w:rPr>
-        <w:t xml:space="preserve">The HarmBench judge validation is complete (job 61047) and the official classifier is the primary HarmBench scorer (decision D16); §6.12 carries the results. There is no pending scoring work. The remaining items are non-technical: push the latest commit to origin; send the supervisor progress note (T1); record the exact storage quota via `MyTCinfo` (T3, hardware already confirmed as a 32 GB Tesla V100); and prepare the final submission (T15).</w:t>
+        <w:t xml:space="preserve">The HarmBench judge validation is complete (job 61047) and the official classifier is the primary HarmBench scorer (decision D16); §6.12 carries the results. There is no pending scoring work. Future agents should start from the repo-native handoff in `docs/HANDOFF.md`, then verify live Git state with `git status -sb`. The remaining non-technical items are: send the supervisor progress note (T1); record the exact storage quota via `MyTCinfo` (T3, hardware already confirmed as a 32 GB Tesla V100); and prepare the final submission (T15).</w:t>
       </w:r>
     </w:p>
     <w:p>

</xml_diff>

<commit_message>
feat: agent-harness layer + D19 robustness hardening + T18 sensitivity infra
Lands the previously-uncommitted agent-harness layer (D17/D18): make agent-check gate, artifact policy, harness module, generated handoff/dashboard/TC1 checklist, architecture docs, Codex skills/subagents/hooks, CI workflow, raw-artifact manifest.

Adds D19 Priority-1 results hardening: two-layer label/evidence_status (label unchanged, significance reported separately), McNemar exact paired test for HarmBench dASR with discordant counts (Qwen 1.7B p=0.027), committed per-subject MMLU breakdown, LF-normalized analysis CSVs.

Adds D20 T18 multi-seed sensitivity arm infrastructure (configs/tc1_sensitivity.yaml, slurm/jobs_tc1_sensitivity/, generate_sensitivity_jobs.py, sensitivity_analysis.py) at T=0.7 across seeds, judge-scored to match the headline metric; run pending on TC1.

Drafts the Dr. Zhang progress email (T1). 192 tests pass; make agent-check 8/8.

Co-Authored-By: Claude Opus 4.8 <noreply@anthropic.com>
</commit_message>
<xml_diff>
--- a/docs/FYP_Report_2026-05-27.docx
+++ b/docs/FYP_Report_2026-05-27.docx
@@ -4439,6 +4439,20 @@
     </w:p>
     <w:p>
       <w:pPr>
+        <w:spacing w:after="160" w:line="300"/>
+        <w:jc w:val="both"/>
+      </w:pPr>
+      <w:r>
+        <w:rPr>
+          <w:rFonts w:ascii="Calibri" w:cs="Calibri" w:eastAsia="Calibri" w:hAnsi="Calibri"/>
+          <w:sz w:val="22"/>
+          <w:szCs w:val="22"/>
+        </w:rPr>
+        <w:t xml:space="preserve">Paired significance test for HarmBench (McNemar). Because both pair members see the identical prompt set, the HarmBench ΔASR is a paired-binary contrast, and the textbook-correct significance test is McNemar's exact test on the discordant prompts — those scored harmful under exactly one member — rather than an unpaired two-proportion test. Writing b for the number of prompts that become harmful under quantization (baseline-safe → 4-bit-harmful) and c for those that become safe (baseline-harmful → 4-bit-safe), under the null hypothesis that quantization does not change harmful compliance each discordant prompt favours one member with probability one half, so min(b, c) follows a Binomial(b + c, 0.5); the exact two-sided p-value doubles the lower tail. Reporting b and c also makes the effect size transparent: the reader sees exactly how many prompts moved each way rather than only the net delta. McNemar's exact p is reported alongside the bootstrap CI for every HarmBench pair as an independent corroboration that does not assume large-sample normality (implemented in mcnemar_exact_test, no SciPy dependency).</w:t>
+      </w:r>
+    </w:p>
+    <w:p>
+      <w:pPr>
         <w:pStyle w:val="Heading2"/>
         <w:spacing w:after="140" w:before="280"/>
       </w:pPr>
@@ -5060,6 +5074,20 @@
           <w:szCs w:val="18"/>
         </w:rPr>
         <w:t xml:space="preserve">Table 3.4  Interpretation labels derived from combined deltas. Numerical thresholds for the qualitative terms ("roughly flat", "small") are set as configurable parameters in the analysis module.</w:t>
+      </w:r>
+    </w:p>
+    <w:p>
+      <w:pPr>
+        <w:spacing w:after="160" w:line="300"/>
+        <w:jc w:val="both"/>
+      </w:pPr>
+      <w:r>
+        <w:rPr>
+          <w:rFonts w:ascii="Calibri" w:cs="Calibri" w:eastAsia="Calibri" w:hAnsi="Calibri"/>
+          <w:sz w:val="22"/>
+          <w:szCs w:val="22"/>
+        </w:rPr>
+        <w:t xml:space="preserve">Two-layer reporting: label plus evidence status. The interpretation label is a statement about the direction and magnitude of the point-estimate deltas; it is intentionally decoupled from statistical significance so the taxonomy stays stable and legible. Each label is therefore paired with a separate evidence_status field derived from the same paired-bootstrap 95% CI (and, for HarmBench, McNemar's exact test described in §3.7): confirmed when the delta the label keys on excludes zero, directional when the point estimate crosses the threshold but the CI includes zero, null for robust_preservation (a bounded CI cannot positively certify a null), and unknown when per-prompt outcomes are unavailable. This decoupling prevents a non-significant point estimate from being read as a confirmed finding — for example the Qwen 4B pair is labelled alignment_degradation (its ASR point estimate exceeds threshold) but carries evidence_status = directional because its CI touches zero. The status is computed by label_evidence_status alongside the label and emitted in results/analysis/pair_interpretations.json and judge_agreement.json; the label rule itself (classify_pair_change) is unchanged, so the diagnostic taxonomy and the strength-of-evidence reporting are independent, auditable layers.</w:t>
       </w:r>
     </w:p>
     <w:p>
@@ -12436,7 +12464,7 @@
                 <w:sz w:val="20"/>
                 <w:szCs w:val="20"/>
               </w:rPr>
-              <w:t xml:space="preserve">XSTest Δover-refusal</w:t>
+              <w:t xml:space="preserve">  HarmBench McNemar exact p</w:t>
             </w:r>
           </w:p>
         </w:tc>
@@ -12466,7 +12494,7 @@
                 <w:sz w:val="20"/>
                 <w:szCs w:val="20"/>
               </w:rPr>
-              <w:t xml:space="preserve">−0.024</w:t>
+              <w:t xml:space="preserve">0.027</w:t>
             </w:r>
           </w:p>
         </w:tc>
@@ -12496,7 +12524,7 @@
                 <w:sz w:val="20"/>
                 <w:szCs w:val="20"/>
               </w:rPr>
-              <w:t xml:space="preserve">−0.008</w:t>
+              <w:t xml:space="preserve">0.18</w:t>
             </w:r>
           </w:p>
         </w:tc>
@@ -12526,7 +12554,7 @@
                 <w:sz w:val="20"/>
                 <w:szCs w:val="20"/>
               </w:rPr>
-              <w:t xml:space="preserve">+0.016</w:t>
+              <w:t xml:space="preserve">1.00</w:t>
             </w:r>
           </w:p>
         </w:tc>
@@ -12558,7 +12586,7 @@
                 <w:sz w:val="20"/>
                 <w:szCs w:val="20"/>
               </w:rPr>
-              <w:t xml:space="preserve">MMLU Δaccuracy</w:t>
+              <w:t xml:space="preserve">XSTest Δover-refusal</w:t>
             </w:r>
           </w:p>
         </w:tc>
@@ -12588,7 +12616,7 @@
                 <w:sz w:val="20"/>
                 <w:szCs w:val="20"/>
               </w:rPr>
-              <w:t xml:space="preserve">−0.087  ★</w:t>
+              <w:t xml:space="preserve">−0.024</w:t>
             </w:r>
           </w:p>
         </w:tc>
@@ -12618,7 +12646,7 @@
                 <w:sz w:val="20"/>
                 <w:szCs w:val="20"/>
               </w:rPr>
-              <w:t xml:space="preserve">−0.003</w:t>
+              <w:t xml:space="preserve">−0.008</w:t>
             </w:r>
           </w:p>
         </w:tc>
@@ -12648,7 +12676,7 @@
                 <w:sz w:val="20"/>
                 <w:szCs w:val="20"/>
               </w:rPr>
-              <w:t xml:space="preserve">−0.043  ★</w:t>
+              <w:t xml:space="preserve">+0.016</w:t>
             </w:r>
           </w:p>
         </w:tc>
@@ -12680,6 +12708,128 @@
                 <w:sz w:val="20"/>
                 <w:szCs w:val="20"/>
               </w:rPr>
+              <w:t xml:space="preserve">MMLU Δaccuracy</w:t>
+            </w:r>
+          </w:p>
+        </w:tc>
+        <w:tc>
+          <w:tcPr>
+            <w:tcW w:type="dxa" w:w="2600"/>
+            <w:tcBorders>
+              <w:top w:val="single" w:color="999999" w:sz="4"/>
+              <w:left w:val="single" w:color="999999" w:sz="4"/>
+              <w:bottom w:val="single" w:color="999999" w:sz="4"/>
+              <w:right w:val="single" w:color="999999" w:sz="4"/>
+            </w:tcBorders>
+            <w:tcMar>
+              <w:top w:type="dxa" w:w="80"/>
+              <w:left w:type="dxa" w:w="120"/>
+              <w:bottom w:type="dxa" w:w="80"/>
+              <w:right w:type="dxa" w:w="120"/>
+            </w:tcMar>
+          </w:tcPr>
+          <w:p>
+            <w:pPr>
+              <w:spacing w:after="0"/>
+            </w:pPr>
+            <w:r>
+              <w:rPr>
+                <w:rFonts w:ascii="Calibri" w:cs="Calibri" w:eastAsia="Calibri" w:hAnsi="Calibri"/>
+                <w:sz w:val="20"/>
+                <w:szCs w:val="20"/>
+              </w:rPr>
+              <w:t xml:space="preserve">−0.087  ★</w:t>
+            </w:r>
+          </w:p>
+        </w:tc>
+        <w:tc>
+          <w:tcPr>
+            <w:tcW w:type="dxa" w:w="2600"/>
+            <w:tcBorders>
+              <w:top w:val="single" w:color="999999" w:sz="4"/>
+              <w:left w:val="single" w:color="999999" w:sz="4"/>
+              <w:bottom w:val="single" w:color="999999" w:sz="4"/>
+              <w:right w:val="single" w:color="999999" w:sz="4"/>
+            </w:tcBorders>
+            <w:tcMar>
+              <w:top w:type="dxa" w:w="80"/>
+              <w:left w:type="dxa" w:w="120"/>
+              <w:bottom w:type="dxa" w:w="80"/>
+              <w:right w:type="dxa" w:w="120"/>
+            </w:tcMar>
+          </w:tcPr>
+          <w:p>
+            <w:pPr>
+              <w:spacing w:after="0"/>
+            </w:pPr>
+            <w:r>
+              <w:rPr>
+                <w:rFonts w:ascii="Calibri" w:cs="Calibri" w:eastAsia="Calibri" w:hAnsi="Calibri"/>
+                <w:sz w:val="20"/>
+                <w:szCs w:val="20"/>
+              </w:rPr>
+              <w:t xml:space="preserve">−0.003</w:t>
+            </w:r>
+          </w:p>
+        </w:tc>
+        <w:tc>
+          <w:tcPr>
+            <w:tcW w:type="dxa" w:w="2700"/>
+            <w:tcBorders>
+              <w:top w:val="single" w:color="999999" w:sz="4"/>
+              <w:left w:val="single" w:color="999999" w:sz="4"/>
+              <w:bottom w:val="single" w:color="999999" w:sz="4"/>
+              <w:right w:val="single" w:color="999999" w:sz="4"/>
+            </w:tcBorders>
+            <w:tcMar>
+              <w:top w:type="dxa" w:w="80"/>
+              <w:left w:type="dxa" w:w="120"/>
+              <w:bottom w:type="dxa" w:w="80"/>
+              <w:right w:type="dxa" w:w="120"/>
+            </w:tcMar>
+          </w:tcPr>
+          <w:p>
+            <w:pPr>
+              <w:spacing w:after="0"/>
+            </w:pPr>
+            <w:r>
+              <w:rPr>
+                <w:rFonts w:ascii="Calibri" w:cs="Calibri" w:eastAsia="Calibri" w:hAnsi="Calibri"/>
+                <w:sz w:val="20"/>
+                <w:szCs w:val="20"/>
+              </w:rPr>
+              <w:t xml:space="preserve">−0.043  ★</w:t>
+            </w:r>
+          </w:p>
+        </w:tc>
+      </w:tr>
+      <w:tr>
+        <w:tc>
+          <w:tcPr>
+            <w:tcW w:type="dxa" w:w="2400"/>
+            <w:tcBorders>
+              <w:top w:val="single" w:color="999999" w:sz="4"/>
+              <w:left w:val="single" w:color="999999" w:sz="4"/>
+              <w:bottom w:val="single" w:color="999999" w:sz="4"/>
+              <w:right w:val="single" w:color="999999" w:sz="4"/>
+            </w:tcBorders>
+            <w:tcMar>
+              <w:top w:type="dxa" w:w="80"/>
+              <w:left w:type="dxa" w:w="120"/>
+              <w:bottom w:type="dxa" w:w="80"/>
+              <w:right w:type="dxa" w:w="120"/>
+            </w:tcMar>
+          </w:tcPr>
+          <w:p>
+            <w:pPr>
+              <w:spacing w:after="0"/>
+            </w:pPr>
+            <w:r>
+              <w:rPr>
+                <w:rFonts w:ascii="Calibri" w:cs="Calibri" w:eastAsia="Calibri" w:hAnsi="Calibri"/>
+                <w:sz w:val="20"/>
+                <w:szCs w:val="20"/>
+              </w:rPr>
               <w:t xml:space="preserve">Interpretation label (judge-primary)</w:t>
             </w:r>
           </w:p>
@@ -12740,7 +12890,7 @@
                 <w:sz w:val="20"/>
                 <w:szCs w:val="20"/>
               </w:rPr>
-              <w:t xml:space="preserve">alignment_degradation (directional)</w:t>
+              <w:t xml:space="preserve">alignment_degradation</w:t>
             </w:r>
           </w:p>
         </w:tc>
@@ -12771,6 +12921,128 @@
                 <w:szCs w:val="20"/>
               </w:rPr>
               <w:t xml:space="preserve">broad_degradation</w:t>
+            </w:r>
+          </w:p>
+        </w:tc>
+      </w:tr>
+      <w:tr>
+        <w:tc>
+          <w:tcPr>
+            <w:tcW w:type="dxa" w:w="2400"/>
+            <w:tcBorders>
+              <w:top w:val="single" w:color="999999" w:sz="4"/>
+              <w:left w:val="single" w:color="999999" w:sz="4"/>
+              <w:bottom w:val="single" w:color="999999" w:sz="4"/>
+              <w:right w:val="single" w:color="999999" w:sz="4"/>
+            </w:tcBorders>
+            <w:tcMar>
+              <w:top w:type="dxa" w:w="80"/>
+              <w:left w:type="dxa" w:w="120"/>
+              <w:bottom w:type="dxa" w:w="80"/>
+              <w:right w:type="dxa" w:w="120"/>
+            </w:tcMar>
+          </w:tcPr>
+          <w:p>
+            <w:pPr>
+              <w:spacing w:after="0"/>
+            </w:pPr>
+            <w:r>
+              <w:rPr>
+                <w:rFonts w:ascii="Calibri" w:cs="Calibri" w:eastAsia="Calibri" w:hAnsi="Calibri"/>
+                <w:sz w:val="20"/>
+                <w:szCs w:val="20"/>
+              </w:rPr>
+              <w:t xml:space="preserve">Evidence status (two-layer)</w:t>
+            </w:r>
+          </w:p>
+        </w:tc>
+        <w:tc>
+          <w:tcPr>
+            <w:tcW w:type="dxa" w:w="2600"/>
+            <w:tcBorders>
+              <w:top w:val="single" w:color="999999" w:sz="4"/>
+              <w:left w:val="single" w:color="999999" w:sz="4"/>
+              <w:bottom w:val="single" w:color="999999" w:sz="4"/>
+              <w:right w:val="single" w:color="999999" w:sz="4"/>
+            </w:tcBorders>
+            <w:tcMar>
+              <w:top w:type="dxa" w:w="80"/>
+              <w:left w:type="dxa" w:w="120"/>
+              <w:bottom w:type="dxa" w:w="80"/>
+              <w:right w:type="dxa" w:w="120"/>
+            </w:tcMar>
+          </w:tcPr>
+          <w:p>
+            <w:pPr>
+              <w:spacing w:after="0"/>
+            </w:pPr>
+            <w:r>
+              <w:rPr>
+                <w:rFonts w:ascii="Calibri" w:cs="Calibri" w:eastAsia="Calibri" w:hAnsi="Calibri"/>
+                <w:sz w:val="20"/>
+                <w:szCs w:val="20"/>
+              </w:rPr>
+              <w:t xml:space="preserve">confirmed</w:t>
+            </w:r>
+          </w:p>
+        </w:tc>
+        <w:tc>
+          <w:tcPr>
+            <w:tcW w:type="dxa" w:w="2600"/>
+            <w:tcBorders>
+              <w:top w:val="single" w:color="999999" w:sz="4"/>
+              <w:left w:val="single" w:color="999999" w:sz="4"/>
+              <w:bottom w:val="single" w:color="999999" w:sz="4"/>
+              <w:right w:val="single" w:color="999999" w:sz="4"/>
+            </w:tcBorders>
+            <w:tcMar>
+              <w:top w:type="dxa" w:w="80"/>
+              <w:left w:type="dxa" w:w="120"/>
+              <w:bottom w:type="dxa" w:w="80"/>
+              <w:right w:type="dxa" w:w="120"/>
+            </w:tcMar>
+          </w:tcPr>
+          <w:p>
+            <w:pPr>
+              <w:spacing w:after="0"/>
+            </w:pPr>
+            <w:r>
+              <w:rPr>
+                <w:rFonts w:ascii="Calibri" w:cs="Calibri" w:eastAsia="Calibri" w:hAnsi="Calibri"/>
+                <w:sz w:val="20"/>
+                <w:szCs w:val="20"/>
+              </w:rPr>
+              <w:t xml:space="preserve">directional</w:t>
+            </w:r>
+          </w:p>
+        </w:tc>
+        <w:tc>
+          <w:tcPr>
+            <w:tcW w:type="dxa" w:w="2700"/>
+            <w:tcBorders>
+              <w:top w:val="single" w:color="999999" w:sz="4"/>
+              <w:left w:val="single" w:color="999999" w:sz="4"/>
+              <w:bottom w:val="single" w:color="999999" w:sz="4"/>
+              <w:right w:val="single" w:color="999999" w:sz="4"/>
+            </w:tcBorders>
+            <w:tcMar>
+              <w:top w:type="dxa" w:w="80"/>
+              <w:left w:type="dxa" w:w="120"/>
+              <w:bottom w:type="dxa" w:w="80"/>
+              <w:right w:type="dxa" w:w="120"/>
+            </w:tcMar>
+          </w:tcPr>
+          <w:p>
+            <w:pPr>
+              <w:spacing w:after="0"/>
+            </w:pPr>
+            <w:r>
+              <w:rPr>
+                <w:rFonts w:ascii="Calibri" w:cs="Calibri" w:eastAsia="Calibri" w:hAnsi="Calibri"/>
+                <w:sz w:val="20"/>
+                <w:szCs w:val="20"/>
+              </w:rPr>
+              <w:t xml:space="preserve">confirmed</w:t>
             </w:r>
           </w:p>
         </w:tc>
@@ -12786,7 +13058,7 @@
           <w:sz w:val="18"/>
           <w:szCs w:val="18"/>
         </w:rPr>
-        <w:t xml:space="preserve">Table 6.2  All-pair quantization deltas and interpretation labels. Δ = 4-bit − baseline. HarmBench ΔASR (judge) is the primary scorer; the v2 proxy row is shown for transparency. ★ marks deltas whose paired-bootstrap 95% CI excludes zero. Under the judge, three deltas are significant: Qwen 1.7B ΔASR, Qwen 1.7B ΔMMLU, and Llama ΔMMLU. The Qwen 4B judge ΔASR (+0.025) is directional only — its CI touches zero — so the interpretation label is alignment_degradation by point estimate but not statistically confirmed. Labels are judge-primary (D16).</w:t>
+        <w:t xml:space="preserve">Table 6.2  All-pair quantization deltas, interpretation labels, and evidence status. Δ = 4-bit − baseline. HarmBench ΔASR (judge) is the primary scorer; the v2 proxy row is shown for transparency. ★ marks deltas whose paired-bootstrap 95% CI excludes zero. The McNemar row is the exact two-sided paired-binary test on the judge ΔASR (independent of the bootstrap). Under the judge, three deltas are significant: Qwen 1.7B ΔASR (also McNemar p = 0.027), Qwen 1.7B ΔMMLU, and Llama ΔMMLU. The two-layer evidence status reports each label's statistical support separately from the label itself (§3.8): Qwen 4B keeps the alignment_degradation label by point estimate but is flagged directional because its ΔASR CI touches zero (McNemar p = 0.18) — it is not a statistically confirmed regression. Labels are judge-primary (D16).</w:t>
       </w:r>
     </w:p>
     <w:p>
@@ -13036,7 +13308,7 @@
           <w:sz w:val="22"/>
           <w:szCs w:val="22"/>
         </w:rPr>
-        <w:t xml:space="preserve">Three statistical limitations should be borne in mind when interpreting the results. First, with 200 HarmBench prompts and 250 benign XSTest prompts, the paired bootstrap 95% confidence interval on a binomial-proportion delta is approximately ±0.05 (Table 6.1) — small deltas may not be statistically distinguishable from zero. Under the primary (judge) scorer, the Qwen 1.7B ΔASR (+0.055, CI [+0.010, +0.100]) is the only HarmBench delta whose CI excludes zero; the Qwen 4B ΔASR (+0.025, CI [−0.000, +0.055]) is directional but not significant, and the Llama ΔASR (0.000, CI [−0.020, +0.020]) is within noise. Second, decoding is deterministic at temperature 0.0, so the only source of variance reflected in the bootstrap intervals is prompt sampling — there is no within-condition stochastic variance. A multi-seed (T = 0.7) sensitivity arm for one pair (Chapter 9, future work) would provide an independent variance estimate. Third, the MMLU subset comprises 300 questions pooled across six subjects; subject counts are uneven (25–94 per subject: business_ethics 25, college_biology 33, human_aging 44, clinical_knowledge 48, high_school_world_history 56, high_school_macroeconomics 94). Subject-level accuracy estimates are correspondingly noisy and are not reported as primary statistics. The distribution is identical across all baseline and 4-bit runs (same seed, same prompt IDs), so cross-condition comparisons are unaffected. Fourth, HarmBench ASR is scored by the official HarmBench classifier (primary); the v2 refusal regex is retained only as a secondary non-refusal-rate proxy because the judge validation (§6.12) showed it materially over-counts ASR. XSTest over-refusal is scored by the v2 regex (the HarmBench classifier does not cover the over-refusal question).</w:t>
+        <w:t xml:space="preserve">Three statistical limitations should be borne in mind when interpreting the results. First, with 200 HarmBench prompts and 250 benign XSTest prompts, the paired bootstrap 95% confidence interval on a binomial-proportion delta is approximately ±0.05 (Table 6.1) — small deltas may not be statistically distinguishable from zero. Under the primary (judge) scorer, the Qwen 1.7B ΔASR (+0.055, CI [+0.010, +0.100]) is the only HarmBench delta whose CI excludes zero; the Qwen 4B ΔASR (+0.025, CI [−0.000, +0.055]) is directional but not significant, and the Llama ΔASR (0.000, CI [−0.020, +0.020]) is within noise. Second, decoding is deterministic at temperature 0.0, so the only source of variance reflected in the bootstrap intervals is prompt sampling — there is no within-condition stochastic variance. The one significant HarmBench delta (Qwen 1.7B) is corroborated by McNemar's exact paired test (p = 0.027) in addition to the bootstrap CI, so it does not rest on a single interval procedure; but a multi-seed (T = 0.7) sensitivity arm for one pair (Chapter 9, future work) is still needed to estimate generation-level variance, since both tests here condition on the single greedy decode. To keep point-estimate labels from being over-read, every interpretation label additionally carries a two-layer evidence_status (confirmed / directional / null; §3.8): of the three pairs, Qwen 1.7B and Llama are confirmed and Qwen 4B is directional. Third, the MMLU subset comprises 300 questions pooled across six subjects; subject counts are uneven (25–94 per subject: business_ethics 25, college_biology 33, human_aging 44, clinical_knowledge 48, high_school_world_history 56, high_school_macroeconomics 94). Subject-level accuracy estimates are correspondingly noisy and are not reported as primary statistics. The distribution is identical across all baseline and 4-bit runs (same seed, same prompt IDs), so cross-condition comparisons are unaffected. Fourth, HarmBench ASR is scored by the official HarmBench classifier (primary); the v2 refusal regex is retained only as a secondary non-refusal-rate proxy because the judge validation (§6.12) showed it materially over-counts ASR. XSTest over-refusal is scored by the v2 regex (the HarmBench classifier does not cover the over-refusal question).</w:t>
       </w:r>
     </w:p>
     <w:p>
@@ -13066,7 +13338,21 @@
           <w:sz w:val="22"/>
           <w:szCs w:val="22"/>
         </w:rPr>
-        <w:t xml:space="preserve">Under the official HarmBench classifier, the Qwen 1.7B pair is the strongest result in the study and receives the broad_degradation label — it degrades on both axes. HarmBench ASR rises significantly (0.135 → 0.190, ΔASR = +0.055, 95% CI [+0.010, +0.100], significant) and MMLU accuracy falls significantly (0.620 → 0.533, ΔMMLU = −0.087, CI [−0.137, −0.037], significant). Quantization makes the smallest model both more willing to produce genuinely harmful content and less capable. Because capability also drops beyond tolerance, the rule does not assign alignment_degradation (which requires capability preserved); the honest label is broad_degradation — combined safety and capability worsening.</w:t>
+        <w:t xml:space="preserve">Under the official HarmBench classifier, the Qwen 1.7B pair is the strongest result in the study and receives the broad_degradation label (evidence status: confirmed) — it degrades on both axes. HarmBench ASR rises significantly (0.135 → 0.190, ΔASR = +0.055, 95% CI [+0.010, +0.100], significant) and MMLU accuracy falls significantly (0.620 → 0.533, ΔMMLU = −0.087, CI [−0.137, −0.037], significant). Quantization makes the smallest model both more willing to produce genuinely harmful content and less capable. Because capability also drops beyond tolerance, the rule does not assign alignment_degradation (which requires capability preserved); the honest label is broad_degradation — combined safety and capability worsening.</w:t>
+      </w:r>
+    </w:p>
+    <w:p>
+      <w:pPr>
+        <w:spacing w:after="160" w:line="300"/>
+        <w:jc w:val="both"/>
+      </w:pPr>
+      <w:r>
+        <w:rPr>
+          <w:rFonts w:ascii="Calibri" w:cs="Calibri" w:eastAsia="Calibri" w:hAnsi="Calibri"/>
+          <w:sz w:val="22"/>
+          <w:szCs w:val="22"/>
+        </w:rPr>
+        <w:t xml:space="preserve">The ΔASR finding is corroborated by a second, independent significance test. Because HarmBench is paired, McNemar's exact test (the correct paired-binary test; §3.7) is applied to the judge outcomes: of 200 prompts, 16 became harmful under quantization while only 5 became safe (21 discordant prompts), giving an exact two-sided p = 0.027. The paired bootstrap (CI excludes zero) and McNemar's exact test therefore agree the increase is statistically real rather than a resampling artefact, and the 16-versus-5 split makes the effect size transparent: the +0.055 net delta is the residual of a markedly asymmetric flip. This is the only HarmBench pair in the study significant under both tests.</w:t>
       </w:r>
     </w:p>
     <w:p>
@@ -13182,7 +13468,7 @@
           <w:sz w:val="22"/>
           <w:szCs w:val="22"/>
         </w:rPr>
-        <w:t xml:space="preserve">Under the official classifier, the Qwen 4B pair receives the alignment_degradation label by point estimate, but the effect is directional rather than statistically confirmed. HarmBench ASR rises from 0.065 to 0.090 (ΔASR = +0.025, 95% CI [−0.000, +0.055], not significant — the lower bound touches zero) while capability is preserved (ΔMMLU = −0.003, CI [−0.040, +0.033], not significant). Because capability is preserved and the ASR point estimate exceeds the harm tolerance, the rule assigns alignment_degradation; but the CI includes zero, so this is best read as a suggestive safety worsening, not a confirmed one.</w:t>
+        <w:t xml:space="preserve">Under the official classifier, the Qwen 4B pair receives the alignment_degradation label by point estimate with evidence status directional — the effect is suggestive rather than statistically confirmed. HarmBench ASR rises from 0.065 to 0.090 (ΔASR = +0.025, 95% CI [−0.000, +0.055], not significant — the lower bound touches zero) while capability is preserved (ΔMMLU = −0.003, CI [−0.040, +0.033], not significant). McNemar's exact paired test agrees the move is not significant: only 7 prompts became harmful versus 2 that became safe (9 discordant), exact p = 0.18. Because capability is preserved and the ASR point estimate exceeds the harm tolerance, the rule assigns alignment_degradation; but both the bootstrap CI and McNemar's test include the null, so the two-layer scheme flags this as directional — a suggestive safety worsening, not a confirmed one.</w:t>
       </w:r>
     </w:p>
     <w:p>
@@ -13210,7 +13496,7 @@
           <w:sz w:val="22"/>
           <w:szCs w:val="22"/>
         </w:rPr>
-        <w:t xml:space="preserve">Mechanism and over-refusal. Qwen 4B at full precision is strongly refusal-calibrated on genuine harm (judge baseline ASR = 0.065). XSTest over-refusal moves marginally (0.028 → 0.020, ΔOR = −0.008, not significant). A plausible mechanism for the directional ASR increase is the same NF4 degradation of refusal precision seen elsewhere; but unlike the 1.7B pair, the 4B model retains its capability, so any safety move here is not a capability artefact — it just is not large enough to confirm at this sample size.</w:t>
+        <w:t xml:space="preserve">Mechanism and over-refusal. Qwen 4B at full precision is strongly refusal-calibrated on genuine harm (judge baseline ASR = 0.065). XSTest over-refusal moves marginally (0.028 → 0.020, ΔOR = −0.008, not significant). A plausible mechanism for the directional ASR increase is the same NF4 degradation of refusal precision seen elsewhere; but unlike the 1.7B pair, the 4B model retains its capability, so any safety move here is not a capability artefact — it just is not large enough to confirm at this sample size. The subject-level MMLU is correspondingly flat, corroborating the preserved-capability reading: only two of six subjects regress (business ethics −4.0 pp, college biology −3.0 pp), three are unchanged, and high school macroeconomics rises slightly (+1.1 pp) — a stark contrast with the 1.7B pair's five-of-six broad regression. Per-subject figures for all pairs are in results/analysis/mmlu_subject_breakdown.{json,csv}.</w:t>
       </w:r>
     </w:p>
     <w:p>
@@ -14888,6 +15174,20 @@
           <w:szCs w:val="22"/>
         </w:rPr>
         <w:t xml:space="preserve">Result 2 — the choice of scorer changes the conclusion. Under the judge, the per-pair HarmBench ΔASR values are: Qwen 1.7B +0.055 (CI [+0.010, +0.100], significant); Qwen 4B +0.025 (CI [−0.000, +0.055], not significant); Llama 0.000 (CI [−0.020, +0.020], not significant). Compared with the v2 proxy (−0.025, +0.065, 0.000), the significant effect moves from Qwen 4B to Qwen 1.7B and flips the small-model direction from apparently-negative to significantly-positive. The interpretation labels follow: Qwen 1.7B moves from capability_collapse_masquerading_as_safety (proxy) to broad_degradation (judge: significant ΔASR up + significant ΔMMLU down); Qwen 4B remains alignment_degradation but only directionally (no longer significant); Llama remains broad_degradation. The judge validation is therefore not a rubber stamp — it corrected a refusal-counting artefact and relocated the study's one robust safety regression to the smallest model. This is reported transparently as the central methodological result of the chapter, and the HarmBench numbers throughout the report are the judge values accordingly (D16).</w:t>
+      </w:r>
+    </w:p>
+    <w:p>
+      <w:pPr>
+        <w:spacing w:after="160" w:line="300"/>
+        <w:jc w:val="both"/>
+      </w:pPr>
+      <w:r>
+        <w:rPr>
+          <w:rFonts w:ascii="Calibri" w:cs="Calibri" w:eastAsia="Calibri" w:hAnsi="Calibri"/>
+          <w:sz w:val="22"/>
+          <w:szCs w:val="22"/>
+        </w:rPr>
+        <w:t xml:space="preserve">Result 3 — the relocation is robust to the choice of significance test. The judge ΔASR significance was re-tested with McNemar's exact test, which is the correct paired-binary test for HarmBench and assumes no large-sample normality (§3.7). It reproduces the bootstrap conclusion exactly: Qwen 1.7B p = 0.027 (16 prompts became harmful vs 5 became safe), Qwen 4B p = 0.18 (7 vs 2), Llama p = 1.00 (2 vs 2). Only the smallest model's increase is significant under either test, so the study's single confirmed safety regression does not depend on the bootstrap machinery. A structural property of the judge–regex relationship reinforces the over-counting diagnosis: across all six models the judge labelled essentially no generation harmful that the regex had cleared (judge_harmful_v2_not ≈ 0), so the judge's harmful set is almost a strict subset of the regex's — the disagreement is one-directional over-counting by the regex, not two-sided noise.</w:t>
       </w:r>
     </w:p>
     <w:p>

</xml_diff>